<commit_message>
Add short slide deck and fix JEP Paper docx table rendering
- Create pulling_the_wrong_lever_short_slides.qmd: condensed 16-slide revealjs
  deck based on JEP Paper content with interactive plots (Leaflet map, ggplot)
- Fix JEP Paper tables not rendering in docx: use format-aware branching
  (latex for PDF, pipe for Word) instead of hardcoded format = "latex"
- Add authblk-based author affiliations for PDF title page
- Add link to short slides on docs/index.html

Co-Authored-By: Claude Opus 4.6 <noreply@anthropic.com>
</commit_message>
<xml_diff>
--- a/JEP_Paper.docx
+++ b/JEP_Paper.docx
@@ -1197,7 +1197,2592 @@
               <w:t xml:space="preserve">Table 1: Stepwise progression to the full multilevel model for overall Attainment 8.</w:t>
             </w:r>
           </w:p>
+          <w:tbl>
+            <w:tblPr>
+              <w:tblStyle w:val="Table"/>
+              <w:tblW w:type="pct" w:w="5000"/>
+              <w:tblLayout w:type="fixed"/>
+              <w:tblLook w:firstRow="1" w:lastRow="0" w:firstColumn="0" w:lastColumn="0" w:noHBand="0" w:noVBand="0" w:val="0020"/>
+            </w:tblPr>
+            <w:tblGrid>
+              <w:gridCol w:w="1995"/>
+              <w:gridCol w:w="623"/>
+              <w:gridCol w:w="436"/>
+              <w:gridCol w:w="623"/>
+              <w:gridCol w:w="436"/>
+              <w:gridCol w:w="623"/>
+              <w:gridCol w:w="436"/>
+              <w:gridCol w:w="623"/>
+              <w:gridCol w:w="436"/>
+              <w:gridCol w:w="623"/>
+              <w:gridCol w:w="1060"/>
+            </w:tblGrid>
+            <w:tr>
+              <w:trPr>
+                <w:tblHeader w:val="on"/>
+              </w:trPr>
+              <w:tc>
+                <w:tcPr/>
+                <w:p>
+                  <w:pPr>
+                    <w:pStyle w:val="Compact"/>
+                    <w:jc w:val="left"/>
+                    <w:jc w:val="center"/>
+                  </w:pPr>
+                  <w:r>
+                    <w:t xml:space="preserve">Variable</w:t>
+                  </w:r>
+                </w:p>
+              </w:tc>
+              <w:tc>
+                <w:tcPr/>
+                <w:p>
+                  <w:pPr>
+                    <w:pStyle w:val="Compact"/>
+                    <w:jc w:val="right"/>
+                    <w:jc w:val="center"/>
+                  </w:pPr>
+                  <w:r>
+                    <w:t xml:space="preserve">Est.</w:t>
+                  </w:r>
+                </w:p>
+              </w:tc>
+              <w:tc>
+                <w:tcPr/>
+                <w:p>
+                  <w:pPr>
+                    <w:pStyle w:val="Compact"/>
+                    <w:jc w:val="left"/>
+                    <w:jc w:val="center"/>
+                  </w:pPr>
+                  <w:r>
+                    <w:t xml:space="preserve">t</w:t>
+                  </w:r>
+                </w:p>
+              </w:tc>
+              <w:tc>
+                <w:tcPr/>
+                <w:p>
+                  <w:pPr>
+                    <w:pStyle w:val="Compact"/>
+                    <w:jc w:val="right"/>
+                    <w:jc w:val="center"/>
+                  </w:pPr>
+                  <w:r>
+                    <w:t xml:space="preserve">Est.</w:t>
+                  </w:r>
+                </w:p>
+              </w:tc>
+              <w:tc>
+                <w:tcPr/>
+                <w:p>
+                  <w:pPr>
+                    <w:pStyle w:val="Compact"/>
+                    <w:jc w:val="left"/>
+                    <w:jc w:val="center"/>
+                  </w:pPr>
+                  <w:r>
+                    <w:t xml:space="preserve">t</w:t>
+                  </w:r>
+                </w:p>
+              </w:tc>
+              <w:tc>
+                <w:tcPr/>
+                <w:p>
+                  <w:pPr>
+                    <w:pStyle w:val="Compact"/>
+                    <w:jc w:val="right"/>
+                    <w:jc w:val="center"/>
+                  </w:pPr>
+                  <w:r>
+                    <w:t xml:space="preserve">Est.</w:t>
+                  </w:r>
+                </w:p>
+              </w:tc>
+              <w:tc>
+                <w:tcPr/>
+                <w:p>
+                  <w:pPr>
+                    <w:pStyle w:val="Compact"/>
+                    <w:jc w:val="left"/>
+                    <w:jc w:val="center"/>
+                  </w:pPr>
+                  <w:r>
+                    <w:t xml:space="preserve">t</w:t>
+                  </w:r>
+                </w:p>
+              </w:tc>
+              <w:tc>
+                <w:tcPr/>
+                <w:p>
+                  <w:pPr>
+                    <w:pStyle w:val="Compact"/>
+                    <w:jc w:val="right"/>
+                    <w:jc w:val="center"/>
+                  </w:pPr>
+                  <w:r>
+                    <w:t xml:space="preserve">Est.</w:t>
+                  </w:r>
+                </w:p>
+              </w:tc>
+              <w:tc>
+                <w:tcPr/>
+                <w:p>
+                  <w:pPr>
+                    <w:pStyle w:val="Compact"/>
+                    <w:jc w:val="left"/>
+                    <w:jc w:val="center"/>
+                  </w:pPr>
+                  <w:r>
+                    <w:t xml:space="preserve">t</w:t>
+                  </w:r>
+                </w:p>
+              </w:tc>
+              <w:tc>
+                <w:tcPr/>
+                <w:p>
+                  <w:pPr>
+                    <w:pStyle w:val="Compact"/>
+                    <w:jc w:val="right"/>
+                    <w:jc w:val="center"/>
+                  </w:pPr>
+                  <w:r>
+                    <w:t xml:space="preserve">Est.</w:t>
+                  </w:r>
+                </w:p>
+              </w:tc>
+              <w:tc>
+                <w:tcPr/>
+                <w:p>
+                  <w:pPr>
+                    <w:pStyle w:val="Compact"/>
+                    <w:jc w:val="left"/>
+                    <w:jc w:val="center"/>
+                  </w:pPr>
+                  <w:r>
+                    <w:t xml:space="preserve">t</w:t>
+                  </w:r>
+                </w:p>
+              </w:tc>
+            </w:tr>
+            <w:tr>
+              <w:tc>
+                <w:tcPr/>
+                <w:p>
+                  <w:pPr>
+                    <w:pStyle w:val="Compact"/>
+                    <w:jc w:val="left"/>
+                    <w:jc w:val="center"/>
+                  </w:pPr>
+                  <w:r>
+                    <w:t xml:space="preserve">(Intercept)</w:t>
+                  </w:r>
+                </w:p>
+              </w:tc>
+              <w:tc>
+                <w:tcPr/>
+                <w:p>
+                  <w:pPr>
+                    <w:pStyle w:val="Compact"/>
+                    <w:jc w:val="right"/>
+                    <w:jc w:val="center"/>
+                  </w:pPr>
+                  <w:r>
+                    <w:t xml:space="preserve">4.473***</w:t>
+                  </w:r>
+                </w:p>
+              </w:tc>
+              <w:tc>
+                <w:tcPr/>
+                <w:p>
+                  <w:pPr>
+                    <w:pStyle w:val="Compact"/>
+                    <w:jc w:val="left"/>
+                    <w:jc w:val="center"/>
+                  </w:pPr>
+                  <w:r>
+                    <w:t xml:space="preserve">621.25</w:t>
+                  </w:r>
+                </w:p>
+              </w:tc>
+              <w:tc>
+                <w:tcPr/>
+                <w:p>
+                  <w:pPr>
+                    <w:pStyle w:val="Compact"/>
+                    <w:jc w:val="right"/>
+                    <w:jc w:val="center"/>
+                  </w:pPr>
+                  <w:r>
+                    <w:t xml:space="preserve">5.006***</w:t>
+                  </w:r>
+                </w:p>
+              </w:tc>
+              <w:tc>
+                <w:tcPr/>
+                <w:p>
+                  <w:pPr>
+                    <w:pStyle w:val="Compact"/>
+                    <w:jc w:val="left"/>
+                    <w:jc w:val="center"/>
+                  </w:pPr>
+                  <w:r>
+                    <w:t xml:space="preserve">579.97</w:t>
+                  </w:r>
+                </w:p>
+              </w:tc>
+              <w:tc>
+                <w:tcPr/>
+                <w:p>
+                  <w:pPr>
+                    <w:pStyle w:val="Compact"/>
+                    <w:jc w:val="right"/>
+                    <w:jc w:val="center"/>
+                  </w:pPr>
+                  <w:r>
+                    <w:t xml:space="preserve">4.833***</w:t>
+                  </w:r>
+                </w:p>
+              </w:tc>
+              <w:tc>
+                <w:tcPr/>
+                <w:p>
+                  <w:pPr>
+                    <w:pStyle w:val="Compact"/>
+                    <w:jc w:val="left"/>
+                    <w:jc w:val="center"/>
+                  </w:pPr>
+                  <w:r>
+                    <w:t xml:space="preserve">547.18</w:t>
+                  </w:r>
+                </w:p>
+              </w:tc>
+              <w:tc>
+                <w:tcPr/>
+                <w:p>
+                  <w:pPr>
+                    <w:pStyle w:val="Compact"/>
+                    <w:jc w:val="right"/>
+                    <w:jc w:val="center"/>
+                  </w:pPr>
+                  <w:r>
+                    <w:t xml:space="preserve">4.628***</w:t>
+                  </w:r>
+                </w:p>
+              </w:tc>
+              <w:tc>
+                <w:tcPr/>
+                <w:p>
+                  <w:pPr>
+                    <w:pStyle w:val="Compact"/>
+                    <w:jc w:val="left"/>
+                    <w:jc w:val="center"/>
+                  </w:pPr>
+                  <w:r>
+                    <w:t xml:space="preserve">319.11</w:t>
+                  </w:r>
+                </w:p>
+              </w:tc>
+              <w:tc>
+                <w:tcPr/>
+                <w:p>
+                  <w:pPr>
+                    <w:pStyle w:val="Compact"/>
+                    <w:jc w:val="right"/>
+                    <w:jc w:val="center"/>
+                  </w:pPr>
+                  <w:r>
+                    <w:t xml:space="preserve">4.633***</w:t>
+                  </w:r>
+                </w:p>
+              </w:tc>
+              <w:tc>
+                <w:tcPr/>
+                <w:p>
+                  <w:pPr>
+                    <w:pStyle w:val="Compact"/>
+                    <w:jc w:val="left"/>
+                    <w:jc w:val="center"/>
+                  </w:pPr>
+                  <w:r>
+                    <w:t xml:space="preserve">125.61</w:t>
+                  </w:r>
+                </w:p>
+              </w:tc>
+            </w:tr>
+            <w:tr>
+              <w:tc>
+                <w:tcPr/>
+                <w:p>
+                  <w:pPr>
+                    <w:pStyle w:val="Compact"/>
+                    <w:jc w:val="left"/>
+                    <w:jc w:val="center"/>
+                  </w:pPr>
+                  <w:r>
+                    <w:t xml:space="preserve">log(% FSM)</w:t>
+                  </w:r>
+                </w:p>
+              </w:tc>
+              <w:tc>
+                <w:tcPr/>
+                <w:p>
+                  <w:pPr>
+                    <w:pStyle w:val="Compact"/>
+                    <w:jc w:val="right"/>
+                    <w:jc w:val="center"/>
+                  </w:pPr>
+                  <w:r>
+                    <w:t xml:space="preserve">-0.201***</w:t>
+                  </w:r>
+                </w:p>
+              </w:tc>
+              <w:tc>
+                <w:tcPr/>
+                <w:p>
+                  <w:pPr>
+                    <w:pStyle w:val="Compact"/>
+                    <w:jc w:val="left"/>
+                    <w:jc w:val="center"/>
+                  </w:pPr>
+                  <w:r>
+                    <w:t xml:space="preserve">-88.94</w:t>
+                  </w:r>
+                </w:p>
+              </w:tc>
+              <w:tc>
+                <w:tcPr/>
+                <w:p>
+                  <w:pPr>
+                    <w:pStyle w:val="Compact"/>
+                    <w:jc w:val="right"/>
+                    <w:jc w:val="center"/>
+                  </w:pPr>
+                  <w:r>
+                    <w:t xml:space="preserve">-0.122***</w:t>
+                  </w:r>
+                </w:p>
+              </w:tc>
+              <w:tc>
+                <w:tcPr/>
+                <w:p>
+                  <w:pPr>
+                    <w:pStyle w:val="Compact"/>
+                    <w:jc w:val="left"/>
+                    <w:jc w:val="center"/>
+                  </w:pPr>
+                  <w:r>
+                    <w:t xml:space="preserve">-59.66</w:t>
+                  </w:r>
+                </w:p>
+              </w:tc>
+              <w:tc>
+                <w:tcPr/>
+                <w:p>
+                  <w:pPr>
+                    <w:pStyle w:val="Compact"/>
+                    <w:jc w:val="right"/>
+                    <w:jc w:val="center"/>
+                  </w:pPr>
+                  <w:r>
+                    <w:t xml:space="preserve">-0.073***</w:t>
+                  </w:r>
+                </w:p>
+              </w:tc>
+              <w:tc>
+                <w:tcPr/>
+                <w:p>
+                  <w:pPr>
+                    <w:pStyle w:val="Compact"/>
+                    <w:jc w:val="left"/>
+                    <w:jc w:val="center"/>
+                  </w:pPr>
+                  <w:r>
+                    <w:t xml:space="preserve">-33.46</w:t>
+                  </w:r>
+                </w:p>
+              </w:tc>
+              <w:tc>
+                <w:tcPr/>
+                <w:p>
+                  <w:pPr>
+                    <w:pStyle w:val="Compact"/>
+                    <w:jc w:val="right"/>
+                    <w:jc w:val="center"/>
+                  </w:pPr>
+                  <w:r>
+                    <w:t xml:space="preserve">-0.071***</w:t>
+                  </w:r>
+                </w:p>
+              </w:tc>
+              <w:tc>
+                <w:tcPr/>
+                <w:p>
+                  <w:pPr>
+                    <w:pStyle w:val="Compact"/>
+                    <w:jc w:val="left"/>
+                    <w:jc w:val="center"/>
+                  </w:pPr>
+                  <w:r>
+                    <w:t xml:space="preserve">-28.60</w:t>
+                  </w:r>
+                </w:p>
+              </w:tc>
+              <w:tc>
+                <w:tcPr/>
+                <w:p>
+                  <w:pPr>
+                    <w:pStyle w:val="Compact"/>
+                    <w:jc w:val="right"/>
+                    <w:jc w:val="center"/>
+                  </w:pPr>
+                  <w:r>
+                    <w:t xml:space="preserve">-0.067***</w:t>
+                  </w:r>
+                </w:p>
+              </w:tc>
+              <w:tc>
+                <w:tcPr/>
+                <w:p>
+                  <w:pPr>
+                    <w:pStyle w:val="Compact"/>
+                    <w:jc w:val="left"/>
+                    <w:jc w:val="center"/>
+                  </w:pPr>
+                  <w:r>
+                    <w:t xml:space="preserve">-24.90</w:t>
+                  </w:r>
+                </w:p>
+              </w:tc>
+            </w:tr>
+            <w:tr>
+              <w:tc>
+                <w:tcPr/>
+                <w:p>
+                  <w:pPr>
+                    <w:pStyle w:val="Compact"/>
+                    <w:jc w:val="left"/>
+                    <w:jc w:val="center"/>
+                  </w:pPr>
+                  <w:r>
+                    <w:t xml:space="preserve">log(% Absence)</w:t>
+                  </w:r>
+                </w:p>
+              </w:tc>
+              <w:tc>
+                <w:tcPr/>
+                <w:p>
+                  <w:pPr>
+                    <w:pStyle w:val="Compact"/>
+                  </w:pPr>
+                </w:p>
+              </w:tc>
+              <w:tc>
+                <w:tcPr/>
+                <w:p>
+                  <w:pPr>
+                    <w:pStyle w:val="Compact"/>
+                  </w:pPr>
+                </w:p>
+              </w:tc>
+              <w:tc>
+                <w:tcPr/>
+                <w:p>
+                  <w:pPr>
+                    <w:pStyle w:val="Compact"/>
+                    <w:jc w:val="right"/>
+                    <w:jc w:val="center"/>
+                  </w:pPr>
+                  <w:r>
+                    <w:t xml:space="preserve">-0.364***</w:t>
+                  </w:r>
+                </w:p>
+              </w:tc>
+              <w:tc>
+                <w:tcPr/>
+                <w:p>
+                  <w:pPr>
+                    <w:pStyle w:val="Compact"/>
+                    <w:jc w:val="left"/>
+                    <w:jc w:val="center"/>
+                  </w:pPr>
+                  <w:r>
+                    <w:t xml:space="preserve">-82.87</w:t>
+                  </w:r>
+                </w:p>
+              </w:tc>
+              <w:tc>
+                <w:tcPr/>
+                <w:p>
+                  <w:pPr>
+                    <w:pStyle w:val="Compact"/>
+                    <w:jc w:val="right"/>
+                    <w:jc w:val="center"/>
+                  </w:pPr>
+                  <w:r>
+                    <w:t xml:space="preserve">-0.287***</w:t>
+                  </w:r>
+                </w:p>
+              </w:tc>
+              <w:tc>
+                <w:tcPr/>
+                <w:p>
+                  <w:pPr>
+                    <w:pStyle w:val="Compact"/>
+                    <w:jc w:val="left"/>
+                    <w:jc w:val="center"/>
+                  </w:pPr>
+                  <w:r>
+                    <w:t xml:space="preserve">-65.28</w:t>
+                  </w:r>
+                </w:p>
+              </w:tc>
+              <w:tc>
+                <w:tcPr/>
+                <w:p>
+                  <w:pPr>
+                    <w:pStyle w:val="Compact"/>
+                    <w:jc w:val="right"/>
+                    <w:jc w:val="center"/>
+                  </w:pPr>
+                  <w:r>
+                    <w:t xml:space="preserve">-0.242***</w:t>
+                  </w:r>
+                </w:p>
+              </w:tc>
+              <w:tc>
+                <w:tcPr/>
+                <w:p>
+                  <w:pPr>
+                    <w:pStyle w:val="Compact"/>
+                    <w:jc w:val="left"/>
+                    <w:jc w:val="center"/>
+                  </w:pPr>
+                  <w:r>
+                    <w:t xml:space="preserve">-51.65</w:t>
+                  </w:r>
+                </w:p>
+              </w:tc>
+              <w:tc>
+                <w:tcPr/>
+                <w:p>
+                  <w:pPr>
+                    <w:pStyle w:val="Compact"/>
+                    <w:jc w:val="right"/>
+                    <w:jc w:val="center"/>
+                  </w:pPr>
+                  <w:r>
+                    <w:t xml:space="preserve">-0.213***</w:t>
+                  </w:r>
+                </w:p>
+              </w:tc>
+              <w:tc>
+                <w:tcPr/>
+                <w:p>
+                  <w:pPr>
+                    <w:pStyle w:val="Compact"/>
+                    <w:jc w:val="left"/>
+                    <w:jc w:val="center"/>
+                  </w:pPr>
+                  <w:r>
+                    <w:t xml:space="preserve">-46.03</w:t>
+                  </w:r>
+                </w:p>
+              </w:tc>
+            </w:tr>
+            <w:tr>
+              <w:tc>
+                <w:tcPr/>
+                <w:p>
+                  <w:pPr>
+                    <w:pStyle w:val="Compact"/>
+                    <w:jc w:val="left"/>
+                    <w:jc w:val="center"/>
+                  </w:pPr>
+                  <w:r>
+                    <w:t xml:space="preserve">log(% EAL)</w:t>
+                  </w:r>
+                </w:p>
+              </w:tc>
+              <w:tc>
+                <w:tcPr/>
+                <w:p>
+                  <w:pPr>
+                    <w:pStyle w:val="Compact"/>
+                  </w:pPr>
+                </w:p>
+              </w:tc>
+              <w:tc>
+                <w:tcPr/>
+                <w:p>
+                  <w:pPr>
+                    <w:pStyle w:val="Compact"/>
+                  </w:pPr>
+                </w:p>
+              </w:tc>
+              <w:tc>
+                <w:tcPr/>
+                <w:p>
+                  <w:pPr>
+                    <w:pStyle w:val="Compact"/>
+                  </w:pPr>
+                </w:p>
+              </w:tc>
+              <w:tc>
+                <w:tcPr/>
+                <w:p>
+                  <w:pPr>
+                    <w:pStyle w:val="Compact"/>
+                  </w:pPr>
+                </w:p>
+              </w:tc>
+              <w:tc>
+                <w:tcPr/>
+                <w:p>
+                  <w:pPr>
+                    <w:pStyle w:val="Compact"/>
+                  </w:pPr>
+                </w:p>
+              </w:tc>
+              <w:tc>
+                <w:tcPr/>
+                <w:p>
+                  <w:pPr>
+                    <w:pStyle w:val="Compact"/>
+                  </w:pPr>
+                </w:p>
+              </w:tc>
+              <w:tc>
+                <w:tcPr/>
+                <w:p>
+                  <w:pPr>
+                    <w:pStyle w:val="Compact"/>
+                    <w:jc w:val="right"/>
+                    <w:jc w:val="center"/>
+                  </w:pPr>
+                  <w:r>
+                    <w:t xml:space="preserve">0.014***</w:t>
+                  </w:r>
+                </w:p>
+              </w:tc>
+              <w:tc>
+                <w:tcPr/>
+                <w:p>
+                  <w:pPr>
+                    <w:pStyle w:val="Compact"/>
+                    <w:jc w:val="left"/>
+                    <w:jc w:val="center"/>
+                  </w:pPr>
+                  <w:r>
+                    <w:t xml:space="preserve">13.69</w:t>
+                  </w:r>
+                </w:p>
+              </w:tc>
+              <w:tc>
+                <w:tcPr/>
+                <w:p>
+                  <w:pPr>
+                    <w:pStyle w:val="Compact"/>
+                    <w:jc w:val="right"/>
+                    <w:jc w:val="center"/>
+                  </w:pPr>
+                  <w:r>
+                    <w:t xml:space="preserve">0.006***</w:t>
+                  </w:r>
+                </w:p>
+              </w:tc>
+              <w:tc>
+                <w:tcPr/>
+                <w:p>
+                  <w:pPr>
+                    <w:pStyle w:val="Compact"/>
+                    <w:jc w:val="left"/>
+                    <w:jc w:val="center"/>
+                  </w:pPr>
+                  <w:r>
+                    <w:t xml:space="preserve">4.92</w:t>
+                  </w:r>
+                </w:p>
+              </w:tc>
+            </w:tr>
+            <w:tr>
+              <w:tc>
+                <w:tcPr/>
+                <w:p>
+                  <w:pPr>
+                    <w:pStyle w:val="Compact"/>
+                    <w:jc w:val="left"/>
+                    <w:jc w:val="center"/>
+                  </w:pPr>
+                  <w:r>
+                    <w:t xml:space="preserve">% Low Prior Attainment</w:t>
+                  </w:r>
+                </w:p>
+              </w:tc>
+              <w:tc>
+                <w:tcPr/>
+                <w:p>
+                  <w:pPr>
+                    <w:pStyle w:val="Compact"/>
+                  </w:pPr>
+                </w:p>
+              </w:tc>
+              <w:tc>
+                <w:tcPr/>
+                <w:p>
+                  <w:pPr>
+                    <w:pStyle w:val="Compact"/>
+                  </w:pPr>
+                </w:p>
+              </w:tc>
+              <w:tc>
+                <w:tcPr/>
+                <w:p>
+                  <w:pPr>
+                    <w:pStyle w:val="Compact"/>
+                  </w:pPr>
+                </w:p>
+              </w:tc>
+              <w:tc>
+                <w:tcPr/>
+                <w:p>
+                  <w:pPr>
+                    <w:pStyle w:val="Compact"/>
+                  </w:pPr>
+                </w:p>
+              </w:tc>
+              <w:tc>
+                <w:tcPr/>
+                <w:p>
+                  <w:pPr>
+                    <w:pStyle w:val="Compact"/>
+                    <w:jc w:val="right"/>
+                    <w:jc w:val="center"/>
+                  </w:pPr>
+                  <w:r>
+                    <w:t xml:space="preserve">-0.006***</w:t>
+                  </w:r>
+                </w:p>
+              </w:tc>
+              <w:tc>
+                <w:tcPr/>
+                <w:p>
+                  <w:pPr>
+                    <w:pStyle w:val="Compact"/>
+                    <w:jc w:val="left"/>
+                    <w:jc w:val="center"/>
+                  </w:pPr>
+                  <w:r>
+                    <w:t xml:space="preserve">-45.75</w:t>
+                  </w:r>
+                </w:p>
+              </w:tc>
+              <w:tc>
+                <w:tcPr/>
+                <w:p>
+                  <w:pPr>
+                    <w:pStyle w:val="Compact"/>
+                    <w:jc w:val="right"/>
+                    <w:jc w:val="center"/>
+                  </w:pPr>
+                  <w:r>
+                    <w:t xml:space="preserve">-0.005***</w:t>
+                  </w:r>
+                </w:p>
+              </w:tc>
+              <w:tc>
+                <w:tcPr/>
+                <w:p>
+                  <w:pPr>
+                    <w:pStyle w:val="Compact"/>
+                    <w:jc w:val="left"/>
+                    <w:jc w:val="center"/>
+                  </w:pPr>
+                  <w:r>
+                    <w:t xml:space="preserve">-37.59</w:t>
+                  </w:r>
+                </w:p>
+              </w:tc>
+              <w:tc>
+                <w:tcPr/>
+                <w:p>
+                  <w:pPr>
+                    <w:pStyle w:val="Compact"/>
+                    <w:jc w:val="right"/>
+                    <w:jc w:val="center"/>
+                  </w:pPr>
+                  <w:r>
+                    <w:t xml:space="preserve">-0.006***</w:t>
+                  </w:r>
+                </w:p>
+              </w:tc>
+              <w:tc>
+                <w:tcPr/>
+                <w:p>
+                  <w:pPr>
+                    <w:pStyle w:val="Compact"/>
+                    <w:jc w:val="left"/>
+                    <w:jc w:val="center"/>
+                  </w:pPr>
+                  <w:r>
+                    <w:t xml:space="preserve">-41.35</w:t>
+                  </w:r>
+                </w:p>
+              </w:tc>
+            </w:tr>
+            <w:tr>
+              <w:tc>
+                <w:tcPr/>
+                <w:p>
+                  <w:pPr>
+                    <w:pStyle w:val="Compact"/>
+                    <w:jc w:val="left"/>
+                    <w:jc w:val="center"/>
+                  </w:pPr>
+                  <w:r>
+                    <w:t xml:space="preserve">Admissions: Other non-selective</w:t>
+                  </w:r>
+                </w:p>
+              </w:tc>
+              <w:tc>
+                <w:tcPr/>
+                <w:p>
+                  <w:pPr>
+                    <w:pStyle w:val="Compact"/>
+                  </w:pPr>
+                </w:p>
+              </w:tc>
+              <w:tc>
+                <w:tcPr/>
+                <w:p>
+                  <w:pPr>
+                    <w:pStyle w:val="Compact"/>
+                  </w:pPr>
+                </w:p>
+              </w:tc>
+              <w:tc>
+                <w:tcPr/>
+                <w:p>
+                  <w:pPr>
+                    <w:pStyle w:val="Compact"/>
+                  </w:pPr>
+                </w:p>
+              </w:tc>
+              <w:tc>
+                <w:tcPr/>
+                <w:p>
+                  <w:pPr>
+                    <w:pStyle w:val="Compact"/>
+                  </w:pPr>
+                </w:p>
+              </w:tc>
+              <w:tc>
+                <w:tcPr/>
+                <w:p>
+                  <w:pPr>
+                    <w:pStyle w:val="Compact"/>
+                  </w:pPr>
+                </w:p>
+              </w:tc>
+              <w:tc>
+                <w:tcPr/>
+                <w:p>
+                  <w:pPr>
+                    <w:pStyle w:val="Compact"/>
+                  </w:pPr>
+                </w:p>
+              </w:tc>
+              <w:tc>
+                <w:tcPr/>
+                <w:p>
+                  <w:pPr>
+                    <w:pStyle w:val="Compact"/>
+                    <w:jc w:val="right"/>
+                    <w:jc w:val="center"/>
+                  </w:pPr>
+                  <w:r>
+                    <w:t xml:space="preserve">0.051***</w:t>
+                  </w:r>
+                </w:p>
+              </w:tc>
+              <w:tc>
+                <w:tcPr/>
+                <w:p>
+                  <w:pPr>
+                    <w:pStyle w:val="Compact"/>
+                    <w:jc w:val="left"/>
+                    <w:jc w:val="center"/>
+                  </w:pPr>
+                  <w:r>
+                    <w:t xml:space="preserve">11.01</w:t>
+                  </w:r>
+                </w:p>
+              </w:tc>
+              <w:tc>
+                <w:tcPr/>
+                <w:p>
+                  <w:pPr>
+                    <w:pStyle w:val="Compact"/>
+                    <w:jc w:val="right"/>
+                    <w:jc w:val="center"/>
+                  </w:pPr>
+                  <w:r>
+                    <w:t xml:space="preserve">0.001</w:t>
+                  </w:r>
+                </w:p>
+              </w:tc>
+              <w:tc>
+                <w:tcPr/>
+                <w:p>
+                  <w:pPr>
+                    <w:pStyle w:val="Compact"/>
+                    <w:jc w:val="left"/>
+                    <w:jc w:val="center"/>
+                  </w:pPr>
+                  <w:r>
+                    <w:t xml:space="preserve">0.08</w:t>
+                  </w:r>
+                </w:p>
+              </w:tc>
+            </w:tr>
+            <w:tr>
+              <w:tc>
+                <w:tcPr/>
+                <w:p>
+                  <w:pPr>
+                    <w:pStyle w:val="Compact"/>
+                    <w:jc w:val="left"/>
+                    <w:jc w:val="center"/>
+                  </w:pPr>
+                  <w:r>
+                    <w:t xml:space="preserve">Admissions: Selective</w:t>
+                  </w:r>
+                </w:p>
+              </w:tc>
+              <w:tc>
+                <w:tcPr/>
+                <w:p>
+                  <w:pPr>
+                    <w:pStyle w:val="Compact"/>
+                  </w:pPr>
+                </w:p>
+              </w:tc>
+              <w:tc>
+                <w:tcPr/>
+                <w:p>
+                  <w:pPr>
+                    <w:pStyle w:val="Compact"/>
+                  </w:pPr>
+                </w:p>
+              </w:tc>
+              <w:tc>
+                <w:tcPr/>
+                <w:p>
+                  <w:pPr>
+                    <w:pStyle w:val="Compact"/>
+                  </w:pPr>
+                </w:p>
+              </w:tc>
+              <w:tc>
+                <w:tcPr/>
+                <w:p>
+                  <w:pPr>
+                    <w:pStyle w:val="Compact"/>
+                  </w:pPr>
+                </w:p>
+              </w:tc>
+              <w:tc>
+                <w:tcPr/>
+                <w:p>
+                  <w:pPr>
+                    <w:pStyle w:val="Compact"/>
+                  </w:pPr>
+                </w:p>
+              </w:tc>
+              <w:tc>
+                <w:tcPr/>
+                <w:p>
+                  <w:pPr>
+                    <w:pStyle w:val="Compact"/>
+                  </w:pPr>
+                </w:p>
+              </w:tc>
+              <w:tc>
+                <w:tcPr/>
+                <w:p>
+                  <w:pPr>
+                    <w:pStyle w:val="Compact"/>
+                    <w:jc w:val="right"/>
+                    <w:jc w:val="center"/>
+                  </w:pPr>
+                  <w:r>
+                    <w:t xml:space="preserve">0.140***</w:t>
+                  </w:r>
+                </w:p>
+              </w:tc>
+              <w:tc>
+                <w:tcPr/>
+                <w:p>
+                  <w:pPr>
+                    <w:pStyle w:val="Compact"/>
+                    <w:jc w:val="left"/>
+                    <w:jc w:val="center"/>
+                  </w:pPr>
+                  <w:r>
+                    <w:t xml:space="preserve">19.96</w:t>
+                  </w:r>
+                </w:p>
+              </w:tc>
+              <w:tc>
+                <w:tcPr/>
+                <w:p>
+                  <w:pPr>
+                    <w:pStyle w:val="Compact"/>
+                    <w:jc w:val="right"/>
+                    <w:jc w:val="center"/>
+                  </w:pPr>
+                  <w:r>
+                    <w:t xml:space="preserve">0.108***</w:t>
+                  </w:r>
+                </w:p>
+              </w:tc>
+              <w:tc>
+                <w:tcPr/>
+                <w:p>
+                  <w:pPr>
+                    <w:pStyle w:val="Compact"/>
+                    <w:jc w:val="left"/>
+                    <w:jc w:val="center"/>
+                  </w:pPr>
+                  <w:r>
+                    <w:t xml:space="preserve">16.20</w:t>
+                  </w:r>
+                </w:p>
+              </w:tc>
+            </w:tr>
+            <w:tr>
+              <w:tc>
+                <w:tcPr/>
+                <w:p>
+                  <w:pPr>
+                    <w:pStyle w:val="Compact"/>
+                    <w:jc w:val="left"/>
+                    <w:jc w:val="center"/>
+                  </w:pPr>
+                  <w:r>
+                    <w:t xml:space="preserve">Gorard Segregation</w:t>
+                  </w:r>
+                </w:p>
+              </w:tc>
+              <w:tc>
+                <w:tcPr/>
+                <w:p>
+                  <w:pPr>
+                    <w:pStyle w:val="Compact"/>
+                  </w:pPr>
+                </w:p>
+              </w:tc>
+              <w:tc>
+                <w:tcPr/>
+                <w:p>
+                  <w:pPr>
+                    <w:pStyle w:val="Compact"/>
+                  </w:pPr>
+                </w:p>
+              </w:tc>
+              <w:tc>
+                <w:tcPr/>
+                <w:p>
+                  <w:pPr>
+                    <w:pStyle w:val="Compact"/>
+                  </w:pPr>
+                </w:p>
+              </w:tc>
+              <w:tc>
+                <w:tcPr/>
+                <w:p>
+                  <w:pPr>
+                    <w:pStyle w:val="Compact"/>
+                  </w:pPr>
+                </w:p>
+              </w:tc>
+              <w:tc>
+                <w:tcPr/>
+                <w:p>
+                  <w:pPr>
+                    <w:pStyle w:val="Compact"/>
+                  </w:pPr>
+                </w:p>
+              </w:tc>
+              <w:tc>
+                <w:tcPr/>
+                <w:p>
+                  <w:pPr>
+                    <w:pStyle w:val="Compact"/>
+                  </w:pPr>
+                </w:p>
+              </w:tc>
+              <w:tc>
+                <w:tcPr/>
+                <w:p>
+                  <w:pPr>
+                    <w:pStyle w:val="Compact"/>
+                    <w:jc w:val="right"/>
+                    <w:jc w:val="center"/>
+                  </w:pPr>
+                  <w:r>
+                    <w:t xml:space="preserve">0.052</w:t>
+                  </w:r>
+                </w:p>
+              </w:tc>
+              <w:tc>
+                <w:tcPr/>
+                <w:p>
+                  <w:pPr>
+                    <w:pStyle w:val="Compact"/>
+                    <w:jc w:val="left"/>
+                    <w:jc w:val="center"/>
+                  </w:pPr>
+                  <w:r>
+                    <w:t xml:space="preserve">1.92</w:t>
+                  </w:r>
+                </w:p>
+              </w:tc>
+              <w:tc>
+                <w:tcPr/>
+                <w:p>
+                  <w:pPr>
+                    <w:pStyle w:val="Compact"/>
+                    <w:jc w:val="right"/>
+                    <w:jc w:val="center"/>
+                  </w:pPr>
+                  <w:r>
+                    <w:t xml:space="preserve">-0.033</w:t>
+                  </w:r>
+                </w:p>
+              </w:tc>
+              <w:tc>
+                <w:tcPr/>
+                <w:p>
+                  <w:pPr>
+                    <w:pStyle w:val="Compact"/>
+                    <w:jc w:val="left"/>
+                    <w:jc w:val="center"/>
+                  </w:pPr>
+                  <w:r>
+                    <w:t xml:space="preserve">-0.69</w:t>
+                  </w:r>
+                </w:p>
+              </w:tc>
+            </w:tr>
+            <w:tr>
+              <w:tc>
+                <w:tcPr/>
+                <w:p>
+                  <w:pPr>
+                    <w:pStyle w:val="Compact"/>
+                    <w:jc w:val="left"/>
+                    <w:jc w:val="center"/>
+                  </w:pPr>
+                  <w:r>
+                    <w:t xml:space="preserve">Teacher Retention</w:t>
+                  </w:r>
+                </w:p>
+              </w:tc>
+              <w:tc>
+                <w:tcPr/>
+                <w:p>
+                  <w:pPr>
+                    <w:pStyle w:val="Compact"/>
+                  </w:pPr>
+                </w:p>
+              </w:tc>
+              <w:tc>
+                <w:tcPr/>
+                <w:p>
+                  <w:pPr>
+                    <w:pStyle w:val="Compact"/>
+                  </w:pPr>
+                </w:p>
+              </w:tc>
+              <w:tc>
+                <w:tcPr/>
+                <w:p>
+                  <w:pPr>
+                    <w:pStyle w:val="Compact"/>
+                  </w:pPr>
+                </w:p>
+              </w:tc>
+              <w:tc>
+                <w:tcPr/>
+                <w:p>
+                  <w:pPr>
+                    <w:pStyle w:val="Compact"/>
+                  </w:pPr>
+                </w:p>
+              </w:tc>
+              <w:tc>
+                <w:tcPr/>
+                <w:p>
+                  <w:pPr>
+                    <w:pStyle w:val="Compact"/>
+                  </w:pPr>
+                </w:p>
+              </w:tc>
+              <w:tc>
+                <w:tcPr/>
+                <w:p>
+                  <w:pPr>
+                    <w:pStyle w:val="Compact"/>
+                  </w:pPr>
+                </w:p>
+              </w:tc>
+              <w:tc>
+                <w:tcPr/>
+                <w:p>
+                  <w:pPr>
+                    <w:pStyle w:val="Compact"/>
+                    <w:jc w:val="right"/>
+                    <w:jc w:val="center"/>
+                  </w:pPr>
+                  <w:r>
+                    <w:t xml:space="preserve">0.001***</w:t>
+                  </w:r>
+                </w:p>
+              </w:tc>
+              <w:tc>
+                <w:tcPr/>
+                <w:p>
+                  <w:pPr>
+                    <w:pStyle w:val="Compact"/>
+                    <w:jc w:val="left"/>
+                    <w:jc w:val="center"/>
+                  </w:pPr>
+                  <w:r>
+                    <w:t xml:space="preserve">12.92</w:t>
+                  </w:r>
+                </w:p>
+              </w:tc>
+              <w:tc>
+                <w:tcPr/>
+                <w:p>
+                  <w:pPr>
+                    <w:pStyle w:val="Compact"/>
+                    <w:jc w:val="right"/>
+                    <w:jc w:val="center"/>
+                  </w:pPr>
+                  <w:r>
+                    <w:t xml:space="preserve">0.000***</w:t>
+                  </w:r>
+                </w:p>
+              </w:tc>
+              <w:tc>
+                <w:tcPr/>
+                <w:p>
+                  <w:pPr>
+                    <w:pStyle w:val="Compact"/>
+                    <w:jc w:val="left"/>
+                    <w:jc w:val="center"/>
+                  </w:pPr>
+                  <w:r>
+                    <w:t xml:space="preserve">10.20</w:t>
+                  </w:r>
+                </w:p>
+              </w:tc>
+            </w:tr>
+            <w:tr>
+              <w:tc>
+                <w:tcPr/>
+                <w:p>
+                  <w:pPr>
+                    <w:pStyle w:val="Compact"/>
+                    <w:jc w:val="left"/>
+                    <w:jc w:val="center"/>
+                  </w:pPr>
+                  <w:r>
+                    <w:t xml:space="preserve">Leadership Pay %</w:t>
+                  </w:r>
+                </w:p>
+              </w:tc>
+              <w:tc>
+                <w:tcPr/>
+                <w:p>
+                  <w:pPr>
+                    <w:pStyle w:val="Compact"/>
+                  </w:pPr>
+                </w:p>
+              </w:tc>
+              <w:tc>
+                <w:tcPr/>
+                <w:p>
+                  <w:pPr>
+                    <w:pStyle w:val="Compact"/>
+                  </w:pPr>
+                </w:p>
+              </w:tc>
+              <w:tc>
+                <w:tcPr/>
+                <w:p>
+                  <w:pPr>
+                    <w:pStyle w:val="Compact"/>
+                  </w:pPr>
+                </w:p>
+              </w:tc>
+              <w:tc>
+                <w:tcPr/>
+                <w:p>
+                  <w:pPr>
+                    <w:pStyle w:val="Compact"/>
+                  </w:pPr>
+                </w:p>
+              </w:tc>
+              <w:tc>
+                <w:tcPr/>
+                <w:p>
+                  <w:pPr>
+                    <w:pStyle w:val="Compact"/>
+                  </w:pPr>
+                </w:p>
+              </w:tc>
+              <w:tc>
+                <w:tcPr/>
+                <w:p>
+                  <w:pPr>
+                    <w:pStyle w:val="Compact"/>
+                  </w:pPr>
+                </w:p>
+              </w:tc>
+              <w:tc>
+                <w:tcPr/>
+                <w:p>
+                  <w:pPr>
+                    <w:pStyle w:val="Compact"/>
+                    <w:jc w:val="right"/>
+                    <w:jc w:val="center"/>
+                  </w:pPr>
+                  <w:r>
+                    <w:t xml:space="preserve">-0.001***</w:t>
+                  </w:r>
+                </w:p>
+              </w:tc>
+              <w:tc>
+                <w:tcPr/>
+                <w:p>
+                  <w:pPr>
+                    <w:pStyle w:val="Compact"/>
+                    <w:jc w:val="left"/>
+                    <w:jc w:val="center"/>
+                  </w:pPr>
+                  <w:r>
+                    <w:t xml:space="preserve">-6.10</w:t>
+                  </w:r>
+                </w:p>
+              </w:tc>
+              <w:tc>
+                <w:tcPr/>
+                <w:p>
+                  <w:pPr>
+                    <w:pStyle w:val="Compact"/>
+                    <w:jc w:val="right"/>
+                    <w:jc w:val="center"/>
+                  </w:pPr>
+                  <w:r>
+                    <w:t xml:space="preserve">-0.001***</w:t>
+                  </w:r>
+                </w:p>
+              </w:tc>
+              <w:tc>
+                <w:tcPr/>
+                <w:p>
+                  <w:pPr>
+                    <w:pStyle w:val="Compact"/>
+                    <w:jc w:val="left"/>
+                    <w:jc w:val="center"/>
+                  </w:pPr>
+                  <w:r>
+                    <w:t xml:space="preserve">-5.39</w:t>
+                  </w:r>
+                </w:p>
+              </w:tc>
+            </w:tr>
+            <w:tr>
+              <w:tc>
+                <w:tcPr/>
+                <w:p>
+                  <w:pPr>
+                    <w:pStyle w:val="Compact"/>
+                    <w:jc w:val="left"/>
+                    <w:jc w:val="center"/>
+                  </w:pPr>
+                  <w:r>
+                    <w:t xml:space="preserve">log(Teacher Sickness)</w:t>
+                  </w:r>
+                </w:p>
+              </w:tc>
+              <w:tc>
+                <w:tcPr/>
+                <w:p>
+                  <w:pPr>
+                    <w:pStyle w:val="Compact"/>
+                  </w:pPr>
+                </w:p>
+              </w:tc>
+              <w:tc>
+                <w:tcPr/>
+                <w:p>
+                  <w:pPr>
+                    <w:pStyle w:val="Compact"/>
+                  </w:pPr>
+                </w:p>
+              </w:tc>
+              <w:tc>
+                <w:tcPr/>
+                <w:p>
+                  <w:pPr>
+                    <w:pStyle w:val="Compact"/>
+                  </w:pPr>
+                </w:p>
+              </w:tc>
+              <w:tc>
+                <w:tcPr/>
+                <w:p>
+                  <w:pPr>
+                    <w:pStyle w:val="Compact"/>
+                  </w:pPr>
+                </w:p>
+              </w:tc>
+              <w:tc>
+                <w:tcPr/>
+                <w:p>
+                  <w:pPr>
+                    <w:pStyle w:val="Compact"/>
+                  </w:pPr>
+                </w:p>
+              </w:tc>
+              <w:tc>
+                <w:tcPr/>
+                <w:p>
+                  <w:pPr>
+                    <w:pStyle w:val="Compact"/>
+                  </w:pPr>
+                </w:p>
+              </w:tc>
+              <w:tc>
+                <w:tcPr/>
+                <w:p>
+                  <w:pPr>
+                    <w:pStyle w:val="Compact"/>
+                    <w:jc w:val="right"/>
+                    <w:jc w:val="center"/>
+                  </w:pPr>
+                  <w:r>
+                    <w:t xml:space="preserve">-0.016***</w:t>
+                  </w:r>
+                </w:p>
+              </w:tc>
+              <w:tc>
+                <w:tcPr/>
+                <w:p>
+                  <w:pPr>
+                    <w:pStyle w:val="Compact"/>
+                    <w:jc w:val="left"/>
+                    <w:jc w:val="center"/>
+                  </w:pPr>
+                  <w:r>
+                    <w:t xml:space="preserve">-6.08</w:t>
+                  </w:r>
+                </w:p>
+              </w:tc>
+              <w:tc>
+                <w:tcPr/>
+                <w:p>
+                  <w:pPr>
+                    <w:pStyle w:val="Compact"/>
+                    <w:jc w:val="right"/>
+                    <w:jc w:val="center"/>
+                  </w:pPr>
+                  <w:r>
+                    <w:t xml:space="preserve">-0.015***</w:t>
+                  </w:r>
+                </w:p>
+              </w:tc>
+              <w:tc>
+                <w:tcPr/>
+                <w:p>
+                  <w:pPr>
+                    <w:pStyle w:val="Compact"/>
+                    <w:jc w:val="left"/>
+                    <w:jc w:val="center"/>
+                  </w:pPr>
+                  <w:r>
+                    <w:t xml:space="preserve">-6.17</w:t>
+                  </w:r>
+                </w:p>
+              </w:tc>
+            </w:tr>
+            <w:tr>
+              <w:tc>
+                <w:tcPr/>
+                <w:p>
+                  <w:pPr>
+                    <w:pStyle w:val="Compact"/>
+                    <w:jc w:val="left"/>
+                    <w:jc w:val="center"/>
+                  </w:pPr>
+                  <w:r>
+                    <w:t xml:space="preserve">Random effects</w:t>
+                  </w:r>
+                </w:p>
+              </w:tc>
+              <w:tc>
+                <w:tcPr/>
+                <w:p>
+                  <w:pPr>
+                    <w:pStyle w:val="Compact"/>
+                  </w:pPr>
+                </w:p>
+              </w:tc>
+              <w:tc>
+                <w:tcPr/>
+                <w:p>
+                  <w:pPr>
+                    <w:pStyle w:val="Compact"/>
+                  </w:pPr>
+                </w:p>
+              </w:tc>
+              <w:tc>
+                <w:tcPr/>
+                <w:p>
+                  <w:pPr>
+                    <w:pStyle w:val="Compact"/>
+                  </w:pPr>
+                </w:p>
+              </w:tc>
+              <w:tc>
+                <w:tcPr/>
+                <w:p>
+                  <w:pPr>
+                    <w:pStyle w:val="Compact"/>
+                  </w:pPr>
+                </w:p>
+              </w:tc>
+              <w:tc>
+                <w:tcPr/>
+                <w:p>
+                  <w:pPr>
+                    <w:pStyle w:val="Compact"/>
+                  </w:pPr>
+                </w:p>
+              </w:tc>
+              <w:tc>
+                <w:tcPr/>
+                <w:p>
+                  <w:pPr>
+                    <w:pStyle w:val="Compact"/>
+                  </w:pPr>
+                </w:p>
+              </w:tc>
+              <w:tc>
+                <w:tcPr/>
+                <w:p>
+                  <w:pPr>
+                    <w:pStyle w:val="Compact"/>
+                  </w:pPr>
+                </w:p>
+              </w:tc>
+              <w:tc>
+                <w:tcPr/>
+                <w:p>
+                  <w:pPr>
+                    <w:pStyle w:val="Compact"/>
+                  </w:pPr>
+                </w:p>
+              </w:tc>
+              <w:tc>
+                <w:tcPr/>
+                <w:p>
+                  <w:pPr>
+                    <w:pStyle w:val="Compact"/>
+                  </w:pPr>
+                </w:p>
+              </w:tc>
+              <w:tc>
+                <w:tcPr/>
+                <w:p>
+                  <w:pPr>
+                    <w:pStyle w:val="Compact"/>
+                  </w:pPr>
+                </w:p>
+              </w:tc>
+            </w:tr>
+            <w:tr>
+              <w:tc>
+                <w:tcPr/>
+                <w:p>
+                  <w:pPr>
+                    <w:pStyle w:val="Compact"/>
+                    <w:jc w:val="left"/>
+                    <w:jc w:val="center"/>
+                  </w:pPr>
+                  <w:r>
+                    <w:t xml:space="preserve">Year</w:t>
+                  </w:r>
+                </w:p>
+              </w:tc>
+              <w:tc>
+                <w:tcPr/>
+                <w:p>
+                  <w:pPr>
+                    <w:pStyle w:val="Compact"/>
+                  </w:pPr>
+                </w:p>
+              </w:tc>
+              <w:tc>
+                <w:tcPr/>
+                <w:p>
+                  <w:pPr>
+                    <w:pStyle w:val="Compact"/>
+                  </w:pPr>
+                </w:p>
+              </w:tc>
+              <w:tc>
+                <w:tcPr/>
+                <w:p>
+                  <w:pPr>
+                    <w:pStyle w:val="Compact"/>
+                  </w:pPr>
+                </w:p>
+              </w:tc>
+              <w:tc>
+                <w:tcPr/>
+                <w:p>
+                  <w:pPr>
+                    <w:pStyle w:val="Compact"/>
+                  </w:pPr>
+                </w:p>
+              </w:tc>
+              <w:tc>
+                <w:tcPr/>
+                <w:p>
+                  <w:pPr>
+                    <w:pStyle w:val="Compact"/>
+                  </w:pPr>
+                </w:p>
+              </w:tc>
+              <w:tc>
+                <w:tcPr/>
+                <w:p>
+                  <w:pPr>
+                    <w:pStyle w:val="Compact"/>
+                  </w:pPr>
+                </w:p>
+              </w:tc>
+              <w:tc>
+                <w:tcPr/>
+                <w:p>
+                  <w:pPr>
+                    <w:pStyle w:val="Compact"/>
+                  </w:pPr>
+                </w:p>
+              </w:tc>
+              <w:tc>
+                <w:tcPr/>
+                <w:p>
+                  <w:pPr>
+                    <w:pStyle w:val="Compact"/>
+                  </w:pPr>
+                </w:p>
+              </w:tc>
+              <w:tc>
+                <w:tcPr/>
+                <w:p>
+                  <w:pPr>
+                    <w:pStyle w:val="Compact"/>
+                    <w:jc w:val="right"/>
+                    <w:jc w:val="center"/>
+                  </w:pPr>
+                  <w:r>
+                    <w:t xml:space="preserve">0.030</w:t>
+                  </w:r>
+                </w:p>
+              </w:tc>
+              <w:tc>
+                <w:tcPr/>
+                <w:p>
+                  <w:pPr>
+                    <w:pStyle w:val="Compact"/>
+                    <w:jc w:val="left"/>
+                    <w:jc w:val="center"/>
+                  </w:pPr>
+                  <w:r>
+                    <w:t xml:space="preserve">(SD)</w:t>
+                  </w:r>
+                </w:p>
+              </w:tc>
+            </w:tr>
+            <w:tr>
+              <w:tc>
+                <w:tcPr/>
+                <w:p>
+                  <w:pPr>
+                    <w:pStyle w:val="Compact"/>
+                    <w:jc w:val="left"/>
+                    <w:jc w:val="center"/>
+                  </w:pPr>
+                  <w:r>
+                    <w:t xml:space="preserve">Ofsted rating</w:t>
+                  </w:r>
+                </w:p>
+              </w:tc>
+              <w:tc>
+                <w:tcPr/>
+                <w:p>
+                  <w:pPr>
+                    <w:pStyle w:val="Compact"/>
+                  </w:pPr>
+                </w:p>
+              </w:tc>
+              <w:tc>
+                <w:tcPr/>
+                <w:p>
+                  <w:pPr>
+                    <w:pStyle w:val="Compact"/>
+                  </w:pPr>
+                </w:p>
+              </w:tc>
+              <w:tc>
+                <w:tcPr/>
+                <w:p>
+                  <w:pPr>
+                    <w:pStyle w:val="Compact"/>
+                  </w:pPr>
+                </w:p>
+              </w:tc>
+              <w:tc>
+                <w:tcPr/>
+                <w:p>
+                  <w:pPr>
+                    <w:pStyle w:val="Compact"/>
+                  </w:pPr>
+                </w:p>
+              </w:tc>
+              <w:tc>
+                <w:tcPr/>
+                <w:p>
+                  <w:pPr>
+                    <w:pStyle w:val="Compact"/>
+                  </w:pPr>
+                </w:p>
+              </w:tc>
+              <w:tc>
+                <w:tcPr/>
+                <w:p>
+                  <w:pPr>
+                    <w:pStyle w:val="Compact"/>
+                  </w:pPr>
+                </w:p>
+              </w:tc>
+              <w:tc>
+                <w:tcPr/>
+                <w:p>
+                  <w:pPr>
+                    <w:pStyle w:val="Compact"/>
+                  </w:pPr>
+                </w:p>
+              </w:tc>
+              <w:tc>
+                <w:tcPr/>
+                <w:p>
+                  <w:pPr>
+                    <w:pStyle w:val="Compact"/>
+                  </w:pPr>
+                </w:p>
+              </w:tc>
+              <w:tc>
+                <w:tcPr/>
+                <w:p>
+                  <w:pPr>
+                    <w:pStyle w:val="Compact"/>
+                    <w:jc w:val="right"/>
+                    <w:jc w:val="center"/>
+                  </w:pPr>
+                  <w:r>
+                    <w:t xml:space="preserve">0.017</w:t>
+                  </w:r>
+                </w:p>
+              </w:tc>
+              <w:tc>
+                <w:tcPr/>
+                <w:p>
+                  <w:pPr>
+                    <w:pStyle w:val="Compact"/>
+                    <w:jc w:val="left"/>
+                    <w:jc w:val="center"/>
+                  </w:pPr>
+                  <w:r>
+                    <w:t xml:space="preserve">(SD)</w:t>
+                  </w:r>
+                </w:p>
+              </w:tc>
+            </w:tr>
+            <w:tr>
+              <w:tc>
+                <w:tcPr/>
+                <w:p>
+                  <w:pPr>
+                    <w:pStyle w:val="Compact"/>
+                    <w:jc w:val="left"/>
+                    <w:jc w:val="center"/>
+                  </w:pPr>
+                  <w:r>
+                    <w:t xml:space="preserve">Region</w:t>
+                  </w:r>
+                </w:p>
+              </w:tc>
+              <w:tc>
+                <w:tcPr/>
+                <w:p>
+                  <w:pPr>
+                    <w:pStyle w:val="Compact"/>
+                  </w:pPr>
+                </w:p>
+              </w:tc>
+              <w:tc>
+                <w:tcPr/>
+                <w:p>
+                  <w:pPr>
+                    <w:pStyle w:val="Compact"/>
+                  </w:pPr>
+                </w:p>
+              </w:tc>
+              <w:tc>
+                <w:tcPr/>
+                <w:p>
+                  <w:pPr>
+                    <w:pStyle w:val="Compact"/>
+                  </w:pPr>
+                </w:p>
+              </w:tc>
+              <w:tc>
+                <w:tcPr/>
+                <w:p>
+                  <w:pPr>
+                    <w:pStyle w:val="Compact"/>
+                  </w:pPr>
+                </w:p>
+              </w:tc>
+              <w:tc>
+                <w:tcPr/>
+                <w:p>
+                  <w:pPr>
+                    <w:pStyle w:val="Compact"/>
+                  </w:pPr>
+                </w:p>
+              </w:tc>
+              <w:tc>
+                <w:tcPr/>
+                <w:p>
+                  <w:pPr>
+                    <w:pStyle w:val="Compact"/>
+                  </w:pPr>
+                </w:p>
+              </w:tc>
+              <w:tc>
+                <w:tcPr/>
+                <w:p>
+                  <w:pPr>
+                    <w:pStyle w:val="Compact"/>
+                  </w:pPr>
+                </w:p>
+              </w:tc>
+              <w:tc>
+                <w:tcPr/>
+                <w:p>
+                  <w:pPr>
+                    <w:pStyle w:val="Compact"/>
+                  </w:pPr>
+                </w:p>
+              </w:tc>
+              <w:tc>
+                <w:tcPr/>
+                <w:p>
+                  <w:pPr>
+                    <w:pStyle w:val="Compact"/>
+                    <w:jc w:val="right"/>
+                    <w:jc w:val="center"/>
+                  </w:pPr>
+                  <w:r>
+                    <w:t xml:space="preserve">0.047</w:t>
+                  </w:r>
+                </w:p>
+              </w:tc>
+              <w:tc>
+                <w:tcPr/>
+                <w:p>
+                  <w:pPr>
+                    <w:pStyle w:val="Compact"/>
+                    <w:jc w:val="left"/>
+                    <w:jc w:val="center"/>
+                  </w:pPr>
+                  <w:r>
+                    <w:t xml:space="preserve">(SD)</w:t>
+                  </w:r>
+                </w:p>
+              </w:tc>
+            </w:tr>
+            <w:tr>
+              <w:tc>
+                <w:tcPr/>
+                <w:p>
+                  <w:pPr>
+                    <w:pStyle w:val="Compact"/>
+                    <w:jc w:val="left"/>
+                    <w:jc w:val="center"/>
+                  </w:pPr>
+                  <w:r>
+                    <w:t xml:space="preserve">LA (nested in region)</w:t>
+                  </w:r>
+                </w:p>
+              </w:tc>
+              <w:tc>
+                <w:tcPr/>
+                <w:p>
+                  <w:pPr>
+                    <w:pStyle w:val="Compact"/>
+                  </w:pPr>
+                </w:p>
+              </w:tc>
+              <w:tc>
+                <w:tcPr/>
+                <w:p>
+                  <w:pPr>
+                    <w:pStyle w:val="Compact"/>
+                  </w:pPr>
+                </w:p>
+              </w:tc>
+              <w:tc>
+                <w:tcPr/>
+                <w:p>
+                  <w:pPr>
+                    <w:pStyle w:val="Compact"/>
+                  </w:pPr>
+                </w:p>
+              </w:tc>
+              <w:tc>
+                <w:tcPr/>
+                <w:p>
+                  <w:pPr>
+                    <w:pStyle w:val="Compact"/>
+                  </w:pPr>
+                </w:p>
+              </w:tc>
+              <w:tc>
+                <w:tcPr/>
+                <w:p>
+                  <w:pPr>
+                    <w:pStyle w:val="Compact"/>
+                  </w:pPr>
+                </w:p>
+              </w:tc>
+              <w:tc>
+                <w:tcPr/>
+                <w:p>
+                  <w:pPr>
+                    <w:pStyle w:val="Compact"/>
+                  </w:pPr>
+                </w:p>
+              </w:tc>
+              <w:tc>
+                <w:tcPr/>
+                <w:p>
+                  <w:pPr>
+                    <w:pStyle w:val="Compact"/>
+                  </w:pPr>
+                </w:p>
+              </w:tc>
+              <w:tc>
+                <w:tcPr/>
+                <w:p>
+                  <w:pPr>
+                    <w:pStyle w:val="Compact"/>
+                  </w:pPr>
+                </w:p>
+              </w:tc>
+              <w:tc>
+                <w:tcPr/>
+                <w:p>
+                  <w:pPr>
+                    <w:pStyle w:val="Compact"/>
+                    <w:jc w:val="right"/>
+                    <w:jc w:val="center"/>
+                  </w:pPr>
+                  <w:r>
+                    <w:t xml:space="preserve">0.044</w:t>
+                  </w:r>
+                </w:p>
+              </w:tc>
+              <w:tc>
+                <w:tcPr/>
+                <w:p>
+                  <w:pPr>
+                    <w:pStyle w:val="Compact"/>
+                    <w:jc w:val="left"/>
+                    <w:jc w:val="center"/>
+                  </w:pPr>
+                  <w:r>
+                    <w:t xml:space="preserve">(SD)</w:t>
+                  </w:r>
+                </w:p>
+              </w:tc>
+            </w:tr>
+            <w:tr>
+              <w:tc>
+                <w:tcPr/>
+                <w:p>
+                  <w:pPr>
+                    <w:pStyle w:val="Compact"/>
+                    <w:jc w:val="left"/>
+                    <w:jc w:val="center"/>
+                  </w:pPr>
+                  <w:r>
+                    <w:t xml:space="preserve">Residual</w:t>
+                  </w:r>
+                </w:p>
+              </w:tc>
+              <w:tc>
+                <w:tcPr/>
+                <w:p>
+                  <w:pPr>
+                    <w:pStyle w:val="Compact"/>
+                  </w:pPr>
+                </w:p>
+              </w:tc>
+              <w:tc>
+                <w:tcPr/>
+                <w:p>
+                  <w:pPr>
+                    <w:pStyle w:val="Compact"/>
+                  </w:pPr>
+                </w:p>
+              </w:tc>
+              <w:tc>
+                <w:tcPr/>
+                <w:p>
+                  <w:pPr>
+                    <w:pStyle w:val="Compact"/>
+                  </w:pPr>
+                </w:p>
+              </w:tc>
+              <w:tc>
+                <w:tcPr/>
+                <w:p>
+                  <w:pPr>
+                    <w:pStyle w:val="Compact"/>
+                  </w:pPr>
+                </w:p>
+              </w:tc>
+              <w:tc>
+                <w:tcPr/>
+                <w:p>
+                  <w:pPr>
+                    <w:pStyle w:val="Compact"/>
+                  </w:pPr>
+                </w:p>
+              </w:tc>
+              <w:tc>
+                <w:tcPr/>
+                <w:p>
+                  <w:pPr>
+                    <w:pStyle w:val="Compact"/>
+                  </w:pPr>
+                </w:p>
+              </w:tc>
+              <w:tc>
+                <w:tcPr/>
+                <w:p>
+                  <w:pPr>
+                    <w:pStyle w:val="Compact"/>
+                  </w:pPr>
+                </w:p>
+              </w:tc>
+              <w:tc>
+                <w:tcPr/>
+                <w:p>
+                  <w:pPr>
+                    <w:pStyle w:val="Compact"/>
+                  </w:pPr>
+                </w:p>
+              </w:tc>
+              <w:tc>
+                <w:tcPr/>
+                <w:p>
+                  <w:pPr>
+                    <w:pStyle w:val="Compact"/>
+                    <w:jc w:val="right"/>
+                    <w:jc w:val="center"/>
+                  </w:pPr>
+                  <w:r>
+                    <w:t xml:space="preserve">0.094</w:t>
+                  </w:r>
+                </w:p>
+              </w:tc>
+              <w:tc>
+                <w:tcPr/>
+                <w:p>
+                  <w:pPr>
+                    <w:pStyle w:val="Compact"/>
+                    <w:jc w:val="left"/>
+                    <w:jc w:val="center"/>
+                  </w:pPr>
+                  <w:r>
+                    <w:t xml:space="preserve">(SD)</w:t>
+                  </w:r>
+                </w:p>
+              </w:tc>
+            </w:tr>
+            <w:tr>
+              <w:tc>
+                <w:tcPr/>
+                <w:p>
+                  <w:pPr>
+                    <w:pStyle w:val="Compact"/>
+                  </w:pPr>
+                </w:p>
+              </w:tc>
+              <w:tc>
+                <w:tcPr/>
+                <w:p>
+                  <w:pPr>
+                    <w:pStyle w:val="Compact"/>
+                  </w:pPr>
+                </w:p>
+              </w:tc>
+              <w:tc>
+                <w:tcPr/>
+                <w:p>
+                  <w:pPr>
+                    <w:pStyle w:val="Compact"/>
+                  </w:pPr>
+                </w:p>
+              </w:tc>
+              <w:tc>
+                <w:tcPr/>
+                <w:p>
+                  <w:pPr>
+                    <w:pStyle w:val="Compact"/>
+                  </w:pPr>
+                </w:p>
+              </w:tc>
+              <w:tc>
+                <w:tcPr/>
+                <w:p>
+                  <w:pPr>
+                    <w:pStyle w:val="Compact"/>
+                  </w:pPr>
+                </w:p>
+              </w:tc>
+              <w:tc>
+                <w:tcPr/>
+                <w:p>
+                  <w:pPr>
+                    <w:pStyle w:val="Compact"/>
+                  </w:pPr>
+                </w:p>
+              </w:tc>
+              <w:tc>
+                <w:tcPr/>
+                <w:p>
+                  <w:pPr>
+                    <w:pStyle w:val="Compact"/>
+                  </w:pPr>
+                </w:p>
+              </w:tc>
+              <w:tc>
+                <w:tcPr/>
+                <w:p>
+                  <w:pPr>
+                    <w:pStyle w:val="Compact"/>
+                  </w:pPr>
+                </w:p>
+              </w:tc>
+              <w:tc>
+                <w:tcPr/>
+                <w:p>
+                  <w:pPr>
+                    <w:pStyle w:val="Compact"/>
+                  </w:pPr>
+                </w:p>
+              </w:tc>
+              <w:tc>
+                <w:tcPr/>
+                <w:p>
+                  <w:pPr>
+                    <w:pStyle w:val="Compact"/>
+                  </w:pPr>
+                </w:p>
+              </w:tc>
+              <w:tc>
+                <w:tcPr/>
+                <w:p>
+                  <w:pPr>
+                    <w:pStyle w:val="Compact"/>
+                  </w:pPr>
+                </w:p>
+              </w:tc>
+            </w:tr>
+            <w:tr>
+              <w:tc>
+                <w:tcPr/>
+                <w:p>
+                  <w:pPr>
+                    <w:pStyle w:val="Compact"/>
+                    <w:jc w:val="left"/>
+                    <w:jc w:val="center"/>
+                  </w:pPr>
+                  <w:r>
+                    <w:t xml:space="preserve">R²</w:t>
+                  </w:r>
+                </w:p>
+              </w:tc>
+              <w:tc>
+                <w:tcPr/>
+                <w:p>
+                  <w:pPr>
+                    <w:pStyle w:val="Compact"/>
+                    <w:jc w:val="right"/>
+                    <w:jc w:val="center"/>
+                  </w:pPr>
+                  <w:r>
+                    <w:t xml:space="preserve">0.393</w:t>
+                  </w:r>
+                </w:p>
+              </w:tc>
+              <w:tc>
+                <w:tcPr/>
+                <w:p>
+                  <w:pPr>
+                    <w:pStyle w:val="Compact"/>
+                  </w:pPr>
+                </w:p>
+              </w:tc>
+              <w:tc>
+                <w:tcPr/>
+                <w:p>
+                  <w:pPr>
+                    <w:pStyle w:val="Compact"/>
+                    <w:jc w:val="right"/>
+                    <w:jc w:val="center"/>
+                  </w:pPr>
+                  <w:r>
+                    <w:t xml:space="preserve">0.612</w:t>
+                  </w:r>
+                </w:p>
+              </w:tc>
+              <w:tc>
+                <w:tcPr/>
+                <w:p>
+                  <w:pPr>
+                    <w:pStyle w:val="Compact"/>
+                  </w:pPr>
+                </w:p>
+              </w:tc>
+              <w:tc>
+                <w:tcPr/>
+                <w:p>
+                  <w:pPr>
+                    <w:pStyle w:val="Compact"/>
+                    <w:jc w:val="right"/>
+                    <w:jc w:val="center"/>
+                  </w:pPr>
+                  <w:r>
+                    <w:t xml:space="preserve">0.669</w:t>
+                  </w:r>
+                </w:p>
+              </w:tc>
+              <w:tc>
+                <w:tcPr/>
+                <w:p>
+                  <w:pPr>
+                    <w:pStyle w:val="Compact"/>
+                  </w:pPr>
+                </w:p>
+              </w:tc>
+              <w:tc>
+                <w:tcPr/>
+                <w:p>
+                  <w:pPr>
+                    <w:pStyle w:val="Compact"/>
+                    <w:jc w:val="right"/>
+                    <w:jc w:val="center"/>
+                  </w:pPr>
+                  <w:r>
+                    <w:t xml:space="preserve">0.693</w:t>
+                  </w:r>
+                </w:p>
+              </w:tc>
+              <w:tc>
+                <w:tcPr/>
+                <w:p>
+                  <w:pPr>
+                    <w:pStyle w:val="Compact"/>
+                  </w:pPr>
+                </w:p>
+              </w:tc>
+              <w:tc>
+                <w:tcPr/>
+                <w:p>
+                  <w:pPr>
+                    <w:pStyle w:val="Compact"/>
+                    <w:jc w:val="right"/>
+                    <w:jc w:val="center"/>
+                  </w:pPr>
+                  <w:r>
+                    <w:t xml:space="preserve">0.632</w:t>
+                  </w:r>
+                </w:p>
+              </w:tc>
+              <w:tc>
+                <w:tcPr/>
+                <w:p>
+                  <w:pPr>
+                    <w:pStyle w:val="Compact"/>
+                    <w:jc w:val="left"/>
+                    <w:jc w:val="center"/>
+                  </w:pPr>
+                  <w:r>
+                    <w:t xml:space="preserve">(marginal)</w:t>
+                  </w:r>
+                </w:p>
+              </w:tc>
+            </w:tr>
+            <w:tr>
+              <w:tc>
+                <w:tcPr/>
+                <w:p>
+                  <w:pPr>
+                    <w:pStyle w:val="Compact"/>
+                    <w:jc w:val="left"/>
+                    <w:jc w:val="center"/>
+                  </w:pPr>
+                  <w:r>
+                    <w:t xml:space="preserve">R² (conditional)</w:t>
+                  </w:r>
+                </w:p>
+              </w:tc>
+              <w:tc>
+                <w:tcPr/>
+                <w:p>
+                  <w:pPr>
+                    <w:pStyle w:val="Compact"/>
+                  </w:pPr>
+                </w:p>
+              </w:tc>
+              <w:tc>
+                <w:tcPr/>
+                <w:p>
+                  <w:pPr>
+                    <w:pStyle w:val="Compact"/>
+                  </w:pPr>
+                </w:p>
+              </w:tc>
+              <w:tc>
+                <w:tcPr/>
+                <w:p>
+                  <w:pPr>
+                    <w:pStyle w:val="Compact"/>
+                  </w:pPr>
+                </w:p>
+              </w:tc>
+              <w:tc>
+                <w:tcPr/>
+                <w:p>
+                  <w:pPr>
+                    <w:pStyle w:val="Compact"/>
+                  </w:pPr>
+                </w:p>
+              </w:tc>
+              <w:tc>
+                <w:tcPr/>
+                <w:p>
+                  <w:pPr>
+                    <w:pStyle w:val="Compact"/>
+                  </w:pPr>
+                </w:p>
+              </w:tc>
+              <w:tc>
+                <w:tcPr/>
+                <w:p>
+                  <w:pPr>
+                    <w:pStyle w:val="Compact"/>
+                  </w:pPr>
+                </w:p>
+              </w:tc>
+              <w:tc>
+                <w:tcPr/>
+                <w:p>
+                  <w:pPr>
+                    <w:pStyle w:val="Compact"/>
+                  </w:pPr>
+                </w:p>
+              </w:tc>
+              <w:tc>
+                <w:tcPr/>
+                <w:p>
+                  <w:pPr>
+                    <w:pStyle w:val="Compact"/>
+                  </w:pPr>
+                </w:p>
+              </w:tc>
+              <w:tc>
+                <w:tcPr/>
+                <w:p>
+                  <w:pPr>
+                    <w:pStyle w:val="Compact"/>
+                    <w:jc w:val="right"/>
+                    <w:jc w:val="center"/>
+                  </w:pPr>
+                  <w:r>
+                    <w:t xml:space="preserve">0.771</w:t>
+                  </w:r>
+                </w:p>
+              </w:tc>
+              <w:tc>
+                <w:tcPr/>
+                <w:p>
+                  <w:pPr>
+                    <w:pStyle w:val="Compact"/>
+                    <w:jc w:val="left"/>
+                    <w:jc w:val="center"/>
+                  </w:pPr>
+                  <w:r>
+                    <w:t xml:space="preserve">(fixed + random)</w:t>
+                  </w:r>
+                </w:p>
+              </w:tc>
+            </w:tr>
+            <w:tr>
+              <w:tc>
+                <w:tcPr/>
+                <w:p>
+                  <w:pPr>
+                    <w:pStyle w:val="Compact"/>
+                    <w:jc w:val="left"/>
+                    <w:jc w:val="center"/>
+                  </w:pPr>
+                  <w:r>
+                    <w:t xml:space="preserve">N</w:t>
+                  </w:r>
+                </w:p>
+              </w:tc>
+              <w:tc>
+                <w:tcPr/>
+                <w:p>
+                  <w:pPr>
+                    <w:pStyle w:val="Compact"/>
+                    <w:jc w:val="right"/>
+                    <w:jc w:val="center"/>
+                  </w:pPr>
+                  <w:r>
+                    <w:t xml:space="preserve">12,210</w:t>
+                  </w:r>
+                </w:p>
+              </w:tc>
+              <w:tc>
+                <w:tcPr/>
+                <w:p>
+                  <w:pPr>
+                    <w:pStyle w:val="Compact"/>
+                  </w:pPr>
+                </w:p>
+              </w:tc>
+              <w:tc>
+                <w:tcPr/>
+                <w:p>
+                  <w:pPr>
+                    <w:pStyle w:val="Compact"/>
+                    <w:jc w:val="right"/>
+                    <w:jc w:val="center"/>
+                  </w:pPr>
+                  <w:r>
+                    <w:t xml:space="preserve">12,210</w:t>
+                  </w:r>
+                </w:p>
+              </w:tc>
+              <w:tc>
+                <w:tcPr/>
+                <w:p>
+                  <w:pPr>
+                    <w:pStyle w:val="Compact"/>
+                  </w:pPr>
+                </w:p>
+              </w:tc>
+              <w:tc>
+                <w:tcPr/>
+                <w:p>
+                  <w:pPr>
+                    <w:pStyle w:val="Compact"/>
+                    <w:jc w:val="right"/>
+                    <w:jc w:val="center"/>
+                  </w:pPr>
+                  <w:r>
+                    <w:t xml:space="preserve">12,210</w:t>
+                  </w:r>
+                </w:p>
+              </w:tc>
+              <w:tc>
+                <w:tcPr/>
+                <w:p>
+                  <w:pPr>
+                    <w:pStyle w:val="Compact"/>
+                  </w:pPr>
+                </w:p>
+              </w:tc>
+              <w:tc>
+                <w:tcPr/>
+                <w:p>
+                  <w:pPr>
+                    <w:pStyle w:val="Compact"/>
+                    <w:jc w:val="right"/>
+                    <w:jc w:val="center"/>
+                  </w:pPr>
+                  <w:r>
+                    <w:t xml:space="preserve">12,210</w:t>
+                  </w:r>
+                </w:p>
+              </w:tc>
+              <w:tc>
+                <w:tcPr/>
+                <w:p>
+                  <w:pPr>
+                    <w:pStyle w:val="Compact"/>
+                  </w:pPr>
+                </w:p>
+              </w:tc>
+              <w:tc>
+                <w:tcPr/>
+                <w:p>
+                  <w:pPr>
+                    <w:pStyle w:val="Compact"/>
+                    <w:jc w:val="right"/>
+                    <w:jc w:val="center"/>
+                  </w:pPr>
+                  <w:r>
+                    <w:t xml:space="preserve">12,210</w:t>
+                  </w:r>
+                </w:p>
+              </w:tc>
+              <w:tc>
+                <w:tcPr/>
+                <w:p>
+                  <w:pPr>
+                    <w:pStyle w:val="Compact"/>
+                  </w:pPr>
+                </w:p>
+              </w:tc>
+            </w:tr>
+          </w:tbl>
           <w:bookmarkEnd w:id="35"/>
+          <w:p/>
         </w:tc>
       </w:tr>
     </w:tbl>
@@ -2352,7 +4937,1981 @@
               <w:t xml:space="preserve">Table 2: Value-added rankings for Brighton and Hove schools (panel model residuals by year, in Attainment 8 points).</w:t>
             </w:r>
           </w:p>
+          <w:tbl>
+            <w:tblPr>
+              <w:tblStyle w:val="Table"/>
+              <w:tblW w:type="pct" w:w="5000"/>
+              <w:tblLayout w:type="fixed"/>
+              <w:tblLook w:firstRow="1" w:lastRow="0" w:firstColumn="0" w:lastColumn="0" w:noHBand="0" w:noVBand="0" w:val="0020"/>
+            </w:tblPr>
+            <w:tblGrid>
+              <w:gridCol w:w="488"/>
+              <w:gridCol w:w="3813"/>
+              <w:gridCol w:w="782"/>
+              <w:gridCol w:w="782"/>
+              <w:gridCol w:w="782"/>
+              <w:gridCol w:w="782"/>
+              <w:gridCol w:w="488"/>
+            </w:tblGrid>
+            <w:tr>
+              <w:trPr>
+                <w:tblHeader w:val="on"/>
+              </w:trPr>
+              <w:tc>
+                <w:tcPr/>
+                <w:p>
+                  <w:pPr>
+                    <w:pStyle w:val="Compact"/>
+                    <w:jc w:val="right"/>
+                    <w:jc w:val="center"/>
+                  </w:pPr>
+                  <w:r>
+                    <w:t xml:space="preserve">Rank</w:t>
+                  </w:r>
+                </w:p>
+              </w:tc>
+              <w:tc>
+                <w:tcPr/>
+                <w:p>
+                  <w:pPr>
+                    <w:pStyle w:val="Compact"/>
+                    <w:jc w:val="left"/>
+                    <w:jc w:val="center"/>
+                  </w:pPr>
+                  <w:r>
+                    <w:t xml:space="preserve">School</w:t>
+                  </w:r>
+                </w:p>
+              </w:tc>
+              <w:tc>
+                <w:tcPr/>
+                <w:p>
+                  <w:pPr>
+                    <w:pStyle w:val="Compact"/>
+                    <w:jc w:val="right"/>
+                    <w:jc w:val="center"/>
+                  </w:pPr>
+                  <w:r>
+                    <w:t xml:space="preserve">2021-22</w:t>
+                  </w:r>
+                </w:p>
+              </w:tc>
+              <w:tc>
+                <w:tcPr/>
+                <w:p>
+                  <w:pPr>
+                    <w:pStyle w:val="Compact"/>
+                    <w:jc w:val="right"/>
+                    <w:jc w:val="center"/>
+                  </w:pPr>
+                  <w:r>
+                    <w:t xml:space="preserve">2022-23</w:t>
+                  </w:r>
+                </w:p>
+              </w:tc>
+              <w:tc>
+                <w:tcPr/>
+                <w:p>
+                  <w:pPr>
+                    <w:pStyle w:val="Compact"/>
+                    <w:jc w:val="right"/>
+                    <w:jc w:val="center"/>
+                  </w:pPr>
+                  <w:r>
+                    <w:t xml:space="preserve">2023-24</w:t>
+                  </w:r>
+                </w:p>
+              </w:tc>
+              <w:tc>
+                <w:tcPr/>
+                <w:p>
+                  <w:pPr>
+                    <w:pStyle w:val="Compact"/>
+                    <w:jc w:val="right"/>
+                    <w:jc w:val="center"/>
+                  </w:pPr>
+                  <w:r>
+                    <w:t xml:space="preserve">2024-25</w:t>
+                  </w:r>
+                </w:p>
+              </w:tc>
+              <w:tc>
+                <w:tcPr/>
+                <w:p>
+                  <w:pPr>
+                    <w:pStyle w:val="Compact"/>
+                    <w:jc w:val="right"/>
+                    <w:jc w:val="center"/>
+                  </w:pPr>
+                  <w:r>
+                    <w:t xml:space="preserve">Mean</w:t>
+                  </w:r>
+                </w:p>
+              </w:tc>
+            </w:tr>
+            <w:tr>
+              <w:tc>
+                <w:tcPr/>
+                <w:p>
+                  <w:pPr>
+                    <w:pStyle w:val="Compact"/>
+                    <w:jc w:val="right"/>
+                    <w:jc w:val="center"/>
+                  </w:pPr>
+                  <w:r>
+                    <w:t xml:space="preserve">1</w:t>
+                  </w:r>
+                </w:p>
+              </w:tc>
+              <w:tc>
+                <w:tcPr/>
+                <w:p>
+                  <w:pPr>
+                    <w:pStyle w:val="Compact"/>
+                    <w:jc w:val="left"/>
+                    <w:jc w:val="center"/>
+                  </w:pPr>
+                  <w:r>
+                    <w:t xml:space="preserve">Dorothy Stringer School</w:t>
+                  </w:r>
+                </w:p>
+              </w:tc>
+              <w:tc>
+                <w:tcPr/>
+                <w:p>
+                  <w:pPr>
+                    <w:pStyle w:val="Compact"/>
+                    <w:jc w:val="right"/>
+                    <w:jc w:val="center"/>
+                  </w:pPr>
+                  <w:r>
+                    <w:t xml:space="preserve">+3.5</w:t>
+                  </w:r>
+                </w:p>
+              </w:tc>
+              <w:tc>
+                <w:tcPr/>
+                <w:p>
+                  <w:pPr>
+                    <w:pStyle w:val="Compact"/>
+                    <w:jc w:val="right"/>
+                    <w:jc w:val="center"/>
+                  </w:pPr>
+                  <w:r>
+                    <w:t xml:space="preserve">+3.8</w:t>
+                  </w:r>
+                </w:p>
+              </w:tc>
+              <w:tc>
+                <w:tcPr/>
+                <w:p>
+                  <w:pPr>
+                    <w:pStyle w:val="Compact"/>
+                    <w:jc w:val="right"/>
+                    <w:jc w:val="center"/>
+                  </w:pPr>
+                  <w:r>
+                    <w:t xml:space="preserve">+2.8</w:t>
+                  </w:r>
+                </w:p>
+              </w:tc>
+              <w:tc>
+                <w:tcPr/>
+                <w:p>
+                  <w:pPr>
+                    <w:pStyle w:val="Compact"/>
+                    <w:jc w:val="right"/>
+                    <w:jc w:val="center"/>
+                  </w:pPr>
+                  <w:r>
+                    <w:t xml:space="preserve">+5.2</w:t>
+                  </w:r>
+                </w:p>
+              </w:tc>
+              <w:tc>
+                <w:tcPr/>
+                <w:p>
+                  <w:pPr>
+                    <w:pStyle w:val="Compact"/>
+                    <w:jc w:val="right"/>
+                    <w:jc w:val="center"/>
+                  </w:pPr>
+                  <w:r>
+                    <w:t xml:space="preserve">+3.8</w:t>
+                  </w:r>
+                </w:p>
+              </w:tc>
+            </w:tr>
+            <w:tr>
+              <w:tc>
+                <w:tcPr/>
+                <w:p>
+                  <w:pPr>
+                    <w:pStyle w:val="Compact"/>
+                    <w:jc w:val="right"/>
+                    <w:jc w:val="center"/>
+                  </w:pPr>
+                  <w:r>
+                    <w:t xml:space="preserve">2</w:t>
+                  </w:r>
+                </w:p>
+              </w:tc>
+              <w:tc>
+                <w:tcPr/>
+                <w:p>
+                  <w:pPr>
+                    <w:pStyle w:val="Compact"/>
+                    <w:jc w:val="left"/>
+                    <w:jc w:val="center"/>
+                  </w:pPr>
+                  <w:r>
+                    <w:t xml:space="preserve">Varndean School</w:t>
+                  </w:r>
+                </w:p>
+              </w:tc>
+              <w:tc>
+                <w:tcPr/>
+                <w:p>
+                  <w:pPr>
+                    <w:pStyle w:val="Compact"/>
+                    <w:jc w:val="right"/>
+                    <w:jc w:val="center"/>
+                  </w:pPr>
+                  <w:r>
+                    <w:t xml:space="preserve">+4.0</w:t>
+                  </w:r>
+                </w:p>
+              </w:tc>
+              <w:tc>
+                <w:tcPr/>
+                <w:p>
+                  <w:pPr>
+                    <w:pStyle w:val="Compact"/>
+                    <w:jc w:val="right"/>
+                    <w:jc w:val="center"/>
+                  </w:pPr>
+                  <w:r>
+                    <w:t xml:space="preserve">+3.3</w:t>
+                  </w:r>
+                </w:p>
+              </w:tc>
+              <w:tc>
+                <w:tcPr/>
+                <w:p>
+                  <w:pPr>
+                    <w:pStyle w:val="Compact"/>
+                    <w:jc w:val="right"/>
+                    <w:jc w:val="center"/>
+                  </w:pPr>
+                  <w:r>
+                    <w:t xml:space="preserve">+6.0</w:t>
+                  </w:r>
+                </w:p>
+              </w:tc>
+              <w:tc>
+                <w:tcPr/>
+                <w:p>
+                  <w:pPr>
+                    <w:pStyle w:val="Compact"/>
+                    <w:jc w:val="right"/>
+                    <w:jc w:val="center"/>
+                  </w:pPr>
+                  <w:r>
+                    <w:t xml:space="preserve">+1.2</w:t>
+                  </w:r>
+                </w:p>
+              </w:tc>
+              <w:tc>
+                <w:tcPr/>
+                <w:p>
+                  <w:pPr>
+                    <w:pStyle w:val="Compact"/>
+                    <w:jc w:val="right"/>
+                    <w:jc w:val="center"/>
+                  </w:pPr>
+                  <w:r>
+                    <w:t xml:space="preserve">+3.6</w:t>
+                  </w:r>
+                </w:p>
+              </w:tc>
+            </w:tr>
+            <w:tr>
+              <w:tc>
+                <w:tcPr/>
+                <w:p>
+                  <w:pPr>
+                    <w:pStyle w:val="Compact"/>
+                    <w:jc w:val="right"/>
+                    <w:jc w:val="center"/>
+                  </w:pPr>
+                  <w:r>
+                    <w:t xml:space="preserve">3</w:t>
+                  </w:r>
+                </w:p>
+              </w:tc>
+              <w:tc>
+                <w:tcPr/>
+                <w:p>
+                  <w:pPr>
+                    <w:pStyle w:val="Compact"/>
+                    <w:jc w:val="left"/>
+                    <w:jc w:val="center"/>
+                  </w:pPr>
+                  <w:r>
+                    <w:t xml:space="preserve">King’s School</w:t>
+                  </w:r>
+                </w:p>
+              </w:tc>
+              <w:tc>
+                <w:tcPr/>
+                <w:p>
+                  <w:pPr>
+                    <w:pStyle w:val="Compact"/>
+                    <w:jc w:val="right"/>
+                    <w:jc w:val="center"/>
+                  </w:pPr>
+                  <w:r>
+                    <w:t xml:space="preserve">+4.8</w:t>
+                  </w:r>
+                </w:p>
+              </w:tc>
+              <w:tc>
+                <w:tcPr/>
+                <w:p>
+                  <w:pPr>
+                    <w:pStyle w:val="Compact"/>
+                    <w:jc w:val="right"/>
+                    <w:jc w:val="center"/>
+                  </w:pPr>
+                  <w:r>
+                    <w:t xml:space="preserve">+0.1</w:t>
+                  </w:r>
+                </w:p>
+              </w:tc>
+              <w:tc>
+                <w:tcPr/>
+                <w:p>
+                  <w:pPr>
+                    <w:pStyle w:val="Compact"/>
+                    <w:jc w:val="right"/>
+                    <w:jc w:val="center"/>
+                  </w:pPr>
+                  <w:r>
+                    <w:t xml:space="preserve">+5.9</w:t>
+                  </w:r>
+                </w:p>
+              </w:tc>
+              <w:tc>
+                <w:tcPr/>
+                <w:p>
+                  <w:pPr>
+                    <w:pStyle w:val="Compact"/>
+                    <w:jc w:val="right"/>
+                    <w:jc w:val="center"/>
+                  </w:pPr>
+                  <w:r>
+                    <w:t xml:space="preserve">+0.8</w:t>
+                  </w:r>
+                </w:p>
+              </w:tc>
+              <w:tc>
+                <w:tcPr/>
+                <w:p>
+                  <w:pPr>
+                    <w:pStyle w:val="Compact"/>
+                    <w:jc w:val="right"/>
+                    <w:jc w:val="center"/>
+                  </w:pPr>
+                  <w:r>
+                    <w:t xml:space="preserve">+2.9</w:t>
+                  </w:r>
+                </w:p>
+              </w:tc>
+            </w:tr>
+            <w:tr>
+              <w:tc>
+                <w:tcPr/>
+                <w:p>
+                  <w:pPr>
+                    <w:pStyle w:val="Compact"/>
+                    <w:jc w:val="right"/>
+                    <w:jc w:val="center"/>
+                  </w:pPr>
+                  <w:r>
+                    <w:t xml:space="preserve">4</w:t>
+                  </w:r>
+                </w:p>
+              </w:tc>
+              <w:tc>
+                <w:tcPr/>
+                <w:p>
+                  <w:pPr>
+                    <w:pStyle w:val="Compact"/>
+                    <w:jc w:val="left"/>
+                    <w:jc w:val="center"/>
+                  </w:pPr>
+                  <w:r>
+                    <w:t xml:space="preserve">Portslade Aldridge Community Academy</w:t>
+                  </w:r>
+                </w:p>
+              </w:tc>
+              <w:tc>
+                <w:tcPr/>
+                <w:p>
+                  <w:pPr>
+                    <w:pStyle w:val="Compact"/>
+                    <w:jc w:val="right"/>
+                    <w:jc w:val="center"/>
+                  </w:pPr>
+                  <w:r>
+                    <w:t xml:space="preserve">+2.9</w:t>
+                  </w:r>
+                </w:p>
+              </w:tc>
+              <w:tc>
+                <w:tcPr/>
+                <w:p>
+                  <w:pPr>
+                    <w:pStyle w:val="Compact"/>
+                    <w:jc w:val="right"/>
+                    <w:jc w:val="center"/>
+                  </w:pPr>
+                  <w:r>
+                    <w:t xml:space="preserve">-0.4</w:t>
+                  </w:r>
+                </w:p>
+              </w:tc>
+              <w:tc>
+                <w:tcPr/>
+                <w:p>
+                  <w:pPr>
+                    <w:pStyle w:val="Compact"/>
+                    <w:jc w:val="right"/>
+                    <w:jc w:val="center"/>
+                  </w:pPr>
+                  <w:r>
+                    <w:t xml:space="preserve">+3.1</w:t>
+                  </w:r>
+                </w:p>
+              </w:tc>
+              <w:tc>
+                <w:tcPr/>
+                <w:p>
+                  <w:pPr>
+                    <w:pStyle w:val="Compact"/>
+                    <w:jc w:val="right"/>
+                    <w:jc w:val="center"/>
+                  </w:pPr>
+                  <w:r>
+                    <w:t xml:space="preserve">-0.5</w:t>
+                  </w:r>
+                </w:p>
+              </w:tc>
+              <w:tc>
+                <w:tcPr/>
+                <w:p>
+                  <w:pPr>
+                    <w:pStyle w:val="Compact"/>
+                    <w:jc w:val="right"/>
+                    <w:jc w:val="center"/>
+                  </w:pPr>
+                  <w:r>
+                    <w:t xml:space="preserve">+1.3</w:t>
+                  </w:r>
+                </w:p>
+              </w:tc>
+            </w:tr>
+            <w:tr>
+              <w:tc>
+                <w:tcPr/>
+                <w:p>
+                  <w:pPr>
+                    <w:pStyle w:val="Compact"/>
+                    <w:jc w:val="right"/>
+                    <w:jc w:val="center"/>
+                  </w:pPr>
+                  <w:r>
+                    <w:t xml:space="preserve">5</w:t>
+                  </w:r>
+                </w:p>
+              </w:tc>
+              <w:tc>
+                <w:tcPr/>
+                <w:p>
+                  <w:pPr>
+                    <w:pStyle w:val="Compact"/>
+                    <w:jc w:val="left"/>
+                    <w:jc w:val="center"/>
+                  </w:pPr>
+                  <w:r>
+                    <w:t xml:space="preserve">Brighton Aldridge Community Academy</w:t>
+                  </w:r>
+                </w:p>
+              </w:tc>
+              <w:tc>
+                <w:tcPr/>
+                <w:p>
+                  <w:pPr>
+                    <w:pStyle w:val="Compact"/>
+                    <w:jc w:val="right"/>
+                    <w:jc w:val="center"/>
+                  </w:pPr>
+                  <w:r>
+                    <w:t xml:space="preserve">+2.0</w:t>
+                  </w:r>
+                </w:p>
+              </w:tc>
+              <w:tc>
+                <w:tcPr/>
+                <w:p>
+                  <w:pPr>
+                    <w:pStyle w:val="Compact"/>
+                    <w:jc w:val="right"/>
+                    <w:jc w:val="center"/>
+                  </w:pPr>
+                  <w:r>
+                    <w:t xml:space="preserve">+1.2</w:t>
+                  </w:r>
+                </w:p>
+              </w:tc>
+              <w:tc>
+                <w:tcPr/>
+                <w:p>
+                  <w:pPr>
+                    <w:pStyle w:val="Compact"/>
+                    <w:jc w:val="right"/>
+                    <w:jc w:val="center"/>
+                  </w:pPr>
+                  <w:r>
+                    <w:t xml:space="preserve">+0.4</w:t>
+                  </w:r>
+                </w:p>
+              </w:tc>
+              <w:tc>
+                <w:tcPr/>
+                <w:p>
+                  <w:pPr>
+                    <w:pStyle w:val="Compact"/>
+                    <w:jc w:val="right"/>
+                    <w:jc w:val="center"/>
+                  </w:pPr>
+                  <w:r>
+                    <w:t xml:space="preserve">-0.0</w:t>
+                  </w:r>
+                </w:p>
+              </w:tc>
+              <w:tc>
+                <w:tcPr/>
+                <w:p>
+                  <w:pPr>
+                    <w:pStyle w:val="Compact"/>
+                    <w:jc w:val="right"/>
+                    <w:jc w:val="center"/>
+                  </w:pPr>
+                  <w:r>
+                    <w:t xml:space="preserve">+0.9</w:t>
+                  </w:r>
+                </w:p>
+              </w:tc>
+            </w:tr>
+            <w:tr>
+              <w:tc>
+                <w:tcPr/>
+                <w:p>
+                  <w:pPr>
+                    <w:pStyle w:val="Compact"/>
+                    <w:jc w:val="right"/>
+                    <w:jc w:val="center"/>
+                  </w:pPr>
+                  <w:r>
+                    <w:t xml:space="preserve">6</w:t>
+                  </w:r>
+                </w:p>
+              </w:tc>
+              <w:tc>
+                <w:tcPr/>
+                <w:p>
+                  <w:pPr>
+                    <w:pStyle w:val="Compact"/>
+                    <w:jc w:val="left"/>
+                    <w:jc w:val="center"/>
+                  </w:pPr>
+                  <w:r>
+                    <w:t xml:space="preserve">Blatchington Mill School</w:t>
+                  </w:r>
+                </w:p>
+              </w:tc>
+              <w:tc>
+                <w:tcPr/>
+                <w:p>
+                  <w:pPr>
+                    <w:pStyle w:val="Compact"/>
+                    <w:jc w:val="right"/>
+                    <w:jc w:val="center"/>
+                  </w:pPr>
+                  <w:r>
+                    <w:t xml:space="preserve">-2.2</w:t>
+                  </w:r>
+                </w:p>
+              </w:tc>
+              <w:tc>
+                <w:tcPr/>
+                <w:p>
+                  <w:pPr>
+                    <w:pStyle w:val="Compact"/>
+                    <w:jc w:val="right"/>
+                    <w:jc w:val="center"/>
+                  </w:pPr>
+                  <w:r>
+                    <w:t xml:space="preserve">-0.8</w:t>
+                  </w:r>
+                </w:p>
+              </w:tc>
+              <w:tc>
+                <w:tcPr/>
+                <w:p>
+                  <w:pPr>
+                    <w:pStyle w:val="Compact"/>
+                    <w:jc w:val="right"/>
+                    <w:jc w:val="center"/>
+                  </w:pPr>
+                  <w:r>
+                    <w:t xml:space="preserve">+2.5</w:t>
+                  </w:r>
+                </w:p>
+              </w:tc>
+              <w:tc>
+                <w:tcPr/>
+                <w:p>
+                  <w:pPr>
+                    <w:pStyle w:val="Compact"/>
+                    <w:jc w:val="right"/>
+                    <w:jc w:val="center"/>
+                  </w:pPr>
+                  <w:r>
+                    <w:t xml:space="preserve">+3.1</w:t>
+                  </w:r>
+                </w:p>
+              </w:tc>
+              <w:tc>
+                <w:tcPr/>
+                <w:p>
+                  <w:pPr>
+                    <w:pStyle w:val="Compact"/>
+                    <w:jc w:val="right"/>
+                    <w:jc w:val="center"/>
+                  </w:pPr>
+                  <w:r>
+                    <w:t xml:space="preserve">+0.6</w:t>
+                  </w:r>
+                </w:p>
+              </w:tc>
+            </w:tr>
+            <w:tr>
+              <w:tc>
+                <w:tcPr/>
+                <w:p>
+                  <w:pPr>
+                    <w:pStyle w:val="Compact"/>
+                    <w:jc w:val="right"/>
+                    <w:jc w:val="center"/>
+                  </w:pPr>
+                  <w:r>
+                    <w:t xml:space="preserve">7</w:t>
+                  </w:r>
+                </w:p>
+              </w:tc>
+              <w:tc>
+                <w:tcPr/>
+                <w:p>
+                  <w:pPr>
+                    <w:pStyle w:val="Compact"/>
+                    <w:jc w:val="left"/>
+                    <w:jc w:val="center"/>
+                  </w:pPr>
+                  <w:r>
+                    <w:t xml:space="preserve">Hove Park School and Sixth Form Centre</w:t>
+                  </w:r>
+                </w:p>
+              </w:tc>
+              <w:tc>
+                <w:tcPr/>
+                <w:p>
+                  <w:pPr>
+                    <w:pStyle w:val="Compact"/>
+                    <w:jc w:val="right"/>
+                    <w:jc w:val="center"/>
+                  </w:pPr>
+                  <w:r>
+                    <w:t xml:space="preserve">+0.6</w:t>
+                  </w:r>
+                </w:p>
+              </w:tc>
+              <w:tc>
+                <w:tcPr/>
+                <w:p>
+                  <w:pPr>
+                    <w:pStyle w:val="Compact"/>
+                    <w:jc w:val="right"/>
+                    <w:jc w:val="center"/>
+                  </w:pPr>
+                  <w:r>
+                    <w:t xml:space="preserve">+2.0</w:t>
+                  </w:r>
+                </w:p>
+              </w:tc>
+              <w:tc>
+                <w:tcPr/>
+                <w:p>
+                  <w:pPr>
+                    <w:pStyle w:val="Compact"/>
+                    <w:jc w:val="right"/>
+                    <w:jc w:val="center"/>
+                  </w:pPr>
+                  <w:r>
+                    <w:t xml:space="preserve">+0.4</w:t>
+                  </w:r>
+                </w:p>
+              </w:tc>
+              <w:tc>
+                <w:tcPr/>
+                <w:p>
+                  <w:pPr>
+                    <w:pStyle w:val="Compact"/>
+                    <w:jc w:val="right"/>
+                    <w:jc w:val="center"/>
+                  </w:pPr>
+                  <w:r>
+                    <w:t xml:space="preserve">-0.6</w:t>
+                  </w:r>
+                </w:p>
+              </w:tc>
+              <w:tc>
+                <w:tcPr/>
+                <w:p>
+                  <w:pPr>
+                    <w:pStyle w:val="Compact"/>
+                    <w:jc w:val="right"/>
+                    <w:jc w:val="center"/>
+                  </w:pPr>
+                  <w:r>
+                    <w:t xml:space="preserve">+0.6</w:t>
+                  </w:r>
+                </w:p>
+              </w:tc>
+            </w:tr>
+            <w:tr>
+              <w:tc>
+                <w:tcPr/>
+                <w:p>
+                  <w:pPr>
+                    <w:pStyle w:val="Compact"/>
+                    <w:jc w:val="right"/>
+                    <w:jc w:val="center"/>
+                  </w:pPr>
+                  <w:r>
+                    <w:t xml:space="preserve">8</w:t>
+                  </w:r>
+                </w:p>
+              </w:tc>
+              <w:tc>
+                <w:tcPr/>
+                <w:p>
+                  <w:pPr>
+                    <w:pStyle w:val="Compact"/>
+                    <w:jc w:val="left"/>
+                    <w:jc w:val="center"/>
+                  </w:pPr>
+                  <w:r>
+                    <w:t xml:space="preserve">Cardinal Newman Catholic School</w:t>
+                  </w:r>
+                </w:p>
+              </w:tc>
+              <w:tc>
+                <w:tcPr/>
+                <w:p>
+                  <w:pPr>
+                    <w:pStyle w:val="Compact"/>
+                    <w:jc w:val="right"/>
+                    <w:jc w:val="center"/>
+                  </w:pPr>
+                  <w:r>
+                    <w:t xml:space="preserve">+0.4</w:t>
+                  </w:r>
+                </w:p>
+              </w:tc>
+              <w:tc>
+                <w:tcPr/>
+                <w:p>
+                  <w:pPr>
+                    <w:pStyle w:val="Compact"/>
+                    <w:jc w:val="right"/>
+                    <w:jc w:val="center"/>
+                  </w:pPr>
+                  <w:r>
+                    <w:t xml:space="preserve">-1.7</w:t>
+                  </w:r>
+                </w:p>
+              </w:tc>
+              <w:tc>
+                <w:tcPr/>
+                <w:p>
+                  <w:pPr>
+                    <w:pStyle w:val="Compact"/>
+                    <w:jc w:val="right"/>
+                    <w:jc w:val="center"/>
+                  </w:pPr>
+                  <w:r>
+                    <w:t xml:space="preserve">+1.2</w:t>
+                  </w:r>
+                </w:p>
+              </w:tc>
+              <w:tc>
+                <w:tcPr/>
+                <w:p>
+                  <w:pPr>
+                    <w:pStyle w:val="Compact"/>
+                    <w:jc w:val="right"/>
+                    <w:jc w:val="center"/>
+                  </w:pPr>
+                  <w:r>
+                    <w:t xml:space="preserve">-1.3</w:t>
+                  </w:r>
+                </w:p>
+              </w:tc>
+              <w:tc>
+                <w:tcPr/>
+                <w:p>
+                  <w:pPr>
+                    <w:pStyle w:val="Compact"/>
+                    <w:jc w:val="right"/>
+                    <w:jc w:val="center"/>
+                  </w:pPr>
+                  <w:r>
+                    <w:t xml:space="preserve">-0.3</w:t>
+                  </w:r>
+                </w:p>
+              </w:tc>
+            </w:tr>
+            <w:tr>
+              <w:tc>
+                <w:tcPr/>
+                <w:p>
+                  <w:pPr>
+                    <w:pStyle w:val="Compact"/>
+                    <w:jc w:val="right"/>
+                    <w:jc w:val="center"/>
+                  </w:pPr>
+                  <w:r>
+                    <w:t xml:space="preserve">9</w:t>
+                  </w:r>
+                </w:p>
+              </w:tc>
+              <w:tc>
+                <w:tcPr/>
+                <w:p>
+                  <w:pPr>
+                    <w:pStyle w:val="Compact"/>
+                    <w:jc w:val="left"/>
+                    <w:jc w:val="center"/>
+                  </w:pPr>
+                  <w:r>
+                    <w:t xml:space="preserve">Longhill High School</w:t>
+                  </w:r>
+                </w:p>
+              </w:tc>
+              <w:tc>
+                <w:tcPr/>
+                <w:p>
+                  <w:pPr>
+                    <w:pStyle w:val="Compact"/>
+                    <w:jc w:val="right"/>
+                    <w:jc w:val="center"/>
+                  </w:pPr>
+                  <w:r>
+                    <w:t xml:space="preserve">+0.4</w:t>
+                  </w:r>
+                </w:p>
+              </w:tc>
+              <w:tc>
+                <w:tcPr/>
+                <w:p>
+                  <w:pPr>
+                    <w:pStyle w:val="Compact"/>
+                    <w:jc w:val="right"/>
+                    <w:jc w:val="center"/>
+                  </w:pPr>
+                  <w:r>
+                    <w:t xml:space="preserve">-2.2</w:t>
+                  </w:r>
+                </w:p>
+              </w:tc>
+              <w:tc>
+                <w:tcPr/>
+                <w:p>
+                  <w:pPr>
+                    <w:pStyle w:val="Compact"/>
+                    <w:jc w:val="right"/>
+                    <w:jc w:val="center"/>
+                  </w:pPr>
+                  <w:r>
+                    <w:t xml:space="preserve">-2.2</w:t>
+                  </w:r>
+                </w:p>
+              </w:tc>
+              <w:tc>
+                <w:tcPr/>
+                <w:p>
+                  <w:pPr>
+                    <w:pStyle w:val="Compact"/>
+                    <w:jc w:val="right"/>
+                    <w:jc w:val="center"/>
+                  </w:pPr>
+                  <w:r>
+                    <w:t xml:space="preserve">-3.4</w:t>
+                  </w:r>
+                </w:p>
+              </w:tc>
+              <w:tc>
+                <w:tcPr/>
+                <w:p>
+                  <w:pPr>
+                    <w:pStyle w:val="Compact"/>
+                    <w:jc w:val="right"/>
+                    <w:jc w:val="center"/>
+                  </w:pPr>
+                  <w:r>
+                    <w:t xml:space="preserve">-1.8</w:t>
+                  </w:r>
+                </w:p>
+              </w:tc>
+            </w:tr>
+            <w:tr>
+              <w:tc>
+                <w:tcPr/>
+                <w:p>
+                  <w:pPr>
+                    <w:pStyle w:val="Compact"/>
+                    <w:jc w:val="right"/>
+                    <w:jc w:val="center"/>
+                  </w:pPr>
+                  <w:r>
+                    <w:t xml:space="preserve">10</w:t>
+                  </w:r>
+                </w:p>
+              </w:tc>
+              <w:tc>
+                <w:tcPr/>
+                <w:p>
+                  <w:pPr>
+                    <w:pStyle w:val="Compact"/>
+                    <w:jc w:val="left"/>
+                    <w:jc w:val="center"/>
+                  </w:pPr>
+                  <w:r>
+                    <w:t xml:space="preserve">Patcham High School</w:t>
+                  </w:r>
+                </w:p>
+              </w:tc>
+              <w:tc>
+                <w:tcPr/>
+                <w:p>
+                  <w:pPr>
+                    <w:pStyle w:val="Compact"/>
+                    <w:jc w:val="right"/>
+                    <w:jc w:val="center"/>
+                  </w:pPr>
+                  <w:r>
+                    <w:t xml:space="preserve">-3.2</w:t>
+                  </w:r>
+                </w:p>
+              </w:tc>
+              <w:tc>
+                <w:tcPr/>
+                <w:p>
+                  <w:pPr>
+                    <w:pStyle w:val="Compact"/>
+                    <w:jc w:val="right"/>
+                    <w:jc w:val="center"/>
+                  </w:pPr>
+                  <w:r>
+                    <w:t xml:space="preserve">-2.7</w:t>
+                  </w:r>
+                </w:p>
+              </w:tc>
+              <w:tc>
+                <w:tcPr/>
+                <w:p>
+                  <w:pPr>
+                    <w:pStyle w:val="Compact"/>
+                    <w:jc w:val="right"/>
+                    <w:jc w:val="center"/>
+                  </w:pPr>
+                  <w:r>
+                    <w:t xml:space="preserve">-4.9</w:t>
+                  </w:r>
+                </w:p>
+              </w:tc>
+              <w:tc>
+                <w:tcPr/>
+                <w:p>
+                  <w:pPr>
+                    <w:pStyle w:val="Compact"/>
+                    <w:jc w:val="right"/>
+                    <w:jc w:val="center"/>
+                  </w:pPr>
+                  <w:r>
+                    <w:t xml:space="preserve">-3.4</w:t>
+                  </w:r>
+                </w:p>
+              </w:tc>
+              <w:tc>
+                <w:tcPr/>
+                <w:p>
+                  <w:pPr>
+                    <w:pStyle w:val="Compact"/>
+                    <w:jc w:val="right"/>
+                    <w:jc w:val="center"/>
+                  </w:pPr>
+                  <w:r>
+                    <w:t xml:space="preserve">-3.6</w:t>
+                  </w:r>
+                </w:p>
+              </w:tc>
+            </w:tr>
+            <w:tr>
+              <w:tc>
+                <w:tcPr/>
+                <w:p>
+                  <w:pPr>
+                    <w:pStyle w:val="Compact"/>
+                    <w:jc w:val="right"/>
+                    <w:jc w:val="center"/>
+                  </w:pPr>
+                  <w:r>
+                    <w:t xml:space="preserve">1</w:t>
+                  </w:r>
+                </w:p>
+              </w:tc>
+              <w:tc>
+                <w:tcPr/>
+                <w:p>
+                  <w:pPr>
+                    <w:pStyle w:val="Compact"/>
+                    <w:jc w:val="left"/>
+                    <w:jc w:val="center"/>
+                  </w:pPr>
+                  <w:r>
+                    <w:t xml:space="preserve">Brighton Aldridge Community Academy</w:t>
+                  </w:r>
+                </w:p>
+              </w:tc>
+              <w:tc>
+                <w:tcPr/>
+                <w:p>
+                  <w:pPr>
+                    <w:pStyle w:val="Compact"/>
+                    <w:jc w:val="right"/>
+                    <w:jc w:val="center"/>
+                  </w:pPr>
+                  <w:r>
+                    <w:t xml:space="preserve">+3.2</w:t>
+                  </w:r>
+                </w:p>
+              </w:tc>
+              <w:tc>
+                <w:tcPr/>
+                <w:p>
+                  <w:pPr>
+                    <w:pStyle w:val="Compact"/>
+                    <w:jc w:val="right"/>
+                    <w:jc w:val="center"/>
+                  </w:pPr>
+                  <w:r>
+                    <w:t xml:space="preserve">-1.3</w:t>
+                  </w:r>
+                </w:p>
+              </w:tc>
+              <w:tc>
+                <w:tcPr/>
+                <w:p>
+                  <w:pPr>
+                    <w:pStyle w:val="Compact"/>
+                    <w:jc w:val="right"/>
+                    <w:jc w:val="center"/>
+                  </w:pPr>
+                  <w:r>
+                    <w:t xml:space="preserve">+4.1</w:t>
+                  </w:r>
+                </w:p>
+              </w:tc>
+              <w:tc>
+                <w:tcPr/>
+                <w:p>
+                  <w:pPr>
+                    <w:pStyle w:val="Compact"/>
+                    <w:jc w:val="right"/>
+                    <w:jc w:val="center"/>
+                  </w:pPr>
+                  <w:r>
+                    <w:t xml:space="preserve">+5.2</w:t>
+                  </w:r>
+                </w:p>
+              </w:tc>
+              <w:tc>
+                <w:tcPr/>
+                <w:p>
+                  <w:pPr>
+                    <w:pStyle w:val="Compact"/>
+                    <w:jc w:val="right"/>
+                    <w:jc w:val="center"/>
+                  </w:pPr>
+                  <w:r>
+                    <w:t xml:space="preserve">+2.8</w:t>
+                  </w:r>
+                </w:p>
+              </w:tc>
+            </w:tr>
+            <w:tr>
+              <w:tc>
+                <w:tcPr/>
+                <w:p>
+                  <w:pPr>
+                    <w:pStyle w:val="Compact"/>
+                    <w:jc w:val="right"/>
+                    <w:jc w:val="center"/>
+                  </w:pPr>
+                  <w:r>
+                    <w:t xml:space="preserve">2</w:t>
+                  </w:r>
+                </w:p>
+              </w:tc>
+              <w:tc>
+                <w:tcPr/>
+                <w:p>
+                  <w:pPr>
+                    <w:pStyle w:val="Compact"/>
+                    <w:jc w:val="left"/>
+                    <w:jc w:val="center"/>
+                  </w:pPr>
+                  <w:r>
+                    <w:t xml:space="preserve">Varndean School</w:t>
+                  </w:r>
+                </w:p>
+              </w:tc>
+              <w:tc>
+                <w:tcPr/>
+                <w:p>
+                  <w:pPr>
+                    <w:pStyle w:val="Compact"/>
+                    <w:jc w:val="right"/>
+                    <w:jc w:val="center"/>
+                  </w:pPr>
+                  <w:r>
+                    <w:t xml:space="preserve">+3.2</w:t>
+                  </w:r>
+                </w:p>
+              </w:tc>
+              <w:tc>
+                <w:tcPr/>
+                <w:p>
+                  <w:pPr>
+                    <w:pStyle w:val="Compact"/>
+                    <w:jc w:val="right"/>
+                    <w:jc w:val="center"/>
+                  </w:pPr>
+                  <w:r>
+                    <w:t xml:space="preserve">+3.6</w:t>
+                  </w:r>
+                </w:p>
+              </w:tc>
+              <w:tc>
+                <w:tcPr/>
+                <w:p>
+                  <w:pPr>
+                    <w:pStyle w:val="Compact"/>
+                    <w:jc w:val="right"/>
+                    <w:jc w:val="center"/>
+                  </w:pPr>
+                  <w:r>
+                    <w:t xml:space="preserve">+4.5</w:t>
+                  </w:r>
+                </w:p>
+              </w:tc>
+              <w:tc>
+                <w:tcPr/>
+                <w:p>
+                  <w:pPr>
+                    <w:pStyle w:val="Compact"/>
+                    <w:jc w:val="right"/>
+                    <w:jc w:val="center"/>
+                  </w:pPr>
+                  <w:r>
+                    <w:t xml:space="preserve">-1.9</w:t>
+                  </w:r>
+                </w:p>
+              </w:tc>
+              <w:tc>
+                <w:tcPr/>
+                <w:p>
+                  <w:pPr>
+                    <w:pStyle w:val="Compact"/>
+                    <w:jc w:val="right"/>
+                    <w:jc w:val="center"/>
+                  </w:pPr>
+                  <w:r>
+                    <w:t xml:space="preserve">+2.3</w:t>
+                  </w:r>
+                </w:p>
+              </w:tc>
+            </w:tr>
+            <w:tr>
+              <w:tc>
+                <w:tcPr/>
+                <w:p>
+                  <w:pPr>
+                    <w:pStyle w:val="Compact"/>
+                    <w:jc w:val="right"/>
+                    <w:jc w:val="center"/>
+                  </w:pPr>
+                  <w:r>
+                    <w:t xml:space="preserve">3</w:t>
+                  </w:r>
+                </w:p>
+              </w:tc>
+              <w:tc>
+                <w:tcPr/>
+                <w:p>
+                  <w:pPr>
+                    <w:pStyle w:val="Compact"/>
+                    <w:jc w:val="left"/>
+                    <w:jc w:val="center"/>
+                  </w:pPr>
+                  <w:r>
+                    <w:t xml:space="preserve">Dorothy Stringer School</w:t>
+                  </w:r>
+                </w:p>
+              </w:tc>
+              <w:tc>
+                <w:tcPr/>
+                <w:p>
+                  <w:pPr>
+                    <w:pStyle w:val="Compact"/>
+                    <w:jc w:val="right"/>
+                    <w:jc w:val="center"/>
+                  </w:pPr>
+                  <w:r>
+                    <w:t xml:space="preserve">+2.9</w:t>
+                  </w:r>
+                </w:p>
+              </w:tc>
+              <w:tc>
+                <w:tcPr/>
+                <w:p>
+                  <w:pPr>
+                    <w:pStyle w:val="Compact"/>
+                    <w:jc w:val="right"/>
+                    <w:jc w:val="center"/>
+                  </w:pPr>
+                  <w:r>
+                    <w:t xml:space="preserve">+3.2</w:t>
+                  </w:r>
+                </w:p>
+              </w:tc>
+              <w:tc>
+                <w:tcPr/>
+                <w:p>
+                  <w:pPr>
+                    <w:pStyle w:val="Compact"/>
+                    <w:jc w:val="right"/>
+                    <w:jc w:val="center"/>
+                  </w:pPr>
+                  <w:r>
+                    <w:t xml:space="preserve">+0.3</w:t>
+                  </w:r>
+                </w:p>
+              </w:tc>
+              <w:tc>
+                <w:tcPr/>
+                <w:p>
+                  <w:pPr>
+                    <w:pStyle w:val="Compact"/>
+                    <w:jc w:val="right"/>
+                    <w:jc w:val="center"/>
+                  </w:pPr>
+                  <w:r>
+                    <w:t xml:space="preserve">+1.7</w:t>
+                  </w:r>
+                </w:p>
+              </w:tc>
+              <w:tc>
+                <w:tcPr/>
+                <w:p>
+                  <w:pPr>
+                    <w:pStyle w:val="Compact"/>
+                    <w:jc w:val="right"/>
+                    <w:jc w:val="center"/>
+                  </w:pPr>
+                  <w:r>
+                    <w:t xml:space="preserve">+2.0</w:t>
+                  </w:r>
+                </w:p>
+              </w:tc>
+            </w:tr>
+            <w:tr>
+              <w:tc>
+                <w:tcPr/>
+                <w:p>
+                  <w:pPr>
+                    <w:pStyle w:val="Compact"/>
+                    <w:jc w:val="right"/>
+                    <w:jc w:val="center"/>
+                  </w:pPr>
+                  <w:r>
+                    <w:t xml:space="preserve">4</w:t>
+                  </w:r>
+                </w:p>
+              </w:tc>
+              <w:tc>
+                <w:tcPr/>
+                <w:p>
+                  <w:pPr>
+                    <w:pStyle w:val="Compact"/>
+                    <w:jc w:val="left"/>
+                    <w:jc w:val="center"/>
+                  </w:pPr>
+                  <w:r>
+                    <w:t xml:space="preserve">Cardinal Newman Catholic School</w:t>
+                  </w:r>
+                </w:p>
+              </w:tc>
+              <w:tc>
+                <w:tcPr/>
+                <w:p>
+                  <w:pPr>
+                    <w:pStyle w:val="Compact"/>
+                    <w:jc w:val="right"/>
+                    <w:jc w:val="center"/>
+                  </w:pPr>
+                  <w:r>
+                    <w:t xml:space="preserve">+2.4</w:t>
+                  </w:r>
+                </w:p>
+              </w:tc>
+              <w:tc>
+                <w:tcPr/>
+                <w:p>
+                  <w:pPr>
+                    <w:pStyle w:val="Compact"/>
+                    <w:jc w:val="right"/>
+                    <w:jc w:val="center"/>
+                  </w:pPr>
+                  <w:r>
+                    <w:t xml:space="preserve">-5.0</w:t>
+                  </w:r>
+                </w:p>
+              </w:tc>
+              <w:tc>
+                <w:tcPr/>
+                <w:p>
+                  <w:pPr>
+                    <w:pStyle w:val="Compact"/>
+                    <w:jc w:val="right"/>
+                    <w:jc w:val="center"/>
+                  </w:pPr>
+                  <w:r>
+                    <w:t xml:space="preserve">+6.5</w:t>
+                  </w:r>
+                </w:p>
+              </w:tc>
+              <w:tc>
+                <w:tcPr/>
+                <w:p>
+                  <w:pPr>
+                    <w:pStyle w:val="Compact"/>
+                    <w:jc w:val="right"/>
+                    <w:jc w:val="center"/>
+                  </w:pPr>
+                  <w:r>
+                    <w:t xml:space="preserve">+2.5</w:t>
+                  </w:r>
+                </w:p>
+              </w:tc>
+              <w:tc>
+                <w:tcPr/>
+                <w:p>
+                  <w:pPr>
+                    <w:pStyle w:val="Compact"/>
+                    <w:jc w:val="right"/>
+                    <w:jc w:val="center"/>
+                  </w:pPr>
+                  <w:r>
+                    <w:t xml:space="preserve">+1.6</w:t>
+                  </w:r>
+                </w:p>
+              </w:tc>
+            </w:tr>
+            <w:tr>
+              <w:tc>
+                <w:tcPr/>
+                <w:p>
+                  <w:pPr>
+                    <w:pStyle w:val="Compact"/>
+                    <w:jc w:val="right"/>
+                    <w:jc w:val="center"/>
+                  </w:pPr>
+                  <w:r>
+                    <w:t xml:space="preserve">5</w:t>
+                  </w:r>
+                </w:p>
+              </w:tc>
+              <w:tc>
+                <w:tcPr/>
+                <w:p>
+                  <w:pPr>
+                    <w:pStyle w:val="Compact"/>
+                    <w:jc w:val="left"/>
+                    <w:jc w:val="center"/>
+                  </w:pPr>
+                  <w:r>
+                    <w:t xml:space="preserve">King’s School</w:t>
+                  </w:r>
+                </w:p>
+              </w:tc>
+              <w:tc>
+                <w:tcPr/>
+                <w:p>
+                  <w:pPr>
+                    <w:pStyle w:val="Compact"/>
+                    <w:jc w:val="right"/>
+                    <w:jc w:val="center"/>
+                  </w:pPr>
+                  <w:r>
+                    <w:t xml:space="preserve">+5.8</w:t>
+                  </w:r>
+                </w:p>
+              </w:tc>
+              <w:tc>
+                <w:tcPr/>
+                <w:p>
+                  <w:pPr>
+                    <w:pStyle w:val="Compact"/>
+                    <w:jc w:val="right"/>
+                    <w:jc w:val="center"/>
+                  </w:pPr>
+                  <w:r>
+                    <w:t xml:space="preserve">+0.9</w:t>
+                  </w:r>
+                </w:p>
+              </w:tc>
+              <w:tc>
+                <w:tcPr/>
+                <w:p>
+                  <w:pPr>
+                    <w:pStyle w:val="Compact"/>
+                    <w:jc w:val="right"/>
+                    <w:jc w:val="center"/>
+                  </w:pPr>
+                  <w:r>
+                    <w:t xml:space="preserve">+4.4</w:t>
+                  </w:r>
+                </w:p>
+              </w:tc>
+              <w:tc>
+                <w:tcPr/>
+                <w:p>
+                  <w:pPr>
+                    <w:pStyle w:val="Compact"/>
+                    <w:jc w:val="right"/>
+                    <w:jc w:val="center"/>
+                  </w:pPr>
+                  <w:r>
+                    <w:t xml:space="preserve">-5.4</w:t>
+                  </w:r>
+                </w:p>
+              </w:tc>
+              <w:tc>
+                <w:tcPr/>
+                <w:p>
+                  <w:pPr>
+                    <w:pStyle w:val="Compact"/>
+                    <w:jc w:val="right"/>
+                    <w:jc w:val="center"/>
+                  </w:pPr>
+                  <w:r>
+                    <w:t xml:space="preserve">+1.5</w:t>
+                  </w:r>
+                </w:p>
+              </w:tc>
+            </w:tr>
+            <w:tr>
+              <w:tc>
+                <w:tcPr/>
+                <w:p>
+                  <w:pPr>
+                    <w:pStyle w:val="Compact"/>
+                    <w:jc w:val="right"/>
+                    <w:jc w:val="center"/>
+                  </w:pPr>
+                  <w:r>
+                    <w:t xml:space="preserve">6</w:t>
+                  </w:r>
+                </w:p>
+              </w:tc>
+              <w:tc>
+                <w:tcPr/>
+                <w:p>
+                  <w:pPr>
+                    <w:pStyle w:val="Compact"/>
+                    <w:jc w:val="left"/>
+                    <w:jc w:val="center"/>
+                  </w:pPr>
+                  <w:r>
+                    <w:t xml:space="preserve">Blatchington Mill School</w:t>
+                  </w:r>
+                </w:p>
+              </w:tc>
+              <w:tc>
+                <w:tcPr/>
+                <w:p>
+                  <w:pPr>
+                    <w:pStyle w:val="Compact"/>
+                    <w:jc w:val="right"/>
+                    <w:jc w:val="center"/>
+                  </w:pPr>
+                  <w:r>
+                    <w:t xml:space="preserve">-5.4</w:t>
+                  </w:r>
+                </w:p>
+              </w:tc>
+              <w:tc>
+                <w:tcPr/>
+                <w:p>
+                  <w:pPr>
+                    <w:pStyle w:val="Compact"/>
+                    <w:jc w:val="right"/>
+                    <w:jc w:val="center"/>
+                  </w:pPr>
+                  <w:r>
+                    <w:t xml:space="preserve">+1.3</w:t>
+                  </w:r>
+                </w:p>
+              </w:tc>
+              <w:tc>
+                <w:tcPr/>
+                <w:p>
+                  <w:pPr>
+                    <w:pStyle w:val="Compact"/>
+                    <w:jc w:val="right"/>
+                    <w:jc w:val="center"/>
+                  </w:pPr>
+                  <w:r>
+                    <w:t xml:space="preserve">+5.2</w:t>
+                  </w:r>
+                </w:p>
+              </w:tc>
+              <w:tc>
+                <w:tcPr/>
+                <w:p>
+                  <w:pPr>
+                    <w:pStyle w:val="Compact"/>
+                    <w:jc w:val="right"/>
+                    <w:jc w:val="center"/>
+                  </w:pPr>
+                  <w:r>
+                    <w:t xml:space="preserve">+3.4</w:t>
+                  </w:r>
+                </w:p>
+              </w:tc>
+              <w:tc>
+                <w:tcPr/>
+                <w:p>
+                  <w:pPr>
+                    <w:pStyle w:val="Compact"/>
+                    <w:jc w:val="right"/>
+                    <w:jc w:val="center"/>
+                  </w:pPr>
+                  <w:r>
+                    <w:t xml:space="preserve">+1.1</w:t>
+                  </w:r>
+                </w:p>
+              </w:tc>
+            </w:tr>
+            <w:tr>
+              <w:tc>
+                <w:tcPr/>
+                <w:p>
+                  <w:pPr>
+                    <w:pStyle w:val="Compact"/>
+                    <w:jc w:val="right"/>
+                    <w:jc w:val="center"/>
+                  </w:pPr>
+                  <w:r>
+                    <w:t xml:space="preserve">7</w:t>
+                  </w:r>
+                </w:p>
+              </w:tc>
+              <w:tc>
+                <w:tcPr/>
+                <w:p>
+                  <w:pPr>
+                    <w:pStyle w:val="Compact"/>
+                    <w:jc w:val="left"/>
+                    <w:jc w:val="center"/>
+                  </w:pPr>
+                  <w:r>
+                    <w:t xml:space="preserve">Hove Park School and Sixth Form Centre</w:t>
+                  </w:r>
+                </w:p>
+              </w:tc>
+              <w:tc>
+                <w:tcPr/>
+                <w:p>
+                  <w:pPr>
+                    <w:pStyle w:val="Compact"/>
+                    <w:jc w:val="right"/>
+                    <w:jc w:val="center"/>
+                  </w:pPr>
+                  <w:r>
+                    <w:t xml:space="preserve">+2.4</w:t>
+                  </w:r>
+                </w:p>
+              </w:tc>
+              <w:tc>
+                <w:tcPr/>
+                <w:p>
+                  <w:pPr>
+                    <w:pStyle w:val="Compact"/>
+                    <w:jc w:val="right"/>
+                    <w:jc w:val="center"/>
+                  </w:pPr>
+                  <w:r>
+                    <w:t xml:space="preserve">-1.7</w:t>
+                  </w:r>
+                </w:p>
+              </w:tc>
+              <w:tc>
+                <w:tcPr/>
+                <w:p>
+                  <w:pPr>
+                    <w:pStyle w:val="Compact"/>
+                    <w:jc w:val="right"/>
+                    <w:jc w:val="center"/>
+                  </w:pPr>
+                  <w:r>
+                    <w:t xml:space="preserve">+1.3</w:t>
+                  </w:r>
+                </w:p>
+              </w:tc>
+              <w:tc>
+                <w:tcPr/>
+                <w:p>
+                  <w:pPr>
+                    <w:pStyle w:val="Compact"/>
+                    <w:jc w:val="right"/>
+                    <w:jc w:val="center"/>
+                  </w:pPr>
+                  <w:r>
+                    <w:t xml:space="preserve">+0.5</w:t>
+                  </w:r>
+                </w:p>
+              </w:tc>
+              <w:tc>
+                <w:tcPr/>
+                <w:p>
+                  <w:pPr>
+                    <w:pStyle w:val="Compact"/>
+                    <w:jc w:val="right"/>
+                    <w:jc w:val="center"/>
+                  </w:pPr>
+                  <w:r>
+                    <w:t xml:space="preserve">+0.6</w:t>
+                  </w:r>
+                </w:p>
+              </w:tc>
+            </w:tr>
+            <w:tr>
+              <w:tc>
+                <w:tcPr/>
+                <w:p>
+                  <w:pPr>
+                    <w:pStyle w:val="Compact"/>
+                    <w:jc w:val="right"/>
+                    <w:jc w:val="center"/>
+                  </w:pPr>
+                  <w:r>
+                    <w:t xml:space="preserve">8</w:t>
+                  </w:r>
+                </w:p>
+              </w:tc>
+              <w:tc>
+                <w:tcPr/>
+                <w:p>
+                  <w:pPr>
+                    <w:pStyle w:val="Compact"/>
+                    <w:jc w:val="left"/>
+                    <w:jc w:val="center"/>
+                  </w:pPr>
+                  <w:r>
+                    <w:t xml:space="preserve">Portslade Aldridge Community Academy</w:t>
+                  </w:r>
+                </w:p>
+              </w:tc>
+              <w:tc>
+                <w:tcPr/>
+                <w:p>
+                  <w:pPr>
+                    <w:pStyle w:val="Compact"/>
+                    <w:jc w:val="right"/>
+                    <w:jc w:val="center"/>
+                  </w:pPr>
+                  <w:r>
+                    <w:t xml:space="preserve">+2.6</w:t>
+                  </w:r>
+                </w:p>
+              </w:tc>
+              <w:tc>
+                <w:tcPr/>
+                <w:p>
+                  <w:pPr>
+                    <w:pStyle w:val="Compact"/>
+                    <w:jc w:val="right"/>
+                    <w:jc w:val="center"/>
+                  </w:pPr>
+                  <w:r>
+                    <w:t xml:space="preserve">-4.0</w:t>
+                  </w:r>
+                </w:p>
+              </w:tc>
+              <w:tc>
+                <w:tcPr/>
+                <w:p>
+                  <w:pPr>
+                    <w:pStyle w:val="Compact"/>
+                    <w:jc w:val="right"/>
+                    <w:jc w:val="center"/>
+                  </w:pPr>
+                  <w:r>
+                    <w:t xml:space="preserve">+4.7</w:t>
+                  </w:r>
+                </w:p>
+              </w:tc>
+              <w:tc>
+                <w:tcPr/>
+                <w:p>
+                  <w:pPr>
+                    <w:pStyle w:val="Compact"/>
+                    <w:jc w:val="right"/>
+                    <w:jc w:val="center"/>
+                  </w:pPr>
+                  <w:r>
+                    <w:t xml:space="preserve">-1.3</w:t>
+                  </w:r>
+                </w:p>
+              </w:tc>
+              <w:tc>
+                <w:tcPr/>
+                <w:p>
+                  <w:pPr>
+                    <w:pStyle w:val="Compact"/>
+                    <w:jc w:val="right"/>
+                    <w:jc w:val="center"/>
+                  </w:pPr>
+                  <w:r>
+                    <w:t xml:space="preserve">+0.5</w:t>
+                  </w:r>
+                </w:p>
+              </w:tc>
+            </w:tr>
+            <w:tr>
+              <w:tc>
+                <w:tcPr/>
+                <w:p>
+                  <w:pPr>
+                    <w:pStyle w:val="Compact"/>
+                    <w:jc w:val="right"/>
+                    <w:jc w:val="center"/>
+                  </w:pPr>
+                  <w:r>
+                    <w:t xml:space="preserve">9</w:t>
+                  </w:r>
+                </w:p>
+              </w:tc>
+              <w:tc>
+                <w:tcPr/>
+                <w:p>
+                  <w:pPr>
+                    <w:pStyle w:val="Compact"/>
+                    <w:jc w:val="left"/>
+                    <w:jc w:val="center"/>
+                  </w:pPr>
+                  <w:r>
+                    <w:t xml:space="preserve">Patcham High School</w:t>
+                  </w:r>
+                </w:p>
+              </w:tc>
+              <w:tc>
+                <w:tcPr/>
+                <w:p>
+                  <w:pPr>
+                    <w:pStyle w:val="Compact"/>
+                    <w:jc w:val="right"/>
+                    <w:jc w:val="center"/>
+                  </w:pPr>
+                  <w:r>
+                    <w:t xml:space="preserve">+3.8</w:t>
+                  </w:r>
+                </w:p>
+              </w:tc>
+              <w:tc>
+                <w:tcPr/>
+                <w:p>
+                  <w:pPr>
+                    <w:pStyle w:val="Compact"/>
+                    <w:jc w:val="right"/>
+                    <w:jc w:val="center"/>
+                  </w:pPr>
+                  <w:r>
+                    <w:t xml:space="preserve">+1.6</w:t>
+                  </w:r>
+                </w:p>
+              </w:tc>
+              <w:tc>
+                <w:tcPr/>
+                <w:p>
+                  <w:pPr>
+                    <w:pStyle w:val="Compact"/>
+                    <w:jc w:val="right"/>
+                    <w:jc w:val="center"/>
+                  </w:pPr>
+                  <w:r>
+                    <w:t xml:space="preserve">-11.9</w:t>
+                  </w:r>
+                </w:p>
+              </w:tc>
+              <w:tc>
+                <w:tcPr/>
+                <w:p>
+                  <w:pPr>
+                    <w:pStyle w:val="Compact"/>
+                    <w:jc w:val="right"/>
+                    <w:jc w:val="center"/>
+                  </w:pPr>
+                  <w:r>
+                    <w:t xml:space="preserve">-3.7</w:t>
+                  </w:r>
+                </w:p>
+              </w:tc>
+              <w:tc>
+                <w:tcPr/>
+                <w:p>
+                  <w:pPr>
+                    <w:pStyle w:val="Compact"/>
+                    <w:jc w:val="right"/>
+                    <w:jc w:val="center"/>
+                  </w:pPr>
+                  <w:r>
+                    <w:t xml:space="preserve">-2.6</w:t>
+                  </w:r>
+                </w:p>
+              </w:tc>
+            </w:tr>
+            <w:tr>
+              <w:tc>
+                <w:tcPr/>
+                <w:p>
+                  <w:pPr>
+                    <w:pStyle w:val="Compact"/>
+                    <w:jc w:val="right"/>
+                    <w:jc w:val="center"/>
+                  </w:pPr>
+                  <w:r>
+                    <w:t xml:space="preserve">10</w:t>
+                  </w:r>
+                </w:p>
+              </w:tc>
+              <w:tc>
+                <w:tcPr/>
+                <w:p>
+                  <w:pPr>
+                    <w:pStyle w:val="Compact"/>
+                    <w:jc w:val="left"/>
+                    <w:jc w:val="center"/>
+                  </w:pPr>
+                  <w:r>
+                    <w:t xml:space="preserve">Longhill High School</w:t>
+                  </w:r>
+                </w:p>
+              </w:tc>
+              <w:tc>
+                <w:tcPr/>
+                <w:p>
+                  <w:pPr>
+                    <w:pStyle w:val="Compact"/>
+                    <w:jc w:val="right"/>
+                    <w:jc w:val="center"/>
+                  </w:pPr>
+                  <w:r>
+                    <w:t xml:space="preserve">-4.6</w:t>
+                  </w:r>
+                </w:p>
+              </w:tc>
+              <w:tc>
+                <w:tcPr/>
+                <w:p>
+                  <w:pPr>
+                    <w:pStyle w:val="Compact"/>
+                    <w:jc w:val="right"/>
+                    <w:jc w:val="center"/>
+                  </w:pPr>
+                  <w:r>
+                    <w:t xml:space="preserve">-6.2</w:t>
+                  </w:r>
+                </w:p>
+              </w:tc>
+              <w:tc>
+                <w:tcPr/>
+                <w:p>
+                  <w:pPr>
+                    <w:pStyle w:val="Compact"/>
+                    <w:jc w:val="right"/>
+                    <w:jc w:val="center"/>
+                  </w:pPr>
+                  <w:r>
+                    <w:t xml:space="preserve">+0.8</w:t>
+                  </w:r>
+                </w:p>
+              </w:tc>
+              <w:tc>
+                <w:tcPr/>
+                <w:p>
+                  <w:pPr>
+                    <w:pStyle w:val="Compact"/>
+                    <w:jc w:val="right"/>
+                    <w:jc w:val="center"/>
+                  </w:pPr>
+                  <w:r>
+                    <w:t xml:space="preserve">-1.4</w:t>
+                  </w:r>
+                </w:p>
+              </w:tc>
+              <w:tc>
+                <w:tcPr/>
+                <w:p>
+                  <w:pPr>
+                    <w:pStyle w:val="Compact"/>
+                    <w:jc w:val="right"/>
+                    <w:jc w:val="center"/>
+                  </w:pPr>
+                  <w:r>
+                    <w:t xml:space="preserve">-2.9</w:t>
+                  </w:r>
+                </w:p>
+              </w:tc>
+            </w:tr>
+          </w:tbl>
           <w:bookmarkEnd w:id="77"/>
+          <w:p/>
         </w:tc>
       </w:tr>
     </w:tbl>

</xml_diff>

<commit_message>
Update JEP Paper and sync PDF to docs/
Co-Authored-By: Claude Opus 4.6 <noreply@anthropic.com>
</commit_message>
<xml_diff>
--- a/JEP_Paper.docx
+++ b/JEP_Paper.docx
@@ -55,7 +55,7 @@
         <w:pStyle w:val="Date"/>
       </w:pPr>
       <w:r>
-        <w:t xml:space="preserve">2026-04-07</w:t>
+        <w:t xml:space="preserve">2026-04-08</w:t>
       </w:r>
     </w:p>
     <w:p>
@@ -71,7 +71,7 @@
         <w:pStyle w:val="Abstract"/>
       </w:pPr>
       <w:r>
-        <w:t xml:space="preserve">The UK Government’s 2026 schools white paper sets ambitious targets including halving the disadvantage attainment gap. Achieving improvements in disadvantaged student attainment requires local education authorities to understand their local situations and the specific drivers in their areas. But it is all to easy to pull the wrong policy lever when information and intelligence is incomplete. Recent experiences in Brighton and Hove have highlighted the gap between open data and actionable intelligence for Policy Makers, Schools and anyone wanting to actively contribute to statutory public consultations. Intelligence to inform local debates could be available from within freely available online data sources, but is largely hidden within mountains of tabular data and a vast specialist literature. Using multilevel linear mixed effects models fitted to all state-funded secondary schools in England over four years (2021–22 to 2024–25), we show that school-level Attainment 8 is highly predictable from a small number of readily available variables, but non-linearities mean understanding local context is key. We apply these models to a case study of Brighton and Hove, where admissions policy proposals in 2024 were designed around the premise that attainment was</w:t>
+        <w:t xml:space="preserve">The UK Government’s 2026 schools white paper sets ambitious targets including halving the disadvantage attainment gap. Achieving improvements in disadvantaged student attainment requires local education authorities to understand their local situations and the specific drivers in their areas. But it is all too easy to pull the wrong policy lever when information and intelligence is incomplete. Recent experiences in Brighton and Hove have highlighted the gap between open data and actionable intelligence for Policy Makers, Schools and anyone wanting to actively contribute to statutory public consultations. Intelligence to inform local debates could be available from within freely available online data sources, but is largely hidden within mountains of tabular data and a vast specialist literature. Using multilevel linear mixed effects models fitted to all state-funded secondary schools in England over four years (2021–22 to 2024–25), we show that school-level Attainment 8 is highly predictable from a small number of readily available variables, but non-linearities mean understanding local context is key. We apply these models to a case study of Brighton and Hove, where admissions policy proposals in 2024 were designed around the premise that attainment was</w:t>
       </w:r>
       <w:r>
         <w:t xml:space="preserve"> </w:t>
@@ -7309,7 +7309,16 @@
         <w:pStyle w:val="FirstParagraph"/>
       </w:pPr>
       <w:r>
-        <w:t xml:space="preserve">Development of the Policy Simulator tool was substantially accelerated by large language model assistance (Anthropic’s Claude) as part of work supported by the UKRI National AI Research Hub for Collective Intelligence (AI4CI).</w:t>
+        <w:t xml:space="preserve">Development of the Policy Simulator tool was substantially accelerated by large language model assistance (Anthropic’s Claude) as part of work supported by the UKRI National AI Research Hub for Collective Intelligence (AI4CI). All of this work has been co-designed through many hours of conversations over the last 18 months or so with a group of parents in Brighton and Hove who have come together under the banner of the</w:t>
+      </w:r>
+      <w:r>
+        <w:t xml:space="preserve"> </w:t>
+      </w:r>
+      <w:r>
+        <w:t xml:space="preserve">‘Parent Support Group’</w:t>
+      </w:r>
+      <w:r>
+        <w:t xml:space="preserve">. The range of perspectives and breath of expertise within this group has been inspirational.</w:t>
       </w:r>
     </w:p>
     <w:bookmarkEnd w:id="94"/>

</xml_diff>

<commit_message>
Re-render all reports, slides and PDFs
Refresh HTML renders for main report, full slides, short slides and
brighton_case_study, plus PDFs for the main report and JEP paper.

Co-Authored-By: Claude Opus 4.6 <noreply@anthropic.com>
</commit_message>
<xml_diff>
--- a/JEP_Paper.docx
+++ b/JEP_Paper.docx
@@ -7,7 +7,7 @@
         <w:pStyle w:val="Title"/>
       </w:pPr>
       <w:r>
-        <w:t xml:space="preserve">Pulling the Wrong Lever: School Attainment, Open Data Analytics and Local Education Policy in England</w:t>
+        <w:t xml:space="preserve">How to Pull the Right Lever: School Attainment, Open Data Analytics and Local Education Policy in England</w:t>
       </w:r>
     </w:p>
     <w:p>
@@ -31,22 +31,6 @@
         <w:pStyle w:val="Author"/>
       </w:pPr>
       <w:r>
-        <w:t xml:space="preserve">Natasha Priest</w:t>
-      </w:r>
-    </w:p>
-    <w:p>
-      <w:pPr>
-        <w:pStyle w:val="Author"/>
-      </w:pPr>
-      <w:r>
-        <w:t xml:space="preserve">Tom Harrison</w:t>
-      </w:r>
-    </w:p>
-    <w:p>
-      <w:pPr>
-        <w:pStyle w:val="Author"/>
-      </w:pPr>
-      <w:r>
         <w:t xml:space="preserve">Dan Campbell-Meiklejohn</w:t>
       </w:r>
     </w:p>
@@ -55,7 +39,7 @@
         <w:pStyle w:val="Date"/>
       </w:pPr>
       <w:r>
-        <w:t xml:space="preserve">2026-04-08</w:t>
+        <w:t xml:space="preserve">2026-04-14</w:t>
       </w:r>
     </w:p>
     <w:p>
@@ -71,7 +55,85 @@
         <w:pStyle w:val="Abstract"/>
       </w:pPr>
       <w:r>
-        <w:t xml:space="preserve">The UK Government’s 2026 schools white paper sets ambitious targets including halving the disadvantage attainment gap. Achieving improvements in disadvantaged student attainment requires local education authorities to understand their local situations and the specific drivers in their areas. But it is all too easy to pull the wrong policy lever when information and intelligence is incomplete. Recent experiences in Brighton and Hove have highlighted the gap between open data and actionable intelligence for Policy Makers, Schools and anyone wanting to actively contribute to statutory public consultations. Intelligence to inform local debates could be available from within freely available online data sources, but is largely hidden within mountains of tabular data and a vast specialist literature. Using multilevel linear mixed effects models fitted to all state-funded secondary schools in England over four years (2021–22 to 2024–25), we show that school-level Attainment 8 is highly predictable from a small number of readily available variables, but non-linearities mean understanding local context is key. We apply these models to a case study of Brighton and Hove, where admissions policy proposals in 2024 were designed around the premise that attainment was</w:t>
+        <w:t xml:space="preserve">In its 2026 White Paper, the UK government has set a worthwhile and ambitious target to halve the disadvantage attainment gap in education. Achieving improvements in disadvantaged student attainment requires local education authorities to understand their local situations and the specific drivers in their areas. But it is all too easy to pull the wrong policy lever when the research is complex and local intelligence is incomplete. Recent experiences in Brighton and Hove have highlighted the gap between open data and actionable information for Policy Makers, Schools and anyone wanting to actively contribute to statutory public consultations. Intelligence to inform local debates could be available from within freely available online data sources, but is largely hidden within mountains of tabular data and a vast specialist literature. Using multilevel linear mixed effects models fitted to all state-funded secondary schools in England over four years (2021–22 to 2024–25), we show that school-level Attainment 8 is highly predictable from a small number of readily available variables, but non-linearities mean understanding local context is key. We apply these models to a case study of Brighton and Hove, where admissions policy proposals in 2024 were designed around the premise that attainment would be reduced by moving children around a large city to increase mixing of socioeconomic status in schools. Our analysis revealed this policy would likely have little impact on attainment in the context of the city, but have considerable social costs. In contrast, Brighton and Hove has the second worst absence rate in England. The council policy was pulling a costly lever with relatively little mechanical advantage while ignoring one with considerably more. We argue that the Department for Education’s open data provides the raw materials for better local policy making, but a crucial gap exists between available data and accessible, contextualised intelligence - a gap we address with a new Policy Simulator tool.</w:t>
+      </w:r>
+    </w:p>
+    <w:bookmarkStart w:id="22" w:name="introduction"/>
+    <w:p>
+      <w:pPr>
+        <w:pStyle w:val="Heading1"/>
+      </w:pPr>
+      <w:r>
+        <w:t xml:space="preserve">1. Introduction</w:t>
+      </w:r>
+    </w:p>
+    <w:p>
+      <w:pPr>
+        <w:pStyle w:val="FirstParagraph"/>
+      </w:pPr>
+      <w:r>
+        <w:t xml:space="preserve">Pupil outcomes, including attainment, are a recurrent policy theme given the established links to individual life outcomes</w:t>
+      </w:r>
+      <w:r>
+        <w:t xml:space="preserve"> </w:t>
+      </w:r>
+      <w:r>
+        <w:t xml:space="preserve">(Farquharson et al. 2024)</w:t>
+      </w:r>
+      <w:r>
+        <w:t xml:space="preserve"> </w:t>
+      </w:r>
+      <w:r>
+        <w:t xml:space="preserve">and our collective national success through measures such as economic productivity</w:t>
+      </w:r>
+      <w:r>
+        <w:t xml:space="preserve"> </w:t>
+      </w:r>
+      <w:r>
+        <w:t xml:space="preserve">(Grant 2017)</w:t>
+      </w:r>
+      <w:r>
+        <w:t xml:space="preserve">. The UK Government’s 2026 schools white paper</w:t>
+      </w:r>
+      <w:r>
+        <w:t xml:space="preserve"> </w:t>
+      </w:r>
+      <w:r>
+        <w:t xml:space="preserve">(DfE 2026)</w:t>
+      </w:r>
+      <w:r>
+        <w:t xml:space="preserve"> </w:t>
+      </w:r>
+      <w:r>
+        <w:t xml:space="preserve">sets ambitious targets including halving the disadvantage attainment gap, improving attendance, reforming admissions and tackling place-based disadvantage. These ambitions will require local education authorities (LEAs) to understand the specific drivers of attainment in their areas and choose interventions accordingly.</w:t>
+      </w:r>
+    </w:p>
+    <w:p>
+      <w:pPr>
+        <w:pStyle w:val="BodyText"/>
+      </w:pPr>
+      <w:r>
+        <w:t xml:space="preserve">This paper argues that the Department for Education’s (DfE) open data provides most of the raw materials needed for such nuanced localised understanding, but a crucial gap exists between data availability and accessible, contextualised intelligence for decision makers. We demonstrate this through an analysis of school-level attainment across England, combined with a case study of Brighton and Hove where secondary school admissions policy proposals in 2024–25 were designed around the wrong local attainment drivers, which would not have occurred if the policy was directly informed by the available data.</w:t>
+      </w:r>
+    </w:p>
+    <w:p>
+      <w:pPr>
+        <w:pStyle w:val="BodyText"/>
+      </w:pPr>
+      <w:r>
+        <w:t xml:space="preserve">Brighton and Hove provides a particularly instructive case. The city already has a distinctive and progressive admissions landscape featuring catchment areas with a lottery tie-break for oversubscribed schools, introduced following a secondary school closure in 2005</w:t>
+      </w:r>
+      <w:r>
+        <w:t xml:space="preserve"> </w:t>
+      </w:r>
+      <w:r>
+        <w:t xml:space="preserve">(Allen et al. 2013)</w:t>
+      </w:r>
+      <w:r>
+        <w:t xml:space="preserve"> </w:t>
+      </w:r>
+      <w:r>
+        <w:t xml:space="preserve">and an admissions priority for those on Free School Meals in all of its community schools. In 2024, the council launched proposals to shake things up even further by reducing Published Admission Numbers at popular central-catchment schools (and keeping them higher at less popular under-subscribed schools), reserving a number of places for out-of-catchment children in central catchments, ahead of in-catchment children and altering the catchment areas in the city. These new policy proposals were promoted to the public as premised on the assumption that attainment in the city was</w:t>
       </w:r>
       <w:r>
         <w:t xml:space="preserve"> </w:t>
@@ -80,16 +142,141 @@
         <w:t xml:space="preserve">‘driven by economic advantage’</w:t>
       </w:r>
       <w:r>
-        <w:t xml:space="preserve">. Our analysis reveals that the city ranks among the highest-performing local authorities once structural factors are accounted for, but has the second worst absence rate in England. The policy as designed was pulling a lever with relatively little mechanical advantage while ignoring one with considerably more. We argue that the Department for Education’s open data provides the raw materials for better local policy making, but a crucial gap exists between available data and accessible, contextualised intelligence - a gap we address with a new Policy Simulator tool.</w:t>
-      </w:r>
-    </w:p>
-    <w:bookmarkStart w:id="22" w:name="introduction"/>
+        <w:t xml:space="preserve"> </w:t>
+      </w:r>
+      <w:r>
+        <w:t xml:space="preserve">and that redistributing pupils around the city would narrow the attainment gap. The response to the consultation was overwhelmingly negative from parents and schools alike, yet many did not have the tools to effectively challenge the council’s narrative and the core policy direction persisted - albeit eventually slightly watered down from the initial proposals.</w:t>
+      </w:r>
+    </w:p>
+    <w:p>
+      <w:pPr>
+        <w:pStyle w:val="BodyText"/>
+      </w:pPr>
+      <w:r>
+        <w:t xml:space="preserve">Raw data on the attainment gap, without context, was used by the local council as partial justification for the policies proposed. The city noted a correlation between concentration of disadvantage in schools, geography, and lower attainment. This was painted by the policy makers as a failure in need of urgent action to counter the assumed impact of economic advantage on school admissions. Due to the assumed dominance of the impact of economic advantage, the impacts of long school journeys to schools outside of local communities on safety, attainment, environment and wellbeing of affected children were not scrutinised in depth. It is our proposal that detailed data and analytics about the local situation would have led to a different frame of the city’s situation. Some rapidly produced analysis was put into the public domain by some of the authors of this paper</w:t>
+      </w:r>
+      <w:r>
+        <w:rPr>
+          <w:rStyle w:val="FootnoteReference"/>
+        </w:rPr>
+        <w:footnoteReference w:id="20"/>
+      </w:r>
+      <w:r>
+        <w:t xml:space="preserve">, but this was produced as a response to, rather than contributing to, the creation of the policy. Consistent with the national picture, there is an attainment gap in Brighton and Hove. However, what we (the citizens of Brighton and Hove, including the local councillors developing policy) didn’t know it at the time, was prior to the policy proposals Brighton and Hove was one of the best performing Local Education Authorities in the Country for both disadvantaged (7th out of 152) and non-disadvantaged (5th out of 152) GCSE attainment, once you account for the factors we know influence that attainment. With this knowledge, the approach to improving outcomes for disadvantaged pupils could have been more effective by asking, for example,</w:t>
+      </w:r>
+      <w:r>
+        <w:t xml:space="preserve"> </w:t>
+      </w:r>
+      <w:r>
+        <w:t xml:space="preserve">“what can we learn from what the city is doing right?”</w:t>
+      </w:r>
+      <w:r>
+        <w:t xml:space="preserve"> </w:t>
+      </w:r>
+      <w:r>
+        <w:t xml:space="preserve">and</w:t>
+      </w:r>
+      <w:r>
+        <w:t xml:space="preserve"> </w:t>
+      </w:r>
+      <w:r>
+        <w:t xml:space="preserve">“would asking pupils to travel out of their communities to schools jeopardise this success?”</w:t>
+      </w:r>
+      <w:r>
+        <w:t xml:space="preserve"> </w:t>
+      </w:r>
+      <w:r>
+        <w:t xml:space="preserve">While we can’t know if open, accessible, location-specific analysis would have resulted in a change of policy direction, it would have facilitated far more informed policy development.</w:t>
+      </w:r>
+    </w:p>
+    <w:p>
+      <w:pPr>
+        <w:pStyle w:val="BodyText"/>
+      </w:pPr>
+      <w:r>
+        <w:t xml:space="preserve">The discussions that led to this paper took place over an 18 month period spanning the 2024 and 2025 secondary school admissions consultation in the city with a wide group of parents and stakeholders. Some were academics, some experienced in national policy making, some involved in school governance and teaching, others worked for the council in different capacities and others would simply identify as concerned parents. This diverse positionality motivates the analysis: we argue that better analytical tools, applied to readily available open data, could have substantially improved the quality of the policy debate and may have resulted in better policy formation.</w:t>
+      </w:r>
+    </w:p>
+    <w:p>
+      <w:pPr>
+        <w:pStyle w:val="BodyText"/>
+      </w:pPr>
+      <w:r>
+        <w:t xml:space="preserve">We are not claiming that the model outlined in this paper is the best possible or that our variable selection is optimal, or indeed novel (the variables and effects are very similar to those reported by</w:t>
+      </w:r>
+      <w:r>
+        <w:t xml:space="preserve"> </w:t>
+      </w:r>
+      <w:r>
+        <w:t xml:space="preserve">Macleod et al. (2015)</w:t>
+      </w:r>
+      <w:r>
+        <w:t xml:space="preserve"> </w:t>
+      </w:r>
+      <w:r>
+        <w:t xml:space="preserve">over 10 years ago). Our intention is to show that with open, freely available data and variables that are along the right lines, it is possible to build a model explaining over 80% of the variation in school-level attainment with just a handful of predictors. Then, when we know the vast majority of influences on attainment and how they interact in different local contexts, we can answer locally targeted questions such as:</w:t>
+      </w:r>
+      <w:r>
+        <w:t xml:space="preserve"> </w:t>
+      </w:r>
+      <w:r>
+        <w:t xml:space="preserve">‘is changing the social mix in schools likely to improve disadvantaged attainment?’</w:t>
+      </w:r>
+      <w:r>
+        <w:t xml:space="preserve">,</w:t>
+      </w:r>
+      <w:r>
+        <w:t xml:space="preserve"> </w:t>
+      </w:r>
+      <w:r>
+        <w:t xml:space="preserve">‘what is the most important factor affecting attainment in a particular LEA?’</w:t>
+      </w:r>
+      <w:r>
+        <w:t xml:space="preserve">, and</w:t>
+      </w:r>
+      <w:r>
+        <w:t xml:space="preserve"> </w:t>
+      </w:r>
+      <w:r>
+        <w:t xml:space="preserve">‘which schools are doing better or worse than expected?’</w:t>
+      </w:r>
+      <w:r>
+        <w:t xml:space="preserve">.</w:t>
+      </w:r>
+    </w:p>
+    <w:p>
+      <w:pPr>
+        <w:pStyle w:val="BodyText"/>
+      </w:pPr>
+      <w:r>
+        <w:t xml:space="preserve">We are also acutely aware that statistical analysis does not always translate effectively into accessible policy relevant intelligence. While the reporting of standard deviation improvements is more statistically sound, trying to translate such an effect into a tangible outcome would be a challenge for most. Therefore in this paper we try to present the effects we observe in more readily understandable GCSE points so that they have more real-world meaning and potentially more resonance with policy makers.</w:t>
+      </w:r>
+    </w:p>
+    <w:p>
+      <w:pPr>
+        <w:pStyle w:val="BodyText"/>
+      </w:pPr>
+      <w:r>
+        <w:t xml:space="preserve">The paper proceeds as follows. We briefly review the literature on secondary school attainment drivers, then outline our modelling approach using DfE open data. We present results showing which factors matter most and how they interact, before applying these findings to Brighton and Hove. We conclude with implications for local and national education policy.</w:t>
+      </w:r>
+    </w:p>
+    <w:bookmarkEnd w:id="22"/>
+    <w:bookmarkStart w:id="28" w:name="literature-review"/>
     <w:p>
       <w:pPr>
         <w:pStyle w:val="Heading1"/>
       </w:pPr>
       <w:r>
-        <w:t xml:space="preserve">1. Introduction</w:t>
+        <w:t xml:space="preserve">2. Literature review</w:t>
+      </w:r>
+    </w:p>
+    <w:bookmarkStart w:id="25" w:name="X27e2b6e819b781033a4a4801b80f2ee81de4995"/>
+    <w:p>
+      <w:pPr>
+        <w:pStyle w:val="Heading2"/>
+      </w:pPr>
+      <w:r>
+        <w:t xml:space="preserve">2.1 Socio-economic background and disadvantage</w:t>
       </w:r>
     </w:p>
     <w:p>
@@ -97,40 +284,28 @@
         <w:pStyle w:val="FirstParagraph"/>
       </w:pPr>
       <w:r>
-        <w:t xml:space="preserve">Pupil outcomes, including attainment, are a recurrent policy theme given the established links to individual life outcomes</w:t>
-      </w:r>
-      <w:r>
-        <w:t xml:space="preserve"> </w:t>
-      </w:r>
-      <w:r>
-        <w:t xml:space="preserve">(Farquharson et al. 2024)</w:t>
-      </w:r>
-      <w:r>
-        <w:t xml:space="preserve"> </w:t>
-      </w:r>
-      <w:r>
-        <w:t xml:space="preserve">and our collective national success through measures such as economic productivity</w:t>
-      </w:r>
-      <w:r>
-        <w:t xml:space="preserve"> </w:t>
-      </w:r>
-      <w:r>
-        <w:t xml:space="preserve">(Grant 2017)</w:t>
-      </w:r>
-      <w:r>
-        <w:t xml:space="preserve">. The UK Government’s 2026 schools white paper</w:t>
-      </w:r>
-      <w:r>
-        <w:t xml:space="preserve"> </w:t>
-      </w:r>
-      <w:r>
-        <w:t xml:space="preserve">(DfE 2026)</w:t>
-      </w:r>
-      <w:r>
-        <w:t xml:space="preserve"> </w:t>
-      </w:r>
-      <w:r>
-        <w:t xml:space="preserve">sets ambitious targets including halving the disadvantage attainment gap, improving attendance, reforming admissions and tackling place-based disadvantage. These ambitions will require local education authorities (LEAs) to understand the specific drivers of attainment in their areas and choose interventions accordingly.</w:t>
+        <w:t xml:space="preserve">The Education Policy Institute’s annual reports document that by the time pupils sit their GCSEs (the General Certificate of Secondary Education - the exam most students in England sit at age 16), disadvantaged pupils are on average around 18 months of learning behind their more affluent peers, a gap that narrowed modestly after 2011 but partially reversed following the COVID-19 pandemic</w:t>
+      </w:r>
+      <w:r>
+        <w:t xml:space="preserve"> </w:t>
+      </w:r>
+      <w:r>
+        <w:t xml:space="preserve">(Tuckett et al. 2023)</w:t>
+      </w:r>
+      <w:r>
+        <w:t xml:space="preserve">. It is this</w:t>
+      </w:r>
+      <w:r>
+        <w:t xml:space="preserve"> </w:t>
+      </w:r>
+      <w:r>
+        <w:t xml:space="preserve">‘attainment-gap’</w:t>
+      </w:r>
+      <w:r>
+        <w:t xml:space="preserve"> </w:t>
+      </w:r>
+      <w:r>
+        <w:t xml:space="preserve">which has remained stubbornly persistent for many years and that the recent government white paper has resolved to try and tackle. The size of the gap and the reasons behind it are complex and vary from place to place, but its existence has spawned large volumes of literature delving into disadvantage and attainment.</w:t>
       </w:r>
     </w:p>
     <w:p>
@@ -138,7 +313,19 @@
         <w:pStyle w:val="BodyText"/>
       </w:pPr>
       <w:r>
-        <w:t xml:space="preserve">This paper argues that the Department for Education’s (DfE) open data provides most of the raw materials needed for such nuanced localised understanding, but a crucial gap exists between data availability and accessible, contextualised intelligence for decision makers. We demonstrate this through an analysis of school-level attainment across England, combined with a case study of Brighton and Hove where secondary school admissions policy proposals in 2024–25 were designed around a flawed understanding of local attainment drivers.</w:t>
+        <w:t xml:space="preserve">Free School Meal (FSM) eligibility serves as the standard proxy for disadvantage, though its limitations are well established. For example,</w:t>
+      </w:r>
+      <w:r>
+        <w:t xml:space="preserve"> </w:t>
+      </w:r>
+      <w:r>
+        <w:t xml:space="preserve">Stopforth and Gayle (2025)</w:t>
+      </w:r>
+      <w:r>
+        <w:t xml:space="preserve"> </w:t>
+      </w:r>
+      <w:r>
+        <w:t xml:space="preserve">demonstrate that finer-grained measures of parental social class reveal persistent attainment gaps that FSM-based analyses tend to understate, with the thresholds for FSM eligibility low enough that many students who might otherwise be classed as disadvantaged, are not included in these statistics. Despite this, because eligibility for Free School Meals is regularly recorded at pupil and school levels, it is frequently used as a proxy.</w:t>
       </w:r>
     </w:p>
     <w:p>
@@ -146,31 +333,127 @@
         <w:pStyle w:val="BodyText"/>
       </w:pPr>
       <w:r>
-        <w:t xml:space="preserve">Brighton and Hove provides a particularly instructive case. The city already has a distinctive and progressive admissions landscape featuring catchment areas with a lottery tie-break for oversubscribed schools, introduced following a secondary school closure in 2005</w:t>
-      </w:r>
-      <w:r>
-        <w:t xml:space="preserve"> </w:t>
-      </w:r>
-      <w:r>
-        <w:t xml:space="preserve">(Allen et al. 2013)</w:t>
-      </w:r>
-      <w:r>
-        <w:t xml:space="preserve"> </w:t>
-      </w:r>
-      <w:r>
-        <w:t xml:space="preserve">and an admissions priority for those on Free School Meals in all of its community schools. In 2024, the council launched proposals to shake things up even further by reducing Published Admission Numbers at popular central-catchment schools (and keeping them higher at less popular under-subscribed schools), reserving a number of places for out-of-catchment children in central catchments, ahead of in-catchment children and altering the catchment areas in the city. These new policy proposals were premised on the belief that attainment in the city was</w:t>
-      </w:r>
-      <w:r>
-        <w:t xml:space="preserve"> </w:t>
-      </w:r>
-      <w:r>
-        <w:t xml:space="preserve">‘driven by economic advantage’</w:t>
-      </w:r>
-      <w:r>
-        <w:t xml:space="preserve"> </w:t>
-      </w:r>
-      <w:r>
-        <w:t xml:space="preserve">and that redistributing pupils would narrow the attainment gap. Or at least this was how it was presented to parents in the city at public meetings ahead of the statutory consultation. The response to the consultation was overwhelmingly negative from parents and schools alike, yet many did not have the tools to effectively challenge the council’s narrative and the core policy direction persisted - albeit eventually slightly watered down from the initial proposals.</w:t>
+        <w:t xml:space="preserve">A crucial dimension is that inequalities in outcomes between disadvantaged and non-disadvantaged students at GCSE level are substantially mediated by prior attainment at National Curriculum Key Stage 2 (KS2 - the latter stages of Primary School from ages 7 to 11</w:t>
+      </w:r>
+      <w:r>
+        <w:rPr>
+          <w:rStyle w:val="FootnoteReference"/>
+        </w:rPr>
+        <w:footnoteReference w:id="23"/>
+      </w:r>
+      <w:r>
+        <w:t xml:space="preserve">). Prior attainment at KS2 reflects accumulated inequalities from before secondary school</w:t>
+      </w:r>
+      <w:r>
+        <w:t xml:space="preserve"> </w:t>
+      </w:r>
+      <w:r>
+        <w:t xml:space="preserve">(Stopforth and Gayle 2025)</w:t>
+      </w:r>
+      <w:r>
+        <w:t xml:space="preserve">, and</w:t>
+      </w:r>
+      <w:r>
+        <w:t xml:space="preserve"> </w:t>
+      </w:r>
+      <w:r>
+        <w:t xml:space="preserve">Gorard and Siddiqui (2019)</w:t>
+      </w:r>
+      <w:r>
+        <w:t xml:space="preserve"> </w:t>
+      </w:r>
+      <w:r>
+        <w:t xml:space="preserve">show that the duration of disadvantage is a stronger predictor than disadvantage at any single point. We will return to this later in the paper, however</w:t>
+      </w:r>
+      <w:r>
+        <w:t xml:space="preserve"> </w:t>
+      </w:r>
+      <w:r>
+        <w:t xml:space="preserve">Gorard and Siddiqui (2019)</w:t>
+      </w:r>
+      <w:r>
+        <w:t xml:space="preserve"> </w:t>
+      </w:r>
+      <w:r>
+        <w:t xml:space="preserve">take their focus on disadvantage further and also propose that pupils do worse in schools with higher concentrations of disadvantage, estimating improvements in grades of 0.05–0.15 standard deviations from greater social mixing. While they don’t translate this effect, it works out at approximately one GCSE grade in one subject (most students take around 8-10 GCSE subjects in total). One seductive policy point they make in their paper is that additional mixing can be achieved at</w:t>
+      </w:r>
+      <w:r>
+        <w:t xml:space="preserve"> </w:t>
+      </w:r>
+      <w:r>
+        <w:t xml:space="preserve">‘almost no cost’</w:t>
+      </w:r>
+      <w:r>
+        <w:t xml:space="preserve">. However this is a conjecture that overlooks the real-world consequences for communities, particularly where local social geographies might mean that de-concentration might require children travelling long distances, either by choice or because they are no longer able to attend their most local school.</w:t>
+      </w:r>
+    </w:p>
+    <w:bookmarkEnd w:id="25"/>
+    <w:bookmarkStart w:id="26" w:name="attendance"/>
+    <w:p>
+      <w:pPr>
+        <w:pStyle w:val="Heading2"/>
+      </w:pPr>
+      <w:r>
+        <w:t xml:space="preserve">2.2 Attendance</w:t>
+      </w:r>
+    </w:p>
+    <w:p>
+      <w:pPr>
+        <w:pStyle w:val="FirstParagraph"/>
+      </w:pPr>
+      <w:r>
+        <w:t xml:space="preserve">School attendance is among the strongest predictors of attainment and this comes through strongly in the literature. DfE analysis of 2018/19 data</w:t>
+      </w:r>
+      <w:r>
+        <w:t xml:space="preserve"> </w:t>
+      </w:r>
+      <w:r>
+        <w:t xml:space="preserve">(DfE 2022)</w:t>
+      </w:r>
+      <w:r>
+        <w:t xml:space="preserve"> </w:t>
+      </w:r>
+      <w:r>
+        <w:t xml:space="preserve">documents a stark gradient: among persistently absent pupils, only 35.6% achieved a standard pass in English and Maths, compared with 83.7% among those with no recorded absences. More recent analysis finds that pupils with near-perfect attendance were 1.9 times as likely to achieve a grade 5 pass compared with otherwise similar pupils attending 90–95% of the time</w:t>
+      </w:r>
+      <w:r>
+        <w:t xml:space="preserve"> </w:t>
+      </w:r>
+      <w:r>
+        <w:t xml:space="preserve">(DfE 2025a)</w:t>
+      </w:r>
+      <w:r>
+        <w:t xml:space="preserve">.</w:t>
+      </w:r>
+      <w:r>
+        <w:t xml:space="preserve"> </w:t>
+      </w:r>
+      <w:r>
+        <w:t xml:space="preserve">Dräger et al. (2024)</w:t>
+      </w:r>
+      <w:r>
+        <w:t xml:space="preserve">, using the 1970 British Cohort Study, find that absences at age 10 are associated with lower educational attainment in adulthood. The Social Mobility Commission</w:t>
+      </w:r>
+      <w:r>
+        <w:t xml:space="preserve"> </w:t>
+      </w:r>
+      <w:r>
+        <w:t xml:space="preserve">(Riordan et al. 2021)</w:t>
+      </w:r>
+      <w:r>
+        <w:t xml:space="preserve"> </w:t>
+      </w:r>
+      <w:r>
+        <w:t xml:space="preserve">conclude that the correlation between attendance and progress is</w:t>
+      </w:r>
+      <w:r>
+        <w:t xml:space="preserve"> </w:t>
+      </w:r>
+      <w:r>
+        <w:t xml:space="preserve">‘most likely to be causal’</w:t>
+      </w:r>
+      <w:r>
+        <w:t xml:space="preserve">.</w:t>
       </w:r>
     </w:p>
     <w:p>
@@ -178,478 +461,203 @@
         <w:pStyle w:val="BodyText"/>
       </w:pPr>
       <w:r>
-        <w:t xml:space="preserve">Detailed data and analytics about the particular local situation were not available at the time and could not be used to contribute to the debate. Some rapidly produced analysis was put into the public domain by some of the authors of this paper</w:t>
+        <w:t xml:space="preserve">Post-pandemic persistent absence has risen sharply, from around 10.5% pre-pandemic to approximately 21.9% in secondary schools by 2023/24, with rates for FSM-eligible pupils around 32%</w:t>
+      </w:r>
+      <w:r>
+        <w:t xml:space="preserve"> </w:t>
+      </w:r>
+      <w:r>
+        <w:t xml:space="preserve">(DfE 2025b)</w:t>
+      </w:r>
+      <w:r>
+        <w:t xml:space="preserve">. This compounds the challenge of disentangling school-level from pupil-level effects.</w:t>
+      </w:r>
+    </w:p>
+    <w:bookmarkEnd w:id="26"/>
+    <w:bookmarkStart w:id="27" w:name="other-factors"/>
+    <w:p>
+      <w:pPr>
+        <w:pStyle w:val="Heading2"/>
+      </w:pPr>
+      <w:r>
+        <w:t xml:space="preserve">2.3 Other factors</w:t>
+      </w:r>
+    </w:p>
+    <w:p>
+      <w:pPr>
+        <w:pStyle w:val="FirstParagraph"/>
+      </w:pPr>
+      <w:r>
+        <w:t xml:space="preserve">Ethnic inequalities are persistent</w:t>
+      </w:r>
+      <w:r>
+        <w:t xml:space="preserve"> </w:t>
+      </w:r>
+      <w:r>
+        <w:t xml:space="preserve">(Gillborn et al. 2017)</w:t>
+      </w:r>
+      <w:r>
+        <w:t xml:space="preserve">, though</w:t>
+      </w:r>
+      <w:r>
+        <w:t xml:space="preserve"> </w:t>
+      </w:r>
+      <w:r>
+        <w:t xml:space="preserve">Gorard et al. (2025)</w:t>
+      </w:r>
+      <w:r>
+        <w:t xml:space="preserve"> </w:t>
+      </w:r>
+      <w:r>
+        <w:t xml:space="preserve">show these are substantially reduced when controlling for pupil-level characteristics. The under-performance of disadvantaged White British pupils, particularly boys, has attracted policy attention, with causes contested between place-based deprivation and cultural factors</w:t>
+      </w:r>
+      <w:r>
+        <w:t xml:space="preserve"> </w:t>
+      </w:r>
+      <w:r>
+        <w:t xml:space="preserve">(Strand 2021; Commons Education Committee 2021)</w:t>
+      </w:r>
+      <w:r>
+        <w:t xml:space="preserve">.</w:t>
+      </w:r>
+    </w:p>
+    <w:p>
+      <w:pPr>
+        <w:pStyle w:val="BodyText"/>
+      </w:pPr>
+      <w:r>
+        <w:t xml:space="preserve">School-level selectivity inflates raw performance metrics.</w:t>
+      </w:r>
+      <w:r>
+        <w:t xml:space="preserve"> </w:t>
+      </w:r>
+      <w:r>
+        <w:t xml:space="preserve">Anders et al. (2024)</w:t>
+      </w:r>
+      <w:r>
+        <w:t xml:space="preserve"> </w:t>
+      </w:r>
+      <w:r>
+        <w:t xml:space="preserve">find that the private school premium effectively disappears once socio-economic background is controlled for.</w:t>
+      </w:r>
+      <w:r>
+        <w:t xml:space="preserve"> </w:t>
+      </w:r>
+      <w:r>
+        <w:t xml:space="preserve">Simon Burgess et al. (2018)</w:t>
+      </w:r>
+      <w:r>
+        <w:t xml:space="preserve"> </w:t>
+      </w:r>
+      <w:r>
+        <w:t xml:space="preserve">show grammar schools reinforce socio-economic stratification without overall attainment benefits.</w:t>
+      </w:r>
+    </w:p>
+    <w:p>
+      <w:pPr>
+        <w:pStyle w:val="BodyText"/>
+      </w:pPr>
+      <w:r>
+        <w:t xml:space="preserve">Workforce factors including effective leadership</w:t>
+      </w:r>
+      <w:r>
+        <w:t xml:space="preserve"> </w:t>
+      </w:r>
+      <w:r>
+        <w:t xml:space="preserve">(Zuccollo et al. 2023)</w:t>
+      </w:r>
+      <w:r>
+        <w:t xml:space="preserve">, teaching quality</w:t>
+      </w:r>
+      <w:r>
+        <w:t xml:space="preserve"> </w:t>
+      </w:r>
+      <w:r>
+        <w:t xml:space="preserve">(Simon Burgess et al. 2023; S. Burgess et al. 2022)</w:t>
+      </w:r>
+      <w:r>
+        <w:t xml:space="preserve">, and teacher retention</w:t>
+      </w:r>
+      <w:r>
+        <w:t xml:space="preserve"> </w:t>
+      </w:r>
+      <w:r>
+        <w:t xml:space="preserve">(Gibbons et al. 2018; Menzies 2023)</w:t>
+      </w:r>
+      <w:r>
+        <w:t xml:space="preserve"> </w:t>
+      </w:r>
+      <w:r>
+        <w:t xml:space="preserve">contribute to variation in attainment, with effects felt most acutely by disadvantaged students</w:t>
+      </w:r>
+      <w:r>
+        <w:t xml:space="preserve"> </w:t>
+      </w:r>
+      <w:r>
+        <w:t xml:space="preserve">(Allen et al. 2018)</w:t>
+      </w:r>
+      <w:r>
+        <w:t xml:space="preserve">. The</w:t>
+      </w:r>
+      <w:r>
+        <w:t xml:space="preserve"> </w:t>
+      </w:r>
+      <w:r>
+        <w:t xml:space="preserve">‘London Effect’</w:t>
+      </w:r>
+      <w:r>
+        <w:t xml:space="preserve"> </w:t>
+      </w:r>
+      <w:r>
+        <w:t xml:space="preserve">(Ross et al. 2020)</w:t>
+      </w:r>
+      <w:r>
+        <w:t xml:space="preserve"> </w:t>
+      </w:r>
+      <w:r>
+        <w:t xml:space="preserve">reflects a localised concentration of agency factors — parental expectations, homework hours, lower unauthorised absence — rather than a purely geographic phenomenon.</w:t>
+      </w:r>
+    </w:p>
+    <w:p>
+      <w:pPr>
+        <w:pStyle w:val="BodyText"/>
+      </w:pPr>
+      <w:r>
+        <w:t xml:space="preserve">It’s clear from the review above that the factors affecting attainment are multifaceted, complex and interrelated. The research is extensive and many of the drivers well-established and evidenced through high-quality studies on thousands of pupils over long periods of time. As such, with so much evidence on the various different drivers of attainment it can be challenging for anyone comparing different studies to make a judgement on which driver(s) might be most relevant or important in a particular context. To do this, what is required is an analysis which is able to combine as many of these drivers at the same time so that their relative influences and interactions can be assessed concurrently — which is where we now turn.</w:t>
+      </w:r>
+    </w:p>
+    <w:bookmarkEnd w:id="27"/>
+    <w:bookmarkEnd w:id="28"/>
+    <w:bookmarkStart w:id="35" w:name="data-and-methods"/>
+    <w:p>
+      <w:pPr>
+        <w:pStyle w:val="Heading1"/>
+      </w:pPr>
+      <w:r>
+        <w:t xml:space="preserve">3. Data and methods</w:t>
+      </w:r>
+    </w:p>
+    <w:bookmarkStart w:id="31" w:name="data"/>
+    <w:p>
+      <w:pPr>
+        <w:pStyle w:val="Heading2"/>
+      </w:pPr>
+      <w:r>
+        <w:t xml:space="preserve">3.1 Data</w:t>
+      </w:r>
+    </w:p>
+    <w:p>
+      <w:pPr>
+        <w:pStyle w:val="FirstParagraph"/>
+      </w:pPr>
+      <w:r>
+        <w:t xml:space="preserve">The DfE publishes extensive open data on schools via its statistical services. We assembled a panel dataset covering the four post-COVID academic years (2021–22 to 2024–25), linking school performance, absence, pupil population, workforce and Ofsted data. Data pre-processing details are available in the supplementary material.</w:t>
       </w:r>
       <w:r>
         <w:rPr>
           <w:rStyle w:val="FootnoteReference"/>
         </w:rPr>
-        <w:footnoteReference w:id="20"/>
-      </w:r>
-      <w:r>
-        <w:t xml:space="preserve">, but this was too little too late and produced as a response to, rather than contributing to, the creation of policy. We (the citizens of Brighton and Hove, including the local councillors developing policy) didn’t know it at the time, but the City is one of the best performing Local Education Authorities in the Country for both disadvantaged (7th out of 152) and non-disadvantaged (5th out of 152) GCSE attainment, once you account for the factors we know influence that attainment. Raw data on the attainment gap, without context, was used as partial justification for the radical policies proposed and the city was painted by policy makers as a failure. However, the question they should have been asking, was</w:t>
-      </w:r>
-      <w:r>
-        <w:t xml:space="preserve"> </w:t>
-      </w:r>
-      <w:r>
-        <w:t xml:space="preserve">“what is the city doing right?”</w:t>
-      </w:r>
-      <w:r>
-        <w:t xml:space="preserve"> </w:t>
-      </w:r>
-      <w:r>
-        <w:t xml:space="preserve">While we can’t know if open, accessible, location-specific analysis and this kind of insight would have resulted in a change of policy direction, it would have certainly facilitated a more informed discussion prior to and during the consultation.</w:t>
-      </w:r>
-    </w:p>
-    <w:p>
-      <w:pPr>
-        <w:pStyle w:val="BodyText"/>
-      </w:pPr>
-      <w:r>
-        <w:t xml:space="preserve">The authors are residents of Brighton and Hove with direct experience of the effects of these proposals on their families and community. Some are academics, some experienced in policy making, some involved in school governance, and some simply parents. This diverse positionality motivates the analysis: we argue that better analytical tools, applied to readily available open data, could have substantially improved the quality of the policy debate and may have resulted in better policy formation.</w:t>
-      </w:r>
-    </w:p>
-    <w:p>
-      <w:pPr>
-        <w:pStyle w:val="BodyText"/>
-      </w:pPr>
-      <w:r>
-        <w:t xml:space="preserve">We are not claiming that the model outlined in this paper is the best possible or that our variable selection is optimal. Our intention is to show that with open, freely available data and variables that are along the right lines, it is possible to build a model explaining over 80% of the variation in school-level attainment with just a handful of predictors. When we know the vast majority of influences on attainment and how they interact in different local contexts, we can answer questions such as:</w:t>
-      </w:r>
-      <w:r>
-        <w:t xml:space="preserve"> </w:t>
-      </w:r>
-      <w:r>
-        <w:t xml:space="preserve">‘is changing the social mix in schools likely to improve disadvantaged attainment?’</w:t>
-      </w:r>
-      <w:r>
-        <w:t xml:space="preserve">,</w:t>
-      </w:r>
-      <w:r>
-        <w:t xml:space="preserve"> </w:t>
-      </w:r>
-      <w:r>
-        <w:t xml:space="preserve">‘what is the most important factor affecting attainment in a particular LEA?’</w:t>
-      </w:r>
-      <w:r>
-        <w:t xml:space="preserve">, and</w:t>
-      </w:r>
-      <w:r>
-        <w:t xml:space="preserve"> </w:t>
-      </w:r>
-      <w:r>
-        <w:t xml:space="preserve">‘which schools are doing better or worse than expected?’</w:t>
-      </w:r>
-      <w:r>
-        <w:t xml:space="preserve">.</w:t>
-      </w:r>
-    </w:p>
-    <w:p>
-      <w:pPr>
-        <w:pStyle w:val="BodyText"/>
-      </w:pPr>
-      <w:r>
-        <w:t xml:space="preserve">We are also acutely aware that statistical analysis does not always translate effectively into accessible policy relevant intelligence. While the reporting of standard deviation improvements is more statistically sound, trying to translate such an effect into a tangible outcome would be a challenge for most. Therefore in this paper we try to present the effects we observe in more readily understandable GCSE points so that they have more real-world meaning and potentially more resonance with policy makers.</w:t>
-      </w:r>
-    </w:p>
-    <w:p>
-      <w:pPr>
-        <w:pStyle w:val="BodyText"/>
-      </w:pPr>
-      <w:r>
-        <w:t xml:space="preserve">The paper proceeds as follows. We briefly review the literature on secondary school attainment drivers, then outline our modelling approach using DfE open data. We present results showing which factors matter most and how they interact, before applying these findings to Brighton and Hove. We conclude with implications for local and national education policy.</w:t>
-      </w:r>
-    </w:p>
-    <w:bookmarkEnd w:id="22"/>
-    <w:bookmarkStart w:id="26" w:name="literature-review"/>
-    <w:p>
-      <w:pPr>
-        <w:pStyle w:val="Heading1"/>
-      </w:pPr>
-      <w:r>
-        <w:t xml:space="preserve">2. Literature review</w:t>
-      </w:r>
-    </w:p>
-    <w:bookmarkStart w:id="23" w:name="X27e2b6e819b781033a4a4801b80f2ee81de4995"/>
-    <w:p>
-      <w:pPr>
-        <w:pStyle w:val="Heading2"/>
-      </w:pPr>
-      <w:r>
-        <w:t xml:space="preserve">2.1 Socio-economic background and disadvantage</w:t>
-      </w:r>
-    </w:p>
-    <w:p>
-      <w:pPr>
-        <w:pStyle w:val="FirstParagraph"/>
-      </w:pPr>
-      <w:r>
-        <w:t xml:space="preserve">The Education Policy Institute’s annual reports document that by the time pupils sit their GCSEs, disadvantaged pupils are on average around 18 months of learning behind their more affluent peers, a gap that narrowed modestly after 2011 but partially reversed following the COVID-19 pandemic</w:t>
-      </w:r>
-      <w:r>
-        <w:t xml:space="preserve"> </w:t>
-      </w:r>
-      <w:r>
-        <w:t xml:space="preserve">(Tuckett et al. 2023)</w:t>
-      </w:r>
-      <w:r>
-        <w:t xml:space="preserve">. It is this</w:t>
-      </w:r>
-      <w:r>
-        <w:t xml:space="preserve"> </w:t>
-      </w:r>
-      <w:r>
-        <w:t xml:space="preserve">‘attainment-gap’</w:t>
-      </w:r>
-      <w:r>
-        <w:t xml:space="preserve"> </w:t>
-      </w:r>
-      <w:r>
-        <w:t xml:space="preserve">which has remained stubbornly persistent for many years and that the recent government white paper has resolved to try and tackle. The size of the gap and the reasons behind it are complex and vary from place to place, but its existence has spawned large volumes of literature delving into disadvantage and attainment.</w:t>
-      </w:r>
-    </w:p>
-    <w:p>
-      <w:pPr>
-        <w:pStyle w:val="BodyText"/>
-      </w:pPr>
-      <w:r>
-        <w:t xml:space="preserve">Free School Meal (FSM) eligibility serves as the standard proxy for disadvantage, though its limitations are well established. For example,</w:t>
-      </w:r>
-      <w:r>
-        <w:t xml:space="preserve"> </w:t>
-      </w:r>
-      <w:r>
-        <w:t xml:space="preserve">Stopforth and Gayle (2025)</w:t>
-      </w:r>
-      <w:r>
-        <w:t xml:space="preserve"> </w:t>
-      </w:r>
-      <w:r>
-        <w:t xml:space="preserve">demonstrate that finer-grained measures of parental social class reveal persistent attainment gaps that FSM-based analyses tend to understate, with the thresholds for FSM eligibility low enough that many students who might otherwise be classed as disadvantaged, are not included in these statistics. Despite this, because eligibility for Free School Meals is regularly recorded at pupil and school levels, it is frequently used as a proxy.</w:t>
-      </w:r>
-    </w:p>
-    <w:p>
-      <w:pPr>
-        <w:pStyle w:val="BodyText"/>
-      </w:pPr>
-      <w:r>
-        <w:t xml:space="preserve">A crucial dimension is that inequalities in outcomes between disadvantaged and non-disadvantaged students at GCSE level are substantially mediated by prior attainment at Key Stage 2 (KS2). Prior attainment at KS2 reflects accumulated inequalities from before secondary school</w:t>
-      </w:r>
-      <w:r>
-        <w:t xml:space="preserve"> </w:t>
-      </w:r>
-      <w:r>
-        <w:t xml:space="preserve">(Stopforth and Gayle 2025)</w:t>
-      </w:r>
-      <w:r>
-        <w:t xml:space="preserve">, and</w:t>
-      </w:r>
-      <w:r>
-        <w:t xml:space="preserve"> </w:t>
-      </w:r>
-      <w:r>
-        <w:t xml:space="preserve">Gorard and Siddiqui (2019)</w:t>
-      </w:r>
-      <w:r>
-        <w:t xml:space="preserve"> </w:t>
-      </w:r>
-      <w:r>
-        <w:t xml:space="preserve">show that the duration of disadvantage is a stronger predictor than disadvantage at any single point. We will return to this later in the paper, however</w:t>
-      </w:r>
-      <w:r>
-        <w:t xml:space="preserve"> </w:t>
-      </w:r>
-      <w:r>
-        <w:t xml:space="preserve">Gorard and Siddiqui (2019)</w:t>
-      </w:r>
-      <w:r>
-        <w:t xml:space="preserve"> </w:t>
-      </w:r>
-      <w:r>
-        <w:t xml:space="preserve">take their focus on disadvantage further and also propose that pupils do worse in schools with higher concentrations of disadvantage, estimating improvements in grades of 0.05–0.15 standard deviations from greater social mixing. While they don’t translate this effect, it works out at approximately one GCSE grade in one subject. One crucial and seductive policy point they make in their paper is that additional mixing can be achieved at</w:t>
-      </w:r>
-      <w:r>
-        <w:t xml:space="preserve"> </w:t>
-      </w:r>
-      <w:r>
-        <w:t xml:space="preserve">‘almost no cost’</w:t>
-      </w:r>
-      <w:r>
-        <w:t xml:space="preserve">. However this is a conjecture that overlooks the real-world consequences for communities, particularly where local social geographies might mean that de-concentration might require children travelling long distances, either by choice or because they are no longer able to attend their most local school.</w:t>
-      </w:r>
-    </w:p>
-    <w:bookmarkEnd w:id="23"/>
-    <w:bookmarkStart w:id="24" w:name="attendance"/>
-    <w:p>
-      <w:pPr>
-        <w:pStyle w:val="Heading2"/>
-      </w:pPr>
-      <w:r>
-        <w:t xml:space="preserve">2.2 Attendance</w:t>
-      </w:r>
-    </w:p>
-    <w:p>
-      <w:pPr>
-        <w:pStyle w:val="FirstParagraph"/>
-      </w:pPr>
-      <w:r>
-        <w:t xml:space="preserve">School attendance is among the strongest predictors of attainment and this comes through strongly in the literature. DfE analysis of 2018/19 data</w:t>
-      </w:r>
-      <w:r>
-        <w:t xml:space="preserve"> </w:t>
-      </w:r>
-      <w:r>
-        <w:t xml:space="preserve">(DfE 2022)</w:t>
-      </w:r>
-      <w:r>
-        <w:t xml:space="preserve"> </w:t>
-      </w:r>
-      <w:r>
-        <w:t xml:space="preserve">documents a stark gradient: among persistently absent pupils, only 35.6% achieved a standard pass in English and Maths, compared with 83.7% among those with no recorded absences. More recent analysis finds that pupils with near-perfect attendance were 1.9 times as likely to achieve a grade 5 pass compared with otherwise similar pupils attending 90–95% of the time</w:t>
-      </w:r>
-      <w:r>
-        <w:t xml:space="preserve"> </w:t>
-      </w:r>
-      <w:r>
-        <w:t xml:space="preserve">(DfE 2025a)</w:t>
-      </w:r>
-      <w:r>
-        <w:t xml:space="preserve">.</w:t>
-      </w:r>
-      <w:r>
-        <w:t xml:space="preserve"> </w:t>
-      </w:r>
-      <w:r>
-        <w:t xml:space="preserve">Dräger et al. (2024)</w:t>
-      </w:r>
-      <w:r>
-        <w:t xml:space="preserve">, using the 1970 British Cohort Study, find that absences at age 10 are associated with lower educational attainment in adulthood. The Social Mobility Commission</w:t>
-      </w:r>
-      <w:r>
-        <w:t xml:space="preserve"> </w:t>
-      </w:r>
-      <w:r>
-        <w:t xml:space="preserve">(Riordan et al. 2021)</w:t>
-      </w:r>
-      <w:r>
-        <w:t xml:space="preserve"> </w:t>
-      </w:r>
-      <w:r>
-        <w:t xml:space="preserve">conclude that the correlation between attendance and progress is</w:t>
-      </w:r>
-      <w:r>
-        <w:t xml:space="preserve"> </w:t>
-      </w:r>
-      <w:r>
-        <w:t xml:space="preserve">‘most likely to be causal’</w:t>
-      </w:r>
-      <w:r>
-        <w:t xml:space="preserve">.</w:t>
-      </w:r>
-    </w:p>
-    <w:p>
-      <w:pPr>
-        <w:pStyle w:val="BodyText"/>
-      </w:pPr>
-      <w:r>
-        <w:t xml:space="preserve">Post-pandemic persistent absence has risen sharply, from around 10.5% pre-pandemic to approximately 21.9% in secondary schools by 2023/24, with rates for FSM-eligible pupils around 32%</w:t>
-      </w:r>
-      <w:r>
-        <w:t xml:space="preserve"> </w:t>
-      </w:r>
-      <w:r>
-        <w:t xml:space="preserve">(DfE 2025b)</w:t>
-      </w:r>
-      <w:r>
-        <w:t xml:space="preserve">. This compounds the challenge of disentangling school-level from pupil-level effects.</w:t>
-      </w:r>
-    </w:p>
-    <w:bookmarkEnd w:id="24"/>
-    <w:bookmarkStart w:id="25" w:name="other-factors"/>
-    <w:p>
-      <w:pPr>
-        <w:pStyle w:val="Heading2"/>
-      </w:pPr>
-      <w:r>
-        <w:t xml:space="preserve">2.3 Other factors</w:t>
-      </w:r>
-    </w:p>
-    <w:p>
-      <w:pPr>
-        <w:pStyle w:val="FirstParagraph"/>
-      </w:pPr>
-      <w:r>
-        <w:t xml:space="preserve">Ethnic inequalities are persistent</w:t>
-      </w:r>
-      <w:r>
-        <w:t xml:space="preserve"> </w:t>
-      </w:r>
-      <w:r>
-        <w:t xml:space="preserve">(Gillborn et al. 2017)</w:t>
-      </w:r>
-      <w:r>
-        <w:t xml:space="preserve">, though</w:t>
-      </w:r>
-      <w:r>
-        <w:t xml:space="preserve"> </w:t>
-      </w:r>
-      <w:r>
-        <w:t xml:space="preserve">Gorard et al. (2025)</w:t>
-      </w:r>
-      <w:r>
-        <w:t xml:space="preserve"> </w:t>
-      </w:r>
-      <w:r>
-        <w:t xml:space="preserve">show these are substantially reduced when controlling for pupil-level characteristics. The under-performance of disadvantaged White British pupils, particularly boys, has attracted policy attention, with causes contested between place-based deprivation and cultural factors</w:t>
-      </w:r>
-      <w:r>
-        <w:t xml:space="preserve"> </w:t>
-      </w:r>
-      <w:r>
-        <w:t xml:space="preserve">(Strand 2021; Commons Education Committee 2021)</w:t>
-      </w:r>
-      <w:r>
-        <w:t xml:space="preserve">.</w:t>
-      </w:r>
-    </w:p>
-    <w:p>
-      <w:pPr>
-        <w:pStyle w:val="BodyText"/>
-      </w:pPr>
-      <w:r>
-        <w:t xml:space="preserve">School-level selectivity inflates raw performance metrics.</w:t>
-      </w:r>
-      <w:r>
-        <w:t xml:space="preserve"> </w:t>
-      </w:r>
-      <w:r>
-        <w:t xml:space="preserve">Anders et al. (2024)</w:t>
-      </w:r>
-      <w:r>
-        <w:t xml:space="preserve"> </w:t>
-      </w:r>
-      <w:r>
-        <w:t xml:space="preserve">find that the private school premium effectively disappears once socio-economic background is controlled for.</w:t>
-      </w:r>
-      <w:r>
-        <w:t xml:space="preserve"> </w:t>
-      </w:r>
-      <w:r>
-        <w:t xml:space="preserve">Simon Burgess et al. (2018)</w:t>
-      </w:r>
-      <w:r>
-        <w:t xml:space="preserve"> </w:t>
-      </w:r>
-      <w:r>
-        <w:t xml:space="preserve">show grammar schools reinforce socio-economic stratification without overall attainment benefits.</w:t>
-      </w:r>
-    </w:p>
-    <w:p>
-      <w:pPr>
-        <w:pStyle w:val="BodyText"/>
-      </w:pPr>
-      <w:r>
-        <w:t xml:space="preserve">Workforce factors including effective leadership</w:t>
-      </w:r>
-      <w:r>
-        <w:t xml:space="preserve"> </w:t>
-      </w:r>
-      <w:r>
-        <w:t xml:space="preserve">(Zuccollo et al. 2023)</w:t>
-      </w:r>
-      <w:r>
-        <w:t xml:space="preserve">, teaching quality</w:t>
-      </w:r>
-      <w:r>
-        <w:t xml:space="preserve"> </w:t>
-      </w:r>
-      <w:r>
-        <w:t xml:space="preserve">(Simon Burgess et al. 2023; S. Burgess et al. 2022)</w:t>
-      </w:r>
-      <w:r>
-        <w:t xml:space="preserve">, and teacher retention</w:t>
-      </w:r>
-      <w:r>
-        <w:t xml:space="preserve"> </w:t>
-      </w:r>
-      <w:r>
-        <w:t xml:space="preserve">(Gibbons et al. 2018; Menzies 2023)</w:t>
-      </w:r>
-      <w:r>
-        <w:t xml:space="preserve"> </w:t>
-      </w:r>
-      <w:r>
-        <w:t xml:space="preserve">contribute to variation in attainment, with effects felt most acutely by disadvantaged students</w:t>
-      </w:r>
-      <w:r>
-        <w:t xml:space="preserve"> </w:t>
-      </w:r>
-      <w:r>
-        <w:t xml:space="preserve">(Allen et al. 2018)</w:t>
-      </w:r>
-      <w:r>
-        <w:t xml:space="preserve">. The</w:t>
-      </w:r>
-      <w:r>
-        <w:t xml:space="preserve"> </w:t>
-      </w:r>
-      <w:r>
-        <w:t xml:space="preserve">‘London Effect’</w:t>
-      </w:r>
-      <w:r>
-        <w:t xml:space="preserve"> </w:t>
-      </w:r>
-      <w:r>
-        <w:t xml:space="preserve">(Ross et al. 2020)</w:t>
-      </w:r>
-      <w:r>
-        <w:t xml:space="preserve"> </w:t>
-      </w:r>
-      <w:r>
-        <w:t xml:space="preserve">reflects a localised concentration of agency factors — parental expectations, homework hours, lower unauthorised absence — rather than a purely geographic phenomenon.</w:t>
-      </w:r>
-    </w:p>
-    <w:p>
-      <w:pPr>
-        <w:pStyle w:val="BodyText"/>
-      </w:pPr>
-      <w:r>
-        <w:t xml:space="preserve">It’s clear from the review above that the factors affecting attainment are multifaceted, complex and interrelated. The research is extensive and many of the drivers well-established and evidenced through high-quality studies on thousands of pupils over long periods of time. As such, with so much evidence on the various different drivers of attainment it can be challenging for anyone comparing different studies to make a judgement on which driver(s) might be most relevant or important in a particular context. To do this, what is required is an analysis which is able to combine as many of these drivers at the same time so that their relative influences and interactions can be assessed concurrently — which is where we now turn.</w:t>
-      </w:r>
-    </w:p>
-    <w:bookmarkEnd w:id="25"/>
-    <w:bookmarkEnd w:id="26"/>
-    <w:bookmarkStart w:id="33" w:name="data-and-methods"/>
-    <w:p>
-      <w:pPr>
-        <w:pStyle w:val="Heading1"/>
-      </w:pPr>
-      <w:r>
-        <w:t xml:space="preserve">3. Data and methods</w:t>
-      </w:r>
-    </w:p>
-    <w:bookmarkStart w:id="29" w:name="data"/>
-    <w:p>
-      <w:pPr>
-        <w:pStyle w:val="Heading2"/>
-      </w:pPr>
-      <w:r>
-        <w:t xml:space="preserve">3.1 Data</w:t>
-      </w:r>
-    </w:p>
-    <w:p>
-      <w:pPr>
-        <w:pStyle w:val="FirstParagraph"/>
-      </w:pPr>
-      <w:r>
-        <w:t xml:space="preserve">The DfE publishes extensive open data on schools via its statistical services. We assembled a panel dataset covering the four post-COVID academic years (2021–22 to 2024–25), linking school performance, absence, pupil population, workforce and Ofsted data. Data pre-processing details are available in the supplementary material.</w:t>
-      </w:r>
-      <w:r>
-        <w:rPr>
-          <w:rStyle w:val="FootnoteReference"/>
-        </w:rPr>
-        <w:footnoteReference w:id="27"/>
+        <w:footnoteReference w:id="29"/>
       </w:r>
       <w:r>
         <w:t xml:space="preserve"> </w:t>
@@ -658,8 +666,8 @@
         <w:t xml:space="preserve">The full panel comprises 13,419 school-year observations from 3,523 academies and maintained schools across 152 LEAs. Independent schools, colleges and special schools are excluded. After listwise exclusion of cases with missing predictor values required for the log-linear specification (principally missing workforce or Ofsted data), the analysis sample used in the models is approximately 12,200 observations. All data are school-level aggregates; interpretations relate to this level of aggregation.</w:t>
       </w:r>
     </w:p>
-    <w:bookmarkEnd w:id="29"/>
-    <w:bookmarkStart w:id="32" w:name="model-specification"/>
+    <w:bookmarkEnd w:id="31"/>
+    <w:bookmarkStart w:id="34" w:name="model-specification"/>
     <w:p>
       <w:pPr>
         <w:pStyle w:val="Heading2"/>
@@ -1034,7 +1042,7 @@
         <w:rPr>
           <w:rStyle w:val="FootnoteReference"/>
         </w:rPr>
-        <w:footnoteReference w:id="30"/>
+        <w:footnoteReference w:id="32"/>
       </w:r>
       <w:r>
         <w:t xml:space="preserve">.</w:t>
@@ -1063,9 +1071,9 @@
         <w:t xml:space="preserve">package in R with REML estimation.</w:t>
       </w:r>
     </w:p>
-    <w:bookmarkEnd w:id="32"/>
-    <w:bookmarkEnd w:id="33"/>
-    <w:bookmarkStart w:id="49" w:name="results"/>
+    <w:bookmarkEnd w:id="34"/>
+    <w:bookmarkEnd w:id="35"/>
+    <w:bookmarkStart w:id="51" w:name="results"/>
     <w:p>
       <w:pPr>
         <w:pStyle w:val="Heading1"/>
@@ -1074,7 +1082,7 @@
         <w:t xml:space="preserve">4. Results</w:t>
       </w:r>
     </w:p>
-    <w:bookmarkStart w:id="34" w:name="model-fit"/>
+    <w:bookmarkStart w:id="36" w:name="model-fit"/>
     <w:p>
       <w:pPr>
         <w:pStyle w:val="Heading2"/>
@@ -1160,8 +1168,8 @@
         <w:t xml:space="preserve">is 0.73; for non-disadvantaged pupils, 0.79. School-level attainment is remarkably predictable from these structural factors, which makes them very useful for exploring the effectiveness of local policy levers.</w:t>
       </w:r>
     </w:p>
-    <w:bookmarkEnd w:id="34"/>
-    <w:bookmarkStart w:id="36" w:name="stepwise-decomposition"/>
+    <w:bookmarkEnd w:id="36"/>
+    <w:bookmarkStart w:id="38" w:name="stepwise-decomposition"/>
     <w:p>
       <w:pPr>
         <w:pStyle w:val="Heading2"/>
@@ -1183,7 +1191,7 @@
       <w:tr>
         <w:tc>
           <w:tcPr/>
-          <w:bookmarkStart w:id="35" w:name="tbl-stepwise"/>
+          <w:bookmarkStart w:id="37" w:name="tbl-stepwise"/>
           <w:p>
             <w:pPr>
               <w:jc w:val="center"/>
@@ -3781,7 +3789,7 @@
               </w:tc>
             </w:tr>
           </w:tbl>
-          <w:bookmarkEnd w:id="35"/>
+          <w:bookmarkEnd w:id="37"/>
           <w:p/>
         </w:tc>
       </w:tr>
@@ -3858,8 +3866,8 @@
         <w:t xml:space="preserve">A crucial feature of these models is that the log-transformed variables encode non-linear relationships. The same percentage-point change produces different effects depending on where a school starts. For concentrations of disadvantage, the relationship between FSM and attainment flattens above about 20% FSM — further increases in disadvantage do not correlate with noticeable further declines. Most of the strong effect appears below 15%, where further reductions are correlated with much steeper attainment increases. This non-linearity has direct policy consequences: individual LEAs need to consider carefully where each school sits on the distribution to appreciate what changes might realistically achieve.</w:t>
       </w:r>
     </w:p>
-    <w:bookmarkEnd w:id="36"/>
-    <w:bookmarkStart w:id="48" w:name="relative-variable-importance"/>
+    <w:bookmarkEnd w:id="38"/>
+    <w:bookmarkStart w:id="50" w:name="relative-variable-importance"/>
     <w:p>
       <w:pPr>
         <w:pStyle w:val="Heading2"/>
@@ -3881,7 +3889,7 @@
       <w:tr>
         <w:tc>
           <w:tcPr/>
-          <w:bookmarkStart w:id="40" w:name="fig-standardised-coefficients"/>
+          <w:bookmarkStart w:id="42" w:name="fig-standardised-coefficients"/>
           <w:p>
             <w:pPr>
               <w:pStyle w:val="Compact"/>
@@ -3892,18 +3900,18 @@
                 <wp:inline>
                   <wp:extent cx="5334000" cy="3810000"/>
                   <wp:effectExtent b="0" l="0" r="0" t="0"/>
-                  <wp:docPr descr="" title="" id="38" name="Picture"/>
+                  <wp:docPr descr="" title="" id="40" name="Picture"/>
                   <a:graphic>
                     <a:graphicData uri="http://schemas.openxmlformats.org/drawingml/2006/picture">
                       <pic:pic>
                         <pic:nvPicPr>
-                          <pic:cNvPr descr="JEP_Paper_files/figure-docx/fig-standardised-coefficients-1.png" id="39" name="Picture"/>
+                          <pic:cNvPr descr="JEP_Paper_files/figure-docx/fig-standardised-coefficients-1.png" id="41" name="Picture"/>
                           <pic:cNvPicPr>
                             <a:picLocks noChangeArrowheads="1" noChangeAspect="1"/>
                           </pic:cNvPicPr>
                         </pic:nvPicPr>
                         <pic:blipFill>
-                          <a:blip r:embed="rId37"/>
+                          <a:blip r:embed="rId39"/>
                           <a:stretch>
                             <a:fillRect/>
                           </a:stretch>
@@ -3943,7 +3951,7 @@
               <w:t xml:space="preserve">Figure 1: Standardised coefficients showing relative variable importance across pupil groups. Bars show the change in log(ATT8) associated with a one-SD shift in each predictor.</w:t>
             </w:r>
           </w:p>
-          <w:bookmarkEnd w:id="40"/>
+          <w:bookmarkEnd w:id="42"/>
         </w:tc>
       </w:tr>
     </w:tbl>
@@ -3969,7 +3977,7 @@
         <w:rPr>
           <w:rStyle w:val="FootnoteReference"/>
         </w:rPr>
-        <w:footnoteReference w:id="41"/>
+        <w:footnoteReference w:id="43"/>
       </w:r>
       <w:r>
         <w:t xml:space="preserve"> </w:t>
@@ -3981,7 +3989,7 @@
         <w:rPr>
           <w:rStyle w:val="FootnoteReference"/>
         </w:rPr>
-        <w:footnoteReference w:id="42"/>
+        <w:footnoteReference w:id="44"/>
       </w:r>
       <w:r>
         <w:t xml:space="preserve">). Absence is the dominant predictor across all groups, but it is</w:t>
@@ -4008,7 +4016,19 @@
         <w:pStyle w:val="BodyText"/>
       </w:pPr>
       <w:r>
-        <w:t xml:space="preserve">The most contentious finding in our analysis concerns concentrations of disadvantage. For non-disadvantaged pupils, higher FSM proportions are associated with lower attainment. But for disadvantaged pupils, the coefficient is</w:t>
+        <w:t xml:space="preserve">The most contentious finding in our analysis concerns concentrations of disadvantage (contentious in Brighton and Hove - the findings echo the analysis of</w:t>
+      </w:r>
+      <w:r>
+        <w:t xml:space="preserve"> </w:t>
+      </w:r>
+      <w:r>
+        <w:t xml:space="preserve">Macleod et al. (2015)</w:t>
+      </w:r>
+      <w:r>
+        <w:t xml:space="preserve"> </w:t>
+      </w:r>
+      <w:r>
+        <w:t xml:space="preserve">a decade ago). For non-disadvantaged pupils, higher FSM proportions are associated with lower attainment. But for disadvantaged pupils, the coefficient is</w:t>
       </w:r>
       <w:r>
         <w:t xml:space="preserve"> </w:t>
@@ -4030,7 +4050,7 @@
         <w:rPr>
           <w:rStyle w:val="FootnoteReference"/>
         </w:rPr>
-        <w:footnoteReference w:id="44"/>
+        <w:footnoteReference w:id="46"/>
       </w:r>
       <w:r>
         <w:t xml:space="preserve"> </w:t>
@@ -4060,7 +4080,7 @@
         <w:pStyle w:val="BodyText"/>
       </w:pPr>
       <w:r>
-        <w:t xml:space="preserve">For non-disadvantaged pupils, the effects of higher disadvantage concentrations are more clearly negative. Even after controlling for attendance and prior scores, being in a higher-disadvantage school depresses Attainment 8 for this group — a possible peer effect or curriculum-resourcing dynamic. Both of these findings are contentious in the Brighton and Hove context as they challenge the</w:t>
+        <w:t xml:space="preserve">For non-disadvantaged pupils, the effects of higher disadvantage concentrations are more clearly negative. Even after controlling for attendance and prior scores, being in a higher-disadvantage school depresses Attainment 8 for this group — possibly due to a peer effect or curriculum-resourcing dynamic. Both of these findings are contentious in the Brighton and Hove context as they challenge the</w:t>
       </w:r>
       <w:r>
         <w:t xml:space="preserve"> </w:t>
@@ -4078,10 +4098,13 @@
         <w:rPr>
           <w:rStyle w:val="FootnoteReference"/>
         </w:rPr>
-        <w:footnoteReference w:id="46"/>
-      </w:r>
-      <w:r>
-        <w:t xml:space="preserve">) might actually be counter productive as a policy to improve disadvantaged attainment.</w:t>
+        <w:footnoteReference w:id="48"/>
+      </w:r>
+      <w:r>
+        <w:t xml:space="preserve"> </w:t>
+      </w:r>
+      <w:r>
+        <w:t xml:space="preserve">– a fact that emerged during the 2024 consultation, but not one that on its own moved the dial) might actually be counter productive as a policy to improve disadvantaged attainment.</w:t>
       </w:r>
     </w:p>
     <w:p>
@@ -4089,7 +4112,7 @@
         <w:pStyle w:val="BodyText"/>
       </w:pPr>
       <w:r>
-        <w:t xml:space="preserve">Absence remains consistently the biggest predictor across all groups and is even more important for disadvantaged pupils. Nearly half of the difference in school-level performance for disadvantaged pupils is explained simply by whether they attend. Disadvantaged pupils lack the safety net of engaged parents, private tutors or revision resources that some less disadvantaged students have, making them more reliant on classroom instruction. In this sense, attendance is the ultimate equity lever.</w:t>
+        <w:t xml:space="preserve">Absence remains consistently the biggest predictor across all groups and is even more important for disadvantaged pupils. Nearly half of the difference in school-level performance for disadvantaged pupils is explained simply by whether they regularly attend. Disadvantaged pupils may lack the safety net of engaged parents, private tutors or revision resources that some less disadvantaged students have, which could be a factor in making classroom instruction more important for them. In this sense, attendance is the ultimate equity lever.</w:t>
       </w:r>
     </w:p>
     <w:p>
@@ -4097,7 +4120,7 @@
         <w:pStyle w:val="BodyText"/>
       </w:pPr>
       <w:r>
-        <w:t xml:space="preserve">These outcomes do not mean that advocate for concentrating disadvantaged pupils. We do not. However, where the social and spatial composition of LEAs means that disadvantaged and non-disadvantaged students are not evenly spread across schools, deconcentration policies premised on the assumption that disadvantaged pupils inevitably fare worse in schools with lower concentrations of disadvantage are not supported by this evidence. And where such policies require longer journeys that risk increasing absence</w:t>
+        <w:t xml:space="preserve">These outcomes do not advocate for concentrating disadvantaged pupils. We do not. However, where the social and spatial composition of LEAs means that disadvantaged and non-disadvantaged students are not evenly spread across schools, deconcentration policies premised on the assumption that disadvantaged pupils inevitably fare worse in schools with lower concentrations of disadvantage are not supported by this evidence. And where remediating policies require longer journeys that risk increasing absence</w:t>
       </w:r>
       <w:r>
         <w:t xml:space="preserve"> </w:t>
@@ -4109,9 +4132,9 @@
         <w:t xml:space="preserve">, they could be actively counter-productive given how much more negatively impactful absence is.</w:t>
       </w:r>
     </w:p>
-    <w:bookmarkEnd w:id="48"/>
-    <w:bookmarkEnd w:id="49"/>
-    <w:bookmarkStart w:id="70" w:name="brighton-and-hove-case-study"/>
+    <w:bookmarkEnd w:id="50"/>
+    <w:bookmarkEnd w:id="51"/>
+    <w:bookmarkStart w:id="72" w:name="brighton-and-hove-case-study"/>
     <w:p>
       <w:pPr>
         <w:pStyle w:val="Heading1"/>
@@ -4120,7 +4143,7 @@
         <w:t xml:space="preserve">5. Brighton and Hove case study</w:t>
       </w:r>
     </w:p>
-    <w:bookmarkStart w:id="54" w:name="local-context"/>
+    <w:bookmarkStart w:id="56" w:name="local-context"/>
     <w:p>
       <w:pPr>
         <w:pStyle w:val="Heading2"/>
@@ -4162,7 +4185,7 @@
         <w:pStyle w:val="BodyText"/>
       </w:pPr>
       <w:r>
-        <w:t xml:space="preserve">Following the 2023 local elections, the Labour Party took overall control and implemented a Leader and Cabinet system, concentrating decision-making power. In October 2024, the council launched proposals to reduce Published Admission Numbers at popular central schools, redraw catchment boundaries, and reserve 20% of places in some schools for out-of-catchment children. The stated aims were to improve educational outcomes for disadvantaged pupils and ensure financial viability of under-subscribed peripheral schools. Underpinning the proposals was an assertion that attainment in the city was</w:t>
+        <w:t xml:space="preserve">Following the 2023 local elections, the Labour Party took overall control and implemented a Leader and Cabinet system, concentrating decision-making power. In October 2024, the council launched proposals to reduce Published Admission Numbers at popular central schools, redraw catchment boundaries, and reserve 20% of places in some schools for out-of-catchment children. The stated aims were to improve educational outcomes for disadvantaged pupils and ensure financial viability of under-subscribed schools located at the geographic periphery of the city. Underpinning the proposals was an assertion that attainment in the city was</w:t>
       </w:r>
       <w:r>
         <w:t xml:space="preserve"> </w:t>
@@ -4174,7 +4197,16 @@
         <w:t xml:space="preserve"> </w:t>
       </w:r>
       <w:r>
-        <w:t xml:space="preserve">and that redistributing disadvantaged pupils would narrow the attainment gap, drawing on the work of</w:t>
+        <w:t xml:space="preserve">(e.g. housing costs near better performing schools - another common misconception empirically disproven in Brighton and Hove</w:t>
+      </w:r>
+      <w:r>
+        <w:t xml:space="preserve"> </w:t>
+      </w:r>
+      <w:r>
+        <w:t xml:space="preserve">Tan and Dennett (2025)</w:t>
+      </w:r>
+      <w:r>
+        <w:t xml:space="preserve">) and that redistributing disadvantaged pupils would narrow the attainment gap, drawing on the work of</w:t>
       </w:r>
       <w:r>
         <w:t xml:space="preserve"> </w:t>
@@ -4194,7 +4226,7 @@
         <w:pStyle w:val="BodyText"/>
       </w:pPr>
       <w:r>
-        <w:t xml:space="preserve">The public response was overwhelmingly negative, with the council’s own feedback summary from the pre-consultation engagement exercise noting</w:t>
+        <w:t xml:space="preserve">The public response was overwhelmingly negative, with the council’s feedback summary from the pre-consultation engagement exercise noting</w:t>
       </w:r>
       <w:r>
         <w:t xml:space="preserve"> </w:t>
@@ -4207,7 +4239,7 @@
         <w:t xml:space="preserve">‘a strong preference for improving existing schools rather than redistributing students, alongside deep concerns about potential impacts on community cohesion and student wellbeing’</w:t>
       </w:r>
       <w:r>
-        <w:t xml:space="preserve">. The proposals would, by the council’s own calculations, force significant numbers of children from central catchments to attend schools at the periphery of the city, potentially requiring over two hours of daily commuting.</w:t>
+        <w:t xml:space="preserve">. The proposals would, by the council’s own calculations, force significant numbers of children from central catchments to attend schools at the periphery of the city, potentially requiring over two hours of daily school commuting for many pupils.</w:t>
       </w:r>
     </w:p>
     <w:p>
@@ -4215,7 +4247,7 @@
         <w:pStyle w:val="BodyText"/>
       </w:pPr>
       <w:r>
-        <w:t xml:space="preserve">From the papers accompanying the proposals and the content of the scrutiny committee meetings, it was clear the council had settled on affecting increased social mixing — beyond levels already in the top third nationally — in the belief this would raise disadvantaged attainment. This was in addition to a 2023 policy giving FSM-eligible pupils priority in admissions, which was already affecting further mixing without opposition. That the central catchments were perceived as more</w:t>
+        <w:t xml:space="preserve">From the papers accompanying the proposals and the content of the scrutiny committee meetings, it was clear the council had settled on affecting increased social mixing — beyond levels already in the top third nationally — in the belief this would narrow the attainment gap (presumably by raising disadvantaged attainment). This was in addition to a 2023 policy giving FSM-eligible pupils priority in admissions, which was already affecting further mixing without majority opposition. That the central catchments were perceived as more</w:t>
       </w:r>
       <w:r>
         <w:t xml:space="preserve"> </w:t>
@@ -4236,7 +4268,7 @@
         <w:t xml:space="preserve">‘working-class’</w:t>
       </w:r>
       <w:r>
-        <w:t xml:space="preserve">, may have factored into this design.</w:t>
+        <w:t xml:space="preserve">, may have factored into this policy design.</w:t>
       </w:r>
     </w:p>
     <w:p>
@@ -4244,7 +4276,7 @@
         <w:pStyle w:val="BodyText"/>
       </w:pPr>
       <w:r>
-        <w:t xml:space="preserve">Whether the availability of better evidence would have changed the political outcome is unknowable. But having been on the side of the city responding to proposals rather than generating them, we can say that accessible evidence</w:t>
+        <w:t xml:space="preserve">Whether the availability of better evidence would have changed the political outcome is unknowable. But with lived experience of responding to the council’s proposals, we can say that accessible evidence</w:t>
       </w:r>
       <w:r>
         <w:t xml:space="preserve"> </w:t>
@@ -4260,7 +4292,7 @@
         <w:t xml:space="preserve"> </w:t>
       </w:r>
       <w:r>
-        <w:t xml:space="preserve">have enabled earlier and more constructive engagement. The compressed consultation timeline left wholly inadequate time to assemble and present counter-evidence for the complexity of the issues at stake. What follows is an attempt to demonstrate what that evidence looks like.</w:t>
+        <w:t xml:space="preserve">have enabled earlier and more constructive engagement. Without ease of data access, the compressed consultation timeline left inadequate time to assemble and present counter-evidence for the complexity of the issues at stake. What follows is an attempt to demonstrate what that evidence looks like.</w:t>
       </w:r>
     </w:p>
     <w:tbl>
@@ -4276,7 +4308,7 @@
       <w:tr>
         <w:tc>
           <w:tcPr/>
-          <w:bookmarkStart w:id="53" w:name="fig-catchments"/>
+          <w:bookmarkStart w:id="55" w:name="fig-catchments"/>
           <w:p>
             <w:pPr>
               <w:pStyle w:val="Compact"/>
@@ -4287,18 +4319,18 @@
                 <wp:inline>
                   <wp:extent cx="5334000" cy="4572000"/>
                   <wp:effectExtent b="0" l="0" r="0" t="0"/>
-                  <wp:docPr descr="" title="" id="51" name="Picture"/>
+                  <wp:docPr descr="" title="" id="53" name="Picture"/>
                   <a:graphic>
                     <a:graphicData uri="http://schemas.openxmlformats.org/drawingml/2006/picture">
                       <pic:pic>
                         <pic:nvPicPr>
-                          <pic:cNvPr descr="JEP_Paper_files/figure-docx/fig-catchments-1.png" id="52" name="Picture"/>
+                          <pic:cNvPr descr="JEP_Paper_files/figure-docx/fig-catchments-1.png" id="54" name="Picture"/>
                           <pic:cNvPicPr>
                             <a:picLocks noChangeArrowheads="1" noChangeAspect="1"/>
                           </pic:cNvPicPr>
                         </pic:nvPicPr>
                         <pic:blipFill>
-                          <a:blip r:embed="rId50"/>
+                          <a:blip r:embed="rId52"/>
                           <a:stretch>
                             <a:fillRect/>
                           </a:stretch>
@@ -4338,12 +4370,12 @@
               <w:t xml:space="preserve">Figure 2: Brighton and Hove secondary schools with 2025/26 catchment boundaries.</w:t>
             </w:r>
           </w:p>
-          <w:bookmarkEnd w:id="53"/>
+          <w:bookmarkEnd w:id="55"/>
         </w:tc>
       </w:tr>
     </w:tbl>
-    <w:bookmarkEnd w:id="54"/>
-    <w:bookmarkStart w:id="59" w:name="local-authority-effects"/>
+    <w:bookmarkEnd w:id="56"/>
+    <w:bookmarkStart w:id="61" w:name="local-authority-effects"/>
     <w:p>
       <w:pPr>
         <w:pStyle w:val="Heading2"/>
@@ -4365,7 +4397,7 @@
       <w:tr>
         <w:tc>
           <w:tcPr/>
-          <w:bookmarkStart w:id="58" w:name="fig-caterpillar"/>
+          <w:bookmarkStart w:id="60" w:name="fig-caterpillar"/>
           <w:p>
             <w:pPr>
               <w:pStyle w:val="Compact"/>
@@ -4376,18 +4408,18 @@
                 <wp:inline>
                   <wp:extent cx="5334000" cy="4572000"/>
                   <wp:effectExtent b="0" l="0" r="0" t="0"/>
-                  <wp:docPr descr="" title="" id="56" name="Picture"/>
+                  <wp:docPr descr="" title="" id="58" name="Picture"/>
                   <a:graphic>
                     <a:graphicData uri="http://schemas.openxmlformats.org/drawingml/2006/picture">
                       <pic:pic>
                         <pic:nvPicPr>
-                          <pic:cNvPr descr="JEP_Paper_files/figure-docx/fig-caterpillar-1.png" id="57" name="Picture"/>
+                          <pic:cNvPr descr="JEP_Paper_files/figure-docx/fig-caterpillar-1.png" id="59" name="Picture"/>
                           <pic:cNvPicPr>
                             <a:picLocks noChangeArrowheads="1" noChangeAspect="1"/>
                           </pic:cNvPicPr>
                         </pic:nvPicPr>
                         <pic:blipFill>
-                          <a:blip r:embed="rId55"/>
+                          <a:blip r:embed="rId57"/>
                           <a:stretch>
                             <a:fillRect/>
                           </a:stretch>
@@ -4427,7 +4459,7 @@
               <w:t xml:space="preserve">Figure 3: LA random intercepts for disadvantaged-pupil attainment (imputed full panel model). Top and bottom 10 LAs labelled; Brighton and Hove highlighted.</w:t>
             </w:r>
           </w:p>
-          <w:bookmarkEnd w:id="58"/>
+          <w:bookmarkEnd w:id="60"/>
         </w:tc>
       </w:tr>
     </w:tbl>
@@ -4447,11 +4479,11 @@
         <w:t xml:space="preserve"> </w:t>
       </w:r>
       <w:r>
-        <w:t xml:space="preserve">shows that Brighton and Hove ranks 7th out of 152 LEAs for disadvantaged attainment once structural factors are accounted for in the multilevel model presented earlier. For non-disadvantaged pupils it ranks 5th; for all pupils, 4th. The positive random intercept of approximately +0.06 translates to around a 6% uplift in Attainment 8 — roughly 2 GCSE points above what structural factors would predict. This was unknown at the time of the 2024 consultation and entirely absent from the public narrative, which was framed around a premise of failure.</w:t>
-      </w:r>
-    </w:p>
-    <w:bookmarkEnd w:id="59"/>
-    <w:bookmarkStart w:id="64" w:name="X2c44da290b91186546cdc06847184f26ab3e331"/>
+        <w:t xml:space="preserve">shows that Brighton and Hove ranks 7th out of 152 LEAs for disadvantaged attainment once structural factors are accounted for in the multilevel model presented earlier. For non-disadvantaged pupils it ranks 5th; for all pupils, 4th. The positive random intercept of approximately +0.06 translates to around a 6% uplift in Attainment 8 — roughly 2 GCSE points above what structural factors would predict. This was unknown at the time of the 2024 consultation and entirely absent from the public narrative, which was framed around a premise of failure, based on limited analysis.</w:t>
+      </w:r>
+    </w:p>
+    <w:bookmarkEnd w:id="61"/>
+    <w:bookmarkStart w:id="66" w:name="X2c44da290b91186546cdc06847184f26ab3e331"/>
     <w:p>
       <w:pPr>
         <w:pStyle w:val="Heading2"/>
@@ -4514,7 +4546,7 @@
       <w:tr>
         <w:tc>
           <w:tcPr/>
-          <w:bookmarkStart w:id="63" w:name="fig-accelerating-returns"/>
+          <w:bookmarkStart w:id="65" w:name="fig-accelerating-returns"/>
           <w:p>
             <w:pPr>
               <w:pStyle w:val="Compact"/>
@@ -4525,18 +4557,18 @@
                 <wp:inline>
                   <wp:extent cx="5334000" cy="3429000"/>
                   <wp:effectExtent b="0" l="0" r="0" t="0"/>
-                  <wp:docPr descr="" title="" id="61" name="Picture"/>
+                  <wp:docPr descr="" title="" id="63" name="Picture"/>
                   <a:graphic>
                     <a:graphicData uri="http://schemas.openxmlformats.org/drawingml/2006/picture">
                       <pic:pic>
                         <pic:nvPicPr>
-                          <pic:cNvPr descr="JEP_Paper_files/figure-docx/fig-accelerating-returns-1.png" id="62" name="Picture"/>
+                          <pic:cNvPr descr="JEP_Paper_files/figure-docx/fig-accelerating-returns-1.png" id="64" name="Picture"/>
                           <pic:cNvPicPr>
                             <a:picLocks noChangeArrowheads="1" noChangeAspect="1"/>
                           </pic:cNvPicPr>
                         </pic:nvPicPr>
                         <pic:blipFill>
-                          <a:blip r:embed="rId60"/>
+                          <a:blip r:embed="rId62"/>
                           <a:stretch>
                             <a:fillRect/>
                           </a:stretch>
@@ -4576,7 +4608,7 @@
               <w:t xml:space="preserve">Figure 4: Accelerating returns: each percentage-point reduction buys a progressively larger ATT8 gain (reading right to left). Absence delivers substantially larger gains than FSM at every level. Brighton and Hove schools marked on each curve.</w:t>
             </w:r>
           </w:p>
-          <w:bookmarkEnd w:id="63"/>
+          <w:bookmarkEnd w:id="65"/>
         </w:tc>
       </w:tr>
     </w:tbl>
@@ -4601,7 +4633,7 @@
         <w:t xml:space="preserve"> </w:t>
       </w:r>
       <w:r>
-        <w:t xml:space="preserve">as values improve. Third, Brighton and Hove schools cluster in the flatter right-hand portion for both variables, but the city’s position is far more extreme on absence.</w:t>
+        <w:t xml:space="preserve">as values improve. Third, Brighton and Hove schools cluster in the flatter right-hand portion for both variables, but the city’s position is far more extreme for absence.</w:t>
       </w:r>
     </w:p>
     <w:p>
@@ -4620,8 +4652,8 @@
         <w:t xml:space="preserve">Bringing schools above the national average for absence down to it would produce predicted gains averaging +2.9 Attainment 8 points per school, with gains for disadvantaged pupils averaging +3.3 points. Even dramatic FSM reductions would yield gains closer to 1 point. The policy was pulling a lever with relatively little mechanical advantage while ignoring one with considerably more.</w:t>
       </w:r>
     </w:p>
-    <w:bookmarkEnd w:id="64"/>
-    <w:bookmarkStart w:id="69" w:name="contextualised-school-performance"/>
+    <w:bookmarkEnd w:id="66"/>
+    <w:bookmarkStart w:id="71" w:name="contextualised-school-performance"/>
     <w:p>
       <w:pPr>
         <w:pStyle w:val="Heading2"/>
@@ -4643,7 +4675,7 @@
       <w:tr>
         <w:tc>
           <w:tcPr/>
-          <w:bookmarkStart w:id="68" w:name="fig-obs-vs-pred"/>
+          <w:bookmarkStart w:id="70" w:name="fig-obs-vs-pred"/>
           <w:p>
             <w:pPr>
               <w:pStyle w:val="Compact"/>
@@ -4654,18 +4686,18 @@
                 <wp:inline>
                   <wp:extent cx="5334000" cy="6858000"/>
                   <wp:effectExtent b="0" l="0" r="0" t="0"/>
-                  <wp:docPr descr="" title="" id="66" name="Picture"/>
+                  <wp:docPr descr="" title="" id="68" name="Picture"/>
                   <a:graphic>
                     <a:graphicData uri="http://schemas.openxmlformats.org/drawingml/2006/picture">
                       <pic:pic>
                         <pic:nvPicPr>
-                          <pic:cNvPr descr="JEP_Paper_files/figure-docx/fig-obs-vs-pred-1.png" id="67" name="Picture"/>
+                          <pic:cNvPr descr="JEP_Paper_files/figure-docx/fig-obs-vs-pred-1.png" id="69" name="Picture"/>
                           <pic:cNvPicPr>
                             <a:picLocks noChangeArrowheads="1" noChangeAspect="1"/>
                           </pic:cNvPicPr>
                         </pic:nvPicPr>
                         <pic:blipFill>
-                          <a:blip r:embed="rId65"/>
+                          <a:blip r:embed="rId67"/>
                           <a:stretch>
                             <a:fillRect/>
                           </a:stretch>
@@ -4705,7 +4737,7 @@
               <w:t xml:space="preserve">Figure 5: Observed versus predicted Attainment 8 for Brighton and Hove schools (highlighted) against all schools nationally, 2024–25.</w:t>
             </w:r>
           </w:p>
-          <w:bookmarkEnd w:id="68"/>
+          <w:bookmarkEnd w:id="70"/>
         </w:tc>
       </w:tr>
     </w:tbl>
@@ -4763,9 +4795,9 @@
         <w:t xml:space="preserve">measures - more nuanced than Progress 8 - as this model-based value added accounts for far more than just prior attainment in its representation.</w:t>
       </w:r>
     </w:p>
-    <w:bookmarkEnd w:id="69"/>
-    <w:bookmarkEnd w:id="70"/>
-    <w:bookmarkStart w:id="92" w:name="discussion"/>
+    <w:bookmarkEnd w:id="71"/>
+    <w:bookmarkEnd w:id="72"/>
+    <w:bookmarkStart w:id="94" w:name="discussion"/>
     <w:p>
       <w:pPr>
         <w:pStyle w:val="Heading1"/>
@@ -4774,7 +4806,7 @@
         <w:t xml:space="preserve">6. Discussion</w:t>
       </w:r>
     </w:p>
-    <w:bookmarkStart w:id="73" w:name="Xd3364b35d543c93770b334c5dc736f1edb746ee"/>
+    <w:bookmarkStart w:id="75" w:name="Xd3364b35d543c93770b334c5dc736f1edb746ee"/>
     <w:p>
       <w:pPr>
         <w:pStyle w:val="Heading2"/>
@@ -4794,7 +4826,7 @@
         <w:rPr>
           <w:rStyle w:val="FootnoteReference"/>
         </w:rPr>
-        <w:footnoteReference w:id="71"/>
+        <w:footnoteReference w:id="73"/>
       </w:r>
       <w:r>
         <w:t xml:space="preserve">, it was stated</w:t>
@@ -4813,7 +4845,16 @@
         <w:t xml:space="preserve"> </w:t>
       </w:r>
       <w:r>
-        <w:t xml:space="preserve">Our analysis suggests this was at best a flawed understanding and at worst a policy with many losers and few clear winners. Concentrations of disadvantage are one of the weaker available levers, and for disadvantaged pupils specifically, the direction of the effect runs in the opposite direction to the policy assumptions. Reducing absence to the national average at the worst-affected schools could yield gains of 3–5 GCSE points; even dramatic FSM reductions would yield closer to 1–2 points and possibly only for the non-disadvantaged students.</w:t>
+        <w:t xml:space="preserve">While this premise is false in the context of</w:t>
+      </w:r>
+      <w:r>
+        <w:t xml:space="preserve"> </w:t>
+      </w:r>
+      <w:r>
+        <w:t xml:space="preserve">Macleod et al. (2015)</w:t>
+      </w:r>
+      <w:r>
+        <w:t xml:space="preserve">’s analysis for the DfE, our more up-to-date modelling confirms this was, at best, a flawed understanding; at worst a policy with many losers and few clear winners. Concentrations of disadvantage are one of the weaker available levers, and for disadvantaged pupils specifically, the direction of the effect runs in the opposite direction to the policy assumptions. Reducing absence to the national average at the worst-affected schools could yield gains of 3–5 GCSE points; even dramatic FSM reductions would yield closer to 1–2 points and possibly only for the non-disadvantaged students.</w:t>
       </w:r>
     </w:p>
     <w:p>
@@ -4821,7 +4862,7 @@
         <w:pStyle w:val="BodyText"/>
       </w:pPr>
       <w:r>
-        <w:t xml:space="preserve">Furthermore, the chosen lever carried its own risks. Longer journeys imposed by redistribution policies are associated with higher absence</w:t>
+        <w:t xml:space="preserve">Furthermore, the chosen lever carried its own risks. Of the many negative impacts of longer journeys imposed by redistribution policies (e.g. reduced sleep and mental health), they are associated with higher absence</w:t>
       </w:r>
       <w:r>
         <w:t xml:space="preserve"> </w:t>
@@ -4854,8 +4895,8 @@
         <w:t xml:space="preserve">overlooks these second-order effects and could be the kind of comment that without context, could do a lot of damage.</w:t>
       </w:r>
     </w:p>
-    <w:bookmarkEnd w:id="73"/>
-    <w:bookmarkStart w:id="76" w:name="absence-as-the-primary-policy-lever"/>
+    <w:bookmarkEnd w:id="75"/>
+    <w:bookmarkStart w:id="78" w:name="absence-as-the-primary-policy-lever"/>
     <w:p>
       <w:pPr>
         <w:pStyle w:val="Heading2"/>
@@ -4869,19 +4910,19 @@
         <w:pStyle w:val="FirstParagraph"/>
       </w:pPr>
       <w:r>
-        <w:t xml:space="preserve">Perhaps the most striking finding is the complete absence of absence from the policy narrative. The city had the second worst absence rate in England in 2024–25 and has been consistently among the worst in England. Yet absence was not part of the policy conversation. It was not mentioned in any of the presentation slides in the initial engagement</w:t>
+        <w:t xml:space="preserve">Perhaps the most striking finding is the complete absence of absence from the policy narrative. The city had the second worst absence rate in England in 2024–25 and has been consistently among the worst in England. Yet absence was not part of the policy conversation. It was not mentioned in any of the presentation slides in the initial public facing engagement</w:t>
       </w:r>
       <w:r>
         <w:rPr>
           <w:rStyle w:val="FootnoteReference"/>
         </w:rPr>
-        <w:footnoteReference w:id="74"/>
-      </w:r>
-      <w:r>
-        <w:t xml:space="preserve"> </w:t>
-      </w:r>
-      <w:r>
-        <w:t xml:space="preserve">or any of the published materials accompanying the consultations. The irony is considerable: the city ranks best 7th for disadvantaged attainment after structural adjustments, but this strong underlying performance is being dragged down by an extreme absence problem.</w:t>
+        <w:footnoteReference w:id="76"/>
+      </w:r>
+      <w:r>
+        <w:t xml:space="preserve"> </w:t>
+      </w:r>
+      <w:r>
+        <w:t xml:space="preserve">or any of the published materials accompanying the consultations. The irony is considerable: the city ranks 7th best for disadvantaged attainment after structural adjustments, but this strong underlying performance is still likely being dragged down by an extreme absence problem.</w:t>
       </w:r>
     </w:p>
     <w:p>
@@ -4889,11 +4930,11 @@
         <w:pStyle w:val="BodyText"/>
       </w:pPr>
       <w:r>
-        <w:t xml:space="preserve">Brighton and Hove’s absence rates are not a necessary consequence of its intake composition. The city has near-average FSM levels but near-worst absence, suggesting the problem is driven by local factors — attendance culture, enforcement practices, or community dynamics — rather than being an unavoidable correlate of disadvantage.</w:t>
-      </w:r>
-    </w:p>
-    <w:bookmarkEnd w:id="76"/>
-    <w:bookmarkStart w:id="84" w:name="X3fc496a95cceb2f31de10765d345b6860b0e78e"/>
+        <w:t xml:space="preserve">Brighton and Hove’s absence rates are not a necessary consequence of its intake composition. The city has near-average FSM eligibility levels but near-worst absence, suggesting the problem is likely driven by local factors — attendance culture, enforcement practices, or community dynamics — rather than being an unavoidable correlate of disadvantage.</w:t>
+      </w:r>
+    </w:p>
+    <w:bookmarkEnd w:id="78"/>
+    <w:bookmarkStart w:id="86" w:name="X3fc496a95cceb2f31de10765d345b6860b0e78e"/>
     <w:p>
       <w:pPr>
         <w:pStyle w:val="Heading2"/>
@@ -4923,7 +4964,7 @@
       <w:tr>
         <w:tc>
           <w:tcPr/>
-          <w:bookmarkStart w:id="77" w:name="tbl-league"/>
+          <w:bookmarkStart w:id="79" w:name="tbl-league"/>
           <w:p>
             <w:pPr>
               <w:jc w:val="center"/>
@@ -6910,7 +6951,7 @@
               </w:tc>
             </w:tr>
           </w:tbl>
-          <w:bookmarkEnd w:id="77"/>
+          <w:bookmarkEnd w:id="79"/>
           <w:p/>
         </w:tc>
       </w:tr>
@@ -6926,7 +6967,7 @@
         <w:rPr>
           <w:rStyle w:val="FootnoteReference"/>
         </w:rPr>
-        <w:footnoteReference w:id="78"/>
+        <w:footnoteReference w:id="80"/>
       </w:r>
       <w:r>
         <w:t xml:space="preserve"> </w:t>
@@ -6938,7 +6979,7 @@
         <w:rPr>
           <w:rStyle w:val="FootnoteReference"/>
         </w:rPr>
-        <w:footnoteReference w:id="80"/>
+        <w:footnoteReference w:id="82"/>
       </w:r>
       <w:r>
         <w:t xml:space="preserve">) emerged from within the BACA catchment advocating for parents to have more options available to</w:t>
@@ -6977,7 +7018,23 @@
         <w:pStyle w:val="BodyText"/>
       </w:pPr>
       <w:r>
-        <w:t xml:space="preserve">One of the outcomes that emerged from the vocal public debate, was a considerable number of parents from the BACA catchment opting to send their children to Patcham School (in the neighbouring catchment — see</w:t>
+        <w:t xml:space="preserve">As a family deciding on where to send their child, they can decide based on how the school performs overall, or where their child is most likely to succeed. These do not always lead to the same answer. The latter means looking beyond the structural causes of attainment, and understanding how a school performs</w:t>
+      </w:r>
+      <w:r>
+        <w:t xml:space="preserve"> </w:t>
+      </w:r>
+      <w:r>
+        <w:rPr>
+          <w:i/>
+          <w:iCs/>
+        </w:rPr>
+        <w:t xml:space="preserve">beyond</w:t>
+      </w:r>
+      <w:r>
+        <w:t xml:space="preserve"> </w:t>
+      </w:r>
+      <w:r>
+        <w:t xml:space="preserve">the influence of those factors. In Brighton and Hove, one of the outcomes that emerged from the vocal public debate, was a considerable number of parents from the BACA catchment opting to send their children to Patcham School (in the neighbouring catchment — see</w:t>
       </w:r>
       <w:r>
         <w:t xml:space="preserve"> </w:t>
@@ -7042,7 +7099,7 @@
         <w:t xml:space="preserve"> </w:t>
       </w:r>
       <w:r>
-        <w:t xml:space="preserve">in above reveal, in 2024-25, a disadvantaged pupil attending BACA and taking their GSCEs would have, on average, left that school with GCSEs 5-points higher than if they’d attended a similar school with a similar profile elsewhere in England. Over the last 4 years, this would have averaged around 3 points higher. This is a boost way in excess of the fraction of a point differences that might be expected from altering the disadvantage mix in schools. BACA is doing incredibly well for its disadvantaged students and indeed out-performs every other school in the city by some margin — even those which in the popular imagination are viewed as the</w:t>
+        <w:t xml:space="preserve">in above reveal, in 2024-25, a disadvantaged pupil attending the less popular BACA and taking their GSCEs would have, on average, left that school with GCSEs 5-points higher than if they’d attended a similar school with a similar profile elsewhere in England. Over the last 4 years, this would have averaged around 3 points higher. This is a boost way in excess of the fraction of a point differences that might be expected from altering the disadvantage mix in schools. BACA is doing incredibly well for its disadvantaged students and indeed out-performs every other school in the city by some margin — even those which in the popular imagination are viewed as the</w:t>
       </w:r>
       <w:r>
         <w:t xml:space="preserve"> </w:t>
@@ -7072,7 +7129,7 @@
         <w:rPr>
           <w:rStyle w:val="FootnoteReference"/>
         </w:rPr>
-        <w:footnoteReference w:id="82"/>
+        <w:footnoteReference w:id="84"/>
       </w:r>
       <w:r>
         <w:t xml:space="preserve"> </w:t>
@@ -7086,7 +7143,7 @@
         <w:pStyle w:val="BodyText"/>
       </w:pPr>
       <w:r>
-        <w:t xml:space="preserve">If we contrast BACA — the school popular narrative discouraged parents from sending their children to — with Patcham — the school many from BACA catchment in the end opted for, the differences on this alternative league table are stark. Disadvantaged pupils attending Patcham on average over the last 4 years and compared to other disadvantaged pupils attending schools with similar profiles elsewhere in England, would leave with around 2.6 GCSE points fewer than they might be expected to compared to similar schools elsewhere in England. In 2023-24, the difference was in double figures. These differences have been hidden from view amongst the comfortable mid-table position, in raw attainment terms, the school has enjoyed. Now, of course, there might be many reasons why parents would want to opt for Patcham High School over BACA, but the nuance afforded to the effectiveness of these schools by the modelling in this paper might have provided an alternative view that could have made some of parents from BACA catchment who opted to send their children to Patcham, make a different decision.</w:t>
+        <w:t xml:space="preserve">If we contrast BACA — the school popular narrative discouraged parents from sending their children to — with Patcham — the school many from BACA catchment in the end opted for, the differences on this alternative league table are stark. Disadvantaged pupils attending Patcham on average over the last 4 years and compared to other disadvantaged pupils attending schools with similar profiles elsewhere in England, would leave with around 2.6 GCSE points fewer than they might be expected to compared to similar schools elsewhere in England. In 2023-24, the difference was in double figures. These differences have been hidden from view amongst the comfortable mid-table position, in raw attainment terms, the school has enjoyed. There might be many reasons why parents would want to opt for Patcham High School over BACA, but the nuance afforded to the effectiveness of these schools by the modelling in this paper might have provided an alternative view that could have made some of parents from BACA catchment who opted to send their children to Patcham, make a different decision.</w:t>
       </w:r>
     </w:p>
     <w:p>
@@ -7094,11 +7151,11 @@
         <w:pStyle w:val="BodyText"/>
       </w:pPr>
       <w:r>
-        <w:t xml:space="preserve">One thing other schools in the city certainly could learn from Patcham High School is in how to improve attendance rates. The school is one of only two in the city with attendance better than the national average. This is an actionable policy lever at the school-level. Without a deeper dive into attendance issues at the different schools in the city. Indeed, given we now know where the real problems in Brighton and Hove lie at the LEA level, one useful policy focus at the city level could well be exploring how schools like Patcham are able to keep attendance relatively high, while then allowing more school-level investigations into where under-performance might be occurring given our new knowledge of interacting structural drivers within the city.</w:t>
-      </w:r>
-    </w:p>
-    <w:bookmarkEnd w:id="84"/>
-    <w:bookmarkStart w:id="85" w:name="X40b1884cedc541d2941047d67c0b6e8ce71c267"/>
+        <w:t xml:space="preserve">One thing other schools in the city certainly could learn from Patcham High School is in how to improve attendance rates. The school is one of only two in the city with attendance better than the national average. This is an actionable policy lever at the school-level. Without a deeper dive into attendance issues at the different schools in the city, it’s impossible to know what the drivers of this issue are. But given we now know where the real problems in Brighton and Hove lie at the LEA level, one useful policy focus at the city level could well be exploring how schools like Patcham are able to keep attendance relatively high, while then allowing more school-level investigations into where under-performance might be occurring given our new knowledge of interacting structural drivers within the city.</w:t>
+      </w:r>
+    </w:p>
+    <w:bookmarkEnd w:id="86"/>
+    <w:bookmarkStart w:id="87" w:name="X40b1884cedc541d2941047d67c0b6e8ce71c267"/>
     <w:p>
       <w:pPr>
         <w:pStyle w:val="Heading2"/>
@@ -7112,7 +7169,7 @@
         <w:pStyle w:val="FirstParagraph"/>
       </w:pPr>
       <w:r>
-        <w:t xml:space="preserve">It is worth acknowledging what was only partially articulated during the consultation: that a significant driver of the proposals was financial rather than educational. Reducing PANs at popular schools and creating out-of-catchment priority places were designed, at least in part, to redirect pupil flows toward under-subscribed peripheral schools. Keeping such schools financially viable is a legitimate concern. However, there is an inherent tension between optimising for financial sustainability and optimising for educational outcomes. If the net effect is to move children from schools adding more value to schools adding less, the aggregate impact on city-wide attainment could be negative. The financial and educational cases needed to be weighed transparently, and it is not clear this trade-off was adequately acknowledged.</w:t>
+        <w:t xml:space="preserve">It is worth acknowledging what was only partially articulated during the consultation: that a significant driver of the proposals was financial rather than educational. Reducing PANs at popular schools and creating out-of-catchment priority places were designed, at least in part, to redirect pupil flows toward under-subscribed schools at the periphery of the city. Complicating things further, the closure of a school in an economically deprived area of the city in the mid 2000s has meant that students in this area were already forced to make long journeys to school to these under-subscribed schools on the outskirts of the city. Due to the effects of having large proportions of disadvantaged students in these peripheral schools captured by our model, this can cause lower raw score results and can further reduce applications to attend those schools. Since schools receive funding on a per pupil basis, keeping these schools financially viable is a legitimate concern. However, there is an inherent tension between optimising for financial sustainability and optimising for educational outcomes. At the city level, it is easy for a policy-maker to point to surface level data and assume the disadvantage concentrations in a school are a driving effect of attainment and popularity. The two are related, but for Brighton and Hove, it does not appear to be the case that rebalancing disadvantage levels across schools would have a net positive effect on attainment for individual pupils or the city. If the net effect is to move children from schools adding more value to schools adding less, the aggregate impact on city-wide attainment could be negative. The financial and educational cases needed to be weighed transparently, and it is not clear this trade-off was adequately acknowledged in Brighton and Hove.</w:t>
       </w:r>
     </w:p>
     <w:p>
@@ -7123,8 +7180,8 @@
         <w:t xml:space="preserve">Following widespread opposition and appeals to the Schools Adjudicator, the proposed PAN reductions were rejected and the 20% out-of-catchment priority was reduced to 5%. While displacement was minimised, the policy reverberations continued through the choices expressed by parents already influenced by the preceding debate.</w:t>
       </w:r>
     </w:p>
-    <w:bookmarkEnd w:id="85"/>
-    <w:bookmarkStart w:id="87" w:name="the-cost-of-speed-over-evidence"/>
+    <w:bookmarkEnd w:id="87"/>
+    <w:bookmarkStart w:id="89" w:name="the-cost-of-speed-over-evidence"/>
     <w:p>
       <w:pPr>
         <w:pStyle w:val="Heading2"/>
@@ -7141,7 +7198,7 @@
         <w:t xml:space="preserve">The institutional context deserves reflection. The shift to a Leader and Cabinet system concentrated decision-making power and enabled policy to be enacted through a whipped voting system. The consultation was compressed in timeline and limited in scope for deliberative engagement. This matters because the evidence base for school attainment is complex — the factors are multiple, interacting, non-linear and context-dependent. Institutional structures that compress deliberation timelines are particularly dangerous when the evidence requires careful handling and its implications are counterintuitive. Had the analysis presented here been available at the outset, the quality of public scrutiny would have been substantially higher, even if the political outcome had remained the same.</w:t>
       </w:r>
     </w:p>
-    <w:bookmarkStart w:id="86" w:name="X6c85e6b131c00160602066b25667ec048f9fb77"/>
+    <w:bookmarkStart w:id="88" w:name="X6c85e6b131c00160602066b25667ec048f9fb77"/>
     <w:p>
       <w:pPr>
         <w:pStyle w:val="Heading3"/>
@@ -7174,9 +7231,9 @@
         <w:t xml:space="preserve">The honest answer is that we do not yet know what produces this LEA effect. The random effect, by definition, captures variance that the fixed-effect predictors do not explain. It could reflect high levels of parental engagement and aspiration — Brighton and Hove has a well-educated population with a strong civic culture. It could relate to the quality of school leadership and governance across the city, or to effective local authority support services and school improvement programmes. It could be something about the collaborative relationships between schools, or community factors that are difficult to quantify. Identifying the sources of this over-performance is an important research question in its own right, and one that could require additional qualitative investigation or access to pupil-level data that goes beyond what is publicly available. What is clear, however, is that policy interventions which risk disrupting a well-functioning system without understanding what makes it function well carry substantial downside risk.</w:t>
       </w:r>
     </w:p>
-    <w:bookmarkEnd w:id="86"/>
-    <w:bookmarkEnd w:id="87"/>
-    <w:bookmarkStart w:id="90" w:name="implications-for-national-policy"/>
+    <w:bookmarkEnd w:id="88"/>
+    <w:bookmarkEnd w:id="89"/>
+    <w:bookmarkStart w:id="92" w:name="implications-for-national-policy"/>
     <w:p>
       <w:pPr>
         <w:pStyle w:val="Heading2"/>
@@ -7216,7 +7273,7 @@
         <w:rPr>
           <w:rStyle w:val="FootnoteReference"/>
         </w:rPr>
-        <w:footnoteReference w:id="88"/>
+        <w:footnoteReference w:id="90"/>
       </w:r>
       <w:r>
         <w:t xml:space="preserve"> </w:t>
@@ -7225,8 +7282,8 @@
         <w:t xml:space="preserve">underpinned by the models in this paper, to begin bridging that gap. The tool allows users to explore any school in England, compare against contextual expectations, and model the indicative impact of changes to key variables.</w:t>
       </w:r>
     </w:p>
-    <w:bookmarkEnd w:id="90"/>
-    <w:bookmarkStart w:id="91" w:name="limitations"/>
+    <w:bookmarkEnd w:id="92"/>
+    <w:bookmarkStart w:id="93" w:name="limitations"/>
     <w:p>
       <w:pPr>
         <w:pStyle w:val="Heading2"/>
@@ -7243,9 +7300,9 @@
         <w:t xml:space="preserve">These are school-level models built from aggregate published data, not pupil-level analyses. The associations identified are not experimental causal estimates but the best approximations available from observational data. The models cannot capture unmeasured factors such as school culture, parental engagement, or individual pupil resilience. The Policy Simulator translates associations into indicative, not definitive, projections. We do not claim that reducing absence by a given amount will mechanically produce the predicted gain — the real world is more complex than any model captures. What we do claim is that these models are accurate enough, and the patterns consistent enough across years and specifications, to substantially improve the quality of the conversation around what matters most.</w:t>
       </w:r>
     </w:p>
-    <w:bookmarkEnd w:id="91"/>
-    <w:bookmarkEnd w:id="92"/>
-    <w:bookmarkStart w:id="93" w:name="conclusion"/>
+    <w:bookmarkEnd w:id="93"/>
+    <w:bookmarkEnd w:id="94"/>
+    <w:bookmarkStart w:id="95" w:name="conclusion"/>
     <w:p>
       <w:pPr>
         <w:pStyle w:val="Heading1"/>
@@ -7294,8 +7351,8 @@
         <w:t xml:space="preserve">decisions are made — not after. The raw materials already exist. What is needed is the analytical capacity and institutional willingness to use them.</w:t>
       </w:r>
     </w:p>
-    <w:bookmarkEnd w:id="93"/>
-    <w:bookmarkStart w:id="94" w:name="acknowledgements"/>
+    <w:bookmarkEnd w:id="95"/>
+    <w:bookmarkStart w:id="96" w:name="acknowledgements"/>
     <w:p>
       <w:pPr>
         <w:pStyle w:val="Heading1"/>
@@ -7318,11 +7375,11 @@
         <w:t xml:space="preserve">‘Parent Support Group’</w:t>
       </w:r>
       <w:r>
-        <w:t xml:space="preserve">. The range of perspectives and breath of expertise within this group has been inspirational.</w:t>
-      </w:r>
-    </w:p>
-    <w:bookmarkEnd w:id="94"/>
-    <w:bookmarkStart w:id="95" w:name="declaration-of-interest"/>
+        <w:t xml:space="preserve">. The range of perspectives and breadth of expertise within this group has been inspirational.</w:t>
+      </w:r>
+    </w:p>
+    <w:bookmarkEnd w:id="96"/>
+    <w:bookmarkStart w:id="97" w:name="declaration-of-interest"/>
     <w:p>
       <w:pPr>
         <w:pStyle w:val="Heading1"/>
@@ -7339,8 +7396,8 @@
         <w:t xml:space="preserve">The authors are residents of Brighton and Hove with lived experience of the effects of the admissions policy process described. Some authors are involved in local school governance. No financial conflicts of interest exist.</w:t>
       </w:r>
     </w:p>
-    <w:bookmarkEnd w:id="95"/>
-    <w:bookmarkStart w:id="150" w:name="references"/>
+    <w:bookmarkEnd w:id="97"/>
+    <w:bookmarkStart w:id="156" w:name="references"/>
     <w:p>
       <w:pPr>
         <w:pStyle w:val="Heading1"/>
@@ -7349,8 +7406,8 @@
         <w:t xml:space="preserve">References</w:t>
       </w:r>
     </w:p>
-    <w:bookmarkStart w:id="149" w:name="refs"/>
-    <w:bookmarkStart w:id="97" w:name="ref-Allen2018"/>
+    <w:bookmarkStart w:id="155" w:name="refs"/>
+    <w:bookmarkStart w:id="99" w:name="ref-Allen2018"/>
     <w:p>
       <w:pPr>
         <w:pStyle w:val="Bibliography"/>
@@ -7392,7 +7449,7 @@
       <w:r>
         <w:t xml:space="preserve"> </w:t>
       </w:r>
-      <w:hyperlink r:id="rId96">
+      <w:hyperlink r:id="rId98">
         <w:r>
           <w:rPr>
             <w:rStyle w:val="Hyperlink"/>
@@ -7404,8 +7461,8 @@
         <w:t xml:space="preserve">.</w:t>
       </w:r>
     </w:p>
-    <w:bookmarkEnd w:id="97"/>
-    <w:bookmarkStart w:id="99" w:name="ref-Allen2013"/>
+    <w:bookmarkEnd w:id="99"/>
+    <w:bookmarkStart w:id="101" w:name="ref-Allen2013"/>
     <w:p>
       <w:pPr>
         <w:pStyle w:val="Bibliography"/>
@@ -7459,7 +7516,7 @@
       <w:r>
         <w:t xml:space="preserve"> </w:t>
       </w:r>
-      <w:hyperlink r:id="rId98">
+      <w:hyperlink r:id="rId100">
         <w:r>
           <w:rPr>
             <w:rStyle w:val="Hyperlink"/>
@@ -7471,8 +7528,8 @@
         <w:t xml:space="preserve">.</w:t>
       </w:r>
     </w:p>
-    <w:bookmarkEnd w:id="99"/>
-    <w:bookmarkStart w:id="101" w:name="ref-Anders2024"/>
+    <w:bookmarkEnd w:id="101"/>
+    <w:bookmarkStart w:id="103" w:name="ref-Anders2024"/>
     <w:p>
       <w:pPr>
         <w:pStyle w:val="Bibliography"/>
@@ -7526,7 +7583,7 @@
       <w:r>
         <w:t xml:space="preserve"> </w:t>
       </w:r>
-      <w:hyperlink r:id="rId100">
+      <w:hyperlink r:id="rId102">
         <w:r>
           <w:rPr>
             <w:rStyle w:val="Hyperlink"/>
@@ -7538,8 +7595,8 @@
         <w:t xml:space="preserve">.</w:t>
       </w:r>
     </w:p>
-    <w:bookmarkEnd w:id="101"/>
-    <w:bookmarkStart w:id="103" w:name="ref-Burgess2018"/>
+    <w:bookmarkEnd w:id="103"/>
+    <w:bookmarkStart w:id="105" w:name="ref-Burgess2018"/>
     <w:p>
       <w:pPr>
         <w:pStyle w:val="Bibliography"/>
@@ -7572,7 +7629,7 @@
       <w:r>
         <w:t xml:space="preserve"> </w:t>
       </w:r>
-      <w:hyperlink r:id="rId102">
+      <w:hyperlink r:id="rId104">
         <w:r>
           <w:rPr>
             <w:rStyle w:val="Hyperlink"/>
@@ -7584,8 +7641,8 @@
         <w:t xml:space="preserve">.</w:t>
       </w:r>
     </w:p>
-    <w:bookmarkEnd w:id="103"/>
-    <w:bookmarkStart w:id="105" w:name="ref-Burgess2023"/>
+    <w:bookmarkEnd w:id="105"/>
+    <w:bookmarkStart w:id="107" w:name="ref-Burgess2023"/>
     <w:p>
       <w:pPr>
         <w:pStyle w:val="Bibliography"/>
@@ -7618,7 +7675,7 @@
       <w:r>
         <w:t xml:space="preserve"> </w:t>
       </w:r>
-      <w:hyperlink r:id="rId104">
+      <w:hyperlink r:id="rId106">
         <w:r>
           <w:rPr>
             <w:rStyle w:val="Hyperlink"/>
@@ -7630,8 +7687,8 @@
         <w:t xml:space="preserve">.</w:t>
       </w:r>
     </w:p>
-    <w:bookmarkEnd w:id="105"/>
-    <w:bookmarkStart w:id="107" w:name="ref-Burgess2022"/>
+    <w:bookmarkEnd w:id="107"/>
+    <w:bookmarkStart w:id="109" w:name="ref-Burgess2022"/>
     <w:p>
       <w:pPr>
         <w:pStyle w:val="Bibliography"/>
@@ -7655,7 +7712,7 @@
       <w:r>
         <w:t xml:space="preserve"> </w:t>
       </w:r>
-      <w:hyperlink r:id="rId106">
+      <w:hyperlink r:id="rId108">
         <w:r>
           <w:rPr>
             <w:rStyle w:val="Hyperlink"/>
@@ -7667,8 +7724,8 @@
         <w:t xml:space="preserve">.</w:t>
       </w:r>
     </w:p>
-    <w:bookmarkEnd w:id="107"/>
-    <w:bookmarkStart w:id="109" w:name="ref-HouseofCommons2021"/>
+    <w:bookmarkEnd w:id="109"/>
+    <w:bookmarkStart w:id="111" w:name="ref-HouseofCommons2021"/>
     <w:p>
       <w:pPr>
         <w:pStyle w:val="Bibliography"/>
@@ -7818,7 +7875,7 @@
       <w:r>
         <w:t xml:space="preserve"> </w:t>
       </w:r>
-      <w:hyperlink r:id="rId108">
+      <w:hyperlink r:id="rId110">
         <w:r>
           <w:rPr>
             <w:rStyle w:val="Hyperlink"/>
@@ -7830,8 +7887,8 @@
         <w:t xml:space="preserve">.</w:t>
       </w:r>
     </w:p>
-    <w:bookmarkEnd w:id="109"/>
-    <w:bookmarkStart w:id="111" w:name="ref-DfE2022"/>
+    <w:bookmarkEnd w:id="111"/>
+    <w:bookmarkStart w:id="113" w:name="ref-DfE2022"/>
     <w:p>
       <w:pPr>
         <w:pStyle w:val="Bibliography"/>
@@ -7932,7 +7989,7 @@
       <w:r>
         <w:t xml:space="preserve"> </w:t>
       </w:r>
-      <w:hyperlink r:id="rId110">
+      <w:hyperlink r:id="rId112">
         <w:r>
           <w:rPr>
             <w:rStyle w:val="Hyperlink"/>
@@ -7944,8 +8001,8 @@
         <w:t xml:space="preserve">.</w:t>
       </w:r>
     </w:p>
-    <w:bookmarkEnd w:id="111"/>
-    <w:bookmarkStart w:id="113" w:name="ref-DfE2025a"/>
+    <w:bookmarkEnd w:id="113"/>
+    <w:bookmarkStart w:id="115" w:name="ref-DfE2025a"/>
     <w:p>
       <w:pPr>
         <w:pStyle w:val="Bibliography"/>
@@ -7969,7 +8026,7 @@
       <w:r>
         <w:t xml:space="preserve"> </w:t>
       </w:r>
-      <w:hyperlink r:id="rId112">
+      <w:hyperlink r:id="rId114">
         <w:r>
           <w:rPr>
             <w:rStyle w:val="Hyperlink"/>
@@ -7981,8 +8038,8 @@
         <w:t xml:space="preserve">.</w:t>
       </w:r>
     </w:p>
-    <w:bookmarkEnd w:id="113"/>
-    <w:bookmarkStart w:id="115" w:name="ref-DfE2025b"/>
+    <w:bookmarkEnd w:id="115"/>
+    <w:bookmarkStart w:id="117" w:name="ref-DfE2025b"/>
     <w:p>
       <w:pPr>
         <w:pStyle w:val="Bibliography"/>
@@ -8055,7 +8112,7 @@
       <w:r>
         <w:t xml:space="preserve"> </w:t>
       </w:r>
-      <w:hyperlink r:id="rId114">
+      <w:hyperlink r:id="rId116">
         <w:r>
           <w:rPr>
             <w:rStyle w:val="Hyperlink"/>
@@ -8067,8 +8124,8 @@
         <w:t xml:space="preserve">.</w:t>
       </w:r>
     </w:p>
-    <w:bookmarkEnd w:id="115"/>
-    <w:bookmarkStart w:id="117" w:name="ref-dfe_every_2026"/>
+    <w:bookmarkEnd w:id="117"/>
+    <w:bookmarkStart w:id="119" w:name="ref-dfe_every_2026"/>
     <w:p>
       <w:pPr>
         <w:pStyle w:val="Bibliography"/>
@@ -8092,7 +8149,7 @@
       <w:r>
         <w:t xml:space="preserve"> </w:t>
       </w:r>
-      <w:hyperlink r:id="rId116">
+      <w:hyperlink r:id="rId118">
         <w:r>
           <w:rPr>
             <w:rStyle w:val="Hyperlink"/>
@@ -8104,8 +8161,8 @@
         <w:t xml:space="preserve">.</w:t>
       </w:r>
     </w:p>
-    <w:bookmarkEnd w:id="117"/>
-    <w:bookmarkStart w:id="119" w:name="ref-Drager2024"/>
+    <w:bookmarkEnd w:id="119"/>
+    <w:bookmarkStart w:id="121" w:name="ref-Drager2024"/>
     <w:p>
       <w:pPr>
         <w:pStyle w:val="Bibliography"/>
@@ -8138,7 +8195,7 @@
       <w:r>
         <w:t xml:space="preserve"> </w:t>
       </w:r>
-      <w:hyperlink r:id="rId118">
+      <w:hyperlink r:id="rId120">
         <w:r>
           <w:rPr>
             <w:rStyle w:val="Hyperlink"/>
@@ -8150,8 +8207,8 @@
         <w:t xml:space="preserve">.</w:t>
       </w:r>
     </w:p>
-    <w:bookmarkEnd w:id="119"/>
-    <w:bookmarkStart w:id="121" w:name="ref-Farquharson2024"/>
+    <w:bookmarkEnd w:id="121"/>
+    <w:bookmarkStart w:id="123" w:name="ref-Farquharson2024"/>
     <w:p>
       <w:pPr>
         <w:pStyle w:val="Bibliography"/>
@@ -8184,7 +8241,7 @@
       <w:r>
         <w:t xml:space="preserve"> </w:t>
       </w:r>
-      <w:hyperlink r:id="rId120">
+      <w:hyperlink r:id="rId122">
         <w:r>
           <w:rPr>
             <w:rStyle w:val="Hyperlink"/>
@@ -8196,8 +8253,8 @@
         <w:t xml:space="preserve">.</w:t>
       </w:r>
     </w:p>
-    <w:bookmarkEnd w:id="121"/>
-    <w:bookmarkStart w:id="123" w:name="ref-Gibbons2018"/>
+    <w:bookmarkEnd w:id="123"/>
+    <w:bookmarkStart w:id="125" w:name="ref-Gibbons2018"/>
     <w:p>
       <w:pPr>
         <w:pStyle w:val="Bibliography"/>
@@ -8221,7 +8278,7 @@
       <w:r>
         <w:t xml:space="preserve"> </w:t>
       </w:r>
-      <w:hyperlink r:id="rId122">
+      <w:hyperlink r:id="rId124">
         <w:r>
           <w:rPr>
             <w:rStyle w:val="Hyperlink"/>
@@ -8233,8 +8290,8 @@
         <w:t xml:space="preserve">.</w:t>
       </w:r>
     </w:p>
-    <w:bookmarkEnd w:id="123"/>
-    <w:bookmarkStart w:id="125" w:name="ref-Gillborn2017"/>
+    <w:bookmarkEnd w:id="125"/>
+    <w:bookmarkStart w:id="127" w:name="ref-Gillborn2017"/>
     <w:p>
       <w:pPr>
         <w:pStyle w:val="Bibliography"/>
@@ -8297,7 +8354,7 @@
       <w:r>
         <w:t xml:space="preserve"> </w:t>
       </w:r>
-      <w:hyperlink r:id="rId124">
+      <w:hyperlink r:id="rId126">
         <w:r>
           <w:rPr>
             <w:rStyle w:val="Hyperlink"/>
@@ -8309,8 +8366,8 @@
         <w:t xml:space="preserve">.</w:t>
       </w:r>
     </w:p>
-    <w:bookmarkEnd w:id="125"/>
-    <w:bookmarkStart w:id="127" w:name="ref-gorard_how_2019"/>
+    <w:bookmarkEnd w:id="127"/>
+    <w:bookmarkStart w:id="129" w:name="ref-gorard_how_2019"/>
     <w:p>
       <w:pPr>
         <w:pStyle w:val="Bibliography"/>
@@ -8388,7 +8445,7 @@
       <w:r>
         <w:t xml:space="preserve"> </w:t>
       </w:r>
-      <w:hyperlink r:id="rId126">
+      <w:hyperlink r:id="rId128">
         <w:r>
           <w:rPr>
             <w:rStyle w:val="Hyperlink"/>
@@ -8400,8 +8457,8 @@
         <w:t xml:space="preserve">.</w:t>
       </w:r>
     </w:p>
-    <w:bookmarkEnd w:id="127"/>
-    <w:bookmarkStart w:id="129" w:name="ref-gorard_school_2025"/>
+    <w:bookmarkEnd w:id="129"/>
+    <w:bookmarkStart w:id="131" w:name="ref-gorard_school_2025"/>
     <w:p>
       <w:pPr>
         <w:pStyle w:val="Bibliography"/>
@@ -8554,7 +8611,7 @@
       <w:r>
         <w:t xml:space="preserve"> </w:t>
       </w:r>
-      <w:hyperlink r:id="rId128">
+      <w:hyperlink r:id="rId130">
         <w:r>
           <w:rPr>
             <w:rStyle w:val="Hyperlink"/>
@@ -8566,8 +8623,8 @@
         <w:t xml:space="preserve">.</w:t>
       </w:r>
     </w:p>
-    <w:bookmarkEnd w:id="129"/>
-    <w:bookmarkStart w:id="131" w:name="ref-Grant2017"/>
+    <w:bookmarkEnd w:id="131"/>
+    <w:bookmarkStart w:id="133" w:name="ref-Grant2017"/>
     <w:p>
       <w:pPr>
         <w:pStyle w:val="Bibliography"/>
@@ -8675,7 +8732,7 @@
       <w:r>
         <w:t xml:space="preserve"> </w:t>
       </w:r>
-      <w:hyperlink r:id="rId130">
+      <w:hyperlink r:id="rId132">
         <w:r>
           <w:rPr>
             <w:rStyle w:val="Hyperlink"/>
@@ -8687,13 +8744,183 @@
         <w:t xml:space="preserve">.</w:t>
       </w:r>
     </w:p>
-    <w:bookmarkEnd w:id="131"/>
-    <w:bookmarkStart w:id="133" w:name="ref-Menzies2023"/>
+    <w:bookmarkEnd w:id="133"/>
+    <w:bookmarkStart w:id="135" w:name="ref-macleod_supporting_2015"/>
     <w:p>
       <w:pPr>
         <w:pStyle w:val="Bibliography"/>
       </w:pPr>
       <w:r>
+        <w:t xml:space="preserve">Macleod, S., C. Sharp, D. Bernardinelli, A. Skipp, and S. Higgins. 2015.</w:t>
+      </w:r>
+      <w:r>
+        <w:t xml:space="preserve"> </w:t>
+      </w:r>
+      <w:r>
+        <w:rPr>
+          <w:i/>
+          <w:iCs/>
+        </w:rPr>
+        <w:t xml:space="preserve">Supporting the</w:t>
+      </w:r>
+      <w:r>
+        <w:rPr>
+          <w:i/>
+          <w:iCs/>
+        </w:rPr>
+        <w:t xml:space="preserve"> </w:t>
+      </w:r>
+      <w:r>
+        <w:rPr>
+          <w:i/>
+          <w:iCs/>
+        </w:rPr>
+        <w:t xml:space="preserve">Attainment</w:t>
+      </w:r>
+      <w:r>
+        <w:rPr>
+          <w:i/>
+          <w:iCs/>
+        </w:rPr>
+        <w:t xml:space="preserve"> </w:t>
+      </w:r>
+      <w:r>
+        <w:rPr>
+          <w:i/>
+          <w:iCs/>
+        </w:rPr>
+        <w:t xml:space="preserve">of</w:t>
+      </w:r>
+      <w:r>
+        <w:rPr>
+          <w:i/>
+          <w:iCs/>
+        </w:rPr>
+        <w:t xml:space="preserve"> </w:t>
+      </w:r>
+      <w:r>
+        <w:rPr>
+          <w:i/>
+          <w:iCs/>
+        </w:rPr>
+        <w:t xml:space="preserve">Disadvantaged</w:t>
+      </w:r>
+      <w:r>
+        <w:rPr>
+          <w:i/>
+          <w:iCs/>
+        </w:rPr>
+        <w:t xml:space="preserve"> </w:t>
+      </w:r>
+      <w:r>
+        <w:rPr>
+          <w:i/>
+          <w:iCs/>
+        </w:rPr>
+        <w:t xml:space="preserve">Pupils</w:t>
+      </w:r>
+      <w:r>
+        <w:rPr>
+          <w:i/>
+          <w:iCs/>
+        </w:rPr>
+        <w:t xml:space="preserve">:</w:t>
+      </w:r>
+      <w:r>
+        <w:rPr>
+          <w:i/>
+          <w:iCs/>
+        </w:rPr>
+        <w:t xml:space="preserve"> </w:t>
+      </w:r>
+      <w:r>
+        <w:rPr>
+          <w:i/>
+          <w:iCs/>
+        </w:rPr>
+        <w:t xml:space="preserve">Articulating</w:t>
+      </w:r>
+      <w:r>
+        <w:rPr>
+          <w:i/>
+          <w:iCs/>
+        </w:rPr>
+        <w:t xml:space="preserve"> </w:t>
+      </w:r>
+      <w:r>
+        <w:rPr>
+          <w:i/>
+          <w:iCs/>
+        </w:rPr>
+        <w:t xml:space="preserve">Success</w:t>
+      </w:r>
+      <w:r>
+        <w:rPr>
+          <w:i/>
+          <w:iCs/>
+        </w:rPr>
+        <w:t xml:space="preserve"> </w:t>
+      </w:r>
+      <w:r>
+        <w:rPr>
+          <w:i/>
+          <w:iCs/>
+        </w:rPr>
+        <w:t xml:space="preserve">and</w:t>
+      </w:r>
+      <w:r>
+        <w:rPr>
+          <w:i/>
+          <w:iCs/>
+        </w:rPr>
+        <w:t xml:space="preserve"> </w:t>
+      </w:r>
+      <w:r>
+        <w:rPr>
+          <w:i/>
+          <w:iCs/>
+        </w:rPr>
+        <w:t xml:space="preserve">Good</w:t>
+      </w:r>
+      <w:r>
+        <w:rPr>
+          <w:i/>
+          <w:iCs/>
+        </w:rPr>
+        <w:t xml:space="preserve"> </w:t>
+      </w:r>
+      <w:r>
+        <w:rPr>
+          <w:i/>
+          <w:iCs/>
+        </w:rPr>
+        <w:t xml:space="preserve">Practice</w:t>
+      </w:r>
+      <w:r>
+        <w:t xml:space="preserve">. Department for Education.</w:t>
+      </w:r>
+      <w:r>
+        <w:t xml:space="preserve"> </w:t>
+      </w:r>
+      <w:hyperlink r:id="rId134">
+        <w:r>
+          <w:rPr>
+            <w:rStyle w:val="Hyperlink"/>
+          </w:rPr>
+          <w:t xml:space="preserve">https://www.nfer.ac.uk/publications/supporting-the-attainment-of-disadvantaged-pupils-articulating-success-and-good-practice/</w:t>
+        </w:r>
+      </w:hyperlink>
+      <w:r>
+        <w:t xml:space="preserve">.</w:t>
+      </w:r>
+    </w:p>
+    <w:bookmarkEnd w:id="135"/>
+    <w:bookmarkStart w:id="137" w:name="ref-Menzies2023"/>
+    <w:p>
+      <w:pPr>
+        <w:pStyle w:val="Bibliography"/>
+      </w:pPr>
+      <w:r>
         <w:t xml:space="preserve">Menzies, Loic. 2023.</w:t>
       </w:r>
       <w:r>
@@ -8721,7 +8948,7 @@
       <w:r>
         <w:t xml:space="preserve"> </w:t>
       </w:r>
-      <w:hyperlink r:id="rId132">
+      <w:hyperlink r:id="rId136">
         <w:r>
           <w:rPr>
             <w:rStyle w:val="Hyperlink"/>
@@ -8733,8 +8960,8 @@
         <w:t xml:space="preserve">.</w:t>
       </w:r>
     </w:p>
-    <w:bookmarkEnd w:id="133"/>
-    <w:bookmarkStart w:id="135" w:name="ref-Riordan2021"/>
+    <w:bookmarkEnd w:id="137"/>
+    <w:bookmarkStart w:id="139" w:name="ref-Riordan2021"/>
     <w:p>
       <w:pPr>
         <w:pStyle w:val="Bibliography"/>
@@ -8758,7 +8985,7 @@
       <w:r>
         <w:t xml:space="preserve"> </w:t>
       </w:r>
-      <w:hyperlink r:id="rId134">
+      <w:hyperlink r:id="rId138">
         <w:r>
           <w:rPr>
             <w:rStyle w:val="Hyperlink"/>
@@ -8770,8 +8997,8 @@
         <w:t xml:space="preserve">.</w:t>
       </w:r>
     </w:p>
-    <w:bookmarkEnd w:id="135"/>
-    <w:bookmarkStart w:id="137" w:name="ref-Ross2020"/>
+    <w:bookmarkEnd w:id="139"/>
+    <w:bookmarkStart w:id="141" w:name="ref-Ross2020"/>
     <w:p>
       <w:pPr>
         <w:pStyle w:val="Bibliography"/>
@@ -8837,7 +9064,7 @@
       <w:r>
         <w:t xml:space="preserve"> </w:t>
       </w:r>
-      <w:hyperlink r:id="rId136">
+      <w:hyperlink r:id="rId140">
         <w:r>
           <w:rPr>
             <w:rStyle w:val="Hyperlink"/>
@@ -8849,8 +9076,8 @@
         <w:t xml:space="preserve">.</w:t>
       </w:r>
     </w:p>
-    <w:bookmarkEnd w:id="137"/>
-    <w:bookmarkStart w:id="138" w:name="ref-Snijders2012"/>
+    <w:bookmarkEnd w:id="141"/>
+    <w:bookmarkStart w:id="142" w:name="ref-Snijders2012"/>
     <w:p>
       <w:pPr>
         <w:pStyle w:val="Bibliography"/>
@@ -8872,8 +9099,8 @@
         <w:t xml:space="preserve">. 2nd ed. SAGE.</w:t>
       </w:r>
     </w:p>
-    <w:bookmarkEnd w:id="138"/>
-    <w:bookmarkStart w:id="140" w:name="ref-StopforthGayle2025"/>
+    <w:bookmarkEnd w:id="142"/>
+    <w:bookmarkStart w:id="144" w:name="ref-StopforthGayle2025"/>
     <w:p>
       <w:pPr>
         <w:pStyle w:val="Bibliography"/>
@@ -8906,7 +9133,7 @@
       <w:r>
         <w:t xml:space="preserve"> </w:t>
       </w:r>
-      <w:hyperlink r:id="rId139">
+      <w:hyperlink r:id="rId143">
         <w:r>
           <w:rPr>
             <w:rStyle w:val="Hyperlink"/>
@@ -8918,8 +9145,8 @@
         <w:t xml:space="preserve">.</w:t>
       </w:r>
     </w:p>
-    <w:bookmarkEnd w:id="140"/>
-    <w:bookmarkStart w:id="142" w:name="ref-Strand2021"/>
+    <w:bookmarkEnd w:id="144"/>
+    <w:bookmarkStart w:id="146" w:name="ref-Strand2021"/>
     <w:p>
       <w:pPr>
         <w:pStyle w:val="Bibliography"/>
@@ -8985,7 +9212,7 @@
       <w:r>
         <w:t xml:space="preserve"> </w:t>
       </w:r>
-      <w:hyperlink r:id="rId141">
+      <w:hyperlink r:id="rId145">
         <w:r>
           <w:rPr>
             <w:rStyle w:val="Hyperlink"/>
@@ -8997,13 +9224,193 @@
         <w:t xml:space="preserve">.</w:t>
       </w:r>
     </w:p>
-    <w:bookmarkEnd w:id="142"/>
-    <w:bookmarkStart w:id="144" w:name="ref-Thomson2023"/>
+    <w:bookmarkEnd w:id="146"/>
+    <w:bookmarkStart w:id="148" w:name="ref-tan_good_2025"/>
     <w:p>
       <w:pPr>
         <w:pStyle w:val="Bibliography"/>
       </w:pPr>
       <w:r>
+        <w:t xml:space="preserve">Tan, Josiah, and Adam Dennett. 2025.</w:t>
+      </w:r>
+      <w:r>
+        <w:t xml:space="preserve"> </w:t>
+      </w:r>
+      <w:r>
+        <w:t xml:space="preserve">“Do</w:t>
+      </w:r>
+      <w:r>
+        <w:t xml:space="preserve"> </w:t>
+      </w:r>
+      <w:r>
+        <w:t xml:space="preserve">Good</w:t>
+      </w:r>
+      <w:r>
+        <w:t xml:space="preserve"> </w:t>
+      </w:r>
+      <w:r>
+        <w:t xml:space="preserve">Schools</w:t>
+      </w:r>
+      <w:r>
+        <w:t xml:space="preserve"> </w:t>
+      </w:r>
+      <w:r>
+        <w:t xml:space="preserve">Influence</w:t>
+      </w:r>
+      <w:r>
+        <w:t xml:space="preserve"> </w:t>
+      </w:r>
+      <w:r>
+        <w:t xml:space="preserve">Property</w:t>
+      </w:r>
+      <w:r>
+        <w:t xml:space="preserve"> </w:t>
+      </w:r>
+      <w:r>
+        <w:t xml:space="preserve">Prices</w:t>
+      </w:r>
+      <w:r>
+        <w:t xml:space="preserve">?</w:t>
+      </w:r>
+      <w:r>
+        <w:t xml:space="preserve"> </w:t>
+      </w:r>
+      <w:r>
+        <w:t xml:space="preserve">Disentangling</w:t>
+      </w:r>
+      <w:r>
+        <w:t xml:space="preserve"> </w:t>
+      </w:r>
+      <w:r>
+        <w:t xml:space="preserve">School</w:t>
+      </w:r>
+      <w:r>
+        <w:t xml:space="preserve"> </w:t>
+      </w:r>
+      <w:r>
+        <w:t xml:space="preserve">and</w:t>
+      </w:r>
+      <w:r>
+        <w:t xml:space="preserve"> </w:t>
+      </w:r>
+      <w:r>
+        <w:t xml:space="preserve">Neighbourhood</w:t>
+      </w:r>
+      <w:r>
+        <w:t xml:space="preserve"> </w:t>
+      </w:r>
+      <w:r>
+        <w:t xml:space="preserve">Effects</w:t>
+      </w:r>
+      <w:r>
+        <w:t xml:space="preserve"> </w:t>
+      </w:r>
+      <w:r>
+        <w:t xml:space="preserve">with</w:t>
+      </w:r>
+      <w:r>
+        <w:t xml:space="preserve"> </w:t>
+      </w:r>
+      <w:r>
+        <w:t xml:space="preserve">Empirical</w:t>
+      </w:r>
+      <w:r>
+        <w:t xml:space="preserve"> </w:t>
+      </w:r>
+      <w:r>
+        <w:t xml:space="preserve">Evidence</w:t>
+      </w:r>
+      <w:r>
+        <w:t xml:space="preserve"> </w:t>
+      </w:r>
+      <w:r>
+        <w:t xml:space="preserve">from</w:t>
+      </w:r>
+      <w:r>
+        <w:t xml:space="preserve"> </w:t>
+      </w:r>
+      <w:r>
+        <w:t xml:space="preserve">Brighton</w:t>
+      </w:r>
+      <w:r>
+        <w:t xml:space="preserve">.”</w:t>
+      </w:r>
+      <w:r>
+        <w:t xml:space="preserve"> </w:t>
+      </w:r>
+      <w:r>
+        <w:t xml:space="preserve">In</w:t>
+      </w:r>
+      <w:r>
+        <w:t xml:space="preserve"> </w:t>
+      </w:r>
+      <w:r>
+        <w:rPr>
+          <w:i/>
+          <w:iCs/>
+        </w:rPr>
+        <w:t xml:space="preserve">Digital-</w:t>
+      </w:r>
+      <w:r>
+        <w:rPr>
+          <w:i/>
+          <w:iCs/>
+        </w:rPr>
+        <w:t xml:space="preserve">Era</w:t>
+      </w:r>
+      <w:r>
+        <w:rPr>
+          <w:i/>
+          <w:iCs/>
+        </w:rPr>
+        <w:t xml:space="preserve"> </w:t>
+      </w:r>
+      <w:r>
+        <w:rPr>
+          <w:i/>
+          <w:iCs/>
+        </w:rPr>
+        <w:t xml:space="preserve">Urban</w:t>
+      </w:r>
+      <w:r>
+        <w:rPr>
+          <w:i/>
+          <w:iCs/>
+        </w:rPr>
+        <w:t xml:space="preserve"> </w:t>
+      </w:r>
+      <w:r>
+        <w:rPr>
+          <w:i/>
+          <w:iCs/>
+        </w:rPr>
+        <w:t xml:space="preserve">Transformations</w:t>
+      </w:r>
+      <w:r>
+        <w:t xml:space="preserve">, edited by Robert Goodspeed, Esra Suel, Huanfa Chen, Joana Barros, and Christopher Pettit. Springer Nature Switzerland.</w:t>
+      </w:r>
+      <w:r>
+        <w:t xml:space="preserve"> </w:t>
+      </w:r>
+      <w:hyperlink r:id="rId147">
+        <w:r>
+          <w:rPr>
+            <w:rStyle w:val="Hyperlink"/>
+          </w:rPr>
+          <w:t xml:space="preserve">https://doi.org/10.1007/978-3-031-98300-9_17</w:t>
+        </w:r>
+      </w:hyperlink>
+      <w:r>
+        <w:t xml:space="preserve">.</w:t>
+      </w:r>
+    </w:p>
+    <w:bookmarkEnd w:id="148"/>
+    <w:bookmarkStart w:id="150" w:name="ref-Thomson2023"/>
+    <w:p>
+      <w:pPr>
+        <w:pStyle w:val="Bibliography"/>
+      </w:pPr>
+      <w:r>
         <w:t xml:space="preserve">Thomson, Dave. 2023.</w:t>
       </w:r>
       <w:r>
@@ -9031,7 +9438,7 @@
       <w:r>
         <w:t xml:space="preserve"> </w:t>
       </w:r>
-      <w:hyperlink r:id="rId143">
+      <w:hyperlink r:id="rId149">
         <w:r>
           <w:rPr>
             <w:rStyle w:val="Hyperlink"/>
@@ -9043,8 +9450,8 @@
         <w:t xml:space="preserve">.</w:t>
       </w:r>
     </w:p>
-    <w:bookmarkEnd w:id="144"/>
-    <w:bookmarkStart w:id="146" w:name="ref-Tuckett2023"/>
+    <w:bookmarkEnd w:id="150"/>
+    <w:bookmarkStart w:id="152" w:name="ref-Tuckett2023"/>
     <w:p>
       <w:pPr>
         <w:pStyle w:val="Bibliography"/>
@@ -9110,7 +9517,7 @@
       <w:r>
         <w:t xml:space="preserve"> </w:t>
       </w:r>
-      <w:hyperlink r:id="rId145">
+      <w:hyperlink r:id="rId151">
         <w:r>
           <w:rPr>
             <w:rStyle w:val="Hyperlink"/>
@@ -9122,8 +9529,8 @@
         <w:t xml:space="preserve">.</w:t>
       </w:r>
     </w:p>
-    <w:bookmarkEnd w:id="146"/>
-    <w:bookmarkStart w:id="148" w:name="ref-Zuccollo2023"/>
+    <w:bookmarkEnd w:id="152"/>
+    <w:bookmarkStart w:id="154" w:name="ref-Zuccollo2023"/>
     <w:p>
       <w:pPr>
         <w:pStyle w:val="Bibliography"/>
@@ -9147,7 +9554,7 @@
       <w:r>
         <w:t xml:space="preserve"> </w:t>
       </w:r>
-      <w:hyperlink r:id="rId147">
+      <w:hyperlink r:id="rId153">
         <w:r>
           <w:rPr>
             <w:rStyle w:val="Hyperlink"/>
@@ -9159,9 +9566,9 @@
         <w:t xml:space="preserve">.</w:t>
       </w:r>
     </w:p>
-    <w:bookmarkEnd w:id="148"/>
-    <w:bookmarkEnd w:id="149"/>
-    <w:bookmarkEnd w:id="150"/>
+    <w:bookmarkEnd w:id="154"/>
+    <w:bookmarkEnd w:id="155"/>
+    <w:bookmarkEnd w:id="156"/>
     <w:sectPr>
       <w:footnotePr>
         <w:numRestart w:val="eachSect"/>
@@ -9215,7 +9622,7 @@
       </w:hyperlink>
     </w:p>
   </w:footnote>
-  <w:footnote w:id="27">
+  <w:footnote w:id="23">
     <w:p>
       <w:pPr>
         <w:pStyle w:val="FootnoteText"/>
@@ -9230,12 +9637,42 @@
         <w:t xml:space="preserve"> </w:t>
       </w:r>
       <w:r>
+        <w:t xml:space="preserve">Details of English National Curriculum Key Stages</w:t>
+      </w:r>
+      <w:r>
+        <w:t xml:space="preserve"> </w:t>
+      </w:r>
+      <w:hyperlink r:id="rId24">
+        <w:r>
+          <w:rPr>
+            <w:rStyle w:val="Hyperlink"/>
+          </w:rPr>
+          <w:t xml:space="preserve">https://www.gov.uk/national-curriculum</w:t>
+        </w:r>
+      </w:hyperlink>
+    </w:p>
+  </w:footnote>
+  <w:footnote w:id="29">
+    <w:p>
+      <w:pPr>
+        <w:pStyle w:val="FootnoteText"/>
+      </w:pPr>
+      <w:r>
+        <w:rPr>
+          <w:rStyle w:val="FootnoteReference"/>
+        </w:rPr>
+        <w:footnoteRef/>
+      </w:r>
+      <w:r>
+        <w:t xml:space="preserve"> </w:t>
+      </w:r>
+      <w:r>
         <w:t xml:space="preserve">Supplementary material:</w:t>
       </w:r>
       <w:r>
         <w:t xml:space="preserve"> </w:t>
       </w:r>
-      <w:hyperlink r:id="rId28">
+      <w:hyperlink r:id="rId30">
         <w:r>
           <w:rPr>
             <w:rStyle w:val="Hyperlink"/>
@@ -9245,7 +9682,7 @@
       </w:hyperlink>
     </w:p>
   </w:footnote>
-  <w:footnote w:id="30">
+  <w:footnote w:id="32">
     <w:p>
       <w:pPr>
         <w:pStyle w:val="FootnoteText"/>
@@ -9265,7 +9702,7 @@
       <w:r>
         <w:t xml:space="preserve"> </w:t>
       </w:r>
-      <w:hyperlink r:id="rId31">
+      <w:hyperlink r:id="rId33">
         <w:r>
           <w:rPr>
             <w:rStyle w:val="Hyperlink"/>
@@ -9275,7 +9712,7 @@
       </w:hyperlink>
     </w:p>
   </w:footnote>
-  <w:footnote w:id="41">
+  <w:footnote w:id="43">
     <w:p>
       <w:pPr>
         <w:pStyle w:val="FootnoteText"/>
@@ -9458,7 +9895,7 @@
       </w:r>
     </w:p>
   </w:footnote>
-  <w:footnote w:id="42">
+  <w:footnote w:id="44">
     <w:p>
       <w:pPr>
         <w:pStyle w:val="FootnoteText"/>
@@ -9478,7 +9915,7 @@
       <w:r>
         <w:t xml:space="preserve"> </w:t>
       </w:r>
-      <w:hyperlink r:id="rId43">
+      <w:hyperlink r:id="rId45">
         <w:r>
           <w:rPr>
             <w:rStyle w:val="Hyperlink"/>
@@ -9488,7 +9925,7 @@
       </w:hyperlink>
     </w:p>
   </w:footnote>
-  <w:footnote w:id="44">
+  <w:footnote w:id="46">
     <w:p>
       <w:pPr>
         <w:pStyle w:val="FootnoteText"/>
@@ -9508,7 +9945,7 @@
       <w:r>
         <w:t xml:space="preserve"> </w:t>
       </w:r>
-      <w:hyperlink r:id="rId45">
+      <w:hyperlink r:id="rId47">
         <w:r>
           <w:rPr>
             <w:rStyle w:val="Hyperlink"/>
@@ -9518,7 +9955,7 @@
       </w:hyperlink>
     </w:p>
   </w:footnote>
-  <w:footnote w:id="46">
+  <w:footnote w:id="48">
     <w:p>
       <w:pPr>
         <w:pStyle w:val="FootnoteText"/>
@@ -9538,7 +9975,7 @@
       <w:r>
         <w:t xml:space="preserve"> </w:t>
       </w:r>
-      <w:hyperlink r:id="rId47">
+      <w:hyperlink r:id="rId49">
         <w:r>
           <w:rPr>
             <w:rStyle w:val="Hyperlink"/>
@@ -9548,7 +9985,7 @@
       </w:hyperlink>
     </w:p>
   </w:footnote>
-  <w:footnote w:id="71">
+  <w:footnote w:id="73">
     <w:p>
       <w:pPr>
         <w:pStyle w:val="FootnoteText"/>
@@ -9568,7 +10005,7 @@
       <w:r>
         <w:t xml:space="preserve"> </w:t>
       </w:r>
-      <w:hyperlink r:id="rId72">
+      <w:hyperlink r:id="rId74">
         <w:r>
           <w:rPr>
             <w:rStyle w:val="Hyperlink"/>
@@ -9578,7 +10015,7 @@
       </w:hyperlink>
     </w:p>
   </w:footnote>
-  <w:footnote w:id="74">
+  <w:footnote w:id="76">
     <w:p>
       <w:pPr>
         <w:pStyle w:val="FootnoteText"/>
@@ -9598,7 +10035,7 @@
       <w:r>
         <w:t xml:space="preserve"> </w:t>
       </w:r>
-      <w:hyperlink r:id="rId75">
+      <w:hyperlink r:id="rId77">
         <w:r>
           <w:rPr>
             <w:rStyle w:val="Hyperlink"/>
@@ -9608,7 +10045,7 @@
       </w:hyperlink>
     </w:p>
   </w:footnote>
-  <w:footnote w:id="78">
+  <w:footnote w:id="80">
     <w:p>
       <w:pPr>
         <w:pStyle w:val="FootnoteText"/>
@@ -9622,7 +10059,7 @@
       <w:r>
         <w:t xml:space="preserve"> </w:t>
       </w:r>
-      <w:hyperlink r:id="rId79">
+      <w:hyperlink r:id="rId81">
         <w:r>
           <w:rPr>
             <w:rStyle w:val="Hyperlink"/>
@@ -9632,7 +10069,7 @@
       </w:hyperlink>
     </w:p>
   </w:footnote>
-  <w:footnote w:id="80">
+  <w:footnote w:id="82">
     <w:p>
       <w:pPr>
         <w:pStyle w:val="FootnoteText"/>
@@ -9646,7 +10083,7 @@
       <w:r>
         <w:t xml:space="preserve"> </w:t>
       </w:r>
-      <w:hyperlink r:id="rId81">
+      <w:hyperlink r:id="rId83">
         <w:r>
           <w:rPr>
             <w:rStyle w:val="Hyperlink"/>
@@ -9656,7 +10093,7 @@
       </w:hyperlink>
     </w:p>
   </w:footnote>
-  <w:footnote w:id="82">
+  <w:footnote w:id="84">
     <w:p>
       <w:pPr>
         <w:pStyle w:val="FootnoteText"/>
@@ -9670,7 +10107,7 @@
       <w:r>
         <w:t xml:space="preserve"> </w:t>
       </w:r>
-      <w:hyperlink r:id="rId83">
+      <w:hyperlink r:id="rId85">
         <w:r>
           <w:rPr>
             <w:rStyle w:val="Hyperlink"/>
@@ -9680,7 +10117,7 @@
       </w:hyperlink>
     </w:p>
   </w:footnote>
-  <w:footnote w:id="88">
+  <w:footnote w:id="90">
     <w:p>
       <w:pPr>
         <w:pStyle w:val="FootnoteText"/>
@@ -9700,7 +10137,7 @@
       <w:r>
         <w:t xml:space="preserve"> </w:t>
       </w:r>
-      <w:hyperlink r:id="rId89">
+      <w:hyperlink r:id="rId91">
         <w:r>
           <w:rPr>
             <w:rStyle w:val="Hyperlink"/>

</xml_diff>

<commit_message>
Update JEP_Paper with new commuting/sleep references
Add 18 new bibliography entries covering sleep, commuting, adolescent
wellbeing, active travel and school transfer. Re-render JEP_Paper PDF
to incorporate the updated text and citations.

Co-Authored-By: Claude Opus 4.6 <noreply@anthropic.com>
</commit_message>
<xml_diff>
--- a/JEP_Paper.docx
+++ b/JEP_Paper.docx
@@ -414,7 +414,16 @@
         <w:t xml:space="preserve"> </w:t>
       </w:r>
       <w:r>
-        <w:t xml:space="preserve">documents a stark gradient: among persistently absent pupils, only 35.6% achieved a standard pass in English and Maths, compared with 83.7% among those with no recorded absences. More recent analysis finds that pupils with near-perfect attendance were 1.9 times as likely to achieve a grade 5 pass compared with otherwise similar pupils attending 90–95% of the time</w:t>
+        <w:t xml:space="preserve">documents a stark gradient: among persistently absent pupils, only 35.6% achieved a standard pass in English and Maths, compared with 83.7% among those with no recorded absences. It is also cited as one of the main factors in pushing down attainment for disadvantaged pupils by</w:t>
+      </w:r>
+      <w:r>
+        <w:t xml:space="preserve"> </w:t>
+      </w:r>
+      <w:r>
+        <w:t xml:space="preserve">Macleod et al. (2015)</w:t>
+      </w:r>
+      <w:r>
+        <w:t xml:space="preserve">. More recent analysis finds that pupils with near-perfect attendance were 1.9 times as likely to achieve a grade 5 pass compared with otherwise similar pupils attending 90–95% of the time</w:t>
       </w:r>
       <w:r>
         <w:t xml:space="preserve"> </w:t>
@@ -4829,11 +4838,13 @@
         <w:footnoteReference w:id="73"/>
       </w:r>
       <w:r>
-        <w:t xml:space="preserve">, it was stated</w:t>
-      </w:r>
-      <w:r>
-        <w:t xml:space="preserve"> </w:t>
-      </w:r>
+        <w:t xml:space="preserve">, it was stated:</w:t>
+      </w:r>
+    </w:p>
+    <w:p>
+      <w:pPr>
+        <w:pStyle w:val="BlockText"/>
+      </w:pPr>
       <w:r>
         <w:rPr>
           <w:i/>
@@ -4841,9 +4852,11 @@
         </w:rPr>
         <w:t xml:space="preserve">“We also know that children from disadvantaged homes are less likely to do well at school and that can be made worse when more disadvantaged children all go to school together. We are looking at options for how we can help the city manage that issue better, including through our school admissions arrangements.”</w:t>
       </w:r>
-      <w:r>
-        <w:t xml:space="preserve"> </w:t>
-      </w:r>
+    </w:p>
+    <w:p>
+      <w:pPr>
+        <w:pStyle w:val="FirstParagraph"/>
+      </w:pPr>
       <w:r>
         <w:t xml:space="preserve">While this premise is false in the context of</w:t>
       </w:r>
@@ -4862,7 +4875,76 @@
         <w:pStyle w:val="BodyText"/>
       </w:pPr>
       <w:r>
-        <w:t xml:space="preserve">Furthermore, the chosen lever carried its own risks. Of the many negative impacts of longer journeys imposed by redistribution policies (e.g. reduced sleep and mental health), they are associated with higher absence</w:t>
+        <w:t xml:space="preserve">Furthermore, the chosen lever carried its own risks. Of the many negative impacts of longer journeys imposed by redistribution policies - e.g. reduced sleep and its psychosocial</w:t>
+      </w:r>
+      <w:r>
+        <w:t xml:space="preserve"> </w:t>
+      </w:r>
+      <w:r>
+        <w:t xml:space="preserve">(Fredriksen et al. 2004; Yeo et al. 2019)</w:t>
+      </w:r>
+      <w:r>
+        <w:t xml:space="preserve">, physical</w:t>
+      </w:r>
+      <w:r>
+        <w:t xml:space="preserve"> </w:t>
+      </w:r>
+      <w:r>
+        <w:t xml:space="preserve">(Voulgaris et al. 2019; Pradhan and Sinha 2017; Pereira et al. 2014; Faulkner et al. 2013)</w:t>
+      </w:r>
+      <w:r>
+        <w:t xml:space="preserve"> </w:t>
+      </w:r>
+      <w:r>
+        <w:t xml:space="preserve">and mental health</w:t>
+      </w:r>
+      <w:r>
+        <w:t xml:space="preserve"> </w:t>
+      </w:r>
+      <w:r>
+        <w:t xml:space="preserve">(Nakajima et al. 2024; Chairassamee et al. 2024; Guan et al. 2025)</w:t>
+      </w:r>
+      <w:r>
+        <w:t xml:space="preserve"> </w:t>
+      </w:r>
+      <w:r>
+        <w:t xml:space="preserve">including stress</w:t>
+      </w:r>
+      <w:r>
+        <w:t xml:space="preserve"> </w:t>
+      </w:r>
+      <w:r>
+        <w:t xml:space="preserve">(Karan et al. 2021)</w:t>
+      </w:r>
+      <w:r>
+        <w:t xml:space="preserve"> </w:t>
+      </w:r>
+      <w:r>
+        <w:t xml:space="preserve">and general wellbeing</w:t>
+      </w:r>
+      <w:r>
+        <w:t xml:space="preserve"> </w:t>
+      </w:r>
+      <w:r>
+        <w:t xml:space="preserve">(Ding et al. 2023)</w:t>
+      </w:r>
+      <w:r>
+        <w:t xml:space="preserve"> </w:t>
+      </w:r>
+      <w:r>
+        <w:t xml:space="preserve">- they are also associated with higher absence in many countries</w:t>
+      </w:r>
+      <w:r>
+        <w:t xml:space="preserve"> </w:t>
+      </w:r>
+      <w:r>
+        <w:t xml:space="preserve">(Otsuka et al. 2025; Cordes et al. 2022; Blagg et al. 2018)</w:t>
+      </w:r>
+      <w:r>
+        <w:t xml:space="preserve"> </w:t>
+      </w:r>
+      <w:r>
+        <w:t xml:space="preserve">including England</w:t>
       </w:r>
       <w:r>
         <w:t xml:space="preserve"> </w:t>
@@ -7397,7 +7479,7 @@
       </w:r>
     </w:p>
     <w:bookmarkEnd w:id="97"/>
-    <w:bookmarkStart w:id="156" w:name="references"/>
+    <w:bookmarkStart w:id="184" w:name="references"/>
     <w:p>
       <w:pPr>
         <w:pStyle w:val="Heading1"/>
@@ -7406,7 +7488,7 @@
         <w:t xml:space="preserve">References</w:t>
       </w:r>
     </w:p>
-    <w:bookmarkStart w:id="155" w:name="refs"/>
+    <w:bookmarkStart w:id="183" w:name="refs"/>
     <w:bookmarkStart w:id="99" w:name="ref-Allen2018"/>
     <w:p>
       <w:pPr>
@@ -7596,12 +7678,217 @@
       </w:r>
     </w:p>
     <w:bookmarkEnd w:id="103"/>
-    <w:bookmarkStart w:id="105" w:name="ref-Burgess2018"/>
+    <w:bookmarkStart w:id="105" w:name="ref-Blagg2018"/>
     <w:p>
       <w:pPr>
         <w:pStyle w:val="Bibliography"/>
       </w:pPr>
       <w:r>
+        <w:t xml:space="preserve">Blagg, Kristin, Victoria Rosenboom, and Matthew M. Chingos. 2018.</w:t>
+      </w:r>
+      <w:r>
+        <w:t xml:space="preserve"> </w:t>
+      </w:r>
+      <w:r>
+        <w:rPr>
+          <w:i/>
+          <w:iCs/>
+        </w:rPr>
+        <w:t xml:space="preserve">The</w:t>
+      </w:r>
+      <w:r>
+        <w:rPr>
+          <w:i/>
+          <w:iCs/>
+        </w:rPr>
+        <w:t xml:space="preserve"> </w:t>
+      </w:r>
+      <w:r>
+        <w:rPr>
+          <w:i/>
+          <w:iCs/>
+        </w:rPr>
+        <w:t xml:space="preserve">Extra</w:t>
+      </w:r>
+      <w:r>
+        <w:rPr>
+          <w:i/>
+          <w:iCs/>
+        </w:rPr>
+        <w:t xml:space="preserve"> </w:t>
+      </w:r>
+      <w:r>
+        <w:rPr>
+          <w:i/>
+          <w:iCs/>
+        </w:rPr>
+        <w:t xml:space="preserve">Mile</w:t>
+      </w:r>
+      <w:r>
+        <w:rPr>
+          <w:i/>
+          <w:iCs/>
+        </w:rPr>
+        <w:t xml:space="preserve">:</w:t>
+      </w:r>
+      <w:r>
+        <w:rPr>
+          <w:i/>
+          <w:iCs/>
+        </w:rPr>
+        <w:t xml:space="preserve"> </w:t>
+      </w:r>
+      <w:r>
+        <w:rPr>
+          <w:i/>
+          <w:iCs/>
+        </w:rPr>
+        <w:t xml:space="preserve">Time</w:t>
+      </w:r>
+      <w:r>
+        <w:rPr>
+          <w:i/>
+          <w:iCs/>
+        </w:rPr>
+        <w:t xml:space="preserve"> </w:t>
+      </w:r>
+      <w:r>
+        <w:rPr>
+          <w:i/>
+          <w:iCs/>
+        </w:rPr>
+        <w:t xml:space="preserve">to</w:t>
+      </w:r>
+      <w:r>
+        <w:rPr>
+          <w:i/>
+          <w:iCs/>
+        </w:rPr>
+        <w:t xml:space="preserve"> </w:t>
+      </w:r>
+      <w:r>
+        <w:rPr>
+          <w:i/>
+          <w:iCs/>
+        </w:rPr>
+        <w:t xml:space="preserve">School</w:t>
+      </w:r>
+      <w:r>
+        <w:rPr>
+          <w:i/>
+          <w:iCs/>
+        </w:rPr>
+        <w:t xml:space="preserve"> </w:t>
+      </w:r>
+      <w:r>
+        <w:rPr>
+          <w:i/>
+          <w:iCs/>
+        </w:rPr>
+        <w:t xml:space="preserve">and</w:t>
+      </w:r>
+      <w:r>
+        <w:rPr>
+          <w:i/>
+          <w:iCs/>
+        </w:rPr>
+        <w:t xml:space="preserve"> </w:t>
+      </w:r>
+      <w:r>
+        <w:rPr>
+          <w:i/>
+          <w:iCs/>
+        </w:rPr>
+        <w:t xml:space="preserve">Student</w:t>
+      </w:r>
+      <w:r>
+        <w:rPr>
+          <w:i/>
+          <w:iCs/>
+        </w:rPr>
+        <w:t xml:space="preserve"> </w:t>
+      </w:r>
+      <w:r>
+        <w:rPr>
+          <w:i/>
+          <w:iCs/>
+        </w:rPr>
+        <w:t xml:space="preserve">Outcomes</w:t>
+      </w:r>
+      <w:r>
+        <w:rPr>
+          <w:i/>
+          <w:iCs/>
+        </w:rPr>
+        <w:t xml:space="preserve"> </w:t>
+      </w:r>
+      <w:r>
+        <w:rPr>
+          <w:i/>
+          <w:iCs/>
+        </w:rPr>
+        <w:t xml:space="preserve">in</w:t>
+      </w:r>
+      <w:r>
+        <w:rPr>
+          <w:i/>
+          <w:iCs/>
+        </w:rPr>
+        <w:t xml:space="preserve"> </w:t>
+      </w:r>
+      <w:r>
+        <w:rPr>
+          <w:i/>
+          <w:iCs/>
+        </w:rPr>
+        <w:t xml:space="preserve">Washington</w:t>
+      </w:r>
+      <w:r>
+        <w:rPr>
+          <w:i/>
+          <w:iCs/>
+        </w:rPr>
+        <w:t xml:space="preserve">,</w:t>
+      </w:r>
+      <w:r>
+        <w:rPr>
+          <w:i/>
+          <w:iCs/>
+        </w:rPr>
+        <w:t xml:space="preserve"> </w:t>
+      </w:r>
+      <w:r>
+        <w:rPr>
+          <w:i/>
+          <w:iCs/>
+        </w:rPr>
+        <w:t xml:space="preserve">DC</w:t>
+      </w:r>
+      <w:r>
+        <w:t xml:space="preserve">. Urban Institute.</w:t>
+      </w:r>
+      <w:r>
+        <w:t xml:space="preserve"> </w:t>
+      </w:r>
+      <w:hyperlink r:id="rId104">
+        <w:r>
+          <w:rPr>
+            <w:rStyle w:val="Hyperlink"/>
+          </w:rPr>
+          <w:t xml:space="preserve">https://www.urban.org/sites/default/files/publication/99027/time_to_school_and_student_outcomes_in_dc_1.pdf</w:t>
+        </w:r>
+      </w:hyperlink>
+      <w:r>
+        <w:t xml:space="preserve">.</w:t>
+      </w:r>
+    </w:p>
+    <w:bookmarkEnd w:id="105"/>
+    <w:bookmarkStart w:id="107" w:name="ref-Burgess2018"/>
+    <w:p>
+      <w:pPr>
+        <w:pStyle w:val="Bibliography"/>
+      </w:pPr>
+      <w:r>
         <w:t xml:space="preserve">Burgess, Simon, Claire Crawford, and Lindsey Macmillan. 2018.</w:t>
       </w:r>
       <w:r>
@@ -7629,7 +7916,7 @@
       <w:r>
         <w:t xml:space="preserve"> </w:t>
       </w:r>
-      <w:hyperlink r:id="rId104">
+      <w:hyperlink r:id="rId106">
         <w:r>
           <w:rPr>
             <w:rStyle w:val="Hyperlink"/>
@@ -7641,8 +7928,8 @@
         <w:t xml:space="preserve">.</w:t>
       </w:r>
     </w:p>
-    <w:bookmarkEnd w:id="105"/>
-    <w:bookmarkStart w:id="107" w:name="ref-Burgess2023"/>
+    <w:bookmarkEnd w:id="107"/>
+    <w:bookmarkStart w:id="109" w:name="ref-Burgess2023"/>
     <w:p>
       <w:pPr>
         <w:pStyle w:val="Bibliography"/>
@@ -7675,7 +7962,7 @@
       <w:r>
         <w:t xml:space="preserve"> </w:t>
       </w:r>
-      <w:hyperlink r:id="rId106">
+      <w:hyperlink r:id="rId108">
         <w:r>
           <w:rPr>
             <w:rStyle w:val="Hyperlink"/>
@@ -7687,8 +7974,8 @@
         <w:t xml:space="preserve">.</w:t>
       </w:r>
     </w:p>
-    <w:bookmarkEnd w:id="107"/>
-    <w:bookmarkStart w:id="109" w:name="ref-Burgess2022"/>
+    <w:bookmarkEnd w:id="109"/>
+    <w:bookmarkStart w:id="111" w:name="ref-Burgess2022"/>
     <w:p>
       <w:pPr>
         <w:pStyle w:val="Bibliography"/>
@@ -7712,7 +7999,7 @@
       <w:r>
         <w:t xml:space="preserve"> </w:t>
       </w:r>
-      <w:hyperlink r:id="rId108">
+      <w:hyperlink r:id="rId110">
         <w:r>
           <w:rPr>
             <w:rStyle w:val="Hyperlink"/>
@@ -7724,13 +8011,59 @@
         <w:t xml:space="preserve">.</w:t>
       </w:r>
     </w:p>
-    <w:bookmarkEnd w:id="109"/>
-    <w:bookmarkStart w:id="111" w:name="ref-HouseofCommons2021"/>
+    <w:bookmarkEnd w:id="111"/>
+    <w:bookmarkStart w:id="113" w:name="ref-Chairassamee2024"/>
     <w:p>
       <w:pPr>
         <w:pStyle w:val="Bibliography"/>
       </w:pPr>
       <w:r>
+        <w:t xml:space="preserve">Chairassamee, Nattanicha, Kanokwan Chancharoenchai, and Wuthiya Saraithong. 2024.</w:t>
+      </w:r>
+      <w:r>
+        <w:t xml:space="preserve"> </w:t>
+      </w:r>
+      <w:r>
+        <w:t xml:space="preserve">“Getting There: How Commuting Time and Distance Impact Students’ Health.”</w:t>
+      </w:r>
+      <w:r>
+        <w:t xml:space="preserve"> </w:t>
+      </w:r>
+      <w:r>
+        <w:rPr>
+          <w:i/>
+          <w:iCs/>
+        </w:rPr>
+        <w:t xml:space="preserve">PLoS One</w:t>
+      </w:r>
+      <w:r>
+        <w:t xml:space="preserve"> </w:t>
+      </w:r>
+      <w:r>
+        <w:t xml:space="preserve">19 (12): e0314687.</w:t>
+      </w:r>
+      <w:r>
+        <w:t xml:space="preserve"> </w:t>
+      </w:r>
+      <w:hyperlink r:id="rId112">
+        <w:r>
+          <w:rPr>
+            <w:rStyle w:val="Hyperlink"/>
+          </w:rPr>
+          <w:t xml:space="preserve">https://doi.org/10.1371/journal.pone.0314687</w:t>
+        </w:r>
+      </w:hyperlink>
+      <w:r>
+        <w:t xml:space="preserve">.</w:t>
+      </w:r>
+    </w:p>
+    <w:bookmarkEnd w:id="113"/>
+    <w:bookmarkStart w:id="115" w:name="ref-HouseofCommons2021"/>
+    <w:p>
+      <w:pPr>
+        <w:pStyle w:val="Bibliography"/>
+      </w:pPr>
+      <w:r>
         <w:t xml:space="preserve">Commons Education Committee, House of. 2021.</w:t>
       </w:r>
       <w:r>
@@ -7875,7 +8208,7 @@
       <w:r>
         <w:t xml:space="preserve"> </w:t>
       </w:r>
-      <w:hyperlink r:id="rId110">
+      <w:hyperlink r:id="rId114">
         <w:r>
           <w:rPr>
             <w:rStyle w:val="Hyperlink"/>
@@ -7887,13 +8220,59 @@
         <w:t xml:space="preserve">.</w:t>
       </w:r>
     </w:p>
-    <w:bookmarkEnd w:id="111"/>
-    <w:bookmarkStart w:id="113" w:name="ref-DfE2022"/>
+    <w:bookmarkEnd w:id="115"/>
+    <w:bookmarkStart w:id="117" w:name="ref-Cordes2022"/>
     <w:p>
       <w:pPr>
         <w:pStyle w:val="Bibliography"/>
       </w:pPr>
       <w:r>
+        <w:t xml:space="preserve">Cordes, Sarah A., Christopher Rick, and Amy Ellen Schwartz. 2022.</w:t>
+      </w:r>
+      <w:r>
+        <w:t xml:space="preserve"> </w:t>
+      </w:r>
+      <w:r>
+        <w:t xml:space="preserve">“Do Long Bus Rides Drive down Academic Outcomes?”</w:t>
+      </w:r>
+      <w:r>
+        <w:t xml:space="preserve"> </w:t>
+      </w:r>
+      <w:r>
+        <w:rPr>
+          <w:i/>
+          <w:iCs/>
+        </w:rPr>
+        <w:t xml:space="preserve">Educational Evaluation and Policy Analysis</w:t>
+      </w:r>
+      <w:r>
+        <w:t xml:space="preserve"> </w:t>
+      </w:r>
+      <w:r>
+        <w:t xml:space="preserve">44 (4): 689–716.</w:t>
+      </w:r>
+      <w:r>
+        <w:t xml:space="preserve"> </w:t>
+      </w:r>
+      <w:hyperlink r:id="rId116">
+        <w:r>
+          <w:rPr>
+            <w:rStyle w:val="Hyperlink"/>
+          </w:rPr>
+          <w:t xml:space="preserve">https://doi.org/10.3102/01623737221092450</w:t>
+        </w:r>
+      </w:hyperlink>
+      <w:r>
+        <w:t xml:space="preserve">.</w:t>
+      </w:r>
+    </w:p>
+    <w:bookmarkEnd w:id="117"/>
+    <w:bookmarkStart w:id="119" w:name="ref-DfE2022"/>
+    <w:p>
+      <w:pPr>
+        <w:pStyle w:val="Bibliography"/>
+      </w:pPr>
+      <w:r>
         <w:t xml:space="preserve">DfE. 2022.</w:t>
       </w:r>
       <w:r>
@@ -7989,7 +8368,7 @@
       <w:r>
         <w:t xml:space="preserve"> </w:t>
       </w:r>
-      <w:hyperlink r:id="rId112">
+      <w:hyperlink r:id="rId118">
         <w:r>
           <w:rPr>
             <w:rStyle w:val="Hyperlink"/>
@@ -8001,8 +8380,8 @@
         <w:t xml:space="preserve">.</w:t>
       </w:r>
     </w:p>
-    <w:bookmarkEnd w:id="113"/>
-    <w:bookmarkStart w:id="115" w:name="ref-DfE2025a"/>
+    <w:bookmarkEnd w:id="119"/>
+    <w:bookmarkStart w:id="121" w:name="ref-DfE2025a"/>
     <w:p>
       <w:pPr>
         <w:pStyle w:val="Bibliography"/>
@@ -8026,7 +8405,7 @@
       <w:r>
         <w:t xml:space="preserve"> </w:t>
       </w:r>
-      <w:hyperlink r:id="rId114">
+      <w:hyperlink r:id="rId120">
         <w:r>
           <w:rPr>
             <w:rStyle w:val="Hyperlink"/>
@@ -8038,8 +8417,8 @@
         <w:t xml:space="preserve">.</w:t>
       </w:r>
     </w:p>
-    <w:bookmarkEnd w:id="115"/>
-    <w:bookmarkStart w:id="117" w:name="ref-DfE2025b"/>
+    <w:bookmarkEnd w:id="121"/>
+    <w:bookmarkStart w:id="123" w:name="ref-DfE2025b"/>
     <w:p>
       <w:pPr>
         <w:pStyle w:val="Bibliography"/>
@@ -8112,7 +8491,7 @@
       <w:r>
         <w:t xml:space="preserve"> </w:t>
       </w:r>
-      <w:hyperlink r:id="rId116">
+      <w:hyperlink r:id="rId122">
         <w:r>
           <w:rPr>
             <w:rStyle w:val="Hyperlink"/>
@@ -8124,8 +8503,8 @@
         <w:t xml:space="preserve">.</w:t>
       </w:r>
     </w:p>
-    <w:bookmarkEnd w:id="117"/>
-    <w:bookmarkStart w:id="119" w:name="ref-dfe_every_2026"/>
+    <w:bookmarkEnd w:id="123"/>
+    <w:bookmarkStart w:id="125" w:name="ref-dfe_every_2026"/>
     <w:p>
       <w:pPr>
         <w:pStyle w:val="Bibliography"/>
@@ -8149,7 +8528,7 @@
       <w:r>
         <w:t xml:space="preserve"> </w:t>
       </w:r>
-      <w:hyperlink r:id="rId118">
+      <w:hyperlink r:id="rId124">
         <w:r>
           <w:rPr>
             <w:rStyle w:val="Hyperlink"/>
@@ -8161,13 +8540,80 @@
         <w:t xml:space="preserve">.</w:t>
       </w:r>
     </w:p>
-    <w:bookmarkEnd w:id="119"/>
-    <w:bookmarkStart w:id="121" w:name="ref-Drager2024"/>
+    <w:bookmarkEnd w:id="125"/>
+    <w:bookmarkStart w:id="127" w:name="ref-Ding2023"/>
     <w:p>
       <w:pPr>
         <w:pStyle w:val="Bibliography"/>
       </w:pPr>
       <w:r>
+        <w:t xml:space="preserve">Ding, Peng, Yan Li, Suwei Feng, and Dorina Pojani. 2023.</w:t>
+      </w:r>
+      <w:r>
+        <w:t xml:space="preserve"> </w:t>
+      </w:r>
+      <w:r>
+        <w:t xml:space="preserve">“Do Long School Commutes Undermine Teenagers’ Wellbeing?</w:t>
+      </w:r>
+      <w:r>
+        <w:t xml:space="preserve"> </w:t>
+      </w:r>
+      <w:r>
+        <w:t xml:space="preserve">Evidence</w:t>
+      </w:r>
+      <w:r>
+        <w:t xml:space="preserve"> </w:t>
+      </w:r>
+      <w:r>
+        <w:t xml:space="preserve">from a Nation-Wide Survey in</w:t>
+      </w:r>
+      <w:r>
+        <w:t xml:space="preserve"> </w:t>
+      </w:r>
+      <w:r>
+        <w:t xml:space="preserve">China</w:t>
+      </w:r>
+      <w:r>
+        <w:t xml:space="preserve">.”</w:t>
+      </w:r>
+      <w:r>
+        <w:t xml:space="preserve"> </w:t>
+      </w:r>
+      <w:r>
+        <w:rPr>
+          <w:i/>
+          <w:iCs/>
+        </w:rPr>
+        <w:t xml:space="preserve">Journal of Transport &amp; Health</w:t>
+      </w:r>
+      <w:r>
+        <w:t xml:space="preserve"> </w:t>
+      </w:r>
+      <w:r>
+        <w:t xml:space="preserve">30: 101605.</w:t>
+      </w:r>
+      <w:r>
+        <w:t xml:space="preserve"> </w:t>
+      </w:r>
+      <w:hyperlink r:id="rId126">
+        <w:r>
+          <w:rPr>
+            <w:rStyle w:val="Hyperlink"/>
+          </w:rPr>
+          <w:t xml:space="preserve">https://doi.org/10.1016/j.jth.2023.101605</w:t>
+        </w:r>
+      </w:hyperlink>
+      <w:r>
+        <w:t xml:space="preserve">.</w:t>
+      </w:r>
+    </w:p>
+    <w:bookmarkEnd w:id="127"/>
+    <w:bookmarkStart w:id="129" w:name="ref-Drager2024"/>
+    <w:p>
+      <w:pPr>
+        <w:pStyle w:val="Bibliography"/>
+      </w:pPr>
+      <w:r>
         <w:t xml:space="preserve">Dräger, Jascha, Markus Klein, and Edward Sosu. 2024.</w:t>
       </w:r>
       <w:r>
@@ -8195,7 +8641,7 @@
       <w:r>
         <w:t xml:space="preserve"> </w:t>
       </w:r>
-      <w:hyperlink r:id="rId120">
+      <w:hyperlink r:id="rId128">
         <w:r>
           <w:rPr>
             <w:rStyle w:val="Hyperlink"/>
@@ -8207,8 +8653,8 @@
         <w:t xml:space="preserve">.</w:t>
       </w:r>
     </w:p>
-    <w:bookmarkEnd w:id="121"/>
-    <w:bookmarkStart w:id="123" w:name="ref-Farquharson2024"/>
+    <w:bookmarkEnd w:id="129"/>
+    <w:bookmarkStart w:id="131" w:name="ref-Farquharson2024"/>
     <w:p>
       <w:pPr>
         <w:pStyle w:val="Bibliography"/>
@@ -8241,7 +8687,7 @@
       <w:r>
         <w:t xml:space="preserve"> </w:t>
       </w:r>
-      <w:hyperlink r:id="rId122">
+      <w:hyperlink r:id="rId130">
         <w:r>
           <w:rPr>
             <w:rStyle w:val="Hyperlink"/>
@@ -8253,13 +8699,114 @@
         <w:t xml:space="preserve">.</w:t>
       </w:r>
     </w:p>
-    <w:bookmarkEnd w:id="123"/>
-    <w:bookmarkStart w:id="125" w:name="ref-Gibbons2018"/>
+    <w:bookmarkEnd w:id="131"/>
+    <w:bookmarkStart w:id="133" w:name="ref-Faulkner2013"/>
     <w:p>
       <w:pPr>
         <w:pStyle w:val="Bibliography"/>
       </w:pPr>
       <w:r>
+        <w:t xml:space="preserve">Faulkner, Guy, Michelle Stone, Ron Buliung, Bonny Wong, and Raktim Mitra. 2013.</w:t>
+      </w:r>
+      <w:r>
+        <w:t xml:space="preserve"> </w:t>
+      </w:r>
+      <w:r>
+        <w:t xml:space="preserve">“School Travel and Children’s Physical Activity: A Cross-Sectional Study Examining the Influence of Distance.”</w:t>
+      </w:r>
+      <w:r>
+        <w:t xml:space="preserve"> </w:t>
+      </w:r>
+      <w:r>
+        <w:rPr>
+          <w:i/>
+          <w:iCs/>
+        </w:rPr>
+        <w:t xml:space="preserve">BMC Public Health</w:t>
+      </w:r>
+      <w:r>
+        <w:t xml:space="preserve"> </w:t>
+      </w:r>
+      <w:r>
+        <w:t xml:space="preserve">13 (1): 1166.</w:t>
+      </w:r>
+      <w:r>
+        <w:t xml:space="preserve"> </w:t>
+      </w:r>
+      <w:hyperlink r:id="rId132">
+        <w:r>
+          <w:rPr>
+            <w:rStyle w:val="Hyperlink"/>
+          </w:rPr>
+          <w:t xml:space="preserve">https://doi.org/10.1186/1471-2458-13-1166</w:t>
+        </w:r>
+      </w:hyperlink>
+      <w:r>
+        <w:t xml:space="preserve">.</w:t>
+      </w:r>
+    </w:p>
+    <w:bookmarkEnd w:id="133"/>
+    <w:bookmarkStart w:id="135" w:name="ref-Fredriksen2004"/>
+    <w:p>
+      <w:pPr>
+        <w:pStyle w:val="Bibliography"/>
+      </w:pPr>
+      <w:r>
+        <w:t xml:space="preserve">Fredriksen, Katia, Jean Rhodes, Ranjini Reddy, and Niobe Way. 2004.</w:t>
+      </w:r>
+      <w:r>
+        <w:t xml:space="preserve"> </w:t>
+      </w:r>
+      <w:r>
+        <w:t xml:space="preserve">“Sleepless in</w:t>
+      </w:r>
+      <w:r>
+        <w:t xml:space="preserve"> </w:t>
+      </w:r>
+      <w:r>
+        <w:t xml:space="preserve">Chicago</w:t>
+      </w:r>
+      <w:r>
+        <w:t xml:space="preserve">: Tracking the Effects of Adolescent Sleep Loss During the Middle School Years.”</w:t>
+      </w:r>
+      <w:r>
+        <w:t xml:space="preserve"> </w:t>
+      </w:r>
+      <w:r>
+        <w:rPr>
+          <w:i/>
+          <w:iCs/>
+        </w:rPr>
+        <w:t xml:space="preserve">Child Development</w:t>
+      </w:r>
+      <w:r>
+        <w:t xml:space="preserve"> </w:t>
+      </w:r>
+      <w:r>
+        <w:t xml:space="preserve">75 (1): 84–95.</w:t>
+      </w:r>
+      <w:r>
+        <w:t xml:space="preserve"> </w:t>
+      </w:r>
+      <w:hyperlink r:id="rId134">
+        <w:r>
+          <w:rPr>
+            <w:rStyle w:val="Hyperlink"/>
+          </w:rPr>
+          <w:t xml:space="preserve">https://doi.org/10.1111/j.1467-8624.2004.00655.x</w:t>
+        </w:r>
+      </w:hyperlink>
+      <w:r>
+        <w:t xml:space="preserve">.</w:t>
+      </w:r>
+    </w:p>
+    <w:bookmarkEnd w:id="135"/>
+    <w:bookmarkStart w:id="137" w:name="ref-Gibbons2018"/>
+    <w:p>
+      <w:pPr>
+        <w:pStyle w:val="Bibliography"/>
+      </w:pPr>
+      <w:r>
         <w:t xml:space="preserve">Gibbons, Stephen, Vincenzo Scrutinio, and Shqiponja Telhaj. 2018.</w:t>
       </w:r>
       <w:r>
@@ -8278,7 +8825,7 @@
       <w:r>
         <w:t xml:space="preserve"> </w:t>
       </w:r>
-      <w:hyperlink r:id="rId124">
+      <w:hyperlink r:id="rId136">
         <w:r>
           <w:rPr>
             <w:rStyle w:val="Hyperlink"/>
@@ -8290,8 +8837,8 @@
         <w:t xml:space="preserve">.</w:t>
       </w:r>
     </w:p>
-    <w:bookmarkEnd w:id="125"/>
-    <w:bookmarkStart w:id="127" w:name="ref-Gillborn2017"/>
+    <w:bookmarkEnd w:id="137"/>
+    <w:bookmarkStart w:id="139" w:name="ref-Gillborn2017"/>
     <w:p>
       <w:pPr>
         <w:pStyle w:val="Bibliography"/>
@@ -8354,7 +8901,7 @@
       <w:r>
         <w:t xml:space="preserve"> </w:t>
       </w:r>
-      <w:hyperlink r:id="rId126">
+      <w:hyperlink r:id="rId138">
         <w:r>
           <w:rPr>
             <w:rStyle w:val="Hyperlink"/>
@@ -8366,8 +8913,8 @@
         <w:t xml:space="preserve">.</w:t>
       </w:r>
     </w:p>
-    <w:bookmarkEnd w:id="127"/>
-    <w:bookmarkStart w:id="129" w:name="ref-gorard_how_2019"/>
+    <w:bookmarkEnd w:id="139"/>
+    <w:bookmarkStart w:id="141" w:name="ref-gorard_how_2019"/>
     <w:p>
       <w:pPr>
         <w:pStyle w:val="Bibliography"/>
@@ -8445,7 +8992,7 @@
       <w:r>
         <w:t xml:space="preserve"> </w:t>
       </w:r>
-      <w:hyperlink r:id="rId128">
+      <w:hyperlink r:id="rId140">
         <w:r>
           <w:rPr>
             <w:rStyle w:val="Hyperlink"/>
@@ -8457,8 +9004,8 @@
         <w:t xml:space="preserve">.</w:t>
       </w:r>
     </w:p>
-    <w:bookmarkEnd w:id="129"/>
-    <w:bookmarkStart w:id="131" w:name="ref-gorard_school_2025"/>
+    <w:bookmarkEnd w:id="141"/>
+    <w:bookmarkStart w:id="143" w:name="ref-gorard_school_2025"/>
     <w:p>
       <w:pPr>
         <w:pStyle w:val="Bibliography"/>
@@ -8611,7 +9158,7 @@
       <w:r>
         <w:t xml:space="preserve"> </w:t>
       </w:r>
-      <w:hyperlink r:id="rId130">
+      <w:hyperlink r:id="rId142">
         <w:r>
           <w:rPr>
             <w:rStyle w:val="Hyperlink"/>
@@ -8623,8 +9170,8 @@
         <w:t xml:space="preserve">.</w:t>
       </w:r>
     </w:p>
-    <w:bookmarkEnd w:id="131"/>
-    <w:bookmarkStart w:id="133" w:name="ref-Grant2017"/>
+    <w:bookmarkEnd w:id="143"/>
+    <w:bookmarkStart w:id="145" w:name="ref-Grant2017"/>
     <w:p>
       <w:pPr>
         <w:pStyle w:val="Bibliography"/>
@@ -8732,7 +9279,7 @@
       <w:r>
         <w:t xml:space="preserve"> </w:t>
       </w:r>
-      <w:hyperlink r:id="rId132">
+      <w:hyperlink r:id="rId144">
         <w:r>
           <w:rPr>
             <w:rStyle w:val="Hyperlink"/>
@@ -8744,13 +9291,126 @@
         <w:t xml:space="preserve">.</w:t>
       </w:r>
     </w:p>
-    <w:bookmarkEnd w:id="133"/>
-    <w:bookmarkStart w:id="135" w:name="ref-macleod_supporting_2015"/>
+    <w:bookmarkEnd w:id="145"/>
+    <w:bookmarkStart w:id="147" w:name="ref-Guan2025"/>
     <w:p>
       <w:pPr>
         <w:pStyle w:val="Bibliography"/>
       </w:pPr>
       <w:r>
+        <w:t xml:space="preserve">Guan, Hongwei, Jingjing Xue, Yaqi Zhang, Fang Chang, and Wei Liu. 2025.</w:t>
+      </w:r>
+      <w:r>
+        <w:t xml:space="preserve"> </w:t>
+      </w:r>
+      <w:r>
+        <w:t xml:space="preserve">“Examining the Relationship Between Commuting Time, Academic Achievement, and Mental Health in Rural</w:t>
+      </w:r>
+      <w:r>
+        <w:t xml:space="preserve"> </w:t>
+      </w:r>
+      <w:r>
+        <w:t xml:space="preserve">China</w:t>
+      </w:r>
+      <w:r>
+        <w:t xml:space="preserve">: A Cross-Sectional Analysis.”</w:t>
+      </w:r>
+      <w:r>
+        <w:t xml:space="preserve"> </w:t>
+      </w:r>
+      <w:r>
+        <w:rPr>
+          <w:i/>
+          <w:iCs/>
+        </w:rPr>
+        <w:t xml:space="preserve">BMC Public Health</w:t>
+      </w:r>
+      <w:r>
+        <w:t xml:space="preserve"> </w:t>
+      </w:r>
+      <w:r>
+        <w:t xml:space="preserve">25 (1): 1616.</w:t>
+      </w:r>
+      <w:r>
+        <w:t xml:space="preserve"> </w:t>
+      </w:r>
+      <w:hyperlink r:id="rId146">
+        <w:r>
+          <w:rPr>
+            <w:rStyle w:val="Hyperlink"/>
+          </w:rPr>
+          <w:t xml:space="preserve">https://doi.org/10.1186/s12889-025-22847-5</w:t>
+        </w:r>
+      </w:hyperlink>
+      <w:r>
+        <w:t xml:space="preserve">.</w:t>
+      </w:r>
+    </w:p>
+    <w:bookmarkEnd w:id="147"/>
+    <w:bookmarkStart w:id="149" w:name="ref-Karan2021"/>
+    <w:p>
+      <w:pPr>
+        <w:pStyle w:val="Bibliography"/>
+      </w:pPr>
+      <w:r>
+        <w:t xml:space="preserve">Karan, Maira, Danny Rahal, David M. Almeida, et al. 2021.</w:t>
+      </w:r>
+      <w:r>
+        <w:t xml:space="preserve"> </w:t>
+      </w:r>
+      <w:r>
+        <w:t xml:space="preserve">“School Commute Time, Chronotype, and Altered</w:t>
+      </w:r>
+      <w:r>
+        <w:t xml:space="preserve"> </w:t>
+      </w:r>
+      <w:r>
+        <w:t xml:space="preserve">HPA</w:t>
+      </w:r>
+      <w:r>
+        <w:t xml:space="preserve"> </w:t>
+      </w:r>
+      <w:r>
+        <w:t xml:space="preserve">Axis Functioning During Adolescence.”</w:t>
+      </w:r>
+      <w:r>
+        <w:t xml:space="preserve"> </w:t>
+      </w:r>
+      <w:r>
+        <w:rPr>
+          <w:i/>
+          <w:iCs/>
+        </w:rPr>
+        <w:t xml:space="preserve">Psychoneuroendocrinology</w:t>
+      </w:r>
+      <w:r>
+        <w:t xml:space="preserve"> </w:t>
+      </w:r>
+      <w:r>
+        <w:t xml:space="preserve">133: 105371.</w:t>
+      </w:r>
+      <w:r>
+        <w:t xml:space="preserve"> </w:t>
+      </w:r>
+      <w:hyperlink r:id="rId148">
+        <w:r>
+          <w:rPr>
+            <w:rStyle w:val="Hyperlink"/>
+          </w:rPr>
+          <w:t xml:space="preserve">https://doi.org/10.1016/j.psyneuen.2021.105371</w:t>
+        </w:r>
+      </w:hyperlink>
+      <w:r>
+        <w:t xml:space="preserve">.</w:t>
+      </w:r>
+    </w:p>
+    <w:bookmarkEnd w:id="149"/>
+    <w:bookmarkStart w:id="151" w:name="ref-macleod_supporting_2015"/>
+    <w:p>
+      <w:pPr>
+        <w:pStyle w:val="Bibliography"/>
+      </w:pPr>
+      <w:r>
         <w:t xml:space="preserve">Macleod, S., C. Sharp, D. Bernardinelli, A. Skipp, and S. Higgins. 2015.</w:t>
       </w:r>
       <w:r>
@@ -8902,7 +9562,7 @@
       <w:r>
         <w:t xml:space="preserve"> </w:t>
       </w:r>
-      <w:hyperlink r:id="rId134">
+      <w:hyperlink r:id="rId150">
         <w:r>
           <w:rPr>
             <w:rStyle w:val="Hyperlink"/>
@@ -8914,8 +9574,8 @@
         <w:t xml:space="preserve">.</w:t>
       </w:r>
     </w:p>
-    <w:bookmarkEnd w:id="135"/>
-    <w:bookmarkStart w:id="137" w:name="ref-Menzies2023"/>
+    <w:bookmarkEnd w:id="151"/>
+    <w:bookmarkStart w:id="153" w:name="ref-Menzies2023"/>
     <w:p>
       <w:pPr>
         <w:pStyle w:val="Bibliography"/>
@@ -8948,7 +9608,7 @@
       <w:r>
         <w:t xml:space="preserve"> </w:t>
       </w:r>
-      <w:hyperlink r:id="rId136">
+      <w:hyperlink r:id="rId152">
         <w:r>
           <w:rPr>
             <w:rStyle w:val="Hyperlink"/>
@@ -8960,13 +9620,221 @@
         <w:t xml:space="preserve">.</w:t>
       </w:r>
     </w:p>
-    <w:bookmarkEnd w:id="137"/>
-    <w:bookmarkStart w:id="139" w:name="ref-Riordan2021"/>
+    <w:bookmarkEnd w:id="153"/>
+    <w:bookmarkStart w:id="155" w:name="ref-Nakajima2024"/>
     <w:p>
       <w:pPr>
         <w:pStyle w:val="Bibliography"/>
       </w:pPr>
       <w:r>
+        <w:t xml:space="preserve">Nakajima, Sakurako, Yuichiro Otsuka, Osamu Itani, Yoshifumi Kaneko, Masato Suzuki, and Yoshitaka Kaneita. 2024.</w:t>
+      </w:r>
+      <w:r>
+        <w:t xml:space="preserve"> </w:t>
+      </w:r>
+      <w:r>
+        <w:t xml:space="preserve">“Association Between Commuting and Mental Health Among</w:t>
+      </w:r>
+      <w:r>
+        <w:t xml:space="preserve"> </w:t>
+      </w:r>
+      <w:r>
+        <w:t xml:space="preserve">Japanese</w:t>
+      </w:r>
+      <w:r>
+        <w:t xml:space="preserve"> </w:t>
+      </w:r>
+      <w:r>
+        <w:t xml:space="preserve">Adolescents.”</w:t>
+      </w:r>
+      <w:r>
+        <w:t xml:space="preserve"> </w:t>
+      </w:r>
+      <w:r>
+        <w:rPr>
+          <w:i/>
+          <w:iCs/>
+        </w:rPr>
+        <w:t xml:space="preserve">Psychiatry and Clinical Neurosciences</w:t>
+      </w:r>
+      <w:r>
+        <w:t xml:space="preserve"> </w:t>
+      </w:r>
+      <w:r>
+        <w:t xml:space="preserve">78 (10): 588–94.</w:t>
+      </w:r>
+      <w:r>
+        <w:t xml:space="preserve"> </w:t>
+      </w:r>
+      <w:hyperlink r:id="rId154">
+        <w:r>
+          <w:rPr>
+            <w:rStyle w:val="Hyperlink"/>
+          </w:rPr>
+          <w:t xml:space="preserve">https://doi.org/10.1111/pcn.13708</w:t>
+        </w:r>
+      </w:hyperlink>
+      <w:r>
+        <w:t xml:space="preserve">.</w:t>
+      </w:r>
+    </w:p>
+    <w:bookmarkEnd w:id="155"/>
+    <w:bookmarkStart w:id="157" w:name="ref-Otsuka2025"/>
+    <w:p>
+      <w:pPr>
+        <w:pStyle w:val="Bibliography"/>
+      </w:pPr>
+      <w:r>
+        <w:t xml:space="preserve">Otsuka, Yuichiro, Mikiko Tokiya, Issei Saitoh, Osamu Itani, and Yoshitaka Kaneita. 2025.</w:t>
+      </w:r>
+      <w:r>
+        <w:t xml:space="preserve"> </w:t>
+      </w:r>
+      <w:r>
+        <w:t xml:space="preserve">“Factors Associated with School Absenteeism Due to Difficulty Awakening: A Two-Year Prospective Cohort Study of</w:t>
+      </w:r>
+      <w:r>
+        <w:t xml:space="preserve"> </w:t>
+      </w:r>
+      <w:r>
+        <w:t xml:space="preserve">Japanese</w:t>
+      </w:r>
+      <w:r>
+        <w:t xml:space="preserve"> </w:t>
+      </w:r>
+      <w:r>
+        <w:t xml:space="preserve">Adolescents.”</w:t>
+      </w:r>
+      <w:r>
+        <w:t xml:space="preserve"> </w:t>
+      </w:r>
+      <w:r>
+        <w:rPr>
+          <w:i/>
+          <w:iCs/>
+        </w:rPr>
+        <w:t xml:space="preserve">Environmental Health and Preventive Medicine</w:t>
+      </w:r>
+      <w:r>
+        <w:t xml:space="preserve"> </w:t>
+      </w:r>
+      <w:r>
+        <w:t xml:space="preserve">30: 89–89.</w:t>
+      </w:r>
+      <w:r>
+        <w:t xml:space="preserve"> </w:t>
+      </w:r>
+      <w:hyperlink r:id="rId156">
+        <w:r>
+          <w:rPr>
+            <w:rStyle w:val="Hyperlink"/>
+          </w:rPr>
+          <w:t xml:space="preserve">https://doi.org/10.1265/ehpm.25-00089</w:t>
+        </w:r>
+      </w:hyperlink>
+      <w:r>
+        <w:t xml:space="preserve">.</w:t>
+      </w:r>
+    </w:p>
+    <w:bookmarkEnd w:id="157"/>
+    <w:bookmarkStart w:id="159" w:name="ref-Pereira2014"/>
+    <w:p>
+      <w:pPr>
+        <w:pStyle w:val="Bibliography"/>
+      </w:pPr>
+      <w:r>
+        <w:t xml:space="preserve">Pereira, Erico F., Claudia Moreno, and Fernando M. Louzada. 2014.</w:t>
+      </w:r>
+      <w:r>
+        <w:t xml:space="preserve"> </w:t>
+      </w:r>
+      <w:r>
+        <w:t xml:space="preserve">“Increased Commuting to School Time Reduces Sleep Duration in Adolescents.”</w:t>
+      </w:r>
+      <w:r>
+        <w:t xml:space="preserve"> </w:t>
+      </w:r>
+      <w:r>
+        <w:rPr>
+          <w:i/>
+          <w:iCs/>
+        </w:rPr>
+        <w:t xml:space="preserve">Chronobiology International</w:t>
+      </w:r>
+      <w:r>
+        <w:t xml:space="preserve"> </w:t>
+      </w:r>
+      <w:r>
+        <w:t xml:space="preserve">31 (1): 87–94.</w:t>
+      </w:r>
+      <w:r>
+        <w:t xml:space="preserve"> </w:t>
+      </w:r>
+      <w:hyperlink r:id="rId158">
+        <w:r>
+          <w:rPr>
+            <w:rStyle w:val="Hyperlink"/>
+          </w:rPr>
+          <w:t xml:space="preserve">https://doi.org/10.3109/07420528.2013.826238</w:t>
+        </w:r>
+      </w:hyperlink>
+      <w:r>
+        <w:t xml:space="preserve">.</w:t>
+      </w:r>
+    </w:p>
+    <w:bookmarkEnd w:id="159"/>
+    <w:bookmarkStart w:id="161" w:name="ref-Pradhan2017"/>
+    <w:p>
+      <w:pPr>
+        <w:pStyle w:val="Bibliography"/>
+      </w:pPr>
+      <w:r>
+        <w:t xml:space="preserve">Pradhan, Rajesh Kumar, and Nandita Sinha. 2017.</w:t>
+      </w:r>
+      <w:r>
+        <w:t xml:space="preserve"> </w:t>
+      </w:r>
+      <w:r>
+        <w:t xml:space="preserve">“Impact of Commuting Distance and School Timing on Sleep of School Students.”</w:t>
+      </w:r>
+      <w:r>
+        <w:t xml:space="preserve"> </w:t>
+      </w:r>
+      <w:r>
+        <w:rPr>
+          <w:i/>
+          <w:iCs/>
+        </w:rPr>
+        <w:t xml:space="preserve">Sleep and Biological Rhythms</w:t>
+      </w:r>
+      <w:r>
+        <w:t xml:space="preserve"> </w:t>
+      </w:r>
+      <w:r>
+        <w:t xml:space="preserve">15 (2): 153–58.</w:t>
+      </w:r>
+      <w:r>
+        <w:t xml:space="preserve"> </w:t>
+      </w:r>
+      <w:hyperlink r:id="rId160">
+        <w:r>
+          <w:rPr>
+            <w:rStyle w:val="Hyperlink"/>
+          </w:rPr>
+          <w:t xml:space="preserve">https://doi.org/10.1007/s41105-017-0086-x</w:t>
+        </w:r>
+      </w:hyperlink>
+      <w:r>
+        <w:t xml:space="preserve">.</w:t>
+      </w:r>
+    </w:p>
+    <w:bookmarkEnd w:id="161"/>
+    <w:bookmarkStart w:id="163" w:name="ref-Riordan2021"/>
+    <w:p>
+      <w:pPr>
+        <w:pStyle w:val="Bibliography"/>
+      </w:pPr>
+      <w:r>
         <w:t xml:space="preserve">Riordan, S., M. Jopling, and S. Starr. 2021.</w:t>
       </w:r>
       <w:r>
@@ -8985,7 +9853,7 @@
       <w:r>
         <w:t xml:space="preserve"> </w:t>
       </w:r>
-      <w:hyperlink r:id="rId138">
+      <w:hyperlink r:id="rId162">
         <w:r>
           <w:rPr>
             <w:rStyle w:val="Hyperlink"/>
@@ -8997,8 +9865,8 @@
         <w:t xml:space="preserve">.</w:t>
       </w:r>
     </w:p>
-    <w:bookmarkEnd w:id="139"/>
-    <w:bookmarkStart w:id="141" w:name="ref-Ross2020"/>
+    <w:bookmarkEnd w:id="163"/>
+    <w:bookmarkStart w:id="165" w:name="ref-Ross2020"/>
     <w:p>
       <w:pPr>
         <w:pStyle w:val="Bibliography"/>
@@ -9064,7 +9932,7 @@
       <w:r>
         <w:t xml:space="preserve"> </w:t>
       </w:r>
-      <w:hyperlink r:id="rId140">
+      <w:hyperlink r:id="rId164">
         <w:r>
           <w:rPr>
             <w:rStyle w:val="Hyperlink"/>
@@ -9076,8 +9944,8 @@
         <w:t xml:space="preserve">.</w:t>
       </w:r>
     </w:p>
-    <w:bookmarkEnd w:id="141"/>
-    <w:bookmarkStart w:id="142" w:name="ref-Snijders2012"/>
+    <w:bookmarkEnd w:id="165"/>
+    <w:bookmarkStart w:id="166" w:name="ref-Snijders2012"/>
     <w:p>
       <w:pPr>
         <w:pStyle w:val="Bibliography"/>
@@ -9099,8 +9967,8 @@
         <w:t xml:space="preserve">. 2nd ed. SAGE.</w:t>
       </w:r>
     </w:p>
-    <w:bookmarkEnd w:id="142"/>
-    <w:bookmarkStart w:id="144" w:name="ref-StopforthGayle2025"/>
+    <w:bookmarkEnd w:id="166"/>
+    <w:bookmarkStart w:id="168" w:name="ref-StopforthGayle2025"/>
     <w:p>
       <w:pPr>
         <w:pStyle w:val="Bibliography"/>
@@ -9133,7 +10001,7 @@
       <w:r>
         <w:t xml:space="preserve"> </w:t>
       </w:r>
-      <w:hyperlink r:id="rId143">
+      <w:hyperlink r:id="rId167">
         <w:r>
           <w:rPr>
             <w:rStyle w:val="Hyperlink"/>
@@ -9145,8 +10013,8 @@
         <w:t xml:space="preserve">.</w:t>
       </w:r>
     </w:p>
-    <w:bookmarkEnd w:id="144"/>
-    <w:bookmarkStart w:id="146" w:name="ref-Strand2021"/>
+    <w:bookmarkEnd w:id="168"/>
+    <w:bookmarkStart w:id="170" w:name="ref-Strand2021"/>
     <w:p>
       <w:pPr>
         <w:pStyle w:val="Bibliography"/>
@@ -9212,7 +10080,7 @@
       <w:r>
         <w:t xml:space="preserve"> </w:t>
       </w:r>
-      <w:hyperlink r:id="rId145">
+      <w:hyperlink r:id="rId169">
         <w:r>
           <w:rPr>
             <w:rStyle w:val="Hyperlink"/>
@@ -9224,8 +10092,8 @@
         <w:t xml:space="preserve">.</w:t>
       </w:r>
     </w:p>
-    <w:bookmarkEnd w:id="146"/>
-    <w:bookmarkStart w:id="148" w:name="ref-tan_good_2025"/>
+    <w:bookmarkEnd w:id="170"/>
+    <w:bookmarkStart w:id="172" w:name="ref-tan_good_2025"/>
     <w:p>
       <w:pPr>
         <w:pStyle w:val="Bibliography"/>
@@ -9392,7 +10260,7 @@
       <w:r>
         <w:t xml:space="preserve"> </w:t>
       </w:r>
-      <w:hyperlink r:id="rId147">
+      <w:hyperlink r:id="rId171">
         <w:r>
           <w:rPr>
             <w:rStyle w:val="Hyperlink"/>
@@ -9404,8 +10272,8 @@
         <w:t xml:space="preserve">.</w:t>
       </w:r>
     </w:p>
-    <w:bookmarkEnd w:id="148"/>
-    <w:bookmarkStart w:id="150" w:name="ref-Thomson2023"/>
+    <w:bookmarkEnd w:id="172"/>
+    <w:bookmarkStart w:id="174" w:name="ref-Thomson2023"/>
     <w:p>
       <w:pPr>
         <w:pStyle w:val="Bibliography"/>
@@ -9438,7 +10306,7 @@
       <w:r>
         <w:t xml:space="preserve"> </w:t>
       </w:r>
-      <w:hyperlink r:id="rId149">
+      <w:hyperlink r:id="rId173">
         <w:r>
           <w:rPr>
             <w:rStyle w:val="Hyperlink"/>
@@ -9450,8 +10318,8 @@
         <w:t xml:space="preserve">.</w:t>
       </w:r>
     </w:p>
-    <w:bookmarkEnd w:id="150"/>
-    <w:bookmarkStart w:id="152" w:name="ref-Tuckett2023"/>
+    <w:bookmarkEnd w:id="174"/>
+    <w:bookmarkStart w:id="176" w:name="ref-Tuckett2023"/>
     <w:p>
       <w:pPr>
         <w:pStyle w:val="Bibliography"/>
@@ -9517,7 +10385,7 @@
       <w:r>
         <w:t xml:space="preserve"> </w:t>
       </w:r>
-      <w:hyperlink r:id="rId151">
+      <w:hyperlink r:id="rId175">
         <w:r>
           <w:rPr>
             <w:rStyle w:val="Hyperlink"/>
@@ -9529,13 +10397,129 @@
         <w:t xml:space="preserve">.</w:t>
       </w:r>
     </w:p>
-    <w:bookmarkEnd w:id="152"/>
-    <w:bookmarkStart w:id="154" w:name="ref-Zuccollo2023"/>
+    <w:bookmarkEnd w:id="176"/>
+    <w:bookmarkStart w:id="178" w:name="ref-Voulgaris2019"/>
     <w:p>
       <w:pPr>
         <w:pStyle w:val="Bibliography"/>
       </w:pPr>
       <w:r>
+        <w:t xml:space="preserve">Voulgaris, Carole Turley, Michael J. Smart, and Brian D. Taylor. 2019.</w:t>
+      </w:r>
+      <w:r>
+        <w:t xml:space="preserve"> </w:t>
+      </w:r>
+      <w:r>
+        <w:t xml:space="preserve">“Tired of Commuting?</w:t>
+      </w:r>
+      <w:r>
+        <w:t xml:space="preserve"> </w:t>
+      </w:r>
+      <w:r>
+        <w:t xml:space="preserve">Relationships</w:t>
+      </w:r>
+      <w:r>
+        <w:t xml:space="preserve"> </w:t>
+      </w:r>
+      <w:r>
+        <w:t xml:space="preserve">Among Journeys to School, Sleep, and Exercise Among</w:t>
+      </w:r>
+      <w:r>
+        <w:t xml:space="preserve"> </w:t>
+      </w:r>
+      <w:r>
+        <w:t xml:space="preserve">American</w:t>
+      </w:r>
+      <w:r>
+        <w:t xml:space="preserve"> </w:t>
+      </w:r>
+      <w:r>
+        <w:t xml:space="preserve">Teenagers.”</w:t>
+      </w:r>
+      <w:r>
+        <w:t xml:space="preserve"> </w:t>
+      </w:r>
+      <w:r>
+        <w:rPr>
+          <w:i/>
+          <w:iCs/>
+        </w:rPr>
+        <w:t xml:space="preserve">Journal of Planning Education and Research</w:t>
+      </w:r>
+      <w:r>
+        <w:t xml:space="preserve"> </w:t>
+      </w:r>
+      <w:r>
+        <w:t xml:space="preserve">39 (2): 142–54.</w:t>
+      </w:r>
+      <w:r>
+        <w:t xml:space="preserve"> </w:t>
+      </w:r>
+      <w:hyperlink r:id="rId177">
+        <w:r>
+          <w:rPr>
+            <w:rStyle w:val="Hyperlink"/>
+          </w:rPr>
+          <w:t xml:space="preserve">https://doi.org/10.1177/0739456X17725148</w:t>
+        </w:r>
+      </w:hyperlink>
+      <w:r>
+        <w:t xml:space="preserve">.</w:t>
+      </w:r>
+    </w:p>
+    <w:bookmarkEnd w:id="178"/>
+    <w:bookmarkStart w:id="180" w:name="ref-Yeo2019"/>
+    <w:p>
+      <w:pPr>
+        <w:pStyle w:val="Bibliography"/>
+      </w:pPr>
+      <w:r>
+        <w:t xml:space="preserve">Yeo, Sing Chen, Anna Mini Jos, Christina Erwin, et al. 2019.</w:t>
+      </w:r>
+      <w:r>
+        <w:t xml:space="preserve"> </w:t>
+      </w:r>
+      <w:r>
+        <w:t xml:space="preserve">“Associations of Sleep Duration on School Nights with Self-Rated Health, Overweight, and Depression Symptoms in Adolescents: Problems and Possible Solutions.”</w:t>
+      </w:r>
+      <w:r>
+        <w:t xml:space="preserve"> </w:t>
+      </w:r>
+      <w:r>
+        <w:rPr>
+          <w:i/>
+          <w:iCs/>
+        </w:rPr>
+        <w:t xml:space="preserve">Sleep Medicine</w:t>
+      </w:r>
+      <w:r>
+        <w:t xml:space="preserve"> </w:t>
+      </w:r>
+      <w:r>
+        <w:t xml:space="preserve">60: 96–108.</w:t>
+      </w:r>
+      <w:r>
+        <w:t xml:space="preserve"> </w:t>
+      </w:r>
+      <w:hyperlink r:id="rId179">
+        <w:r>
+          <w:rPr>
+            <w:rStyle w:val="Hyperlink"/>
+          </w:rPr>
+          <w:t xml:space="preserve">https://doi.org/10.1016/j.sleep.2018.12.004</w:t>
+        </w:r>
+      </w:hyperlink>
+      <w:r>
+        <w:t xml:space="preserve">.</w:t>
+      </w:r>
+    </w:p>
+    <w:bookmarkEnd w:id="180"/>
+    <w:bookmarkStart w:id="182" w:name="ref-Zuccollo2023"/>
+    <w:p>
+      <w:pPr>
+        <w:pStyle w:val="Bibliography"/>
+      </w:pPr>
+      <w:r>
         <w:t xml:space="preserve">Zuccollo, J., J. Cardim Dias, E. Jimenez, and N. Braakmann. 2023.</w:t>
       </w:r>
       <w:r>
@@ -9554,7 +10538,7 @@
       <w:r>
         <w:t xml:space="preserve"> </w:t>
       </w:r>
-      <w:hyperlink r:id="rId153">
+      <w:hyperlink r:id="rId181">
         <w:r>
           <w:rPr>
             <w:rStyle w:val="Hyperlink"/>
@@ -9566,9 +10550,9 @@
         <w:t xml:space="preserve">.</w:t>
       </w:r>
     </w:p>
-    <w:bookmarkEnd w:id="154"/>
-    <w:bookmarkEnd w:id="155"/>
-    <w:bookmarkEnd w:id="156"/>
+    <w:bookmarkEnd w:id="182"/>
+    <w:bookmarkEnd w:id="183"/>
+    <w:bookmarkEnd w:id="184"/>
     <w:sectPr>
       <w:footnotePr>
         <w:numRestart w:val="eachSect"/>

</xml_diff>

<commit_message>
Add CRediT statement and AI use declaration
Add authorship contribution statement and generative AI use
declaration to JEP_Paper, main report (HTML + PDF) and docs index.
Use British English spellings throughout.

Co-Authored-By: Claude Opus 4.6 <noreply@anthropic.com>
</commit_message>
<xml_diff>
--- a/JEP_Paper.docx
+++ b/JEP_Paper.docx
@@ -7434,12 +7434,74 @@
       </w:r>
     </w:p>
     <w:bookmarkEnd w:id="95"/>
-    <w:bookmarkStart w:id="96" w:name="acknowledgements"/>
+    <w:bookmarkStart w:id="96" w:name="credit-authorship-contribution-statement"/>
     <w:p>
       <w:pPr>
         <w:pStyle w:val="Heading1"/>
       </w:pPr>
       <w:r>
+        <w:t xml:space="preserve">CRediT authorship contribution statement</w:t>
+      </w:r>
+    </w:p>
+    <w:p>
+      <w:pPr>
+        <w:pStyle w:val="FirstParagraph"/>
+      </w:pPr>
+      <w:r>
+        <w:rPr>
+          <w:b/>
+          <w:bCs/>
+        </w:rPr>
+        <w:t xml:space="preserve">Adam Dennett:</w:t>
+      </w:r>
+      <w:r>
+        <w:t xml:space="preserve"> </w:t>
+      </w:r>
+      <w:r>
+        <w:t xml:space="preserve">Conceptualisation, Methodology, Software, Formal analysis, Data curation, Writing – original draft, Writing – review &amp; editing, Visualisation, Project administration.</w:t>
+      </w:r>
+      <w:r>
+        <w:t xml:space="preserve"> </w:t>
+      </w:r>
+      <w:r>
+        <w:rPr>
+          <w:b/>
+          <w:bCs/>
+        </w:rPr>
+        <w:t xml:space="preserve">Dan Campbell-Meiklejohn:</w:t>
+      </w:r>
+      <w:r>
+        <w:t xml:space="preserve"> </w:t>
+      </w:r>
+      <w:r>
+        <w:t xml:space="preserve">Methodology – refining and review; Writing – review &amp; editing.</w:t>
+      </w:r>
+    </w:p>
+    <w:bookmarkEnd w:id="96"/>
+    <w:bookmarkStart w:id="97" w:name="declaration-of-generative-ai-use"/>
+    <w:p>
+      <w:pPr>
+        <w:pStyle w:val="Heading1"/>
+      </w:pPr>
+      <w:r>
+        <w:t xml:space="preserve">Declaration of generative AI use</w:t>
+      </w:r>
+    </w:p>
+    <w:p>
+      <w:pPr>
+        <w:pStyle w:val="FirstParagraph"/>
+      </w:pPr>
+      <w:r>
+        <w:t xml:space="preserve">The authors used Anthropic’s Claude Code (Claude Sonnet 4.5) to assist with the development of R data-processing pipelines, the implementation of multilevel model fitting and visualisation code, the formatting of tables and bibliography entries, and the rendering and deployment of Quarto outputs. Any analytical decisions, interpretations, and written content were reviewed, verified and approved by the authors, who take full responsibility for the work.</w:t>
+      </w:r>
+    </w:p>
+    <w:bookmarkEnd w:id="97"/>
+    <w:bookmarkStart w:id="98" w:name="acknowledgements"/>
+    <w:p>
+      <w:pPr>
+        <w:pStyle w:val="Heading1"/>
+      </w:pPr>
+      <w:r>
         <w:t xml:space="preserve">Acknowledgements</w:t>
       </w:r>
     </w:p>
@@ -7460,8 +7522,8 @@
         <w:t xml:space="preserve">. The range of perspectives and breadth of expertise within this group has been inspirational.</w:t>
       </w:r>
     </w:p>
-    <w:bookmarkEnd w:id="96"/>
-    <w:bookmarkStart w:id="97" w:name="declaration-of-interest"/>
+    <w:bookmarkEnd w:id="98"/>
+    <w:bookmarkStart w:id="99" w:name="declaration-of-interest"/>
     <w:p>
       <w:pPr>
         <w:pStyle w:val="Heading1"/>
@@ -7478,8 +7540,8 @@
         <w:t xml:space="preserve">The authors are residents of Brighton and Hove with lived experience of the effects of the admissions policy process described. Some authors are involved in local school governance. No financial conflicts of interest exist.</w:t>
       </w:r>
     </w:p>
-    <w:bookmarkEnd w:id="97"/>
-    <w:bookmarkStart w:id="184" w:name="references"/>
+    <w:bookmarkEnd w:id="99"/>
+    <w:bookmarkStart w:id="186" w:name="references"/>
     <w:p>
       <w:pPr>
         <w:pStyle w:val="Heading1"/>
@@ -7488,8 +7550,8 @@
         <w:t xml:space="preserve">References</w:t>
       </w:r>
     </w:p>
-    <w:bookmarkStart w:id="183" w:name="refs"/>
-    <w:bookmarkStart w:id="99" w:name="ref-Allen2018"/>
+    <w:bookmarkStart w:id="185" w:name="refs"/>
+    <w:bookmarkStart w:id="101" w:name="ref-Allen2018"/>
     <w:p>
       <w:pPr>
         <w:pStyle w:val="Bibliography"/>
@@ -7531,7 +7593,7 @@
       <w:r>
         <w:t xml:space="preserve"> </w:t>
       </w:r>
-      <w:hyperlink r:id="rId98">
+      <w:hyperlink r:id="rId100">
         <w:r>
           <w:rPr>
             <w:rStyle w:val="Hyperlink"/>
@@ -7543,8 +7605,8 @@
         <w:t xml:space="preserve">.</w:t>
       </w:r>
     </w:p>
-    <w:bookmarkEnd w:id="99"/>
-    <w:bookmarkStart w:id="101" w:name="ref-Allen2013"/>
+    <w:bookmarkEnd w:id="101"/>
+    <w:bookmarkStart w:id="103" w:name="ref-Allen2013"/>
     <w:p>
       <w:pPr>
         <w:pStyle w:val="Bibliography"/>
@@ -7598,7 +7660,7 @@
       <w:r>
         <w:t xml:space="preserve"> </w:t>
       </w:r>
-      <w:hyperlink r:id="rId100">
+      <w:hyperlink r:id="rId102">
         <w:r>
           <w:rPr>
             <w:rStyle w:val="Hyperlink"/>
@@ -7610,8 +7672,8 @@
         <w:t xml:space="preserve">.</w:t>
       </w:r>
     </w:p>
-    <w:bookmarkEnd w:id="101"/>
-    <w:bookmarkStart w:id="103" w:name="ref-Anders2024"/>
+    <w:bookmarkEnd w:id="103"/>
+    <w:bookmarkStart w:id="105" w:name="ref-Anders2024"/>
     <w:p>
       <w:pPr>
         <w:pStyle w:val="Bibliography"/>
@@ -7665,7 +7727,7 @@
       <w:r>
         <w:t xml:space="preserve"> </w:t>
       </w:r>
-      <w:hyperlink r:id="rId102">
+      <w:hyperlink r:id="rId104">
         <w:r>
           <w:rPr>
             <w:rStyle w:val="Hyperlink"/>
@@ -7677,8 +7739,8 @@
         <w:t xml:space="preserve">.</w:t>
       </w:r>
     </w:p>
-    <w:bookmarkEnd w:id="103"/>
-    <w:bookmarkStart w:id="105" w:name="ref-Blagg2018"/>
+    <w:bookmarkEnd w:id="105"/>
+    <w:bookmarkStart w:id="107" w:name="ref-Blagg2018"/>
     <w:p>
       <w:pPr>
         <w:pStyle w:val="Bibliography"/>
@@ -7870,7 +7932,7 @@
       <w:r>
         <w:t xml:space="preserve"> </w:t>
       </w:r>
-      <w:hyperlink r:id="rId104">
+      <w:hyperlink r:id="rId106">
         <w:r>
           <w:rPr>
             <w:rStyle w:val="Hyperlink"/>
@@ -7882,8 +7944,8 @@
         <w:t xml:space="preserve">.</w:t>
       </w:r>
     </w:p>
-    <w:bookmarkEnd w:id="105"/>
-    <w:bookmarkStart w:id="107" w:name="ref-Burgess2018"/>
+    <w:bookmarkEnd w:id="107"/>
+    <w:bookmarkStart w:id="109" w:name="ref-Burgess2018"/>
     <w:p>
       <w:pPr>
         <w:pStyle w:val="Bibliography"/>
@@ -7916,7 +7978,7 @@
       <w:r>
         <w:t xml:space="preserve"> </w:t>
       </w:r>
-      <w:hyperlink r:id="rId106">
+      <w:hyperlink r:id="rId108">
         <w:r>
           <w:rPr>
             <w:rStyle w:val="Hyperlink"/>
@@ -7928,8 +7990,8 @@
         <w:t xml:space="preserve">.</w:t>
       </w:r>
     </w:p>
-    <w:bookmarkEnd w:id="107"/>
-    <w:bookmarkStart w:id="109" w:name="ref-Burgess2023"/>
+    <w:bookmarkEnd w:id="109"/>
+    <w:bookmarkStart w:id="111" w:name="ref-Burgess2023"/>
     <w:p>
       <w:pPr>
         <w:pStyle w:val="Bibliography"/>
@@ -7962,7 +8024,7 @@
       <w:r>
         <w:t xml:space="preserve"> </w:t>
       </w:r>
-      <w:hyperlink r:id="rId108">
+      <w:hyperlink r:id="rId110">
         <w:r>
           <w:rPr>
             <w:rStyle w:val="Hyperlink"/>
@@ -7974,8 +8036,8 @@
         <w:t xml:space="preserve">.</w:t>
       </w:r>
     </w:p>
-    <w:bookmarkEnd w:id="109"/>
-    <w:bookmarkStart w:id="111" w:name="ref-Burgess2022"/>
+    <w:bookmarkEnd w:id="111"/>
+    <w:bookmarkStart w:id="113" w:name="ref-Burgess2022"/>
     <w:p>
       <w:pPr>
         <w:pStyle w:val="Bibliography"/>
@@ -7999,7 +8061,7 @@
       <w:r>
         <w:t xml:space="preserve"> </w:t>
       </w:r>
-      <w:hyperlink r:id="rId110">
+      <w:hyperlink r:id="rId112">
         <w:r>
           <w:rPr>
             <w:rStyle w:val="Hyperlink"/>
@@ -8011,8 +8073,8 @@
         <w:t xml:space="preserve">.</w:t>
       </w:r>
     </w:p>
-    <w:bookmarkEnd w:id="111"/>
-    <w:bookmarkStart w:id="113" w:name="ref-Chairassamee2024"/>
+    <w:bookmarkEnd w:id="113"/>
+    <w:bookmarkStart w:id="115" w:name="ref-Chairassamee2024"/>
     <w:p>
       <w:pPr>
         <w:pStyle w:val="Bibliography"/>
@@ -8045,7 +8107,7 @@
       <w:r>
         <w:t xml:space="preserve"> </w:t>
       </w:r>
-      <w:hyperlink r:id="rId112">
+      <w:hyperlink r:id="rId114">
         <w:r>
           <w:rPr>
             <w:rStyle w:val="Hyperlink"/>
@@ -8057,8 +8119,8 @@
         <w:t xml:space="preserve">.</w:t>
       </w:r>
     </w:p>
-    <w:bookmarkEnd w:id="113"/>
-    <w:bookmarkStart w:id="115" w:name="ref-HouseofCommons2021"/>
+    <w:bookmarkEnd w:id="115"/>
+    <w:bookmarkStart w:id="117" w:name="ref-HouseofCommons2021"/>
     <w:p>
       <w:pPr>
         <w:pStyle w:val="Bibliography"/>
@@ -8208,7 +8270,7 @@
       <w:r>
         <w:t xml:space="preserve"> </w:t>
       </w:r>
-      <w:hyperlink r:id="rId114">
+      <w:hyperlink r:id="rId116">
         <w:r>
           <w:rPr>
             <w:rStyle w:val="Hyperlink"/>
@@ -8220,8 +8282,8 @@
         <w:t xml:space="preserve">.</w:t>
       </w:r>
     </w:p>
-    <w:bookmarkEnd w:id="115"/>
-    <w:bookmarkStart w:id="117" w:name="ref-Cordes2022"/>
+    <w:bookmarkEnd w:id="117"/>
+    <w:bookmarkStart w:id="119" w:name="ref-Cordes2022"/>
     <w:p>
       <w:pPr>
         <w:pStyle w:val="Bibliography"/>
@@ -8254,7 +8316,7 @@
       <w:r>
         <w:t xml:space="preserve"> </w:t>
       </w:r>
-      <w:hyperlink r:id="rId116">
+      <w:hyperlink r:id="rId118">
         <w:r>
           <w:rPr>
             <w:rStyle w:val="Hyperlink"/>
@@ -8266,8 +8328,8 @@
         <w:t xml:space="preserve">.</w:t>
       </w:r>
     </w:p>
-    <w:bookmarkEnd w:id="117"/>
-    <w:bookmarkStart w:id="119" w:name="ref-DfE2022"/>
+    <w:bookmarkEnd w:id="119"/>
+    <w:bookmarkStart w:id="121" w:name="ref-DfE2022"/>
     <w:p>
       <w:pPr>
         <w:pStyle w:val="Bibliography"/>
@@ -8368,7 +8430,7 @@
       <w:r>
         <w:t xml:space="preserve"> </w:t>
       </w:r>
-      <w:hyperlink r:id="rId118">
+      <w:hyperlink r:id="rId120">
         <w:r>
           <w:rPr>
             <w:rStyle w:val="Hyperlink"/>
@@ -8380,8 +8442,8 @@
         <w:t xml:space="preserve">.</w:t>
       </w:r>
     </w:p>
-    <w:bookmarkEnd w:id="119"/>
-    <w:bookmarkStart w:id="121" w:name="ref-DfE2025a"/>
+    <w:bookmarkEnd w:id="121"/>
+    <w:bookmarkStart w:id="123" w:name="ref-DfE2025a"/>
     <w:p>
       <w:pPr>
         <w:pStyle w:val="Bibliography"/>
@@ -8405,7 +8467,7 @@
       <w:r>
         <w:t xml:space="preserve"> </w:t>
       </w:r>
-      <w:hyperlink r:id="rId120">
+      <w:hyperlink r:id="rId122">
         <w:r>
           <w:rPr>
             <w:rStyle w:val="Hyperlink"/>
@@ -8417,8 +8479,8 @@
         <w:t xml:space="preserve">.</w:t>
       </w:r>
     </w:p>
-    <w:bookmarkEnd w:id="121"/>
-    <w:bookmarkStart w:id="123" w:name="ref-DfE2025b"/>
+    <w:bookmarkEnd w:id="123"/>
+    <w:bookmarkStart w:id="125" w:name="ref-DfE2025b"/>
     <w:p>
       <w:pPr>
         <w:pStyle w:val="Bibliography"/>
@@ -8491,7 +8553,7 @@
       <w:r>
         <w:t xml:space="preserve"> </w:t>
       </w:r>
-      <w:hyperlink r:id="rId122">
+      <w:hyperlink r:id="rId124">
         <w:r>
           <w:rPr>
             <w:rStyle w:val="Hyperlink"/>
@@ -8503,8 +8565,8 @@
         <w:t xml:space="preserve">.</w:t>
       </w:r>
     </w:p>
-    <w:bookmarkEnd w:id="123"/>
-    <w:bookmarkStart w:id="125" w:name="ref-dfe_every_2026"/>
+    <w:bookmarkEnd w:id="125"/>
+    <w:bookmarkStart w:id="127" w:name="ref-dfe_every_2026"/>
     <w:p>
       <w:pPr>
         <w:pStyle w:val="Bibliography"/>
@@ -8528,7 +8590,7 @@
       <w:r>
         <w:t xml:space="preserve"> </w:t>
       </w:r>
-      <w:hyperlink r:id="rId124">
+      <w:hyperlink r:id="rId126">
         <w:r>
           <w:rPr>
             <w:rStyle w:val="Hyperlink"/>
@@ -8540,8 +8602,8 @@
         <w:t xml:space="preserve">.</w:t>
       </w:r>
     </w:p>
-    <w:bookmarkEnd w:id="125"/>
-    <w:bookmarkStart w:id="127" w:name="ref-Ding2023"/>
+    <w:bookmarkEnd w:id="127"/>
+    <w:bookmarkStart w:id="129" w:name="ref-Ding2023"/>
     <w:p>
       <w:pPr>
         <w:pStyle w:val="Bibliography"/>
@@ -8595,7 +8657,7 @@
       <w:r>
         <w:t xml:space="preserve"> </w:t>
       </w:r>
-      <w:hyperlink r:id="rId126">
+      <w:hyperlink r:id="rId128">
         <w:r>
           <w:rPr>
             <w:rStyle w:val="Hyperlink"/>
@@ -8607,8 +8669,8 @@
         <w:t xml:space="preserve">.</w:t>
       </w:r>
     </w:p>
-    <w:bookmarkEnd w:id="127"/>
-    <w:bookmarkStart w:id="129" w:name="ref-Drager2024"/>
+    <w:bookmarkEnd w:id="129"/>
+    <w:bookmarkStart w:id="131" w:name="ref-Drager2024"/>
     <w:p>
       <w:pPr>
         <w:pStyle w:val="Bibliography"/>
@@ -8641,7 +8703,7 @@
       <w:r>
         <w:t xml:space="preserve"> </w:t>
       </w:r>
-      <w:hyperlink r:id="rId128">
+      <w:hyperlink r:id="rId130">
         <w:r>
           <w:rPr>
             <w:rStyle w:val="Hyperlink"/>
@@ -8653,8 +8715,8 @@
         <w:t xml:space="preserve">.</w:t>
       </w:r>
     </w:p>
-    <w:bookmarkEnd w:id="129"/>
-    <w:bookmarkStart w:id="131" w:name="ref-Farquharson2024"/>
+    <w:bookmarkEnd w:id="131"/>
+    <w:bookmarkStart w:id="133" w:name="ref-Farquharson2024"/>
     <w:p>
       <w:pPr>
         <w:pStyle w:val="Bibliography"/>
@@ -8687,7 +8749,7 @@
       <w:r>
         <w:t xml:space="preserve"> </w:t>
       </w:r>
-      <w:hyperlink r:id="rId130">
+      <w:hyperlink r:id="rId132">
         <w:r>
           <w:rPr>
             <w:rStyle w:val="Hyperlink"/>
@@ -8699,8 +8761,8 @@
         <w:t xml:space="preserve">.</w:t>
       </w:r>
     </w:p>
-    <w:bookmarkEnd w:id="131"/>
-    <w:bookmarkStart w:id="133" w:name="ref-Faulkner2013"/>
+    <w:bookmarkEnd w:id="133"/>
+    <w:bookmarkStart w:id="135" w:name="ref-Faulkner2013"/>
     <w:p>
       <w:pPr>
         <w:pStyle w:val="Bibliography"/>
@@ -8733,7 +8795,7 @@
       <w:r>
         <w:t xml:space="preserve"> </w:t>
       </w:r>
-      <w:hyperlink r:id="rId132">
+      <w:hyperlink r:id="rId134">
         <w:r>
           <w:rPr>
             <w:rStyle w:val="Hyperlink"/>
@@ -8745,8 +8807,8 @@
         <w:t xml:space="preserve">.</w:t>
       </w:r>
     </w:p>
-    <w:bookmarkEnd w:id="133"/>
-    <w:bookmarkStart w:id="135" w:name="ref-Fredriksen2004"/>
+    <w:bookmarkEnd w:id="135"/>
+    <w:bookmarkStart w:id="137" w:name="ref-Fredriksen2004"/>
     <w:p>
       <w:pPr>
         <w:pStyle w:val="Bibliography"/>
@@ -8788,7 +8850,7 @@
       <w:r>
         <w:t xml:space="preserve"> </w:t>
       </w:r>
-      <w:hyperlink r:id="rId134">
+      <w:hyperlink r:id="rId136">
         <w:r>
           <w:rPr>
             <w:rStyle w:val="Hyperlink"/>
@@ -8800,8 +8862,8 @@
         <w:t xml:space="preserve">.</w:t>
       </w:r>
     </w:p>
-    <w:bookmarkEnd w:id="135"/>
-    <w:bookmarkStart w:id="137" w:name="ref-Gibbons2018"/>
+    <w:bookmarkEnd w:id="137"/>
+    <w:bookmarkStart w:id="139" w:name="ref-Gibbons2018"/>
     <w:p>
       <w:pPr>
         <w:pStyle w:val="Bibliography"/>
@@ -8825,7 +8887,7 @@
       <w:r>
         <w:t xml:space="preserve"> </w:t>
       </w:r>
-      <w:hyperlink r:id="rId136">
+      <w:hyperlink r:id="rId138">
         <w:r>
           <w:rPr>
             <w:rStyle w:val="Hyperlink"/>
@@ -8837,8 +8899,8 @@
         <w:t xml:space="preserve">.</w:t>
       </w:r>
     </w:p>
-    <w:bookmarkEnd w:id="137"/>
-    <w:bookmarkStart w:id="139" w:name="ref-Gillborn2017"/>
+    <w:bookmarkEnd w:id="139"/>
+    <w:bookmarkStart w:id="141" w:name="ref-Gillborn2017"/>
     <w:p>
       <w:pPr>
         <w:pStyle w:val="Bibliography"/>
@@ -8901,7 +8963,7 @@
       <w:r>
         <w:t xml:space="preserve"> </w:t>
       </w:r>
-      <w:hyperlink r:id="rId138">
+      <w:hyperlink r:id="rId140">
         <w:r>
           <w:rPr>
             <w:rStyle w:val="Hyperlink"/>
@@ -8913,8 +8975,8 @@
         <w:t xml:space="preserve">.</w:t>
       </w:r>
     </w:p>
-    <w:bookmarkEnd w:id="139"/>
-    <w:bookmarkStart w:id="141" w:name="ref-gorard_how_2019"/>
+    <w:bookmarkEnd w:id="141"/>
+    <w:bookmarkStart w:id="143" w:name="ref-gorard_how_2019"/>
     <w:p>
       <w:pPr>
         <w:pStyle w:val="Bibliography"/>
@@ -8992,7 +9054,7 @@
       <w:r>
         <w:t xml:space="preserve"> </w:t>
       </w:r>
-      <w:hyperlink r:id="rId140">
+      <w:hyperlink r:id="rId142">
         <w:r>
           <w:rPr>
             <w:rStyle w:val="Hyperlink"/>
@@ -9004,8 +9066,8 @@
         <w:t xml:space="preserve">.</w:t>
       </w:r>
     </w:p>
-    <w:bookmarkEnd w:id="141"/>
-    <w:bookmarkStart w:id="143" w:name="ref-gorard_school_2025"/>
+    <w:bookmarkEnd w:id="143"/>
+    <w:bookmarkStart w:id="145" w:name="ref-gorard_school_2025"/>
     <w:p>
       <w:pPr>
         <w:pStyle w:val="Bibliography"/>
@@ -9158,7 +9220,7 @@
       <w:r>
         <w:t xml:space="preserve"> </w:t>
       </w:r>
-      <w:hyperlink r:id="rId142">
+      <w:hyperlink r:id="rId144">
         <w:r>
           <w:rPr>
             <w:rStyle w:val="Hyperlink"/>
@@ -9170,8 +9232,8 @@
         <w:t xml:space="preserve">.</w:t>
       </w:r>
     </w:p>
-    <w:bookmarkEnd w:id="143"/>
-    <w:bookmarkStart w:id="145" w:name="ref-Grant2017"/>
+    <w:bookmarkEnd w:id="145"/>
+    <w:bookmarkStart w:id="147" w:name="ref-Grant2017"/>
     <w:p>
       <w:pPr>
         <w:pStyle w:val="Bibliography"/>
@@ -9279,7 +9341,7 @@
       <w:r>
         <w:t xml:space="preserve"> </w:t>
       </w:r>
-      <w:hyperlink r:id="rId144">
+      <w:hyperlink r:id="rId146">
         <w:r>
           <w:rPr>
             <w:rStyle w:val="Hyperlink"/>
@@ -9291,8 +9353,8 @@
         <w:t xml:space="preserve">.</w:t>
       </w:r>
     </w:p>
-    <w:bookmarkEnd w:id="145"/>
-    <w:bookmarkStart w:id="147" w:name="ref-Guan2025"/>
+    <w:bookmarkEnd w:id="147"/>
+    <w:bookmarkStart w:id="149" w:name="ref-Guan2025"/>
     <w:p>
       <w:pPr>
         <w:pStyle w:val="Bibliography"/>
@@ -9334,7 +9396,7 @@
       <w:r>
         <w:t xml:space="preserve"> </w:t>
       </w:r>
-      <w:hyperlink r:id="rId146">
+      <w:hyperlink r:id="rId148">
         <w:r>
           <w:rPr>
             <w:rStyle w:val="Hyperlink"/>
@@ -9346,8 +9408,8 @@
         <w:t xml:space="preserve">.</w:t>
       </w:r>
     </w:p>
-    <w:bookmarkEnd w:id="147"/>
-    <w:bookmarkStart w:id="149" w:name="ref-Karan2021"/>
+    <w:bookmarkEnd w:id="149"/>
+    <w:bookmarkStart w:id="151" w:name="ref-Karan2021"/>
     <w:p>
       <w:pPr>
         <w:pStyle w:val="Bibliography"/>
@@ -9392,7 +9454,7 @@
       <w:r>
         <w:t xml:space="preserve"> </w:t>
       </w:r>
-      <w:hyperlink r:id="rId148">
+      <w:hyperlink r:id="rId150">
         <w:r>
           <w:rPr>
             <w:rStyle w:val="Hyperlink"/>
@@ -9404,8 +9466,8 @@
         <w:t xml:space="preserve">.</w:t>
       </w:r>
     </w:p>
-    <w:bookmarkEnd w:id="149"/>
-    <w:bookmarkStart w:id="151" w:name="ref-macleod_supporting_2015"/>
+    <w:bookmarkEnd w:id="151"/>
+    <w:bookmarkStart w:id="153" w:name="ref-macleod_supporting_2015"/>
     <w:p>
       <w:pPr>
         <w:pStyle w:val="Bibliography"/>
@@ -9562,7 +9624,7 @@
       <w:r>
         <w:t xml:space="preserve"> </w:t>
       </w:r>
-      <w:hyperlink r:id="rId150">
+      <w:hyperlink r:id="rId152">
         <w:r>
           <w:rPr>
             <w:rStyle w:val="Hyperlink"/>
@@ -9574,8 +9636,8 @@
         <w:t xml:space="preserve">.</w:t>
       </w:r>
     </w:p>
-    <w:bookmarkEnd w:id="151"/>
-    <w:bookmarkStart w:id="153" w:name="ref-Menzies2023"/>
+    <w:bookmarkEnd w:id="153"/>
+    <w:bookmarkStart w:id="155" w:name="ref-Menzies2023"/>
     <w:p>
       <w:pPr>
         <w:pStyle w:val="Bibliography"/>
@@ -9608,7 +9670,7 @@
       <w:r>
         <w:t xml:space="preserve"> </w:t>
       </w:r>
-      <w:hyperlink r:id="rId152">
+      <w:hyperlink r:id="rId154">
         <w:r>
           <w:rPr>
             <w:rStyle w:val="Hyperlink"/>
@@ -9620,8 +9682,8 @@
         <w:t xml:space="preserve">.</w:t>
       </w:r>
     </w:p>
-    <w:bookmarkEnd w:id="153"/>
-    <w:bookmarkStart w:id="155" w:name="ref-Nakajima2024"/>
+    <w:bookmarkEnd w:id="155"/>
+    <w:bookmarkStart w:id="157" w:name="ref-Nakajima2024"/>
     <w:p>
       <w:pPr>
         <w:pStyle w:val="Bibliography"/>
@@ -9666,7 +9728,7 @@
       <w:r>
         <w:t xml:space="preserve"> </w:t>
       </w:r>
-      <w:hyperlink r:id="rId154">
+      <w:hyperlink r:id="rId156">
         <w:r>
           <w:rPr>
             <w:rStyle w:val="Hyperlink"/>
@@ -9678,8 +9740,8 @@
         <w:t xml:space="preserve">.</w:t>
       </w:r>
     </w:p>
-    <w:bookmarkEnd w:id="155"/>
-    <w:bookmarkStart w:id="157" w:name="ref-Otsuka2025"/>
+    <w:bookmarkEnd w:id="157"/>
+    <w:bookmarkStart w:id="159" w:name="ref-Otsuka2025"/>
     <w:p>
       <w:pPr>
         <w:pStyle w:val="Bibliography"/>
@@ -9724,7 +9786,7 @@
       <w:r>
         <w:t xml:space="preserve"> </w:t>
       </w:r>
-      <w:hyperlink r:id="rId156">
+      <w:hyperlink r:id="rId158">
         <w:r>
           <w:rPr>
             <w:rStyle w:val="Hyperlink"/>
@@ -9736,8 +9798,8 @@
         <w:t xml:space="preserve">.</w:t>
       </w:r>
     </w:p>
-    <w:bookmarkEnd w:id="157"/>
-    <w:bookmarkStart w:id="159" w:name="ref-Pereira2014"/>
+    <w:bookmarkEnd w:id="159"/>
+    <w:bookmarkStart w:id="161" w:name="ref-Pereira2014"/>
     <w:p>
       <w:pPr>
         <w:pStyle w:val="Bibliography"/>
@@ -9770,7 +9832,7 @@
       <w:r>
         <w:t xml:space="preserve"> </w:t>
       </w:r>
-      <w:hyperlink r:id="rId158">
+      <w:hyperlink r:id="rId160">
         <w:r>
           <w:rPr>
             <w:rStyle w:val="Hyperlink"/>
@@ -9782,8 +9844,8 @@
         <w:t xml:space="preserve">.</w:t>
       </w:r>
     </w:p>
-    <w:bookmarkEnd w:id="159"/>
-    <w:bookmarkStart w:id="161" w:name="ref-Pradhan2017"/>
+    <w:bookmarkEnd w:id="161"/>
+    <w:bookmarkStart w:id="163" w:name="ref-Pradhan2017"/>
     <w:p>
       <w:pPr>
         <w:pStyle w:val="Bibliography"/>
@@ -9816,7 +9878,7 @@
       <w:r>
         <w:t xml:space="preserve"> </w:t>
       </w:r>
-      <w:hyperlink r:id="rId160">
+      <w:hyperlink r:id="rId162">
         <w:r>
           <w:rPr>
             <w:rStyle w:val="Hyperlink"/>
@@ -9828,8 +9890,8 @@
         <w:t xml:space="preserve">.</w:t>
       </w:r>
     </w:p>
-    <w:bookmarkEnd w:id="161"/>
-    <w:bookmarkStart w:id="163" w:name="ref-Riordan2021"/>
+    <w:bookmarkEnd w:id="163"/>
+    <w:bookmarkStart w:id="165" w:name="ref-Riordan2021"/>
     <w:p>
       <w:pPr>
         <w:pStyle w:val="Bibliography"/>
@@ -9853,7 +9915,7 @@
       <w:r>
         <w:t xml:space="preserve"> </w:t>
       </w:r>
-      <w:hyperlink r:id="rId162">
+      <w:hyperlink r:id="rId164">
         <w:r>
           <w:rPr>
             <w:rStyle w:val="Hyperlink"/>
@@ -9865,8 +9927,8 @@
         <w:t xml:space="preserve">.</w:t>
       </w:r>
     </w:p>
-    <w:bookmarkEnd w:id="163"/>
-    <w:bookmarkStart w:id="165" w:name="ref-Ross2020"/>
+    <w:bookmarkEnd w:id="165"/>
+    <w:bookmarkStart w:id="167" w:name="ref-Ross2020"/>
     <w:p>
       <w:pPr>
         <w:pStyle w:val="Bibliography"/>
@@ -9932,7 +9994,7 @@
       <w:r>
         <w:t xml:space="preserve"> </w:t>
       </w:r>
-      <w:hyperlink r:id="rId164">
+      <w:hyperlink r:id="rId166">
         <w:r>
           <w:rPr>
             <w:rStyle w:val="Hyperlink"/>
@@ -9944,8 +10006,8 @@
         <w:t xml:space="preserve">.</w:t>
       </w:r>
     </w:p>
-    <w:bookmarkEnd w:id="165"/>
-    <w:bookmarkStart w:id="166" w:name="ref-Snijders2012"/>
+    <w:bookmarkEnd w:id="167"/>
+    <w:bookmarkStart w:id="168" w:name="ref-Snijders2012"/>
     <w:p>
       <w:pPr>
         <w:pStyle w:val="Bibliography"/>
@@ -9967,8 +10029,8 @@
         <w:t xml:space="preserve">. 2nd ed. SAGE.</w:t>
       </w:r>
     </w:p>
-    <w:bookmarkEnd w:id="166"/>
-    <w:bookmarkStart w:id="168" w:name="ref-StopforthGayle2025"/>
+    <w:bookmarkEnd w:id="168"/>
+    <w:bookmarkStart w:id="170" w:name="ref-StopforthGayle2025"/>
     <w:p>
       <w:pPr>
         <w:pStyle w:val="Bibliography"/>
@@ -10001,7 +10063,7 @@
       <w:r>
         <w:t xml:space="preserve"> </w:t>
       </w:r>
-      <w:hyperlink r:id="rId167">
+      <w:hyperlink r:id="rId169">
         <w:r>
           <w:rPr>
             <w:rStyle w:val="Hyperlink"/>
@@ -10013,8 +10075,8 @@
         <w:t xml:space="preserve">.</w:t>
       </w:r>
     </w:p>
-    <w:bookmarkEnd w:id="168"/>
-    <w:bookmarkStart w:id="170" w:name="ref-Strand2021"/>
+    <w:bookmarkEnd w:id="170"/>
+    <w:bookmarkStart w:id="172" w:name="ref-Strand2021"/>
     <w:p>
       <w:pPr>
         <w:pStyle w:val="Bibliography"/>
@@ -10080,7 +10142,7 @@
       <w:r>
         <w:t xml:space="preserve"> </w:t>
       </w:r>
-      <w:hyperlink r:id="rId169">
+      <w:hyperlink r:id="rId171">
         <w:r>
           <w:rPr>
             <w:rStyle w:val="Hyperlink"/>
@@ -10092,8 +10154,8 @@
         <w:t xml:space="preserve">.</w:t>
       </w:r>
     </w:p>
-    <w:bookmarkEnd w:id="170"/>
-    <w:bookmarkStart w:id="172" w:name="ref-tan_good_2025"/>
+    <w:bookmarkEnd w:id="172"/>
+    <w:bookmarkStart w:id="174" w:name="ref-tan_good_2025"/>
     <w:p>
       <w:pPr>
         <w:pStyle w:val="Bibliography"/>
@@ -10260,7 +10322,7 @@
       <w:r>
         <w:t xml:space="preserve"> </w:t>
       </w:r>
-      <w:hyperlink r:id="rId171">
+      <w:hyperlink r:id="rId173">
         <w:r>
           <w:rPr>
             <w:rStyle w:val="Hyperlink"/>
@@ -10272,8 +10334,8 @@
         <w:t xml:space="preserve">.</w:t>
       </w:r>
     </w:p>
-    <w:bookmarkEnd w:id="172"/>
-    <w:bookmarkStart w:id="174" w:name="ref-Thomson2023"/>
+    <w:bookmarkEnd w:id="174"/>
+    <w:bookmarkStart w:id="176" w:name="ref-Thomson2023"/>
     <w:p>
       <w:pPr>
         <w:pStyle w:val="Bibliography"/>
@@ -10306,7 +10368,7 @@
       <w:r>
         <w:t xml:space="preserve"> </w:t>
       </w:r>
-      <w:hyperlink r:id="rId173">
+      <w:hyperlink r:id="rId175">
         <w:r>
           <w:rPr>
             <w:rStyle w:val="Hyperlink"/>
@@ -10318,8 +10380,8 @@
         <w:t xml:space="preserve">.</w:t>
       </w:r>
     </w:p>
-    <w:bookmarkEnd w:id="174"/>
-    <w:bookmarkStart w:id="176" w:name="ref-Tuckett2023"/>
+    <w:bookmarkEnd w:id="176"/>
+    <w:bookmarkStart w:id="178" w:name="ref-Tuckett2023"/>
     <w:p>
       <w:pPr>
         <w:pStyle w:val="Bibliography"/>
@@ -10385,7 +10447,7 @@
       <w:r>
         <w:t xml:space="preserve"> </w:t>
       </w:r>
-      <w:hyperlink r:id="rId175">
+      <w:hyperlink r:id="rId177">
         <w:r>
           <w:rPr>
             <w:rStyle w:val="Hyperlink"/>
@@ -10397,8 +10459,8 @@
         <w:t xml:space="preserve">.</w:t>
       </w:r>
     </w:p>
-    <w:bookmarkEnd w:id="176"/>
-    <w:bookmarkStart w:id="178" w:name="ref-Voulgaris2019"/>
+    <w:bookmarkEnd w:id="178"/>
+    <w:bookmarkStart w:id="180" w:name="ref-Voulgaris2019"/>
     <w:p>
       <w:pPr>
         <w:pStyle w:val="Bibliography"/>
@@ -10455,7 +10517,7 @@
       <w:r>
         <w:t xml:space="preserve"> </w:t>
       </w:r>
-      <w:hyperlink r:id="rId177">
+      <w:hyperlink r:id="rId179">
         <w:r>
           <w:rPr>
             <w:rStyle w:val="Hyperlink"/>
@@ -10467,8 +10529,8 @@
         <w:t xml:space="preserve">.</w:t>
       </w:r>
     </w:p>
-    <w:bookmarkEnd w:id="178"/>
-    <w:bookmarkStart w:id="180" w:name="ref-Yeo2019"/>
+    <w:bookmarkEnd w:id="180"/>
+    <w:bookmarkStart w:id="182" w:name="ref-Yeo2019"/>
     <w:p>
       <w:pPr>
         <w:pStyle w:val="Bibliography"/>
@@ -10501,7 +10563,7 @@
       <w:r>
         <w:t xml:space="preserve"> </w:t>
       </w:r>
-      <w:hyperlink r:id="rId179">
+      <w:hyperlink r:id="rId181">
         <w:r>
           <w:rPr>
             <w:rStyle w:val="Hyperlink"/>
@@ -10513,8 +10575,8 @@
         <w:t xml:space="preserve">.</w:t>
       </w:r>
     </w:p>
-    <w:bookmarkEnd w:id="180"/>
-    <w:bookmarkStart w:id="182" w:name="ref-Zuccollo2023"/>
+    <w:bookmarkEnd w:id="182"/>
+    <w:bookmarkStart w:id="184" w:name="ref-Zuccollo2023"/>
     <w:p>
       <w:pPr>
         <w:pStyle w:val="Bibliography"/>
@@ -10538,7 +10600,7 @@
       <w:r>
         <w:t xml:space="preserve"> </w:t>
       </w:r>
-      <w:hyperlink r:id="rId181">
+      <w:hyperlink r:id="rId183">
         <w:r>
           <w:rPr>
             <w:rStyle w:val="Hyperlink"/>
@@ -10550,9 +10612,9 @@
         <w:t xml:space="preserve">.</w:t>
       </w:r>
     </w:p>
-    <w:bookmarkEnd w:id="182"/>
-    <w:bookmarkEnd w:id="183"/>
     <w:bookmarkEnd w:id="184"/>
+    <w:bookmarkEnd w:id="185"/>
+    <w:bookmarkEnd w:id="186"/>
     <w:sectPr>
       <w:footnotePr>
         <w:numRestart w:val="eachSect"/>

</xml_diff>

<commit_message>
Add absence decomposition section to JEP paper
Add 'Decomposing absence: structural intake versus school management'
sub-section between the contextualised school performance results and
the discussion. Describes the two-stage approach in plain language
(no M0/M1/M2 labels), reports the structural-vs-school-controllable
finding at population level, includes the B&H joint-signal quadrant
plot, and walks through BACA (Q2) and Patcham (Q4) as named contrasts.

Co-Authored-By: Claude Opus 4.6 <noreply@anthropic.com>
</commit_message>
<xml_diff>
--- a/JEP_Paper.docx
+++ b/JEP_Paper.docx
@@ -39,7 +39,7 @@
         <w:pStyle w:val="Date"/>
       </w:pPr>
       <w:r>
-        <w:t xml:space="preserve">2026-04-14</w:t>
+        <w:t xml:space="preserve">2026-04-30</w:t>
       </w:r>
     </w:p>
     <w:p>
@@ -55,7 +55,7 @@
         <w:pStyle w:val="Abstract"/>
       </w:pPr>
       <w:r>
-        <w:t xml:space="preserve">In its 2026 White Paper, the UK government has set a worthwhile and ambitious target to halve the disadvantage attainment gap in education. Achieving improvements in disadvantaged student attainment requires local education authorities to understand their local situations and the specific drivers in their areas. But it is all too easy to pull the wrong policy lever when the research is complex and local intelligence is incomplete. Recent experiences in Brighton and Hove have highlighted the gap between open data and actionable information for Policy Makers, Schools and anyone wanting to actively contribute to statutory public consultations. Intelligence to inform local debates could be available from within freely available online data sources, but is largely hidden within mountains of tabular data and a vast specialist literature. Using multilevel linear mixed effects models fitted to all state-funded secondary schools in England over four years (2021–22 to 2024–25), we show that school-level Attainment 8 is highly predictable from a small number of readily available variables, but non-linearities mean understanding local context is key. We apply these models to a case study of Brighton and Hove, where admissions policy proposals in 2024 were designed around the premise that attainment would be reduced by moving children around a large city to increase mixing of socioeconomic status in schools. Our analysis revealed this policy would likely have little impact on attainment in the context of the city, but have considerable social costs. In contrast, Brighton and Hove has the second worst absence rate in England. The council policy was pulling a costly lever with relatively little mechanical advantage while ignoring one with considerably more. We argue that the Department for Education’s open data provides the raw materials for better local policy making, but a crucial gap exists between available data and accessible, contextualised intelligence - a gap we address with a new Policy Simulator tool.</w:t>
+        <w:t xml:space="preserve">In its 2026 White Paper, the UK government has set a worthwhile and ambitious target to halve the disadvantage attainment gap in education. Achieving improvements in disadvantaged student attainment requires local education authorities to understand their local situations and the specific drivers in their areas. But it is all too easy to pull the wrong policy lever when the research is complex and local intelligence is incomplete. Recent experiences in Brighton and Hove have highlighted the gap between open data and actionable information for Policy Makers, Schools and anyone wanting to actively contribute to statutory public consultations. Intelligence to inform local debates could be available from within freely available online data sources, but is largely hidden within mountains of tabular data and a vast specialist literature. Using multilevel linear mixed effects models fitted to all state-funded secondary schools in England over four years (2021–22 to 2024–25), we show that school-level Attainment 8 is highly predictable from a small number of readily available variables, but non-linearities mean understanding local context is key. We apply these models to a case study of Brighton and Hove, where admissions policy proposals in 2024 were designed around the premise that attainment would be reduced by moving children around a large city to increase mixing of socioeconomic status in schools. Our analysis revealed this policy would likely have little impact on attainment in the context of the city, but could have considerable social costs. In contrast, Brighton and Hove has the second worst absence rate in England. The council policy was pulling a costly lever with relatively little mechanical advantage while ignoring one with considerably more. We argue that the Department for Education’s open data provides the raw materials for better local policy making, but a crucial gap exists between available data and accessible, contextualised intelligence - a gap we address with a new Policy Simulator tool.</w:t>
       </w:r>
     </w:p>
     <w:bookmarkStart w:id="22" w:name="introduction"/>
@@ -113,7 +113,7 @@
         <w:pStyle w:val="BodyText"/>
       </w:pPr>
       <w:r>
-        <w:t xml:space="preserve">This paper argues that the Department for Education’s (DfE) open data provides most of the raw materials needed for such nuanced localised understanding, but a crucial gap exists between data availability and accessible, contextualised intelligence for decision makers. We demonstrate this through an analysis of school-level attainment across England, combined with a case study of Brighton and Hove where secondary school admissions policy proposals in 2024–25 were designed around the wrong local attainment drivers, which would not have occurred if the policy was directly informed by the available data.</w:t>
+        <w:t xml:space="preserve">This paper argues that the Department for Education’s (DfE) open data provides most of the raw materials needed for such nuanced localised understanding, but a crucial gap exists between data availability and accessible, contextualised intelligence for decision makers. We demonstrate this through an analysis of school-level attainment across England, combined with a case study of Brighton and Hove where a policy direction would be predicted by our model, to potentially do more harm than good.</w:t>
       </w:r>
     </w:p>
     <w:p>
@@ -145,7 +145,7 @@
         <w:t xml:space="preserve"> </w:t>
       </w:r>
       <w:r>
-        <w:t xml:space="preserve">and that redistributing pupils around the city would narrow the attainment gap. The response to the consultation was overwhelmingly negative from parents and schools alike, yet many did not have the tools to effectively challenge the council’s narrative and the core policy direction persisted - albeit eventually slightly watered down from the initial proposals.</w:t>
+        <w:t xml:space="preserve">and that redistributing pupils around the city would narrow the attainment gap. The response to the consultation was overwhelmingly negative from parents and schools alike, yet many did not have the tools to effectively challenge the proposal and the core policy direction persisted - albeit eventually slightly watered down from the initial proposals.</w:t>
       </w:r>
     </w:p>
     <w:p>
@@ -153,7 +153,7 @@
         <w:pStyle w:val="BodyText"/>
       </w:pPr>
       <w:r>
-        <w:t xml:space="preserve">Raw data on the attainment gap, without context, was used by the local council as partial justification for the policies proposed. The city noted a correlation between concentration of disadvantage in schools, geography, and lower attainment. This was painted by the policy makers as a failure in need of urgent action to counter the assumed impact of economic advantage on school admissions. Due to the assumed dominance of the impact of economic advantage, the impacts of long school journeys to schools outside of local communities on safety, attainment, environment and wellbeing of affected children were not scrutinised in depth. It is our proposal that detailed data and analytics about the local situation would have led to a different frame of the city’s situation. Some rapidly produced analysis was put into the public domain by some of the authors of this paper</w:t>
+        <w:t xml:space="preserve">Raw data on the attainment gap, without context, was presented to the city along with statements about the correlation between concentrations of disadvantage in schools and lower attainment. The attainment gap was painted by the policy makers as a unique failure in need of urgent action to counter the assumed impact of economic advantage on school attainment. Such was the dominance of the narrative around economic advantage, the second-order impacts of the policy interventions, for example longer school journeys to schools outside of local communities affecting safety, attainment, environment and the well-being of affected children, were not scrutinised in depth. It is our proposal that detailed data and analytics about the local situation would have led to a different framing of the city’s situation. Some rapidly produced analysis was put into the public domain by some of the authors of this paper</w:t>
       </w:r>
       <w:r>
         <w:rPr>
@@ -162,7 +162,7 @@
         <w:footnoteReference w:id="20"/>
       </w:r>
       <w:r>
-        <w:t xml:space="preserve">, but this was produced as a response to, rather than contributing to, the creation of the policy. Consistent with the national picture, there is an attainment gap in Brighton and Hove. However, what we (the citizens of Brighton and Hove, including the local councillors developing policy) didn’t know it at the time, was prior to the policy proposals Brighton and Hove was one of the best performing Local Education Authorities in the Country for both disadvantaged (7th out of 152) and non-disadvantaged (5th out of 152) GCSE attainment, once you account for the factors we know influence that attainment. With this knowledge, the approach to improving outcomes for disadvantaged pupils could have been more effective by asking, for example,</w:t>
+        <w:t xml:space="preserve">, but this was produced as a response to, rather than contributing to, the creation of the policy. Consistent with the national picture, there is an attainment gap in Brighton and Hove. However, what we (the citizens of Brighton and Hove, including the local councillors developing policy) didn’t know at the time, was prior to the policy proposals, Brighton and Hove was one of the best performing Local Education Authorities in the Country for both disadvantaged (7th out of 152) and non-disadvantaged (5th out of 152) GCSE attainment, once you account for the factors we know influence that attainment. With this knowledge, the approach to improving outcomes for disadvantaged pupils could have been more effective by asking, for example,</w:t>
       </w:r>
       <w:r>
         <w:t xml:space="preserve"> </w:t>
@@ -186,7 +186,7 @@
         <w:t xml:space="preserve"> </w:t>
       </w:r>
       <w:r>
-        <w:t xml:space="preserve">While we can’t know if open, accessible, location-specific analysis would have resulted in a change of policy direction, it would have facilitated far more informed policy development.</w:t>
+        <w:t xml:space="preserve">While we can’t know if open, accessible, location-specific analysis would have resulted in a change of policy direction, it would have facilitated far more informed policy debate.</w:t>
       </w:r>
     </w:p>
     <w:p>
@@ -220,7 +220,7 @@
         <w:t xml:space="preserve"> </w:t>
       </w:r>
       <w:r>
-        <w:t xml:space="preserve">‘is changing the social mix in schools likely to improve disadvantaged attainment?’</w:t>
+        <w:t xml:space="preserve">‘is changing the social mix in schools likely to improve disadvantaged pupil attainment?’</w:t>
       </w:r>
       <w:r>
         <w:t xml:space="preserve">,</w:t>
@@ -4143,7 +4143,7 @@
     </w:p>
     <w:bookmarkEnd w:id="50"/>
     <w:bookmarkEnd w:id="51"/>
-    <w:bookmarkStart w:id="72" w:name="brighton-and-hove-case-study"/>
+    <w:bookmarkStart w:id="80" w:name="brighton-and-hove-case-study"/>
     <w:p>
       <w:pPr>
         <w:pStyle w:val="Heading1"/>
@@ -4152,7 +4152,7 @@
         <w:t xml:space="preserve">5. Brighton and Hove case study</w:t>
       </w:r>
     </w:p>
-    <w:bookmarkStart w:id="56" w:name="local-context"/>
+    <w:bookmarkStart w:id="57" w:name="local-context"/>
     <w:p>
       <w:pPr>
         <w:pStyle w:val="Heading2"/>
@@ -4194,7 +4194,7 @@
         <w:pStyle w:val="BodyText"/>
       </w:pPr>
       <w:r>
-        <w:t xml:space="preserve">Following the 2023 local elections, the Labour Party took overall control and implemented a Leader and Cabinet system, concentrating decision-making power. In October 2024, the council launched proposals to reduce Published Admission Numbers at popular central schools, redraw catchment boundaries, and reserve 20% of places in some schools for out-of-catchment children. The stated aims were to improve educational outcomes for disadvantaged pupils and ensure financial viability of under-subscribed schools located at the geographic periphery of the city. Underpinning the proposals was an assertion that attainment in the city was</w:t>
+        <w:t xml:space="preserve">Following the 2023 local elections, the Labour Party took overall control and implemented a Leader and Cabinet system, concentrating decision-making power. It’s worth noting that prior to the new administration taking control, the city council had in place a comprehensive strategy for tacking educational disadvantage [^old_strategy] which included a section on attendance, alongside leadership and governance and targeted support. However in October 2024, under the new administration the council launched proposals to amend the secondary school admissions process with the intention of improving disadvantaged attainment. This earlier action plan was not referenced. The proposals were to reduce Published Admission Numbers at popular central schools, redraw catchment boundaries, and reserve 20% of places in some schools for out-of-catchment children. The stated aims were to improve educational outcomes for disadvantaged pupils and ensure financial viability of under-subscribed schools located at the geographic periphery of the city. Underpinning the proposals was an assertion that attainment in the city was</w:t>
       </w:r>
       <w:r>
         <w:t xml:space="preserve"> </w:t>
@@ -4235,6 +4235,22 @@
         <w:pStyle w:val="BodyText"/>
       </w:pPr>
       <w:r>
+        <w:t xml:space="preserve">[^old_strategy]</w:t>
+      </w:r>
+      <w:hyperlink r:id="rId52">
+        <w:r>
+          <w:rPr>
+            <w:rStyle w:val="Hyperlink"/>
+          </w:rPr>
+          <w:t xml:space="preserve">https://www.brighton-hove.gov.uk/schools-and-learning/school-policies-reports-strategies-and-other-documents/better-outcomes-better-lives-brighton-hoves-strategy-tackling-educational-disadvantage</w:t>
+        </w:r>
+      </w:hyperlink>
+    </w:p>
+    <w:p>
+      <w:pPr>
+        <w:pStyle w:val="BodyText"/>
+      </w:pPr>
+      <w:r>
         <w:t xml:space="preserve">The public response was overwhelmingly negative, with the council’s feedback summary from the pre-consultation engagement exercise noting</w:t>
       </w:r>
       <w:r>
@@ -4256,7 +4272,7 @@
         <w:pStyle w:val="BodyText"/>
       </w:pPr>
       <w:r>
-        <w:t xml:space="preserve">From the papers accompanying the proposals and the content of the scrutiny committee meetings, it was clear the council had settled on affecting increased social mixing — beyond levels already in the top third nationally — in the belief this would narrow the attainment gap (presumably by raising disadvantaged attainment). This was in addition to a 2023 policy giving FSM-eligible pupils priority in admissions, which was already affecting further mixing without majority opposition. That the central catchments were perceived as more</w:t>
+        <w:t xml:space="preserve">From the papers accompanying the proposals and the content of the scrutiny committee meetings, it was clear the council had settled on affecting increased social mixing — beyond levels already in the top third nationally — in the belief this would narrow the attainment gap (presumably by raising disadvantaged attainment). This was in addition to a 2023 policy giving FSM-eligible pupils priority in admissions in schools with below the city average (30%) levels of FSM eligible pupils. This was already affecting further social mixing with flows from peripheral to more popular central catchments - the central catchments were perceived as more</w:t>
       </w:r>
       <w:r>
         <w:t xml:space="preserve"> </w:t>
@@ -4277,7 +4293,7 @@
         <w:t xml:space="preserve">‘working-class’</w:t>
       </w:r>
       <w:r>
-        <w:t xml:space="preserve">, may have factored into this policy design.</w:t>
+        <w:t xml:space="preserve">, and this may have factored into the policy design.</w:t>
       </w:r>
     </w:p>
     <w:p>
@@ -4317,7 +4333,7 @@
       <w:tr>
         <w:tc>
           <w:tcPr/>
-          <w:bookmarkStart w:id="55" w:name="fig-catchments"/>
+          <w:bookmarkStart w:id="56" w:name="fig-catchments"/>
           <w:p>
             <w:pPr>
               <w:pStyle w:val="Compact"/>
@@ -4328,18 +4344,18 @@
                 <wp:inline>
                   <wp:extent cx="5334000" cy="4572000"/>
                   <wp:effectExtent b="0" l="0" r="0" t="0"/>
-                  <wp:docPr descr="" title="" id="53" name="Picture"/>
+                  <wp:docPr descr="" title="" id="54" name="Picture"/>
                   <a:graphic>
                     <a:graphicData uri="http://schemas.openxmlformats.org/drawingml/2006/picture">
                       <pic:pic>
                         <pic:nvPicPr>
-                          <pic:cNvPr descr="JEP_Paper_files/figure-docx/fig-catchments-1.png" id="54" name="Picture"/>
+                          <pic:cNvPr descr="JEP_Paper_files/figure-docx/fig-catchments-1.png" id="55" name="Picture"/>
                           <pic:cNvPicPr>
                             <a:picLocks noChangeArrowheads="1" noChangeAspect="1"/>
                           </pic:cNvPicPr>
                         </pic:nvPicPr>
                         <pic:blipFill>
-                          <a:blip r:embed="rId52"/>
+                          <a:blip r:embed="rId53"/>
                           <a:stretch>
                             <a:fillRect/>
                           </a:stretch>
@@ -4379,12 +4395,12 @@
               <w:t xml:space="preserve">Figure 2: Brighton and Hove secondary schools with 2025/26 catchment boundaries.</w:t>
             </w:r>
           </w:p>
-          <w:bookmarkEnd w:id="55"/>
+          <w:bookmarkEnd w:id="56"/>
         </w:tc>
       </w:tr>
     </w:tbl>
-    <w:bookmarkEnd w:id="56"/>
-    <w:bookmarkStart w:id="61" w:name="local-authority-effects"/>
+    <w:bookmarkEnd w:id="57"/>
+    <w:bookmarkStart w:id="62" w:name="local-authority-effects"/>
     <w:p>
       <w:pPr>
         <w:pStyle w:val="Heading2"/>
@@ -4406,7 +4422,7 @@
       <w:tr>
         <w:tc>
           <w:tcPr/>
-          <w:bookmarkStart w:id="60" w:name="fig-caterpillar"/>
+          <w:bookmarkStart w:id="61" w:name="fig-caterpillar"/>
           <w:p>
             <w:pPr>
               <w:pStyle w:val="Compact"/>
@@ -4417,18 +4433,18 @@
                 <wp:inline>
                   <wp:extent cx="5334000" cy="4572000"/>
                   <wp:effectExtent b="0" l="0" r="0" t="0"/>
-                  <wp:docPr descr="" title="" id="58" name="Picture"/>
+                  <wp:docPr descr="" title="" id="59" name="Picture"/>
                   <a:graphic>
                     <a:graphicData uri="http://schemas.openxmlformats.org/drawingml/2006/picture">
                       <pic:pic>
                         <pic:nvPicPr>
-                          <pic:cNvPr descr="JEP_Paper_files/figure-docx/fig-caterpillar-1.png" id="59" name="Picture"/>
+                          <pic:cNvPr descr="JEP_Paper_files/figure-docx/fig-caterpillar-1.png" id="60" name="Picture"/>
                           <pic:cNvPicPr>
                             <a:picLocks noChangeArrowheads="1" noChangeAspect="1"/>
                           </pic:cNvPicPr>
                         </pic:nvPicPr>
                         <pic:blipFill>
-                          <a:blip r:embed="rId57"/>
+                          <a:blip r:embed="rId58"/>
                           <a:stretch>
                             <a:fillRect/>
                           </a:stretch>
@@ -4468,7 +4484,7 @@
               <w:t xml:space="preserve">Figure 3: LA random intercepts for disadvantaged-pupil attainment (imputed full panel model). Top and bottom 10 LAs labelled; Brighton and Hove highlighted.</w:t>
             </w:r>
           </w:p>
-          <w:bookmarkEnd w:id="60"/>
+          <w:bookmarkEnd w:id="61"/>
         </w:tc>
       </w:tr>
     </w:tbl>
@@ -4491,8 +4507,8 @@
         <w:t xml:space="preserve">shows that Brighton and Hove ranks 7th out of 152 LEAs for disadvantaged attainment once structural factors are accounted for in the multilevel model presented earlier. For non-disadvantaged pupils it ranks 5th; for all pupils, 4th. The positive random intercept of approximately +0.06 translates to around a 6% uplift in Attainment 8 — roughly 2 GCSE points above what structural factors would predict. This was unknown at the time of the 2024 consultation and entirely absent from the public narrative, which was framed around a premise of failure, based on limited analysis.</w:t>
       </w:r>
     </w:p>
-    <w:bookmarkEnd w:id="61"/>
-    <w:bookmarkStart w:id="66" w:name="X2c44da290b91186546cdc06847184f26ab3e331"/>
+    <w:bookmarkEnd w:id="62"/>
+    <w:bookmarkStart w:id="67" w:name="X2c44da290b91186546cdc06847184f26ab3e331"/>
     <w:p>
       <w:pPr>
         <w:pStyle w:val="Heading2"/>
@@ -4555,7 +4571,7 @@
       <w:tr>
         <w:tc>
           <w:tcPr/>
-          <w:bookmarkStart w:id="65" w:name="fig-accelerating-returns"/>
+          <w:bookmarkStart w:id="66" w:name="fig-accelerating-returns"/>
           <w:p>
             <w:pPr>
               <w:pStyle w:val="Compact"/>
@@ -4566,18 +4582,18 @@
                 <wp:inline>
                   <wp:extent cx="5334000" cy="3429000"/>
                   <wp:effectExtent b="0" l="0" r="0" t="0"/>
-                  <wp:docPr descr="" title="" id="63" name="Picture"/>
+                  <wp:docPr descr="" title="" id="64" name="Picture"/>
                   <a:graphic>
                     <a:graphicData uri="http://schemas.openxmlformats.org/drawingml/2006/picture">
                       <pic:pic>
                         <pic:nvPicPr>
-                          <pic:cNvPr descr="JEP_Paper_files/figure-docx/fig-accelerating-returns-1.png" id="64" name="Picture"/>
+                          <pic:cNvPr descr="JEP_Paper_files/figure-docx/fig-accelerating-returns-1.png" id="65" name="Picture"/>
                           <pic:cNvPicPr>
                             <a:picLocks noChangeArrowheads="1" noChangeAspect="1"/>
                           </pic:cNvPicPr>
                         </pic:nvPicPr>
                         <pic:blipFill>
-                          <a:blip r:embed="rId62"/>
+                          <a:blip r:embed="rId63"/>
                           <a:stretch>
                             <a:fillRect/>
                           </a:stretch>
@@ -4617,7 +4633,7 @@
               <w:t xml:space="preserve">Figure 4: Accelerating returns: each percentage-point reduction buys a progressively larger ATT8 gain (reading right to left). Absence delivers substantially larger gains than FSM at every level. Brighton and Hove schools marked on each curve.</w:t>
             </w:r>
           </w:p>
-          <w:bookmarkEnd w:id="65"/>
+          <w:bookmarkEnd w:id="66"/>
         </w:tc>
       </w:tr>
     </w:tbl>
@@ -4661,8 +4677,8 @@
         <w:t xml:space="preserve">Bringing schools above the national average for absence down to it would produce predicted gains averaging +2.9 Attainment 8 points per school, with gains for disadvantaged pupils averaging +3.3 points. Even dramatic FSM reductions would yield gains closer to 1 point. The policy was pulling a lever with relatively little mechanical advantage while ignoring one with considerably more.</w:t>
       </w:r>
     </w:p>
-    <w:bookmarkEnd w:id="66"/>
-    <w:bookmarkStart w:id="71" w:name="contextualised-school-performance"/>
+    <w:bookmarkEnd w:id="67"/>
+    <w:bookmarkStart w:id="72" w:name="contextualised-school-performance"/>
     <w:p>
       <w:pPr>
         <w:pStyle w:val="Heading2"/>
@@ -4684,7 +4700,7 @@
       <w:tr>
         <w:tc>
           <w:tcPr/>
-          <w:bookmarkStart w:id="70" w:name="fig-obs-vs-pred"/>
+          <w:bookmarkStart w:id="71" w:name="fig-obs-vs-pred"/>
           <w:p>
             <w:pPr>
               <w:pStyle w:val="Compact"/>
@@ -4695,18 +4711,18 @@
                 <wp:inline>
                   <wp:extent cx="5334000" cy="6858000"/>
                   <wp:effectExtent b="0" l="0" r="0" t="0"/>
-                  <wp:docPr descr="" title="" id="68" name="Picture"/>
+                  <wp:docPr descr="" title="" id="69" name="Picture"/>
                   <a:graphic>
                     <a:graphicData uri="http://schemas.openxmlformats.org/drawingml/2006/picture">
                       <pic:pic>
                         <pic:nvPicPr>
-                          <pic:cNvPr descr="JEP_Paper_files/figure-docx/fig-obs-vs-pred-1.png" id="69" name="Picture"/>
+                          <pic:cNvPr descr="JEP_Paper_files/figure-docx/fig-obs-vs-pred-1.png" id="70" name="Picture"/>
                           <pic:cNvPicPr>
                             <a:picLocks noChangeArrowheads="1" noChangeAspect="1"/>
                           </pic:cNvPicPr>
                         </pic:nvPicPr>
                         <pic:blipFill>
-                          <a:blip r:embed="rId67"/>
+                          <a:blip r:embed="rId68"/>
                           <a:stretch>
                             <a:fillRect/>
                           </a:stretch>
@@ -4746,7 +4762,7 @@
               <w:t xml:space="preserve">Figure 5: Observed versus predicted Attainment 8 for Brighton and Hove schools (highlighted) against all schools nationally, 2024–25.</w:t>
             </w:r>
           </w:p>
-          <w:bookmarkEnd w:id="70"/>
+          <w:bookmarkEnd w:id="71"/>
         </w:tc>
       </w:tr>
     </w:tbl>
@@ -4804,24 +4820,14 @@
         <w:t xml:space="preserve">measures - more nuanced than Progress 8 - as this model-based value added accounts for far more than just prior attainment in its representation.</w:t>
       </w:r>
     </w:p>
-    <w:bookmarkEnd w:id="71"/>
     <w:bookmarkEnd w:id="72"/>
-    <w:bookmarkStart w:id="94" w:name="discussion"/>
-    <w:p>
-      <w:pPr>
-        <w:pStyle w:val="Heading1"/>
-      </w:pPr>
-      <w:r>
-        <w:t xml:space="preserve">6. Discussion</w:t>
-      </w:r>
-    </w:p>
-    <w:bookmarkStart w:id="75" w:name="Xd3364b35d543c93770b334c5dc736f1edb746ee"/>
+    <w:bookmarkStart w:id="79" w:name="X8ff19f05081feb947c9bfda17930b607e81aacb"/>
     <w:p>
       <w:pPr>
         <w:pStyle w:val="Heading2"/>
       </w:pPr>
       <w:r>
-        <w:t xml:space="preserve">6.1 The danger of single-lever policy thinking</w:t>
+        <w:t xml:space="preserve">5.5 Decomposing absence: structural intake versus school management</w:t>
       </w:r>
     </w:p>
     <w:p>
@@ -4829,7 +4835,59 @@
         <w:pStyle w:val="FirstParagraph"/>
       </w:pPr>
       <w:r>
-        <w:t xml:space="preserve">The Brighton and Hove experience illustrates what happens when policy makers latch onto a single causal narrative. The council’s 2024 proposals were built almost entirely on the premise that redistributing disadvantaged pupils would narrow the attainment gap. In the consultation papers released to the public</w:t>
+        <w:t xml:space="preserve">The contextualised value-added reading above hides a complication we should make explicit. Our headline model treats school-level absence as a single regressor on the same footing as the school’s intake variables, but absence is not a single causal entity. Some of school-level absence is exogenous to the school: driven by family circumstances, area health, deprivation patterns, the SEN profile of the catchment and other features of the intake the school inherits but cannot directly choose. Some of it is produced by the school: through pastoral systems, attendance officers, parental engagement and the broader ethos around getting children into class. When we control for raw absence in our headline model, both components are absorbed together — the school-level residual we have just been calling</w:t>
+      </w:r>
+      <w:r>
+        <w:t xml:space="preserve"> </w:t>
+      </w:r>
+      <w:r>
+        <w:t xml:space="preserve">‘value-added’</w:t>
+      </w:r>
+      <w:r>
+        <w:t xml:space="preserve"> </w:t>
+      </w:r>
+      <w:r>
+        <w:t xml:space="preserve">reflects what the school does</w:t>
+      </w:r>
+      <w:r>
+        <w:t xml:space="preserve"> </w:t>
+      </w:r>
+      <w:r>
+        <w:rPr>
+          <w:i/>
+          <w:iCs/>
+        </w:rPr>
+        <w:t xml:space="preserve">given</w:t>
+      </w:r>
+      <w:r>
+        <w:t xml:space="preserve"> </w:t>
+      </w:r>
+      <w:r>
+        <w:t xml:space="preserve">its attendance, not what it does</w:t>
+      </w:r>
+      <w:r>
+        <w:t xml:space="preserve"> </w:t>
+      </w:r>
+      <w:r>
+        <w:rPr>
+          <w:i/>
+          <w:iCs/>
+        </w:rPr>
+        <w:t xml:space="preserve">to</w:t>
+      </w:r>
+      <w:r>
+        <w:t xml:space="preserve"> </w:t>
+      </w:r>
+      <w:r>
+        <w:t xml:space="preserve">its attendance.</w:t>
+      </w:r>
+    </w:p>
+    <w:p>
+      <w:pPr>
+        <w:pStyle w:val="BodyText"/>
+      </w:pPr>
+      <w:r>
+        <w:t xml:space="preserve">A two-stage decomposition</w:t>
       </w:r>
       <w:r>
         <w:rPr>
@@ -4838,36 +4896,58 @@
         <w:footnoteReference w:id="73"/>
       </w:r>
       <w:r>
-        <w:t xml:space="preserve">, it was stated:</w:t>
-      </w:r>
-    </w:p>
-    <w:p>
-      <w:pPr>
-        <w:pStyle w:val="BlockText"/>
-      </w:pPr>
-      <w:r>
-        <w:rPr>
-          <w:i/>
-          <w:iCs/>
-        </w:rPr>
-        <w:t xml:space="preserve">“We also know that children from disadvantaged homes are less likely to do well at school and that can be made worse when more disadvantaged children all go to school together. We are looking at options for how we can help the city manage that issue better, including through our school admissions arrangements.”</w:t>
-      </w:r>
-    </w:p>
-    <w:p>
-      <w:pPr>
-        <w:pStyle w:val="FirstParagraph"/>
-      </w:pPr>
-      <w:r>
-        <w:t xml:space="preserve">While this premise is false in the context of</w:t>
-      </w:r>
-      <w:r>
-        <w:t xml:space="preserve"> </w:t>
-      </w:r>
-      <w:r>
-        <w:t xml:space="preserve">Macleod et al. (2015)</w:t>
-      </w:r>
-      <w:r>
-        <w:t xml:space="preserve">’s analysis for the DfE, our more up-to-date modelling confirms this was, at best, a flawed understanding; at worst a policy with many losers and few clear winners. Concentrations of disadvantage are one of the weaker available levers, and for disadvantaged pupils specifically, the direction of the effect runs in the opposite direction to the policy assumptions. Reducing absence to the national average at the worst-affected schools could yield gains of 3–5 GCSE points; even dramatic FSM reductions would yield closer to 1–2 points and possibly only for the non-disadvantaged students.</w:t>
+        <w:t xml:space="preserve"> </w:t>
+      </w:r>
+      <w:r>
+        <w:t xml:space="preserve">separates these. First, we fit an absence model in which school-level absence is regressed only on the variables we treat as exogenous to the school (FSM, EAL, low prior attainment, segregation, plus place and year random effects). This yields two derived quantities for every school-year: an</w:t>
+      </w:r>
+      <w:r>
+        <w:t xml:space="preserve"> </w:t>
+      </w:r>
+      <w:r>
+        <w:rPr>
+          <w:i/>
+          <w:iCs/>
+        </w:rPr>
+        <w:t xml:space="preserve">expected absence</w:t>
+      </w:r>
+      <w:r>
+        <w:t xml:space="preserve"> </w:t>
+      </w:r>
+      <w:r>
+        <w:t xml:space="preserve">(the part the intake predicts) and a</w:t>
+      </w:r>
+      <w:r>
+        <w:t xml:space="preserve"> </w:t>
+      </w:r>
+      <w:r>
+        <w:rPr>
+          <w:i/>
+          <w:iCs/>
+        </w:rPr>
+        <w:t xml:space="preserve">residual absence</w:t>
+      </w:r>
+      <w:r>
+        <w:t xml:space="preserve"> </w:t>
+      </w:r>
+      <w:r>
+        <w:t xml:space="preserve">(what is left over — broadly, the school-controllable component). Second, we refit the attainment model with the intake-predicted absence in place of raw absence, and we drop the workforce predictors. The school-level residual from this refitted attainment model is a more honest value-added measure: it gives credit for what the school adds to attainment over and above its intake,</w:t>
+      </w:r>
+      <w:r>
+        <w:t xml:space="preserve"> </w:t>
+      </w:r>
+      <w:r>
+        <w:rPr>
+          <w:i/>
+          <w:iCs/>
+        </w:rPr>
+        <w:t xml:space="preserve">with</w:t>
+      </w:r>
+      <w:r>
+        <w:t xml:space="preserve"> </w:t>
+      </w:r>
+      <w:r>
+        <w:t xml:space="preserve">attendance management already counted as part of the school’s contribution rather than stripped away as a control.</w:t>
       </w:r>
     </w:p>
     <w:p>
@@ -4875,162 +4955,36 @@
         <w:pStyle w:val="BodyText"/>
       </w:pPr>
       <w:r>
-        <w:t xml:space="preserve">Furthermore, the chosen lever carried its own risks. Of the many negative impacts of longer journeys imposed by redistribution policies - e.g. reduced sleep and its psychosocial</w:t>
-      </w:r>
-      <w:r>
-        <w:t xml:space="preserve"> </w:t>
-      </w:r>
-      <w:r>
-        <w:t xml:space="preserve">(Fredriksen et al. 2004; Yeo et al. 2019)</w:t>
-      </w:r>
-      <w:r>
-        <w:t xml:space="preserve">, physical</w:t>
-      </w:r>
-      <w:r>
-        <w:t xml:space="preserve"> </w:t>
-      </w:r>
-      <w:r>
-        <w:t xml:space="preserve">(Voulgaris et al. 2019; Pradhan and Sinha 2017; Pereira et al. 2014; Faulkner et al. 2013)</w:t>
-      </w:r>
-      <w:r>
-        <w:t xml:space="preserve"> </w:t>
-      </w:r>
-      <w:r>
-        <w:t xml:space="preserve">and mental health</w:t>
-      </w:r>
-      <w:r>
-        <w:t xml:space="preserve"> </w:t>
-      </w:r>
-      <w:r>
-        <w:t xml:space="preserve">(Nakajima et al. 2024; Chairassamee et al. 2024; Guan et al. 2025)</w:t>
-      </w:r>
-      <w:r>
-        <w:t xml:space="preserve"> </w:t>
-      </w:r>
-      <w:r>
-        <w:t xml:space="preserve">including stress</w:t>
-      </w:r>
-      <w:r>
-        <w:t xml:space="preserve"> </w:t>
-      </w:r>
-      <w:r>
-        <w:t xml:space="preserve">(Karan et al. 2021)</w:t>
-      </w:r>
-      <w:r>
-        <w:t xml:space="preserve"> </w:t>
-      </w:r>
-      <w:r>
-        <w:t xml:space="preserve">and general wellbeing</w:t>
-      </w:r>
-      <w:r>
-        <w:t xml:space="preserve"> </w:t>
-      </w:r>
-      <w:r>
-        <w:t xml:space="preserve">(Ding et al. 2023)</w:t>
-      </w:r>
-      <w:r>
-        <w:t xml:space="preserve"> </w:t>
-      </w:r>
-      <w:r>
-        <w:t xml:space="preserve">- they are also associated with higher absence in many countries</w:t>
-      </w:r>
-      <w:r>
-        <w:t xml:space="preserve"> </w:t>
-      </w:r>
-      <w:r>
-        <w:t xml:space="preserve">(Otsuka et al. 2025; Cordes et al. 2022; Blagg et al. 2018)</w:t>
-      </w:r>
-      <w:r>
-        <w:t xml:space="preserve"> </w:t>
-      </w:r>
-      <w:r>
-        <w:t xml:space="preserve">including England</w:t>
-      </w:r>
-      <w:r>
-        <w:t xml:space="preserve"> </w:t>
-      </w:r>
-      <w:r>
-        <w:t xml:space="preserve">(Thomson 2023)</w:t>
-      </w:r>
-      <w:r>
-        <w:t xml:space="preserve"> </w:t>
-      </w:r>
-      <w:r>
-        <w:t xml:space="preserve">— precisely the factor that most drags on attainment and the biggest problem already besetting Brighton and Hove. The council could be imposing policies that actively make the outcomes for disadvantaged children much worse through failing to engage with the evidence properly. The claim that social mixing can be achieved at</w:t>
-      </w:r>
-      <w:r>
-        <w:t xml:space="preserve"> </w:t>
-      </w:r>
-      <w:r>
-        <w:t xml:space="preserve">‘almost no cost’</w:t>
-      </w:r>
-      <w:r>
-        <w:t xml:space="preserve"> </w:t>
-      </w:r>
-      <w:r>
-        <w:t xml:space="preserve">(Gorard and Siddiqui 2019)</w:t>
-      </w:r>
-      <w:r>
-        <w:t xml:space="preserve"> </w:t>
-      </w:r>
-      <w:r>
-        <w:t xml:space="preserve">overlooks these second-order effects and could be the kind of comment that without context, could do a lot of damage.</w:t>
-      </w:r>
-    </w:p>
-    <w:bookmarkEnd w:id="75"/>
-    <w:bookmarkStart w:id="78" w:name="absence-as-the-primary-policy-lever"/>
-    <w:p>
-      <w:pPr>
-        <w:pStyle w:val="Heading2"/>
-      </w:pPr>
-      <w:r>
-        <w:t xml:space="preserve">6.2 Absence as the primary policy lever</w:t>
-      </w:r>
-    </w:p>
-    <w:p>
-      <w:pPr>
-        <w:pStyle w:val="FirstParagraph"/>
-      </w:pPr>
-      <w:r>
-        <w:t xml:space="preserve">Perhaps the most striking finding is the complete absence of absence from the policy narrative. The city had the second worst absence rate in England in 2024–25 and has been consistently among the worst in England. Yet absence was not part of the policy conversation. It was not mentioned in any of the presentation slides in the initial public facing engagement</w:t>
-      </w:r>
-      <w:r>
-        <w:rPr>
-          <w:rStyle w:val="FootnoteReference"/>
-        </w:rPr>
-        <w:footnoteReference w:id="76"/>
-      </w:r>
-      <w:r>
-        <w:t xml:space="preserve"> </w:t>
-      </w:r>
-      <w:r>
-        <w:t xml:space="preserve">or any of the published materials accompanying the consultations. The irony is considerable: the city ranks 7th best for disadvantaged attainment after structural adjustments, but this strong underlying performance is still likely being dragged down by an extreme absence problem.</w:t>
-      </w:r>
-    </w:p>
-    <w:p>
-      <w:pPr>
-        <w:pStyle w:val="BodyText"/>
-      </w:pPr>
-      <w:r>
-        <w:t xml:space="preserve">Brighton and Hove’s absence rates are not a necessary consequence of its intake composition. The city has near-average FSM eligibility levels but near-worst absence, suggesting the problem is likely driven by local factors — attendance culture, enforcement practices, or community dynamics — rather than being an unavoidable correlate of disadvantage.</w:t>
-      </w:r>
-    </w:p>
-    <w:bookmarkEnd w:id="78"/>
-    <w:bookmarkStart w:id="86" w:name="X3fc496a95cceb2f31de10765d345b6860b0e78e"/>
-    <w:p>
-      <w:pPr>
-        <w:pStyle w:val="Heading2"/>
-      </w:pPr>
-      <w:r>
-        <w:t xml:space="preserve">6.3 The BACA paradox and contextualised benchmarking</w:t>
-      </w:r>
-    </w:p>
-    <w:p>
-      <w:pPr>
-        <w:pStyle w:val="FirstParagraph"/>
-      </w:pPr>
-      <w:r>
-        <w:t xml:space="preserve">The case of Brighton Alridge Community Academy (BACA) offers a particularly sharp illustration of the damage done when school quality is assessed through crude metrics and policy narratives are misleading.</w:t>
+        <w:t xml:space="preserve">The national-level picture this paints is informative. Most of the school-year variation in absence is explained by the intake-only first stage — absence at school level is dominated by intake and place-level structural factors. The school-controllable residual is the smaller share, and a model that fits expected absence and residual absence as separate regressors confirms that the marginal contribution of residual absence to attainment is modest at population level once intake-driven absence is already accounted for. This does not mean attendance management is unimportant. It means</w:t>
+      </w:r>
+      <w:r>
+        <w:t xml:space="preserve"> </w:t>
+      </w:r>
+      <w:r>
+        <w:rPr>
+          <w:b/>
+          <w:bCs/>
+        </w:rPr>
+        <w:t xml:space="preserve">the headline raw-absence coefficient borrows much of its statistical force from the structural component</w:t>
+      </w:r>
+      <w:r>
+        <w:t xml:space="preserve">. The lever is real, but the school-only portion of it is smaller than the single coefficient implies. For local education authorities this has direct policy consequences: closing a city’s absence problem requires both school-level attention</w:t>
+      </w:r>
+      <w:r>
+        <w:t xml:space="preserve"> </w:t>
+      </w:r>
+      <w:r>
+        <w:rPr>
+          <w:i/>
+          <w:iCs/>
+        </w:rPr>
+        <w:t xml:space="preserve">and</w:t>
+      </w:r>
+      <w:r>
+        <w:t xml:space="preserve"> </w:t>
+      </w:r>
+      <w:r>
+        <w:t xml:space="preserve">cross-departmental work — public health, children’s services, area-level deprivation policy — because much of what schools are dealing with on attendance is inherited rather than generated.</w:t>
       </w:r>
     </w:p>
     <w:tbl>
@@ -5046,7 +5000,404 @@
       <w:tr>
         <w:tc>
           <w:tcPr/>
-          <w:bookmarkStart w:id="79" w:name="tbl-league"/>
+          <w:bookmarkStart w:id="78" w:name="fig-quadrant"/>
+          <w:p>
+            <w:pPr>
+              <w:pStyle w:val="Compact"/>
+              <w:jc w:val="center"/>
+            </w:pPr>
+            <w:r>
+              <w:drawing>
+                <wp:inline>
+                  <wp:extent cx="5334000" cy="3810000"/>
+                  <wp:effectExtent b="0" l="0" r="0" t="0"/>
+                  <wp:docPr descr="" title="" id="76" name="Picture"/>
+                  <a:graphic>
+                    <a:graphicData uri="http://schemas.openxmlformats.org/drawingml/2006/picture">
+                      <pic:pic>
+                        <pic:nvPicPr>
+                          <pic:cNvPr descr="JEP_Paper_files/figure-docx/fig-quadrant-1.png" id="77" name="Picture"/>
+                          <pic:cNvPicPr>
+                            <a:picLocks noChangeArrowheads="1" noChangeAspect="1"/>
+                          </pic:cNvPicPr>
+                        </pic:nvPicPr>
+                        <pic:blipFill>
+                          <a:blip r:embed="rId75"/>
+                          <a:stretch>
+                            <a:fillRect/>
+                          </a:stretch>
+                        </pic:blipFill>
+                        <pic:spPr bwMode="auto">
+                          <a:xfrm>
+                            <a:off x="0" y="0"/>
+                            <a:ext cx="5334000" cy="3810000"/>
+                          </a:xfrm>
+                          <a:prstGeom prst="rect">
+                            <a:avLst/>
+                          </a:prstGeom>
+                          <a:noFill/>
+                          <a:ln w="9525">
+                            <a:noFill/>
+                            <a:headEnd/>
+                            <a:tailEnd/>
+                          </a:ln>
+                        </pic:spPr>
+                      </pic:pic>
+                    </a:graphicData>
+                  </a:graphic>
+                </wp:inline>
+              </w:drawing>
+            </w:r>
+          </w:p>
+          <w:p>
+            <w:pPr>
+              <w:jc w:val="center"/>
+            </w:pPr>
+            <w:pPr>
+              <w:jc w:val="left"/>
+              <w:spacing w:before="200"/>
+              <w:pStyle w:val="ImageCaption"/>
+            </w:pPr>
+            <w:r>
+              <w:t xml:space="preserve">Figure 6: Brighton and Hove secondaries on the joint-signal plane: contextualised value-added (vertical, in Attainment 8 points) versus the school-controllable absence component (horizontal, in percentage points). The reference lines at zero on each axis split the plane into four narrative quadrants discussed in the text. The full national version with a local-authority filter is available interactively in the project’s HTML report.</w:t>
+            </w:r>
+          </w:p>
+          <w:bookmarkEnd w:id="78"/>
+        </w:tc>
+      </w:tr>
+    </w:tbl>
+    <w:p>
+      <w:pPr>
+        <w:pStyle w:val="BodyText"/>
+      </w:pPr>
+      <w:r>
+        <w:t xml:space="preserve">For local school-level diagnostics the decomposition becomes considerably more informative. Two signals can now be read side by side: the school’s contextualised value-added, and its residual absence (positive when the school runs more absence than its intake would predict, negative when less). Sorted on these two axes (</w:t>
+      </w:r>
+      <w:hyperlink w:anchor="fig-quadrant">
+        <w:r>
+          <w:rPr>
+            <w:rStyle w:val="Hyperlink"/>
+          </w:rPr>
+          <w:t xml:space="preserve">Figure 6</w:t>
+        </w:r>
+      </w:hyperlink>
+      <w:r>
+        <w:t xml:space="preserve">), schools fall into four meaningful policy stories: schools adding value with attendance management helping (Q1, top-left); schools adding value despite worse-than-predicted attendance (Q2, top-right); schools underperforming with attendance the cleanest single lever (Q3, bottom-right); and schools underperforming despite unusually good attendance management (Q4, bottom-left).</w:t>
+      </w:r>
+    </w:p>
+    <w:p>
+      <w:pPr>
+        <w:pStyle w:val="BodyText"/>
+      </w:pPr>
+      <w:r>
+        <w:t xml:space="preserve">For Brighton and Hove the joint-signal view sharpens the case-study reading.</w:t>
+      </w:r>
+      <w:r>
+        <w:t xml:space="preserve"> </w:t>
+      </w:r>
+      <w:r>
+        <w:rPr>
+          <w:b/>
+          <w:bCs/>
+        </w:rPr>
+        <w:t xml:space="preserve">BACA</w:t>
+      </w:r>
+      <w:r>
+        <w:t xml:space="preserve"> </w:t>
+      </w:r>
+      <w:r>
+        <w:t xml:space="preserve">sits firmly in Q2: the school is delivering attainment well above what its intake would predict and is doing so while running more absence than its intake-driven absence model expects. The pedagogical work happening at BACA is the more impressive for it; closing the school’s residual-absence gap would compound directly onto an already-strong value-added signal.</w:t>
+      </w:r>
+      <w:r>
+        <w:t xml:space="preserve"> </w:t>
+      </w:r>
+      <w:r>
+        <w:rPr>
+          <w:b/>
+          <w:bCs/>
+        </w:rPr>
+        <w:t xml:space="preserve">Patcham</w:t>
+      </w:r>
+      <w:r>
+        <w:t xml:space="preserve">, by contrast, sits in Q4: its attendance management is genuinely strong, but once intake is properly accounted for its attainment outcomes fall short of what its profile predicts, so the simple</w:t>
+      </w:r>
+      <w:r>
+        <w:t xml:space="preserve"> </w:t>
+      </w:r>
+      <w:r>
+        <w:t xml:space="preserve">“fix attendance”</w:t>
+      </w:r>
+      <w:r>
+        <w:t xml:space="preserve"> </w:t>
+      </w:r>
+      <w:r>
+        <w:t xml:space="preserve">improvement story is not available. Schools in Q3 are the most natural targets for council-led attendance interventions, and Q1 schools are where the city should look for practice worth sharing. Reporting</w:t>
+      </w:r>
+      <w:r>
+        <w:t xml:space="preserve"> </w:t>
+      </w:r>
+      <w:r>
+        <w:rPr>
+          <w:b/>
+          <w:bCs/>
+        </w:rPr>
+        <w:t xml:space="preserve">value-added alongside residual absence</w:t>
+      </w:r>
+      <w:r>
+        <w:t xml:space="preserve">, with explicit uncertainty intervals, is a more honest framing than the single number that conventional benchmarking produces, and would help align local policy conversation with what the data can support.</w:t>
+      </w:r>
+    </w:p>
+    <w:bookmarkEnd w:id="79"/>
+    <w:bookmarkEnd w:id="80"/>
+    <w:bookmarkStart w:id="102" w:name="discussion"/>
+    <w:p>
+      <w:pPr>
+        <w:pStyle w:val="Heading1"/>
+      </w:pPr>
+      <w:r>
+        <w:t xml:space="preserve">6. Discussion</w:t>
+      </w:r>
+    </w:p>
+    <w:bookmarkStart w:id="83" w:name="Xd3364b35d543c93770b334c5dc736f1edb746ee"/>
+    <w:p>
+      <w:pPr>
+        <w:pStyle w:val="Heading2"/>
+      </w:pPr>
+      <w:r>
+        <w:t xml:space="preserve">6.1 The danger of single-lever policy thinking</w:t>
+      </w:r>
+    </w:p>
+    <w:p>
+      <w:pPr>
+        <w:pStyle w:val="FirstParagraph"/>
+      </w:pPr>
+      <w:r>
+        <w:t xml:space="preserve">The Brighton and Hove experience illustrates what happens when policy makers latch onto a single causal narrative. The council’s 2024 proposals were built almost entirely on the premise that redistributing disadvantaged pupils would narrow the attainment gap. In the consultation papers released to the public</w:t>
+      </w:r>
+      <w:r>
+        <w:rPr>
+          <w:rStyle w:val="FootnoteReference"/>
+        </w:rPr>
+        <w:footnoteReference w:id="81"/>
+      </w:r>
+      <w:r>
+        <w:t xml:space="preserve">, it was stated:</w:t>
+      </w:r>
+    </w:p>
+    <w:p>
+      <w:pPr>
+        <w:pStyle w:val="BlockText"/>
+      </w:pPr>
+      <w:r>
+        <w:rPr>
+          <w:i/>
+          <w:iCs/>
+        </w:rPr>
+        <w:t xml:space="preserve">“We also know that children from disadvantaged homes are less likely to do well at school and that can be made worse when more disadvantaged children all go to school together. We are looking at options for how we can help the city manage that issue better, including through our school admissions arrangements.”</w:t>
+      </w:r>
+    </w:p>
+    <w:p>
+      <w:pPr>
+        <w:pStyle w:val="FirstParagraph"/>
+      </w:pPr>
+      <w:r>
+        <w:t xml:space="preserve">While this premise is false in the context of</w:t>
+      </w:r>
+      <w:r>
+        <w:t xml:space="preserve"> </w:t>
+      </w:r>
+      <w:r>
+        <w:t xml:space="preserve">Macleod et al. (2015)</w:t>
+      </w:r>
+      <w:r>
+        <w:t xml:space="preserve">’s analysis for the DfE, our more up-to-date modelling confirms this was, at best, a flawed understanding; at worst a policy with many losers and few clear winners. Concentrations of disadvantage are one of the weaker available levers, and for disadvantaged pupils specifically, the direction of the effect runs in the opposite direction to the policy assumptions. Reducing absence to the national average at the worst-affected schools could yield gains of 3–5 GCSE points; even dramatic FSM reductions would yield closer to 1–2 points and possibly only for the non-disadvantaged students.</w:t>
+      </w:r>
+    </w:p>
+    <w:p>
+      <w:pPr>
+        <w:pStyle w:val="BodyText"/>
+      </w:pPr>
+      <w:r>
+        <w:t xml:space="preserve">Furthermore, the chosen lever carried its own risks. Of the many negative impacts of longer journeys that may be required by redistribution policies - e.g. reduced sleep and its psychosocial</w:t>
+      </w:r>
+      <w:r>
+        <w:t xml:space="preserve"> </w:t>
+      </w:r>
+      <w:r>
+        <w:t xml:space="preserve">(Fredriksen et al. 2004; Yeo et al. 2019)</w:t>
+      </w:r>
+      <w:r>
+        <w:t xml:space="preserve">, physical</w:t>
+      </w:r>
+      <w:r>
+        <w:t xml:space="preserve"> </w:t>
+      </w:r>
+      <w:r>
+        <w:t xml:space="preserve">(Voulgaris et al. 2019; Pradhan and Sinha 2017; Pereira et al. 2014; Faulkner et al. 2013)</w:t>
+      </w:r>
+      <w:r>
+        <w:t xml:space="preserve"> </w:t>
+      </w:r>
+      <w:r>
+        <w:t xml:space="preserve">and mental health</w:t>
+      </w:r>
+      <w:r>
+        <w:t xml:space="preserve"> </w:t>
+      </w:r>
+      <w:r>
+        <w:t xml:space="preserve">(Nakajima et al. 2024; Chairassamee et al. 2024; Guan et al. 2025)</w:t>
+      </w:r>
+      <w:r>
+        <w:t xml:space="preserve"> </w:t>
+      </w:r>
+      <w:r>
+        <w:t xml:space="preserve">including stress</w:t>
+      </w:r>
+      <w:r>
+        <w:t xml:space="preserve"> </w:t>
+      </w:r>
+      <w:r>
+        <w:t xml:space="preserve">(Karan et al. 2021)</w:t>
+      </w:r>
+      <w:r>
+        <w:t xml:space="preserve"> </w:t>
+      </w:r>
+      <w:r>
+        <w:t xml:space="preserve">and general wellbeing</w:t>
+      </w:r>
+      <w:r>
+        <w:t xml:space="preserve"> </w:t>
+      </w:r>
+      <w:r>
+        <w:t xml:space="preserve">(Ding et al. 2023)</w:t>
+      </w:r>
+      <w:r>
+        <w:t xml:space="preserve"> </w:t>
+      </w:r>
+      <w:r>
+        <w:t xml:space="preserve">- they are also associated with higher absence in many countries</w:t>
+      </w:r>
+      <w:r>
+        <w:t xml:space="preserve"> </w:t>
+      </w:r>
+      <w:r>
+        <w:t xml:space="preserve">(Otsuka et al. 2025; Cordes et al. 2022; Blagg et al. 2018)</w:t>
+      </w:r>
+      <w:r>
+        <w:t xml:space="preserve"> </w:t>
+      </w:r>
+      <w:r>
+        <w:t xml:space="preserve">including England</w:t>
+      </w:r>
+      <w:r>
+        <w:t xml:space="preserve"> </w:t>
+      </w:r>
+      <w:r>
+        <w:t xml:space="preserve">(Thomson 2023)</w:t>
+      </w:r>
+      <w:r>
+        <w:t xml:space="preserve"> </w:t>
+      </w:r>
+      <w:r>
+        <w:t xml:space="preserve">— precisely the factor that most drags on attainment and the biggest problem already besetting Brighton and Hove. Without considering these impacts, a well-intentioned council can impose policies that actively make the outcomes for disadvantaged children worse. The claim that social mixing can be achieved at</w:t>
+      </w:r>
+      <w:r>
+        <w:t xml:space="preserve"> </w:t>
+      </w:r>
+      <w:r>
+        <w:t xml:space="preserve">‘almost no cost’</w:t>
+      </w:r>
+      <w:r>
+        <w:t xml:space="preserve"> </w:t>
+      </w:r>
+      <w:r>
+        <w:t xml:space="preserve">(Gorard and Siddiqui 2019)</w:t>
+      </w:r>
+      <w:r>
+        <w:t xml:space="preserve"> </w:t>
+      </w:r>
+      <w:r>
+        <w:t xml:space="preserve">overlooks these second-order effects.</w:t>
+      </w:r>
+    </w:p>
+    <w:bookmarkEnd w:id="83"/>
+    <w:bookmarkStart w:id="86" w:name="X7b02c639a05fbe633837d0e0e5f324b227d5713"/>
+    <w:p>
+      <w:pPr>
+        <w:pStyle w:val="Heading2"/>
+      </w:pPr>
+      <w:r>
+        <w:t xml:space="preserve">6.2 Absence as the most effective policy lever</w:t>
+      </w:r>
+    </w:p>
+    <w:p>
+      <w:pPr>
+        <w:pStyle w:val="FirstParagraph"/>
+      </w:pPr>
+      <w:r>
+        <w:t xml:space="preserve">Given our analysis and the earlier acknowledgement of absence in the educational disadvantage strategy prior to the change in administration in 2023, perhaps the most confusing feature of the 2024 consultation is the absence of absence. The city had the second worst absence rate in England in 2024–25 and has been consistently among the worst in England. Yet it was not mentioned in any of the presentation slides in the initial public facing engagement</w:t>
+      </w:r>
+      <w:r>
+        <w:rPr>
+          <w:rStyle w:val="FootnoteReference"/>
+        </w:rPr>
+        <w:footnoteReference w:id="84"/>
+      </w:r>
+      <w:r>
+        <w:t xml:space="preserve"> </w:t>
+      </w:r>
+      <w:r>
+        <w:t xml:space="preserve">or any of the published materials accompanying the consultations. The irony is considerable: the city ranks 7th best for disadvantaged attainment after structural adjustments, but this strong underlying performance is still likely being dragged down by an extreme absence problem.</w:t>
+      </w:r>
+    </w:p>
+    <w:p>
+      <w:pPr>
+        <w:pStyle w:val="BodyText"/>
+      </w:pPr>
+      <w:r>
+        <w:t xml:space="preserve">We can’t say whether or not behind the scenes the council was still working on this challenge, it might have been. However, given the important interactions with the policies being proposed, that is was not mentioned by the council during the consultation when improving disadvantaged attainment was the stated goal and only be viewed at best as a crucial oversight.</w:t>
+      </w:r>
+    </w:p>
+    <w:p>
+      <w:pPr>
+        <w:pStyle w:val="BodyText"/>
+      </w:pPr>
+      <w:r>
+        <w:t xml:space="preserve">Brighton and Hove’s absence rates are not a necessary consequence of its intake composition. The city has near-average FSM eligibility levels but near-worst absence, suggesting the problem is likely driven by local factors — attendance culture, enforcement practices, or community dynamics — rather than being an unavoidable correlate of disadvantage.</w:t>
+      </w:r>
+    </w:p>
+    <w:bookmarkEnd w:id="86"/>
+    <w:bookmarkStart w:id="94" w:name="X3fc496a95cceb2f31de10765d345b6860b0e78e"/>
+    <w:p>
+      <w:pPr>
+        <w:pStyle w:val="Heading2"/>
+      </w:pPr>
+      <w:r>
+        <w:t xml:space="preserve">6.3 The BACA paradox and contextualised benchmarking</w:t>
+      </w:r>
+    </w:p>
+    <w:p>
+      <w:pPr>
+        <w:pStyle w:val="FirstParagraph"/>
+      </w:pPr>
+      <w:r>
+        <w:t xml:space="preserve">The case of Brighton Alridge Community Academy (BACA) offers a particularly sharp illustration of the damage done when school quality is assessed through crude metrics.</w:t>
+      </w:r>
+    </w:p>
+    <w:tbl>
+      <w:tblPr>
+        <w:tblStyle w:val="Table"/>
+        <w:tblW w:type="pct" w:w="5000"/>
+        <w:tblLayout w:type="fixed"/>
+        <w:tblLook w:firstRow="0" w:lastRow="0" w:firstColumn="0" w:lastColumn="0" w:noHBand="0" w:noVBand="0" w:val="0000"/>
+      </w:tblPr>
+      <w:tblGrid>
+        <w:gridCol w:w="7920"/>
+      </w:tblGrid>
+      <w:tr>
+        <w:tc>
+          <w:tcPr/>
+          <w:bookmarkStart w:id="87" w:name="tbl-league"/>
           <w:p>
             <w:pPr>
               <w:jc w:val="center"/>
@@ -7033,7 +7384,7 @@
               </w:tc>
             </w:tr>
           </w:tbl>
-          <w:bookmarkEnd w:id="79"/>
+          <w:bookmarkEnd w:id="87"/>
           <w:p/>
         </w:tc>
       </w:tr>
@@ -7049,7 +7400,7 @@
         <w:rPr>
           <w:rStyle w:val="FootnoteReference"/>
         </w:rPr>
-        <w:footnoteReference w:id="80"/>
+        <w:footnoteReference w:id="88"/>
       </w:r>
       <w:r>
         <w:t xml:space="preserve"> </w:t>
@@ -7061,7 +7412,7 @@
         <w:rPr>
           <w:rStyle w:val="FootnoteReference"/>
         </w:rPr>
-        <w:footnoteReference w:id="82"/>
+        <w:footnoteReference w:id="90"/>
       </w:r>
       <w:r>
         <w:t xml:space="preserve">) emerged from within the BACA catchment advocating for parents to have more options available to</w:t>
@@ -7100,23 +7451,7 @@
         <w:pStyle w:val="BodyText"/>
       </w:pPr>
       <w:r>
-        <w:t xml:space="preserve">As a family deciding on where to send their child, they can decide based on how the school performs overall, or where their child is most likely to succeed. These do not always lead to the same answer. The latter means looking beyond the structural causes of attainment, and understanding how a school performs</w:t>
-      </w:r>
-      <w:r>
-        <w:t xml:space="preserve"> </w:t>
-      </w:r>
-      <w:r>
-        <w:rPr>
-          <w:i/>
-          <w:iCs/>
-        </w:rPr>
-        <w:t xml:space="preserve">beyond</w:t>
-      </w:r>
-      <w:r>
-        <w:t xml:space="preserve"> </w:t>
-      </w:r>
-      <w:r>
-        <w:t xml:space="preserve">the influence of those factors. In Brighton and Hove, one of the outcomes that emerged from the vocal public debate, was a considerable number of parents from the BACA catchment opting to send their children to Patcham School (in the neighbouring catchment — see</w:t>
+        <w:t xml:space="preserve">As a family deciding on where to send their child, they can decide based on how the school performs overall, or where a school increases attainment beyond the structural disadvantage faced by their pupils (over which they have little control). These do not always lead to the same answer. In Brighton and Hove, one of the outcomes that emerged from the vocal public debate, was a considerable number of parents from the BACA catchment opting to send their children to Patcham School (in the neighbouring catchment — see</w:t>
       </w:r>
       <w:r>
         <w:t xml:space="preserve"> </w:t>
@@ -7150,7 +7485,7 @@
         <w:pStyle w:val="BodyText"/>
       </w:pPr>
       <w:r>
-        <w:t xml:space="preserve">As the league tables in</w:t>
+        <w:t xml:space="preserve">These are, of course, school-level observations and difficult to translate into predictions about whether Pupil A will be better-off attending school X or school Y, but they do correspond to an average expected situation. As the league tables in</w:t>
       </w:r>
       <w:r>
         <w:t xml:space="preserve"> </w:t>
@@ -7181,7 +7516,7 @@
         <w:t xml:space="preserve"> </w:t>
       </w:r>
       <w:r>
-        <w:t xml:space="preserve">in above reveal, in 2024-25, a disadvantaged pupil attending the less popular BACA and taking their GSCEs would have, on average, left that school with GCSEs 5-points higher than if they’d attended a similar school with a similar profile elsewhere in England. Over the last 4 years, this would have averaged around 3 points higher. This is a boost way in excess of the fraction of a point differences that might be expected from altering the disadvantage mix in schools. BACA is doing incredibly well for its disadvantaged students and indeed out-performs every other school in the city by some margin — even those which in the popular imagination are viewed as the</w:t>
+        <w:t xml:space="preserve">in above reveal, in 2024-25, a disadvantaged pupil attending BACA and taking their GSCEs would have, on average, left that school with GCSEs 5-points higher than if they’d attended a similar school with a similar profile elsewhere in England. Over the last 4 years, this would have averaged around 3 points higher. This is a boost way in excess of the fraction of a point differences that might be expected from altering the disadvantage mix in schools. BACA is doing incredibly well for its disadvantaged students and indeed out-performs every other school in the city by some margin — even those which in the popular imagination are viewed as the</w:t>
       </w:r>
       <w:r>
         <w:t xml:space="preserve"> </w:t>
@@ -7211,7 +7546,7 @@
         <w:rPr>
           <w:rStyle w:val="FootnoteReference"/>
         </w:rPr>
-        <w:footnoteReference w:id="84"/>
+        <w:footnoteReference w:id="92"/>
       </w:r>
       <w:r>
         <w:t xml:space="preserve"> </w:t>
@@ -7225,7 +7560,31 @@
         <w:pStyle w:val="BodyText"/>
       </w:pPr>
       <w:r>
-        <w:t xml:space="preserve">If we contrast BACA — the school popular narrative discouraged parents from sending their children to — with Patcham — the school many from BACA catchment in the end opted for, the differences on this alternative league table are stark. Disadvantaged pupils attending Patcham on average over the last 4 years and compared to other disadvantaged pupils attending schools with similar profiles elsewhere in England, would leave with around 2.6 GCSE points fewer than they might be expected to compared to similar schools elsewhere in England. In 2023-24, the difference was in double figures. These differences have been hidden from view amongst the comfortable mid-table position, in raw attainment terms, the school has enjoyed. There might be many reasons why parents would want to opt for Patcham High School over BACA, but the nuance afforded to the effectiveness of these schools by the modelling in this paper might have provided an alternative view that could have made some of parents from BACA catchment who opted to send their children to Patcham, make a different decision.</w:t>
+        <w:t xml:space="preserve">If we contrast BACA — the school popular narrative discouraged parents from sending their children to — with Patcham — the school many from BACA catchment in the end opted for, the differences on this alternative league table are stark. Disadvantaged pupils attending Patcham on average over the last 4 years and compared to other disadvantaged pupils attending schools with similar profiles elsewhere in England, would leave with around 2.6 GCSE points fewer than they might be expected to compared to similar schools elsewhere in England. In 2023-24, the difference was in double figures. These differences have been hidden from view amongst the comfortable mid-table position, in raw attainment terms, the school has enjoyed. There might be many reasons why parents would want to opt for Patcham High School over BACA - some may reasonably ask why it would be better to send a child to a school doing well</w:t>
+      </w:r>
+      <w:r>
+        <w:t xml:space="preserve"> </w:t>
+      </w:r>
+      <w:r>
+        <w:t xml:space="preserve">“considering”</w:t>
+      </w:r>
+      <w:r>
+        <w:t xml:space="preserve"> </w:t>
+      </w:r>
+      <w:r>
+        <w:t xml:space="preserve">vs doing well in raw terms? The answer is that at the school-level, those statistics reflect ALL children (including all of those who, for example, missed a lot of school and consequently did poorly in their exams). The</w:t>
+      </w:r>
+      <w:r>
+        <w:t xml:space="preserve"> </w:t>
+      </w:r>
+      <w:r>
+        <w:t xml:space="preserve">“considering”</w:t>
+      </w:r>
+      <w:r>
+        <w:t xml:space="preserve"> </w:t>
+      </w:r>
+      <w:r>
+        <w:t xml:space="preserve">element of this analysis and the nuance nuance it affords to the effectiveness of these schools by showing the value added in the face of (in our example) high levels of absence, reveals the underlying positive features of the school that will benefit all pupils. The modelling in this paper helps provide this alternative view that might have made some of parents from BACA catchment who opted to send their children to Patcham, make a different decision.</w:t>
       </w:r>
     </w:p>
     <w:p>
@@ -7236,8 +7595,8 @@
         <w:t xml:space="preserve">One thing other schools in the city certainly could learn from Patcham High School is in how to improve attendance rates. The school is one of only two in the city with attendance better than the national average. This is an actionable policy lever at the school-level. Without a deeper dive into attendance issues at the different schools in the city, it’s impossible to know what the drivers of this issue are. But given we now know where the real problems in Brighton and Hove lie at the LEA level, one useful policy focus at the city level could well be exploring how schools like Patcham are able to keep attendance relatively high, while then allowing more school-level investigations into where under-performance might be occurring given our new knowledge of interacting structural drivers within the city.</w:t>
       </w:r>
     </w:p>
-    <w:bookmarkEnd w:id="86"/>
-    <w:bookmarkStart w:id="87" w:name="X40b1884cedc541d2941047d67c0b6e8ce71c267"/>
+    <w:bookmarkEnd w:id="94"/>
+    <w:bookmarkStart w:id="95" w:name="X40b1884cedc541d2941047d67c0b6e8ce71c267"/>
     <w:p>
       <w:pPr>
         <w:pStyle w:val="Heading2"/>
@@ -7262,8 +7621,8 @@
         <w:t xml:space="preserve">Following widespread opposition and appeals to the Schools Adjudicator, the proposed PAN reductions were rejected and the 20% out-of-catchment priority was reduced to 5%. While displacement was minimised, the policy reverberations continued through the choices expressed by parents already influenced by the preceding debate.</w:t>
       </w:r>
     </w:p>
-    <w:bookmarkEnd w:id="87"/>
-    <w:bookmarkStart w:id="89" w:name="the-cost-of-speed-over-evidence"/>
+    <w:bookmarkEnd w:id="95"/>
+    <w:bookmarkStart w:id="97" w:name="the-cost-of-speed-over-evidence"/>
     <w:p>
       <w:pPr>
         <w:pStyle w:val="Heading2"/>
@@ -7280,7 +7639,7 @@
         <w:t xml:space="preserve">The institutional context deserves reflection. The shift to a Leader and Cabinet system concentrated decision-making power and enabled policy to be enacted through a whipped voting system. The consultation was compressed in timeline and limited in scope for deliberative engagement. This matters because the evidence base for school attainment is complex — the factors are multiple, interacting, non-linear and context-dependent. Institutional structures that compress deliberation timelines are particularly dangerous when the evidence requires careful handling and its implications are counterintuitive. Had the analysis presented here been available at the outset, the quality of public scrutiny would have been substantially higher, even if the political outcome had remained the same.</w:t>
       </w:r>
     </w:p>
-    <w:bookmarkStart w:id="88" w:name="X6c85e6b131c00160602066b25667ec048f9fb77"/>
+    <w:bookmarkStart w:id="96" w:name="X6c85e6b131c00160602066b25667ec048f9fb77"/>
     <w:p>
       <w:pPr>
         <w:pStyle w:val="Heading3"/>
@@ -7294,7 +7653,7 @@
         <w:pStyle w:val="FirstParagraph"/>
       </w:pPr>
       <w:r>
-        <w:t xml:space="preserve">The LEA random effect for Brighton and Hove is large and statistically significant across all three attainment groups. After accounting for the structural factors in the model — disadvantage, absence, prior attainment, workforce characteristics, selectivity and segregation — schools in the city consistently outperform what the national picture would predict. For disadvantaged pupils, the city ranks 7th; for non-disadvantaged pupils, 5th; for all pupils, 4th in England.</w:t>
+        <w:t xml:space="preserve">The LEA random effect for Brighton and Hove is large and statistically significant across all three attainment groups. After accounting for the structural (disadvantage, absence, prior attainment) or school management and governance (workforce characteristics, staff retention) factors in the model - schools in the city consistently outperform what the national picture would predict. For disadvantaged pupils, the city ranks 7th; for non-disadvantaged pupils, 5th; for all pupils, 4th in England.</w:t>
       </w:r>
     </w:p>
     <w:p>
@@ -7313,9 +7672,9 @@
         <w:t xml:space="preserve">The honest answer is that we do not yet know what produces this LEA effect. The random effect, by definition, captures variance that the fixed-effect predictors do not explain. It could reflect high levels of parental engagement and aspiration — Brighton and Hove has a well-educated population with a strong civic culture. It could relate to the quality of school leadership and governance across the city, or to effective local authority support services and school improvement programmes. It could be something about the collaborative relationships between schools, or community factors that are difficult to quantify. Identifying the sources of this over-performance is an important research question in its own right, and one that could require additional qualitative investigation or access to pupil-level data that goes beyond what is publicly available. What is clear, however, is that policy interventions which risk disrupting a well-functioning system without understanding what makes it function well carry substantial downside risk.</w:t>
       </w:r>
     </w:p>
-    <w:bookmarkEnd w:id="88"/>
-    <w:bookmarkEnd w:id="89"/>
-    <w:bookmarkStart w:id="92" w:name="implications-for-national-policy"/>
+    <w:bookmarkEnd w:id="96"/>
+    <w:bookmarkEnd w:id="97"/>
+    <w:bookmarkStart w:id="100" w:name="implications-for-national-policy"/>
     <w:p>
       <w:pPr>
         <w:pStyle w:val="Heading2"/>
@@ -7355,7 +7714,7 @@
         <w:rPr>
           <w:rStyle w:val="FootnoteReference"/>
         </w:rPr>
-        <w:footnoteReference w:id="90"/>
+        <w:footnoteReference w:id="98"/>
       </w:r>
       <w:r>
         <w:t xml:space="preserve"> </w:t>
@@ -7364,8 +7723,8 @@
         <w:t xml:space="preserve">underpinned by the models in this paper, to begin bridging that gap. The tool allows users to explore any school in England, compare against contextual expectations, and model the indicative impact of changes to key variables.</w:t>
       </w:r>
     </w:p>
-    <w:bookmarkEnd w:id="92"/>
-    <w:bookmarkStart w:id="93" w:name="limitations"/>
+    <w:bookmarkEnd w:id="100"/>
+    <w:bookmarkStart w:id="101" w:name="limitations"/>
     <w:p>
       <w:pPr>
         <w:pStyle w:val="Heading2"/>
@@ -7382,9 +7741,9 @@
         <w:t xml:space="preserve">These are school-level models built from aggregate published data, not pupil-level analyses. The associations identified are not experimental causal estimates but the best approximations available from observational data. The models cannot capture unmeasured factors such as school culture, parental engagement, or individual pupil resilience. The Policy Simulator translates associations into indicative, not definitive, projections. We do not claim that reducing absence by a given amount will mechanically produce the predicted gain — the real world is more complex than any model captures. What we do claim is that these models are accurate enough, and the patterns consistent enough across years and specifications, to substantially improve the quality of the conversation around what matters most.</w:t>
       </w:r>
     </w:p>
-    <w:bookmarkEnd w:id="93"/>
-    <w:bookmarkEnd w:id="94"/>
-    <w:bookmarkStart w:id="95" w:name="conclusion"/>
+    <w:bookmarkEnd w:id="101"/>
+    <w:bookmarkEnd w:id="102"/>
+    <w:bookmarkStart w:id="103" w:name="conclusion"/>
     <w:p>
       <w:pPr>
         <w:pStyle w:val="Heading1"/>
@@ -7433,8 +7792,8 @@
         <w:t xml:space="preserve">decisions are made — not after. The raw materials already exist. What is needed is the analytical capacity and institutional willingness to use them.</w:t>
       </w:r>
     </w:p>
-    <w:bookmarkEnd w:id="95"/>
-    <w:bookmarkStart w:id="96" w:name="credit-authorship-contribution-statement"/>
+    <w:bookmarkEnd w:id="103"/>
+    <w:bookmarkStart w:id="104" w:name="credit-authorship-contribution-statement"/>
     <w:p>
       <w:pPr>
         <w:pStyle w:val="Heading1"/>
@@ -7477,8 +7836,8 @@
         <w:t xml:space="preserve">Methodology – refining and review; Writing – review &amp; editing.</w:t>
       </w:r>
     </w:p>
-    <w:bookmarkEnd w:id="96"/>
-    <w:bookmarkStart w:id="97" w:name="declaration-of-generative-ai-use"/>
+    <w:bookmarkEnd w:id="104"/>
+    <w:bookmarkStart w:id="105" w:name="declaration-of-generative-ai-use"/>
     <w:p>
       <w:pPr>
         <w:pStyle w:val="Heading1"/>
@@ -7495,8 +7854,8 @@
         <w:t xml:space="preserve">The authors used Anthropic’s Claude Code (Claude Opus 4.6) to assist with the development of R data-processing pipelines, the implementation of multilevel model fitting and visualisation code, the formatting of tables and bibliography entries, and the rendering and deployment of Quarto outputs. Any analytical decisions and interpretations during the iterative analytical process were reviewed, verified and approved by the authors, who take full responsibility for the work.</w:t>
       </w:r>
     </w:p>
-    <w:bookmarkEnd w:id="97"/>
-    <w:bookmarkStart w:id="98" w:name="acknowledgements"/>
+    <w:bookmarkEnd w:id="105"/>
+    <w:bookmarkStart w:id="106" w:name="acknowledgements"/>
     <w:p>
       <w:pPr>
         <w:pStyle w:val="Heading1"/>
@@ -7522,8 +7881,8 @@
         <w:t xml:space="preserve">. The range of perspectives and breadth of expertise within this group has been inspirational.</w:t>
       </w:r>
     </w:p>
-    <w:bookmarkEnd w:id="98"/>
-    <w:bookmarkStart w:id="99" w:name="declaration-of-interest"/>
+    <w:bookmarkEnd w:id="106"/>
+    <w:bookmarkStart w:id="107" w:name="declaration-of-interest"/>
     <w:p>
       <w:pPr>
         <w:pStyle w:val="Heading1"/>
@@ -7540,8 +7899,8 @@
         <w:t xml:space="preserve">The authors are residents of Brighton and Hove with lived experience of the effects of the admissions policy process described. Some authors are involved in local school governance. No financial conflicts of interest exist.</w:t>
       </w:r>
     </w:p>
-    <w:bookmarkEnd w:id="99"/>
-    <w:bookmarkStart w:id="186" w:name="references"/>
+    <w:bookmarkEnd w:id="107"/>
+    <w:bookmarkStart w:id="194" w:name="references"/>
     <w:p>
       <w:pPr>
         <w:pStyle w:val="Heading1"/>
@@ -7550,8 +7909,8 @@
         <w:t xml:space="preserve">References</w:t>
       </w:r>
     </w:p>
-    <w:bookmarkStart w:id="185" w:name="refs"/>
-    <w:bookmarkStart w:id="101" w:name="ref-Allen2018"/>
+    <w:bookmarkStart w:id="193" w:name="refs"/>
+    <w:bookmarkStart w:id="109" w:name="ref-Allen2018"/>
     <w:p>
       <w:pPr>
         <w:pStyle w:val="Bibliography"/>
@@ -7593,7 +7952,7 @@
       <w:r>
         <w:t xml:space="preserve"> </w:t>
       </w:r>
-      <w:hyperlink r:id="rId100">
+      <w:hyperlink r:id="rId108">
         <w:r>
           <w:rPr>
             <w:rStyle w:val="Hyperlink"/>
@@ -7605,8 +7964,8 @@
         <w:t xml:space="preserve">.</w:t>
       </w:r>
     </w:p>
-    <w:bookmarkEnd w:id="101"/>
-    <w:bookmarkStart w:id="103" w:name="ref-Allen2013"/>
+    <w:bookmarkEnd w:id="109"/>
+    <w:bookmarkStart w:id="111" w:name="ref-Allen2013"/>
     <w:p>
       <w:pPr>
         <w:pStyle w:val="Bibliography"/>
@@ -7660,7 +8019,7 @@
       <w:r>
         <w:t xml:space="preserve"> </w:t>
       </w:r>
-      <w:hyperlink r:id="rId102">
+      <w:hyperlink r:id="rId110">
         <w:r>
           <w:rPr>
             <w:rStyle w:val="Hyperlink"/>
@@ -7672,8 +8031,8 @@
         <w:t xml:space="preserve">.</w:t>
       </w:r>
     </w:p>
-    <w:bookmarkEnd w:id="103"/>
-    <w:bookmarkStart w:id="105" w:name="ref-Anders2024"/>
+    <w:bookmarkEnd w:id="111"/>
+    <w:bookmarkStart w:id="113" w:name="ref-Anders2024"/>
     <w:p>
       <w:pPr>
         <w:pStyle w:val="Bibliography"/>
@@ -7727,7 +8086,7 @@
       <w:r>
         <w:t xml:space="preserve"> </w:t>
       </w:r>
-      <w:hyperlink r:id="rId104">
+      <w:hyperlink r:id="rId112">
         <w:r>
           <w:rPr>
             <w:rStyle w:val="Hyperlink"/>
@@ -7739,8 +8098,8 @@
         <w:t xml:space="preserve">.</w:t>
       </w:r>
     </w:p>
-    <w:bookmarkEnd w:id="105"/>
-    <w:bookmarkStart w:id="107" w:name="ref-Blagg2018"/>
+    <w:bookmarkEnd w:id="113"/>
+    <w:bookmarkStart w:id="115" w:name="ref-Blagg2018"/>
     <w:p>
       <w:pPr>
         <w:pStyle w:val="Bibliography"/>
@@ -7932,7 +8291,7 @@
       <w:r>
         <w:t xml:space="preserve"> </w:t>
       </w:r>
-      <w:hyperlink r:id="rId106">
+      <w:hyperlink r:id="rId114">
         <w:r>
           <w:rPr>
             <w:rStyle w:val="Hyperlink"/>
@@ -7944,8 +8303,8 @@
         <w:t xml:space="preserve">.</w:t>
       </w:r>
     </w:p>
-    <w:bookmarkEnd w:id="107"/>
-    <w:bookmarkStart w:id="109" w:name="ref-Burgess2018"/>
+    <w:bookmarkEnd w:id="115"/>
+    <w:bookmarkStart w:id="117" w:name="ref-Burgess2018"/>
     <w:p>
       <w:pPr>
         <w:pStyle w:val="Bibliography"/>
@@ -7978,7 +8337,7 @@
       <w:r>
         <w:t xml:space="preserve"> </w:t>
       </w:r>
-      <w:hyperlink r:id="rId108">
+      <w:hyperlink r:id="rId116">
         <w:r>
           <w:rPr>
             <w:rStyle w:val="Hyperlink"/>
@@ -7990,8 +8349,8 @@
         <w:t xml:space="preserve">.</w:t>
       </w:r>
     </w:p>
-    <w:bookmarkEnd w:id="109"/>
-    <w:bookmarkStart w:id="111" w:name="ref-Burgess2023"/>
+    <w:bookmarkEnd w:id="117"/>
+    <w:bookmarkStart w:id="119" w:name="ref-Burgess2023"/>
     <w:p>
       <w:pPr>
         <w:pStyle w:val="Bibliography"/>
@@ -8024,7 +8383,7 @@
       <w:r>
         <w:t xml:space="preserve"> </w:t>
       </w:r>
-      <w:hyperlink r:id="rId110">
+      <w:hyperlink r:id="rId118">
         <w:r>
           <w:rPr>
             <w:rStyle w:val="Hyperlink"/>
@@ -8036,8 +8395,8 @@
         <w:t xml:space="preserve">.</w:t>
       </w:r>
     </w:p>
-    <w:bookmarkEnd w:id="111"/>
-    <w:bookmarkStart w:id="113" w:name="ref-Burgess2022"/>
+    <w:bookmarkEnd w:id="119"/>
+    <w:bookmarkStart w:id="121" w:name="ref-Burgess2022"/>
     <w:p>
       <w:pPr>
         <w:pStyle w:val="Bibliography"/>
@@ -8061,7 +8420,7 @@
       <w:r>
         <w:t xml:space="preserve"> </w:t>
       </w:r>
-      <w:hyperlink r:id="rId112">
+      <w:hyperlink r:id="rId120">
         <w:r>
           <w:rPr>
             <w:rStyle w:val="Hyperlink"/>
@@ -8073,8 +8432,8 @@
         <w:t xml:space="preserve">.</w:t>
       </w:r>
     </w:p>
-    <w:bookmarkEnd w:id="113"/>
-    <w:bookmarkStart w:id="115" w:name="ref-Chairassamee2024"/>
+    <w:bookmarkEnd w:id="121"/>
+    <w:bookmarkStart w:id="123" w:name="ref-Chairassamee2024"/>
     <w:p>
       <w:pPr>
         <w:pStyle w:val="Bibliography"/>
@@ -8107,7 +8466,7 @@
       <w:r>
         <w:t xml:space="preserve"> </w:t>
       </w:r>
-      <w:hyperlink r:id="rId114">
+      <w:hyperlink r:id="rId122">
         <w:r>
           <w:rPr>
             <w:rStyle w:val="Hyperlink"/>
@@ -8119,8 +8478,8 @@
         <w:t xml:space="preserve">.</w:t>
       </w:r>
     </w:p>
-    <w:bookmarkEnd w:id="115"/>
-    <w:bookmarkStart w:id="117" w:name="ref-HouseofCommons2021"/>
+    <w:bookmarkEnd w:id="123"/>
+    <w:bookmarkStart w:id="125" w:name="ref-HouseofCommons2021"/>
     <w:p>
       <w:pPr>
         <w:pStyle w:val="Bibliography"/>
@@ -8270,7 +8629,7 @@
       <w:r>
         <w:t xml:space="preserve"> </w:t>
       </w:r>
-      <w:hyperlink r:id="rId116">
+      <w:hyperlink r:id="rId124">
         <w:r>
           <w:rPr>
             <w:rStyle w:val="Hyperlink"/>
@@ -8282,8 +8641,8 @@
         <w:t xml:space="preserve">.</w:t>
       </w:r>
     </w:p>
-    <w:bookmarkEnd w:id="117"/>
-    <w:bookmarkStart w:id="119" w:name="ref-Cordes2022"/>
+    <w:bookmarkEnd w:id="125"/>
+    <w:bookmarkStart w:id="127" w:name="ref-Cordes2022"/>
     <w:p>
       <w:pPr>
         <w:pStyle w:val="Bibliography"/>
@@ -8316,7 +8675,7 @@
       <w:r>
         <w:t xml:space="preserve"> </w:t>
       </w:r>
-      <w:hyperlink r:id="rId118">
+      <w:hyperlink r:id="rId126">
         <w:r>
           <w:rPr>
             <w:rStyle w:val="Hyperlink"/>
@@ -8328,8 +8687,8 @@
         <w:t xml:space="preserve">.</w:t>
       </w:r>
     </w:p>
-    <w:bookmarkEnd w:id="119"/>
-    <w:bookmarkStart w:id="121" w:name="ref-DfE2022"/>
+    <w:bookmarkEnd w:id="127"/>
+    <w:bookmarkStart w:id="129" w:name="ref-DfE2022"/>
     <w:p>
       <w:pPr>
         <w:pStyle w:val="Bibliography"/>
@@ -8430,7 +8789,7 @@
       <w:r>
         <w:t xml:space="preserve"> </w:t>
       </w:r>
-      <w:hyperlink r:id="rId120">
+      <w:hyperlink r:id="rId128">
         <w:r>
           <w:rPr>
             <w:rStyle w:val="Hyperlink"/>
@@ -8442,8 +8801,8 @@
         <w:t xml:space="preserve">.</w:t>
       </w:r>
     </w:p>
-    <w:bookmarkEnd w:id="121"/>
-    <w:bookmarkStart w:id="123" w:name="ref-DfE2025a"/>
+    <w:bookmarkEnd w:id="129"/>
+    <w:bookmarkStart w:id="131" w:name="ref-DfE2025a"/>
     <w:p>
       <w:pPr>
         <w:pStyle w:val="Bibliography"/>
@@ -8467,7 +8826,7 @@
       <w:r>
         <w:t xml:space="preserve"> </w:t>
       </w:r>
-      <w:hyperlink r:id="rId122">
+      <w:hyperlink r:id="rId130">
         <w:r>
           <w:rPr>
             <w:rStyle w:val="Hyperlink"/>
@@ -8479,8 +8838,8 @@
         <w:t xml:space="preserve">.</w:t>
       </w:r>
     </w:p>
-    <w:bookmarkEnd w:id="123"/>
-    <w:bookmarkStart w:id="125" w:name="ref-DfE2025b"/>
+    <w:bookmarkEnd w:id="131"/>
+    <w:bookmarkStart w:id="133" w:name="ref-DfE2025b"/>
     <w:p>
       <w:pPr>
         <w:pStyle w:val="Bibliography"/>
@@ -8553,7 +8912,7 @@
       <w:r>
         <w:t xml:space="preserve"> </w:t>
       </w:r>
-      <w:hyperlink r:id="rId124">
+      <w:hyperlink r:id="rId132">
         <w:r>
           <w:rPr>
             <w:rStyle w:val="Hyperlink"/>
@@ -8565,8 +8924,8 @@
         <w:t xml:space="preserve">.</w:t>
       </w:r>
     </w:p>
-    <w:bookmarkEnd w:id="125"/>
-    <w:bookmarkStart w:id="127" w:name="ref-dfe_every_2026"/>
+    <w:bookmarkEnd w:id="133"/>
+    <w:bookmarkStart w:id="135" w:name="ref-dfe_every_2026"/>
     <w:p>
       <w:pPr>
         <w:pStyle w:val="Bibliography"/>
@@ -8590,7 +8949,7 @@
       <w:r>
         <w:t xml:space="preserve"> </w:t>
       </w:r>
-      <w:hyperlink r:id="rId126">
+      <w:hyperlink r:id="rId134">
         <w:r>
           <w:rPr>
             <w:rStyle w:val="Hyperlink"/>
@@ -8602,8 +8961,8 @@
         <w:t xml:space="preserve">.</w:t>
       </w:r>
     </w:p>
-    <w:bookmarkEnd w:id="127"/>
-    <w:bookmarkStart w:id="129" w:name="ref-Ding2023"/>
+    <w:bookmarkEnd w:id="135"/>
+    <w:bookmarkStart w:id="137" w:name="ref-Ding2023"/>
     <w:p>
       <w:pPr>
         <w:pStyle w:val="Bibliography"/>
@@ -8657,7 +9016,7 @@
       <w:r>
         <w:t xml:space="preserve"> </w:t>
       </w:r>
-      <w:hyperlink r:id="rId128">
+      <w:hyperlink r:id="rId136">
         <w:r>
           <w:rPr>
             <w:rStyle w:val="Hyperlink"/>
@@ -8669,8 +9028,8 @@
         <w:t xml:space="preserve">.</w:t>
       </w:r>
     </w:p>
-    <w:bookmarkEnd w:id="129"/>
-    <w:bookmarkStart w:id="131" w:name="ref-Drager2024"/>
+    <w:bookmarkEnd w:id="137"/>
+    <w:bookmarkStart w:id="139" w:name="ref-Drager2024"/>
     <w:p>
       <w:pPr>
         <w:pStyle w:val="Bibliography"/>
@@ -8703,7 +9062,7 @@
       <w:r>
         <w:t xml:space="preserve"> </w:t>
       </w:r>
-      <w:hyperlink r:id="rId130">
+      <w:hyperlink r:id="rId138">
         <w:r>
           <w:rPr>
             <w:rStyle w:val="Hyperlink"/>
@@ -8715,8 +9074,8 @@
         <w:t xml:space="preserve">.</w:t>
       </w:r>
     </w:p>
-    <w:bookmarkEnd w:id="131"/>
-    <w:bookmarkStart w:id="133" w:name="ref-Farquharson2024"/>
+    <w:bookmarkEnd w:id="139"/>
+    <w:bookmarkStart w:id="141" w:name="ref-Farquharson2024"/>
     <w:p>
       <w:pPr>
         <w:pStyle w:val="Bibliography"/>
@@ -8749,7 +9108,7 @@
       <w:r>
         <w:t xml:space="preserve"> </w:t>
       </w:r>
-      <w:hyperlink r:id="rId132">
+      <w:hyperlink r:id="rId140">
         <w:r>
           <w:rPr>
             <w:rStyle w:val="Hyperlink"/>
@@ -8761,8 +9120,8 @@
         <w:t xml:space="preserve">.</w:t>
       </w:r>
     </w:p>
-    <w:bookmarkEnd w:id="133"/>
-    <w:bookmarkStart w:id="135" w:name="ref-Faulkner2013"/>
+    <w:bookmarkEnd w:id="141"/>
+    <w:bookmarkStart w:id="143" w:name="ref-Faulkner2013"/>
     <w:p>
       <w:pPr>
         <w:pStyle w:val="Bibliography"/>
@@ -8795,7 +9154,7 @@
       <w:r>
         <w:t xml:space="preserve"> </w:t>
       </w:r>
-      <w:hyperlink r:id="rId134">
+      <w:hyperlink r:id="rId142">
         <w:r>
           <w:rPr>
             <w:rStyle w:val="Hyperlink"/>
@@ -8807,8 +9166,8 @@
         <w:t xml:space="preserve">.</w:t>
       </w:r>
     </w:p>
-    <w:bookmarkEnd w:id="135"/>
-    <w:bookmarkStart w:id="137" w:name="ref-Fredriksen2004"/>
+    <w:bookmarkEnd w:id="143"/>
+    <w:bookmarkStart w:id="145" w:name="ref-Fredriksen2004"/>
     <w:p>
       <w:pPr>
         <w:pStyle w:val="Bibliography"/>
@@ -8850,7 +9209,7 @@
       <w:r>
         <w:t xml:space="preserve"> </w:t>
       </w:r>
-      <w:hyperlink r:id="rId136">
+      <w:hyperlink r:id="rId144">
         <w:r>
           <w:rPr>
             <w:rStyle w:val="Hyperlink"/>
@@ -8862,8 +9221,8 @@
         <w:t xml:space="preserve">.</w:t>
       </w:r>
     </w:p>
-    <w:bookmarkEnd w:id="137"/>
-    <w:bookmarkStart w:id="139" w:name="ref-Gibbons2018"/>
+    <w:bookmarkEnd w:id="145"/>
+    <w:bookmarkStart w:id="147" w:name="ref-Gibbons2018"/>
     <w:p>
       <w:pPr>
         <w:pStyle w:val="Bibliography"/>
@@ -8887,7 +9246,7 @@
       <w:r>
         <w:t xml:space="preserve"> </w:t>
       </w:r>
-      <w:hyperlink r:id="rId138">
+      <w:hyperlink r:id="rId146">
         <w:r>
           <w:rPr>
             <w:rStyle w:val="Hyperlink"/>
@@ -8899,8 +9258,8 @@
         <w:t xml:space="preserve">.</w:t>
       </w:r>
     </w:p>
-    <w:bookmarkEnd w:id="139"/>
-    <w:bookmarkStart w:id="141" w:name="ref-Gillborn2017"/>
+    <w:bookmarkEnd w:id="147"/>
+    <w:bookmarkStart w:id="149" w:name="ref-Gillborn2017"/>
     <w:p>
       <w:pPr>
         <w:pStyle w:val="Bibliography"/>
@@ -8963,7 +9322,7 @@
       <w:r>
         <w:t xml:space="preserve"> </w:t>
       </w:r>
-      <w:hyperlink r:id="rId140">
+      <w:hyperlink r:id="rId148">
         <w:r>
           <w:rPr>
             <w:rStyle w:val="Hyperlink"/>
@@ -8975,8 +9334,8 @@
         <w:t xml:space="preserve">.</w:t>
       </w:r>
     </w:p>
-    <w:bookmarkEnd w:id="141"/>
-    <w:bookmarkStart w:id="143" w:name="ref-gorard_how_2019"/>
+    <w:bookmarkEnd w:id="149"/>
+    <w:bookmarkStart w:id="151" w:name="ref-gorard_how_2019"/>
     <w:p>
       <w:pPr>
         <w:pStyle w:val="Bibliography"/>
@@ -9054,7 +9413,7 @@
       <w:r>
         <w:t xml:space="preserve"> </w:t>
       </w:r>
-      <w:hyperlink r:id="rId142">
+      <w:hyperlink r:id="rId150">
         <w:r>
           <w:rPr>
             <w:rStyle w:val="Hyperlink"/>
@@ -9066,8 +9425,8 @@
         <w:t xml:space="preserve">.</w:t>
       </w:r>
     </w:p>
-    <w:bookmarkEnd w:id="143"/>
-    <w:bookmarkStart w:id="145" w:name="ref-gorard_school_2025"/>
+    <w:bookmarkEnd w:id="151"/>
+    <w:bookmarkStart w:id="153" w:name="ref-gorard_school_2025"/>
     <w:p>
       <w:pPr>
         <w:pStyle w:val="Bibliography"/>
@@ -9220,7 +9579,7 @@
       <w:r>
         <w:t xml:space="preserve"> </w:t>
       </w:r>
-      <w:hyperlink r:id="rId144">
+      <w:hyperlink r:id="rId152">
         <w:r>
           <w:rPr>
             <w:rStyle w:val="Hyperlink"/>
@@ -9232,8 +9591,8 @@
         <w:t xml:space="preserve">.</w:t>
       </w:r>
     </w:p>
-    <w:bookmarkEnd w:id="145"/>
-    <w:bookmarkStart w:id="147" w:name="ref-Grant2017"/>
+    <w:bookmarkEnd w:id="153"/>
+    <w:bookmarkStart w:id="155" w:name="ref-Grant2017"/>
     <w:p>
       <w:pPr>
         <w:pStyle w:val="Bibliography"/>
@@ -9341,7 +9700,7 @@
       <w:r>
         <w:t xml:space="preserve"> </w:t>
       </w:r>
-      <w:hyperlink r:id="rId146">
+      <w:hyperlink r:id="rId154">
         <w:r>
           <w:rPr>
             <w:rStyle w:val="Hyperlink"/>
@@ -9353,8 +9712,8 @@
         <w:t xml:space="preserve">.</w:t>
       </w:r>
     </w:p>
-    <w:bookmarkEnd w:id="147"/>
-    <w:bookmarkStart w:id="149" w:name="ref-Guan2025"/>
+    <w:bookmarkEnd w:id="155"/>
+    <w:bookmarkStart w:id="157" w:name="ref-Guan2025"/>
     <w:p>
       <w:pPr>
         <w:pStyle w:val="Bibliography"/>
@@ -9396,7 +9755,7 @@
       <w:r>
         <w:t xml:space="preserve"> </w:t>
       </w:r>
-      <w:hyperlink r:id="rId148">
+      <w:hyperlink r:id="rId156">
         <w:r>
           <w:rPr>
             <w:rStyle w:val="Hyperlink"/>
@@ -9408,8 +9767,8 @@
         <w:t xml:space="preserve">.</w:t>
       </w:r>
     </w:p>
-    <w:bookmarkEnd w:id="149"/>
-    <w:bookmarkStart w:id="151" w:name="ref-Karan2021"/>
+    <w:bookmarkEnd w:id="157"/>
+    <w:bookmarkStart w:id="159" w:name="ref-Karan2021"/>
     <w:p>
       <w:pPr>
         <w:pStyle w:val="Bibliography"/>
@@ -9454,7 +9813,7 @@
       <w:r>
         <w:t xml:space="preserve"> </w:t>
       </w:r>
-      <w:hyperlink r:id="rId150">
+      <w:hyperlink r:id="rId158">
         <w:r>
           <w:rPr>
             <w:rStyle w:val="Hyperlink"/>
@@ -9466,8 +9825,8 @@
         <w:t xml:space="preserve">.</w:t>
       </w:r>
     </w:p>
-    <w:bookmarkEnd w:id="151"/>
-    <w:bookmarkStart w:id="153" w:name="ref-macleod_supporting_2015"/>
+    <w:bookmarkEnd w:id="159"/>
+    <w:bookmarkStart w:id="161" w:name="ref-macleod_supporting_2015"/>
     <w:p>
       <w:pPr>
         <w:pStyle w:val="Bibliography"/>
@@ -9624,7 +9983,7 @@
       <w:r>
         <w:t xml:space="preserve"> </w:t>
       </w:r>
-      <w:hyperlink r:id="rId152">
+      <w:hyperlink r:id="rId160">
         <w:r>
           <w:rPr>
             <w:rStyle w:val="Hyperlink"/>
@@ -9636,8 +9995,8 @@
         <w:t xml:space="preserve">.</w:t>
       </w:r>
     </w:p>
-    <w:bookmarkEnd w:id="153"/>
-    <w:bookmarkStart w:id="155" w:name="ref-Menzies2023"/>
+    <w:bookmarkEnd w:id="161"/>
+    <w:bookmarkStart w:id="163" w:name="ref-Menzies2023"/>
     <w:p>
       <w:pPr>
         <w:pStyle w:val="Bibliography"/>
@@ -9670,7 +10029,7 @@
       <w:r>
         <w:t xml:space="preserve"> </w:t>
       </w:r>
-      <w:hyperlink r:id="rId154">
+      <w:hyperlink r:id="rId162">
         <w:r>
           <w:rPr>
             <w:rStyle w:val="Hyperlink"/>
@@ -9682,8 +10041,8 @@
         <w:t xml:space="preserve">.</w:t>
       </w:r>
     </w:p>
-    <w:bookmarkEnd w:id="155"/>
-    <w:bookmarkStart w:id="157" w:name="ref-Nakajima2024"/>
+    <w:bookmarkEnd w:id="163"/>
+    <w:bookmarkStart w:id="165" w:name="ref-Nakajima2024"/>
     <w:p>
       <w:pPr>
         <w:pStyle w:val="Bibliography"/>
@@ -9728,7 +10087,7 @@
       <w:r>
         <w:t xml:space="preserve"> </w:t>
       </w:r>
-      <w:hyperlink r:id="rId156">
+      <w:hyperlink r:id="rId164">
         <w:r>
           <w:rPr>
             <w:rStyle w:val="Hyperlink"/>
@@ -9740,8 +10099,8 @@
         <w:t xml:space="preserve">.</w:t>
       </w:r>
     </w:p>
-    <w:bookmarkEnd w:id="157"/>
-    <w:bookmarkStart w:id="159" w:name="ref-Otsuka2025"/>
+    <w:bookmarkEnd w:id="165"/>
+    <w:bookmarkStart w:id="167" w:name="ref-Otsuka2025"/>
     <w:p>
       <w:pPr>
         <w:pStyle w:val="Bibliography"/>
@@ -9786,7 +10145,7 @@
       <w:r>
         <w:t xml:space="preserve"> </w:t>
       </w:r>
-      <w:hyperlink r:id="rId158">
+      <w:hyperlink r:id="rId166">
         <w:r>
           <w:rPr>
             <w:rStyle w:val="Hyperlink"/>
@@ -9798,8 +10157,8 @@
         <w:t xml:space="preserve">.</w:t>
       </w:r>
     </w:p>
-    <w:bookmarkEnd w:id="159"/>
-    <w:bookmarkStart w:id="161" w:name="ref-Pereira2014"/>
+    <w:bookmarkEnd w:id="167"/>
+    <w:bookmarkStart w:id="169" w:name="ref-Pereira2014"/>
     <w:p>
       <w:pPr>
         <w:pStyle w:val="Bibliography"/>
@@ -9832,7 +10191,7 @@
       <w:r>
         <w:t xml:space="preserve"> </w:t>
       </w:r>
-      <w:hyperlink r:id="rId160">
+      <w:hyperlink r:id="rId168">
         <w:r>
           <w:rPr>
             <w:rStyle w:val="Hyperlink"/>
@@ -9844,8 +10203,8 @@
         <w:t xml:space="preserve">.</w:t>
       </w:r>
     </w:p>
-    <w:bookmarkEnd w:id="161"/>
-    <w:bookmarkStart w:id="163" w:name="ref-Pradhan2017"/>
+    <w:bookmarkEnd w:id="169"/>
+    <w:bookmarkStart w:id="171" w:name="ref-Pradhan2017"/>
     <w:p>
       <w:pPr>
         <w:pStyle w:val="Bibliography"/>
@@ -9878,7 +10237,7 @@
       <w:r>
         <w:t xml:space="preserve"> </w:t>
       </w:r>
-      <w:hyperlink r:id="rId162">
+      <w:hyperlink r:id="rId170">
         <w:r>
           <w:rPr>
             <w:rStyle w:val="Hyperlink"/>
@@ -9890,8 +10249,8 @@
         <w:t xml:space="preserve">.</w:t>
       </w:r>
     </w:p>
-    <w:bookmarkEnd w:id="163"/>
-    <w:bookmarkStart w:id="165" w:name="ref-Riordan2021"/>
+    <w:bookmarkEnd w:id="171"/>
+    <w:bookmarkStart w:id="173" w:name="ref-Riordan2021"/>
     <w:p>
       <w:pPr>
         <w:pStyle w:val="Bibliography"/>
@@ -9915,7 +10274,7 @@
       <w:r>
         <w:t xml:space="preserve"> </w:t>
       </w:r>
-      <w:hyperlink r:id="rId164">
+      <w:hyperlink r:id="rId172">
         <w:r>
           <w:rPr>
             <w:rStyle w:val="Hyperlink"/>
@@ -9927,8 +10286,8 @@
         <w:t xml:space="preserve">.</w:t>
       </w:r>
     </w:p>
-    <w:bookmarkEnd w:id="165"/>
-    <w:bookmarkStart w:id="167" w:name="ref-Ross2020"/>
+    <w:bookmarkEnd w:id="173"/>
+    <w:bookmarkStart w:id="175" w:name="ref-Ross2020"/>
     <w:p>
       <w:pPr>
         <w:pStyle w:val="Bibliography"/>
@@ -9994,7 +10353,7 @@
       <w:r>
         <w:t xml:space="preserve"> </w:t>
       </w:r>
-      <w:hyperlink r:id="rId166">
+      <w:hyperlink r:id="rId174">
         <w:r>
           <w:rPr>
             <w:rStyle w:val="Hyperlink"/>
@@ -10006,8 +10365,8 @@
         <w:t xml:space="preserve">.</w:t>
       </w:r>
     </w:p>
-    <w:bookmarkEnd w:id="167"/>
-    <w:bookmarkStart w:id="168" w:name="ref-Snijders2012"/>
+    <w:bookmarkEnd w:id="175"/>
+    <w:bookmarkStart w:id="176" w:name="ref-Snijders2012"/>
     <w:p>
       <w:pPr>
         <w:pStyle w:val="Bibliography"/>
@@ -10029,8 +10388,8 @@
         <w:t xml:space="preserve">. 2nd ed. SAGE.</w:t>
       </w:r>
     </w:p>
-    <w:bookmarkEnd w:id="168"/>
-    <w:bookmarkStart w:id="170" w:name="ref-StopforthGayle2025"/>
+    <w:bookmarkEnd w:id="176"/>
+    <w:bookmarkStart w:id="178" w:name="ref-StopforthGayle2025"/>
     <w:p>
       <w:pPr>
         <w:pStyle w:val="Bibliography"/>
@@ -10063,7 +10422,7 @@
       <w:r>
         <w:t xml:space="preserve"> </w:t>
       </w:r>
-      <w:hyperlink r:id="rId169">
+      <w:hyperlink r:id="rId177">
         <w:r>
           <w:rPr>
             <w:rStyle w:val="Hyperlink"/>
@@ -10075,8 +10434,8 @@
         <w:t xml:space="preserve">.</w:t>
       </w:r>
     </w:p>
-    <w:bookmarkEnd w:id="170"/>
-    <w:bookmarkStart w:id="172" w:name="ref-Strand2021"/>
+    <w:bookmarkEnd w:id="178"/>
+    <w:bookmarkStart w:id="180" w:name="ref-Strand2021"/>
     <w:p>
       <w:pPr>
         <w:pStyle w:val="Bibliography"/>
@@ -10142,7 +10501,7 @@
       <w:r>
         <w:t xml:space="preserve"> </w:t>
       </w:r>
-      <w:hyperlink r:id="rId171">
+      <w:hyperlink r:id="rId179">
         <w:r>
           <w:rPr>
             <w:rStyle w:val="Hyperlink"/>
@@ -10154,8 +10513,8 @@
         <w:t xml:space="preserve">.</w:t>
       </w:r>
     </w:p>
-    <w:bookmarkEnd w:id="172"/>
-    <w:bookmarkStart w:id="174" w:name="ref-tan_good_2025"/>
+    <w:bookmarkEnd w:id="180"/>
+    <w:bookmarkStart w:id="182" w:name="ref-tan_good_2025"/>
     <w:p>
       <w:pPr>
         <w:pStyle w:val="Bibliography"/>
@@ -10322,7 +10681,7 @@
       <w:r>
         <w:t xml:space="preserve"> </w:t>
       </w:r>
-      <w:hyperlink r:id="rId173">
+      <w:hyperlink r:id="rId181">
         <w:r>
           <w:rPr>
             <w:rStyle w:val="Hyperlink"/>
@@ -10334,8 +10693,8 @@
         <w:t xml:space="preserve">.</w:t>
       </w:r>
     </w:p>
-    <w:bookmarkEnd w:id="174"/>
-    <w:bookmarkStart w:id="176" w:name="ref-Thomson2023"/>
+    <w:bookmarkEnd w:id="182"/>
+    <w:bookmarkStart w:id="184" w:name="ref-Thomson2023"/>
     <w:p>
       <w:pPr>
         <w:pStyle w:val="Bibliography"/>
@@ -10368,7 +10727,7 @@
       <w:r>
         <w:t xml:space="preserve"> </w:t>
       </w:r>
-      <w:hyperlink r:id="rId175">
+      <w:hyperlink r:id="rId183">
         <w:r>
           <w:rPr>
             <w:rStyle w:val="Hyperlink"/>
@@ -10380,8 +10739,8 @@
         <w:t xml:space="preserve">.</w:t>
       </w:r>
     </w:p>
-    <w:bookmarkEnd w:id="176"/>
-    <w:bookmarkStart w:id="178" w:name="ref-Tuckett2023"/>
+    <w:bookmarkEnd w:id="184"/>
+    <w:bookmarkStart w:id="186" w:name="ref-Tuckett2023"/>
     <w:p>
       <w:pPr>
         <w:pStyle w:val="Bibliography"/>
@@ -10447,7 +10806,7 @@
       <w:r>
         <w:t xml:space="preserve"> </w:t>
       </w:r>
-      <w:hyperlink r:id="rId177">
+      <w:hyperlink r:id="rId185">
         <w:r>
           <w:rPr>
             <w:rStyle w:val="Hyperlink"/>
@@ -10459,8 +10818,8 @@
         <w:t xml:space="preserve">.</w:t>
       </w:r>
     </w:p>
-    <w:bookmarkEnd w:id="178"/>
-    <w:bookmarkStart w:id="180" w:name="ref-Voulgaris2019"/>
+    <w:bookmarkEnd w:id="186"/>
+    <w:bookmarkStart w:id="188" w:name="ref-Voulgaris2019"/>
     <w:p>
       <w:pPr>
         <w:pStyle w:val="Bibliography"/>
@@ -10517,7 +10876,7 @@
       <w:r>
         <w:t xml:space="preserve"> </w:t>
       </w:r>
-      <w:hyperlink r:id="rId179">
+      <w:hyperlink r:id="rId187">
         <w:r>
           <w:rPr>
             <w:rStyle w:val="Hyperlink"/>
@@ -10529,8 +10888,8 @@
         <w:t xml:space="preserve">.</w:t>
       </w:r>
     </w:p>
-    <w:bookmarkEnd w:id="180"/>
-    <w:bookmarkStart w:id="182" w:name="ref-Yeo2019"/>
+    <w:bookmarkEnd w:id="188"/>
+    <w:bookmarkStart w:id="190" w:name="ref-Yeo2019"/>
     <w:p>
       <w:pPr>
         <w:pStyle w:val="Bibliography"/>
@@ -10563,7 +10922,7 @@
       <w:r>
         <w:t xml:space="preserve"> </w:t>
       </w:r>
-      <w:hyperlink r:id="rId181">
+      <w:hyperlink r:id="rId189">
         <w:r>
           <w:rPr>
             <w:rStyle w:val="Hyperlink"/>
@@ -10575,8 +10934,8 @@
         <w:t xml:space="preserve">.</w:t>
       </w:r>
     </w:p>
-    <w:bookmarkEnd w:id="182"/>
-    <w:bookmarkStart w:id="184" w:name="ref-Zuccollo2023"/>
+    <w:bookmarkEnd w:id="190"/>
+    <w:bookmarkStart w:id="192" w:name="ref-Zuccollo2023"/>
     <w:p>
       <w:pPr>
         <w:pStyle w:val="Bibliography"/>
@@ -10600,7 +10959,7 @@
       <w:r>
         <w:t xml:space="preserve"> </w:t>
       </w:r>
-      <w:hyperlink r:id="rId183">
+      <w:hyperlink r:id="rId191">
         <w:r>
           <w:rPr>
             <w:rStyle w:val="Hyperlink"/>
@@ -10612,9 +10971,9 @@
         <w:t xml:space="preserve">.</w:t>
       </w:r>
     </w:p>
-    <w:bookmarkEnd w:id="184"/>
-    <w:bookmarkEnd w:id="185"/>
-    <w:bookmarkEnd w:id="186"/>
+    <w:bookmarkEnd w:id="192"/>
+    <w:bookmarkEnd w:id="193"/>
+    <w:bookmarkEnd w:id="194"/>
     <w:sectPr>
       <w:footnotePr>
         <w:numRestart w:val="eachSect"/>
@@ -11046,12 +11405,42 @@
         <w:t xml:space="preserve"> </w:t>
       </w:r>
       <w:r>
+        <w:t xml:space="preserve">Full technical details, model fits, sensitivity checks and a 50-replicate clustered bootstrap of school rank uncertainty are in the supplementary material:</w:t>
+      </w:r>
+      <w:r>
+        <w:t xml:space="preserve"> </w:t>
+      </w:r>
+      <w:hyperlink r:id="rId74">
+        <w:r>
+          <w:rPr>
+            <w:rStyle w:val="Hyperlink"/>
+          </w:rPr>
+          <w:t xml:space="preserve">https://adamdennett.github.io/school_attainment_tool/model_experiments.html#sec-two-stage-absence</w:t>
+        </w:r>
+      </w:hyperlink>
+    </w:p>
+  </w:footnote>
+  <w:footnote w:id="81">
+    <w:p>
+      <w:pPr>
+        <w:pStyle w:val="FootnoteText"/>
+      </w:pPr>
+      <w:r>
+        <w:rPr>
+          <w:rStyle w:val="FootnoteReference"/>
+        </w:rPr>
+        <w:footnoteRef/>
+      </w:r>
+      <w:r>
+        <w:t xml:space="preserve"> </w:t>
+      </w:r>
+      <w:r>
         <w:t xml:space="preserve">Brighton and Hove Council 2024 Consultation Papers can be downloaded from here:</w:t>
       </w:r>
       <w:r>
         <w:t xml:space="preserve"> </w:t>
       </w:r>
-      <w:hyperlink r:id="rId74">
+      <w:hyperlink r:id="rId82">
         <w:r>
           <w:rPr>
             <w:rStyle w:val="Hyperlink"/>
@@ -11061,7 +11450,7 @@
       </w:hyperlink>
     </w:p>
   </w:footnote>
-  <w:footnote w:id="76">
+  <w:footnote w:id="84">
     <w:p>
       <w:pPr>
         <w:pStyle w:val="FootnoteText"/>
@@ -11081,7 +11470,7 @@
       <w:r>
         <w:t xml:space="preserve"> </w:t>
       </w:r>
-      <w:hyperlink r:id="rId77">
+      <w:hyperlink r:id="rId85">
         <w:r>
           <w:rPr>
             <w:rStyle w:val="Hyperlink"/>
@@ -11091,7 +11480,7 @@
       </w:hyperlink>
     </w:p>
   </w:footnote>
-  <w:footnote w:id="80">
+  <w:footnote w:id="88">
     <w:p>
       <w:pPr>
         <w:pStyle w:val="FootnoteText"/>
@@ -11105,7 +11494,7 @@
       <w:r>
         <w:t xml:space="preserve"> </w:t>
       </w:r>
-      <w:hyperlink r:id="rId81">
+      <w:hyperlink r:id="rId89">
         <w:r>
           <w:rPr>
             <w:rStyle w:val="Hyperlink"/>
@@ -11115,7 +11504,7 @@
       </w:hyperlink>
     </w:p>
   </w:footnote>
-  <w:footnote w:id="82">
+  <w:footnote w:id="90">
     <w:p>
       <w:pPr>
         <w:pStyle w:val="FootnoteText"/>
@@ -11129,7 +11518,7 @@
       <w:r>
         <w:t xml:space="preserve"> </w:t>
       </w:r>
-      <w:hyperlink r:id="rId83">
+      <w:hyperlink r:id="rId91">
         <w:r>
           <w:rPr>
             <w:rStyle w:val="Hyperlink"/>
@@ -11139,7 +11528,7 @@
       </w:hyperlink>
     </w:p>
   </w:footnote>
-  <w:footnote w:id="84">
+  <w:footnote w:id="92">
     <w:p>
       <w:pPr>
         <w:pStyle w:val="FootnoteText"/>
@@ -11153,7 +11542,7 @@
       <w:r>
         <w:t xml:space="preserve"> </w:t>
       </w:r>
-      <w:hyperlink r:id="rId85">
+      <w:hyperlink r:id="rId93">
         <w:r>
           <w:rPr>
             <w:rStyle w:val="Hyperlink"/>
@@ -11163,7 +11552,7 @@
       </w:hyperlink>
     </w:p>
   </w:footnote>
-  <w:footnote w:id="90">
+  <w:footnote w:id="98">
     <w:p>
       <w:pPr>
         <w:pStyle w:val="FootnoteText"/>
@@ -11183,7 +11572,7 @@
       <w:r>
         <w:t xml:space="preserve"> </w:t>
       </w:r>
-      <w:hyperlink r:id="rId91">
+      <w:hyperlink r:id="rId99">
         <w:r>
           <w:rPr>
             <w:rStyle w:val="Hyperlink"/>

</xml_diff>

<commit_message>
Source bus-provision claim in original JEP paper too; sync deploy PDFs
Apply the same Appendix 9 sourcing footnote to JEP_Paper.qmd as the
tight version, with the documented £339k supported-bus-routes spend
and £267k bus-passes spend. Sync both JEP_Paper.pdf and
JEP_Paper_tight.pdf to docs/.

Co-Authored-By: Claude Opus 4.6 <noreply@anthropic.com>
</commit_message>
<xml_diff>
--- a/JEP_Paper.docx
+++ b/JEP_Paper.docx
@@ -36,10 +36,18 @@
     </w:p>
     <w:p>
       <w:pPr>
+        <w:pStyle w:val="Author"/>
+      </w:pPr>
+      <w:r>
+        <w:t xml:space="preserve">Beatrice Taylor</w:t>
+      </w:r>
+    </w:p>
+    <w:p>
+      <w:pPr>
         <w:pStyle w:val="Date"/>
       </w:pPr>
       <w:r>
-        <w:t xml:space="preserve">2026-04-30</w:t>
+        <w:t xml:space="preserve">2026-05-01</w:t>
       </w:r>
     </w:p>
     <w:p>
@@ -55,7 +63,7 @@
         <w:pStyle w:val="Abstract"/>
       </w:pPr>
       <w:r>
-        <w:t xml:space="preserve">In its 2026 White Paper, the UK government has set a worthwhile and ambitious target to halve the disadvantage attainment gap in education. Achieving improvements in disadvantaged student attainment requires local education authorities to understand their local situations and the specific drivers in their areas. But it is all too easy to pull the wrong policy lever when the research is complex and local intelligence is incomplete. Recent experiences in Brighton and Hove have highlighted the gap between open data and actionable information for Policy Makers, Schools and anyone wanting to actively contribute to statutory public consultations. Intelligence to inform local debates could be available from within freely available online data sources, but is largely hidden within mountains of tabular data and a vast specialist literature. Using multilevel linear mixed effects models fitted to all state-funded secondary schools in England over four years (2021–22 to 2024–25), we show that school-level Attainment 8 is highly predictable from a small number of readily available variables, but non-linearities mean understanding local context is key. We apply these models to a case study of Brighton and Hove, where admissions policy proposals in 2024 were designed around the premise that attainment would be reduced by moving children around a large city to increase mixing of socioeconomic status in schools. Our analysis revealed this policy would likely have little impact on attainment in the context of the city, but could have considerable social costs. In contrast, Brighton and Hove has the second worst absence rate in England. The council policy was pulling a costly lever with relatively little mechanical advantage while ignoring one with considerably more. We argue that the Department for Education’s open data provides the raw materials for better local policy making, but a crucial gap exists between available data and accessible, contextualised intelligence - a gap we address with a new Policy Simulator tool.</w:t>
+        <w:t xml:space="preserve">In its 2026 White Paper, the UK government has set a worthwhile and ambitious target to halve the disadvantage attainment gap in education. Achieving improvements in disadvantaged student attainment requires local education authorities to understand their local situations and the specific drivers in their areas. But it is all too easy to pull the wrong policy lever when the research is complex and local intelligence is incomplete. Recent experiences in Brighton and Hove have highlighted the gap between open data and actionable information for Policy Makers, Schools and anyone wanting to actively contribute to statutory public consultations. Intelligence to inform local debates could be available from within freely available online data sources, but is largely hidden within mountains of tabular data and a vast specialist literature. Using multilevel linear mixed effects models fitted to all state-funded secondary schools in England over four years (2021–22 to 2024–25), we show that school-level Attainment 8 is highly predictable from a small number of readily available variables, but non-linearities mean understanding local context is key. We apply these models to a case study of Brighton and Hove, where admissions policy proposals in 2024 were designed around the premise that attainment would be reduced by moving children around a large city to increase mixing of socioeconomic status in schools. Our analysis revealed this policy would likely have little impact on attainment in the context of the city, but could have considerable social costs. In contrast, Brighton and Hove has the second worst absence rate in England, with the effects on attainment of improving this, dwarfing any other intervention. The council policy was pulling a costly lever with relatively little mechanical advantage while ignoring one with considerably more. Here we introduce a new policy simulator tool, addressing the gap that exists between the Department for Education’s open data and accessible, contextualised intelligence.</w:t>
       </w:r>
     </w:p>
     <w:bookmarkStart w:id="22" w:name="introduction"/>
@@ -261,13 +269,13 @@
       </w:r>
     </w:p>
     <w:bookmarkEnd w:id="22"/>
-    <w:bookmarkStart w:id="28" w:name="literature-review"/>
+    <w:bookmarkStart w:id="28" w:name="X6c5e88f05ffb4b99244fe6316fbbde4006e9a28"/>
     <w:p>
       <w:pPr>
         <w:pStyle w:val="Heading1"/>
       </w:pPr>
       <w:r>
-        <w:t xml:space="preserve">2. Literature review</w:t>
+        <w:t xml:space="preserve">2. Literature review: factors affecting pupil attainment</w:t>
       </w:r>
     </w:p>
     <w:bookmarkStart w:id="25" w:name="X27e2b6e819b781033a4a4801b80f2ee81de4995"/>
@@ -618,6 +626,12 @@
         <w:t xml:space="preserve"> </w:t>
       </w:r>
       <w:r>
+        <w:t xml:space="preserve">(the apparent boost to attainment for disadvantaged pupils who live in the Capital)</w:t>
+      </w:r>
+      <w:r>
+        <w:t xml:space="preserve"> </w:t>
+      </w:r>
+      <w:r>
         <w:t xml:space="preserve">(Ross et al. 2020)</w:t>
       </w:r>
       <w:r>
@@ -632,12 +646,12 @@
         <w:pStyle w:val="BodyText"/>
       </w:pPr>
       <w:r>
-        <w:t xml:space="preserve">It’s clear from the review above that the factors affecting attainment are multifaceted, complex and interrelated. The research is extensive and many of the drivers well-established and evidenced through high-quality studies on thousands of pupils over long periods of time. As such, with so much evidence on the various different drivers of attainment it can be challenging for anyone comparing different studies to make a judgement on which driver(s) might be most relevant or important in a particular context. To do this, what is required is an analysis which is able to combine as many of these drivers at the same time so that their relative influences and interactions can be assessed concurrently — which is where we now turn.</w:t>
+        <w:t xml:space="preserve">It’s clear from the review above that the factors affecting attainment are multifaceted, complex and interrelated. The research is extensive and many of the drivers well-established and evidenced through high-quality studies on thousands of pupils over long periods of time. As such, with so much evidence on the various different drivers of attainment it can be challenging for anyone comparing different studies to make a judgement on which driver(s) might be most relevant or important in a particular context. It is also the case that many of the factors affecting attainment are associated with each other, so unpicking issues of mediation (where a variable sits on the causal pathway between another and an outcome) and confounding (where another variable is a common cause of both explanatory and predictor variables) needs to occur. To do this, what is required is an analysis which is able to combine as many of these drivers at the same time so that their relative influences and interactions can be assessed concurrently — which is where we now turn.</w:t>
       </w:r>
     </w:p>
     <w:bookmarkEnd w:id="27"/>
     <w:bookmarkEnd w:id="28"/>
-    <w:bookmarkStart w:id="35" w:name="data-and-methods"/>
+    <w:bookmarkStart w:id="36" w:name="data-and-methods"/>
     <w:p>
       <w:pPr>
         <w:pStyle w:val="Heading1"/>
@@ -646,7 +660,7 @@
         <w:t xml:space="preserve">3. Data and methods</w:t>
       </w:r>
     </w:p>
-    <w:bookmarkStart w:id="31" w:name="data"/>
+    <w:bookmarkStart w:id="32" w:name="data"/>
     <w:p>
       <w:pPr>
         <w:pStyle w:val="Heading2"/>
@@ -672,11 +686,42 @@
         <w:t xml:space="preserve"> </w:t>
       </w:r>
       <w:r>
-        <w:t xml:space="preserve">The full panel comprises 13,419 school-year observations from 3,523 academies and maintained schools across 152 LEAs. Independent schools, colleges and special schools are excluded. After listwise exclusion of cases with missing predictor values required for the log-linear specification (principally missing workforce or Ofsted data), the analysis sample used in the models is approximately 12,200 observations. All data are school-level aggregates; interpretations relate to this level of aggregation.</w:t>
-      </w:r>
-    </w:p>
-    <w:bookmarkEnd w:id="31"/>
-    <w:bookmarkStart w:id="34" w:name="model-specification"/>
+        <w:t xml:space="preserve">The full panel comprises 13,419 school-year observations from 3,523 academies and maintained schools across 152 LEAs. Independent schools, colleges and</w:t>
+      </w:r>
+      <w:r>
+        <w:t xml:space="preserve"> </w:t>
+      </w:r>
+      <w:r>
+        <w:t xml:space="preserve">‘special schools’</w:t>
+      </w:r>
+      <w:r>
+        <w:t xml:space="preserve"> </w:t>
+      </w:r>
+      <w:r>
+        <w:t xml:space="preserve">(those catering more for pupils with special educational needs and disabilities) are excluded. After the exclusion of cases with missing predictor values or imputation of those values required for the log-linear specification (principally missing workforce or Ofsted data in 2024-25[^missing]), the analysis sample used in the models is approximately 12,200 observations. All data are school-level aggregates; interpretations relate to this level of aggregation.</w:t>
+      </w:r>
+    </w:p>
+    <w:p>
+      <w:pPr>
+        <w:pStyle w:val="BodyText"/>
+      </w:pPr>
+      <w:r>
+        <w:t xml:space="preserve">[^missing] missing data and imputation:</w:t>
+      </w:r>
+      <w:r>
+        <w:t xml:space="preserve"> </w:t>
+      </w:r>
+      <w:hyperlink r:id="rId31">
+        <w:r>
+          <w:rPr>
+            <w:rStyle w:val="Hyperlink"/>
+          </w:rPr>
+          <w:t xml:space="preserve">https://adamdennett.github.io/school_attainment_tool/data_overview.html#missing-data</w:t>
+        </w:r>
+      </w:hyperlink>
+    </w:p>
+    <w:bookmarkEnd w:id="32"/>
+    <w:bookmarkStart w:id="35" w:name="model-specification"/>
     <w:p>
       <w:pPr>
         <w:pStyle w:val="Heading2"/>
@@ -699,7 +744,7 @@
         <w:t xml:space="preserve">(Snijders 2012)</w:t>
       </w:r>
       <w:r>
-        <w:t xml:space="preserve">. The outcome is log-transformed Attainment 8, the measure of interest cited in the</w:t>
+        <w:t xml:space="preserve">. The outcome is log-transformed Attainment 8 (for all, disadvantaged and non-disadvantaged pupils), the measure of interest cited in the</w:t>
       </w:r>
       <w:r>
         <w:t xml:space="preserve"> </w:t>
@@ -1042,7 +1087,7 @@
         <w:pStyle w:val="BodyText"/>
       </w:pPr>
       <w:r>
-        <w:t xml:space="preserve">Fixed-effect predictors comprise: log(% KS4 pupils who are disadvantaged), log(% overall absence), log(% pupils with English not first language), % low prior attainment at KS2, selective admissions (dummy), Gorard Segregation Index (LA-level), teacher retention rate, leadership pay proportion, and log(teacher sickness days). Variable selection was informed by the literature review and by the policy narrative in Brighton and Hove, where segregation featured prominently in the council justification. Full details of the variables and the full analysis panel can be found in the supplementary material</w:t>
+        <w:t xml:space="preserve">Fixed-effect predictors comprise: log(% KS4 pupils who are disadvantaged - %FSM), log(% overall absence - % Absence), log(% pupils with English as an additional language - %EAL), % low prior attainment at KS2, selective admissions (dummy), Gorard Segregation Index (LA-level), teacher retention rate, leadership pay proportion, and log(teacher sickness days). Variable selection was informed by the literature review and by the policy narrative in Brighton and Hove, where segregation featured prominently in the council justification. Full details of the variables and the full analysis panel can be found in the supplementary material</w:t>
       </w:r>
       <w:r>
         <w:t xml:space="preserve"> </w:t>
@@ -1051,7 +1096,7 @@
         <w:rPr>
           <w:rStyle w:val="FootnoteReference"/>
         </w:rPr>
-        <w:footnoteReference w:id="32"/>
+        <w:footnoteReference w:id="33"/>
       </w:r>
       <w:r>
         <w:t xml:space="preserve">.</w:t>
@@ -1077,12 +1122,12 @@
         <w:t xml:space="preserve"> </w:t>
       </w:r>
       <w:r>
-        <w:t xml:space="preserve">package in R with REML estimation.</w:t>
-      </w:r>
-    </w:p>
-    <w:bookmarkEnd w:id="34"/>
+        <w:t xml:space="preserve">package in R with Restricted Maximum Likelihood estimation.</w:t>
+      </w:r>
+    </w:p>
     <w:bookmarkEnd w:id="35"/>
-    <w:bookmarkStart w:id="51" w:name="results"/>
+    <w:bookmarkEnd w:id="36"/>
+    <w:bookmarkStart w:id="52" w:name="results"/>
     <w:p>
       <w:pPr>
         <w:pStyle w:val="Heading1"/>
@@ -1091,7 +1136,7 @@
         <w:t xml:space="preserve">4. Results</w:t>
       </w:r>
     </w:p>
-    <w:bookmarkStart w:id="36" w:name="model-fit"/>
+    <w:bookmarkStart w:id="37" w:name="model-fit"/>
     <w:p>
       <w:pPr>
         <w:pStyle w:val="Heading2"/>
@@ -1105,7 +1150,31 @@
         <w:pStyle w:val="FirstParagraph"/>
       </w:pPr>
       <w:r>
-        <w:t xml:space="preserve">The models explain a substantial proportion of variance in school-level Attainment 8. For all pupils, the conditional</w:t>
+        <w:t xml:space="preserve">The models explain a substantial proportion of variance in school-level Attainment 8. In order that these fits are more intuitive for those used to interpreting OLS regression models, we use the method described by</w:t>
+      </w:r>
+      <w:r>
+        <w:t xml:space="preserve"> </w:t>
+      </w:r>
+      <w:r>
+        <w:t xml:space="preserve">Nakagawa and Schielzeth (2013)</w:t>
+      </w:r>
+      <w:r>
+        <w:t xml:space="preserve"> </w:t>
+      </w:r>
+      <w:r>
+        <w:t xml:space="preserve">and</w:t>
+      </w:r>
+      <w:r>
+        <w:t xml:space="preserve"> </w:t>
+      </w:r>
+      <w:r>
+        <w:t xml:space="preserve">Nakagawa et al. (2017)</w:t>
+      </w:r>
+      <w:r>
+        <w:t xml:space="preserve"> </w:t>
+      </w:r>
+      <w:r>
+        <w:t xml:space="preserve">to general to calculate indicative</w:t>
       </w:r>
       <w:r>
         <w:t xml:space="preserve"> </w:t>
@@ -1128,7 +1197,7 @@
         <w:t xml:space="preserve"> </w:t>
       </w:r>
       <w:r>
-        <w:t xml:space="preserve">(fixed plus random effects) is 0.77, with marginal</w:t>
+        <w:t xml:space="preserve">values. For all pupils, the conditional</w:t>
       </w:r>
       <w:r>
         <w:t xml:space="preserve"> </w:t>
@@ -1151,7 +1220,7 @@
         <w:t xml:space="preserve"> </w:t>
       </w:r>
       <w:r>
-        <w:t xml:space="preserve">(fixed effects alone) of 0.63. For disadvantaged pupils the conditional</w:t>
+        <w:t xml:space="preserve">(fixed plus random effects) is 0.77, with marginal</w:t>
       </w:r>
       <w:r>
         <w:t xml:space="preserve"> </w:t>
@@ -1174,11 +1243,34 @@
         <w:t xml:space="preserve"> </w:t>
       </w:r>
       <w:r>
+        <w:t xml:space="preserve">(fixed effects alone) of 0.63. For disadvantaged pupils the conditional</w:t>
+      </w:r>
+      <w:r>
+        <w:t xml:space="preserve"> </w:t>
+      </w:r>
+      <m:oMath>
+        <m:sSup>
+          <m:e>
+            <m:r>
+              <m:t>R</m:t>
+            </m:r>
+          </m:e>
+          <m:sup>
+            <m:r>
+              <m:t>2</m:t>
+            </m:r>
+          </m:sup>
+        </m:sSup>
+      </m:oMath>
+      <w:r>
+        <w:t xml:space="preserve"> </w:t>
+      </w:r>
+      <w:r>
         <w:t xml:space="preserve">is 0.73; for non-disadvantaged pupils, 0.79. School-level attainment is remarkably predictable from these structural factors, which makes them very useful for exploring the effectiveness of local policy levers.</w:t>
       </w:r>
     </w:p>
-    <w:bookmarkEnd w:id="36"/>
-    <w:bookmarkStart w:id="38" w:name="stepwise-decomposition"/>
+    <w:bookmarkEnd w:id="37"/>
+    <w:bookmarkStart w:id="39" w:name="stepwise-decomposition"/>
     <w:p>
       <w:pPr>
         <w:pStyle w:val="Heading2"/>
@@ -1200,7 +1292,7 @@
       <w:tr>
         <w:tc>
           <w:tcPr/>
-          <w:bookmarkStart w:id="37" w:name="tbl-stepwise"/>
+          <w:bookmarkStart w:id="38" w:name="tbl-stepwise"/>
           <w:p>
             <w:pPr>
               <w:jc w:val="center"/>
@@ -3798,7 +3890,7 @@
               </w:tc>
             </w:tr>
           </w:tbl>
-          <w:bookmarkEnd w:id="37"/>
+          <w:bookmarkEnd w:id="38"/>
           <w:p/>
         </w:tc>
       </w:tr>
@@ -3875,8 +3967,8 @@
         <w:t xml:space="preserve">A crucial feature of these models is that the log-transformed variables encode non-linear relationships. The same percentage-point change produces different effects depending on where a school starts. For concentrations of disadvantage, the relationship between FSM and attainment flattens above about 20% FSM — further increases in disadvantage do not correlate with noticeable further declines. Most of the strong effect appears below 15%, where further reductions are correlated with much steeper attainment increases. This non-linearity has direct policy consequences: individual LEAs need to consider carefully where each school sits on the distribution to appreciate what changes might realistically achieve.</w:t>
       </w:r>
     </w:p>
-    <w:bookmarkEnd w:id="38"/>
-    <w:bookmarkStart w:id="50" w:name="relative-variable-importance"/>
+    <w:bookmarkEnd w:id="39"/>
+    <w:bookmarkStart w:id="51" w:name="relative-variable-importance"/>
     <w:p>
       <w:pPr>
         <w:pStyle w:val="Heading2"/>
@@ -3898,7 +3990,7 @@
       <w:tr>
         <w:tc>
           <w:tcPr/>
-          <w:bookmarkStart w:id="42" w:name="fig-standardised-coefficients"/>
+          <w:bookmarkStart w:id="43" w:name="fig-standardised-coefficients"/>
           <w:p>
             <w:pPr>
               <w:pStyle w:val="Compact"/>
@@ -3909,18 +4001,18 @@
                 <wp:inline>
                   <wp:extent cx="5334000" cy="3810000"/>
                   <wp:effectExtent b="0" l="0" r="0" t="0"/>
-                  <wp:docPr descr="" title="" id="40" name="Picture"/>
+                  <wp:docPr descr="" title="" id="41" name="Picture"/>
                   <a:graphic>
                     <a:graphicData uri="http://schemas.openxmlformats.org/drawingml/2006/picture">
                       <pic:pic>
                         <pic:nvPicPr>
-                          <pic:cNvPr descr="JEP_Paper_files/figure-docx/fig-standardised-coefficients-1.png" id="41" name="Picture"/>
+                          <pic:cNvPr descr="JEP_Paper_files/figure-docx/fig-standardised-coefficients-1.png" id="42" name="Picture"/>
                           <pic:cNvPicPr>
                             <a:picLocks noChangeArrowheads="1" noChangeAspect="1"/>
                           </pic:cNvPicPr>
                         </pic:nvPicPr>
                         <pic:blipFill>
-                          <a:blip r:embed="rId39"/>
+                          <a:blip r:embed="rId40"/>
                           <a:stretch>
                             <a:fillRect/>
                           </a:stretch>
@@ -3960,7 +4052,7 @@
               <w:t xml:space="preserve">Figure 1: Standardised coefficients showing relative variable importance across pupil groups. Bars show the change in log(ATT8) associated with a one-SD shift in each predictor.</w:t>
             </w:r>
           </w:p>
-          <w:bookmarkEnd w:id="42"/>
+          <w:bookmarkEnd w:id="43"/>
         </w:tc>
       </w:tr>
     </w:tbl>
@@ -3986,7 +4078,7 @@
         <w:rPr>
           <w:rStyle w:val="FootnoteReference"/>
         </w:rPr>
-        <w:footnoteReference w:id="43"/>
+        <w:footnoteReference w:id="44"/>
       </w:r>
       <w:r>
         <w:t xml:space="preserve"> </w:t>
@@ -3998,7 +4090,7 @@
         <w:rPr>
           <w:rStyle w:val="FootnoteReference"/>
         </w:rPr>
-        <w:footnoteReference w:id="44"/>
+        <w:footnoteReference w:id="45"/>
       </w:r>
       <w:r>
         <w:t xml:space="preserve">). Absence is the dominant predictor across all groups, but it is</w:t>
@@ -4025,7 +4117,7 @@
         <w:pStyle w:val="BodyText"/>
       </w:pPr>
       <w:r>
-        <w:t xml:space="preserve">The most contentious finding in our analysis concerns concentrations of disadvantage (contentious in Brighton and Hove - the findings echo the analysis of</w:t>
+        <w:t xml:space="preserve">The most contentious finding in our analysis concerns concentrations of disadvantage (contentious in Brighton and Hove - although the findings echo the analysis of</w:t>
       </w:r>
       <w:r>
         <w:t xml:space="preserve"> </w:t>
@@ -4059,7 +4151,7 @@
         <w:rPr>
           <w:rStyle w:val="FootnoteReference"/>
         </w:rPr>
-        <w:footnoteReference w:id="46"/>
+        <w:footnoteReference w:id="47"/>
       </w:r>
       <w:r>
         <w:t xml:space="preserve"> </w:t>
@@ -4107,7 +4199,7 @@
         <w:rPr>
           <w:rStyle w:val="FootnoteReference"/>
         </w:rPr>
-        <w:footnoteReference w:id="48"/>
+        <w:footnoteReference w:id="49"/>
       </w:r>
       <w:r>
         <w:t xml:space="preserve"> </w:t>
@@ -4141,9 +4233,9 @@
         <w:t xml:space="preserve">, they could be actively counter-productive given how much more negatively impactful absence is.</w:t>
       </w:r>
     </w:p>
-    <w:bookmarkEnd w:id="50"/>
     <w:bookmarkEnd w:id="51"/>
-    <w:bookmarkStart w:id="80" w:name="brighton-and-hove-case-study"/>
+    <w:bookmarkEnd w:id="52"/>
+    <w:bookmarkStart w:id="83" w:name="brighton-and-hove-case-study"/>
     <w:p>
       <w:pPr>
         <w:pStyle w:val="Heading1"/>
@@ -4152,7 +4244,7 @@
         <w:t xml:space="preserve">5. Brighton and Hove case study</w:t>
       </w:r>
     </w:p>
-    <w:bookmarkStart w:id="57" w:name="local-context"/>
+    <w:bookmarkStart w:id="60" w:name="local-context"/>
     <w:p>
       <w:pPr>
         <w:pStyle w:val="Heading2"/>
@@ -4237,7 +4329,7 @@
       <w:r>
         <w:t xml:space="preserve">[^old_strategy]</w:t>
       </w:r>
-      <w:hyperlink r:id="rId52">
+      <w:hyperlink r:id="rId53">
         <w:r>
           <w:rPr>
             <w:rStyle w:val="Hyperlink"/>
@@ -4264,7 +4356,19 @@
         <w:t xml:space="preserve">‘a strong preference for improving existing schools rather than redistributing students, alongside deep concerns about potential impacts on community cohesion and student wellbeing’</w:t>
       </w:r>
       <w:r>
-        <w:t xml:space="preserve">. The proposals would, by the council’s own calculations, force significant numbers of children from central catchments to attend schools at the periphery of the city, potentially requiring over two hours of daily school commuting for many pupils.</w:t>
+        <w:t xml:space="preserve">. The proposals would, by the council’s own calculations, force significant numbers of children from central catchments to attend schools at the periphery of the city, potentially requiring over two hours of daily school commuting for many pupils. The council’s own transport-implications appendix to the consultation papers</w:t>
+      </w:r>
+      <w:r>
+        <w:rPr>
+          <w:rStyle w:val="FootnoteReference"/>
+        </w:rPr>
+        <w:footnoteReference w:id="54"/>
+      </w:r>
+      <w:r>
+        <w:t xml:space="preserve"> </w:t>
+      </w:r>
+      <w:r>
+        <w:t xml:space="preserve">reports that approximately £339,000 per year is already spent on supported bus routes in the city and a further £267,000 per year on around 600 bus passes for qualifying pupils, with provision likely to need re-prioritising and in some cases extending to accommodate the additional pupil flows the admissions changes would generate.</w:t>
       </w:r>
     </w:p>
     <w:p>
@@ -4333,7 +4437,7 @@
       <w:tr>
         <w:tc>
           <w:tcPr/>
-          <w:bookmarkStart w:id="56" w:name="fig-catchments"/>
+          <w:bookmarkStart w:id="59" w:name="fig-catchments"/>
           <w:p>
             <w:pPr>
               <w:pStyle w:val="Compact"/>
@@ -4344,18 +4448,18 @@
                 <wp:inline>
                   <wp:extent cx="5334000" cy="4572000"/>
                   <wp:effectExtent b="0" l="0" r="0" t="0"/>
-                  <wp:docPr descr="" title="" id="54" name="Picture"/>
+                  <wp:docPr descr="" title="" id="57" name="Picture"/>
                   <a:graphic>
                     <a:graphicData uri="http://schemas.openxmlformats.org/drawingml/2006/picture">
                       <pic:pic>
                         <pic:nvPicPr>
-                          <pic:cNvPr descr="JEP_Paper_files/figure-docx/fig-catchments-1.png" id="55" name="Picture"/>
+                          <pic:cNvPr descr="JEP_Paper_files/figure-docx/fig-catchments-1.png" id="58" name="Picture"/>
                           <pic:cNvPicPr>
                             <a:picLocks noChangeArrowheads="1" noChangeAspect="1"/>
                           </pic:cNvPicPr>
                         </pic:nvPicPr>
                         <pic:blipFill>
-                          <a:blip r:embed="rId53"/>
+                          <a:blip r:embed="rId56"/>
                           <a:stretch>
                             <a:fillRect/>
                           </a:stretch>
@@ -4395,12 +4499,12 @@
               <w:t xml:space="preserve">Figure 2: Brighton and Hove secondary schools with 2025/26 catchment boundaries.</w:t>
             </w:r>
           </w:p>
-          <w:bookmarkEnd w:id="56"/>
+          <w:bookmarkEnd w:id="59"/>
         </w:tc>
       </w:tr>
     </w:tbl>
-    <w:bookmarkEnd w:id="57"/>
-    <w:bookmarkStart w:id="62" w:name="local-authority-effects"/>
+    <w:bookmarkEnd w:id="60"/>
+    <w:bookmarkStart w:id="65" w:name="local-authority-effects"/>
     <w:p>
       <w:pPr>
         <w:pStyle w:val="Heading2"/>
@@ -4422,7 +4526,7 @@
       <w:tr>
         <w:tc>
           <w:tcPr/>
-          <w:bookmarkStart w:id="61" w:name="fig-caterpillar"/>
+          <w:bookmarkStart w:id="64" w:name="fig-caterpillar"/>
           <w:p>
             <w:pPr>
               <w:pStyle w:val="Compact"/>
@@ -4433,18 +4537,18 @@
                 <wp:inline>
                   <wp:extent cx="5334000" cy="4572000"/>
                   <wp:effectExtent b="0" l="0" r="0" t="0"/>
-                  <wp:docPr descr="" title="" id="59" name="Picture"/>
+                  <wp:docPr descr="" title="" id="62" name="Picture"/>
                   <a:graphic>
                     <a:graphicData uri="http://schemas.openxmlformats.org/drawingml/2006/picture">
                       <pic:pic>
                         <pic:nvPicPr>
-                          <pic:cNvPr descr="JEP_Paper_files/figure-docx/fig-caterpillar-1.png" id="60" name="Picture"/>
+                          <pic:cNvPr descr="JEP_Paper_files/figure-docx/fig-caterpillar-1.png" id="63" name="Picture"/>
                           <pic:cNvPicPr>
                             <a:picLocks noChangeArrowheads="1" noChangeAspect="1"/>
                           </pic:cNvPicPr>
                         </pic:nvPicPr>
                         <pic:blipFill>
-                          <a:blip r:embed="rId58"/>
+                          <a:blip r:embed="rId61"/>
                           <a:stretch>
                             <a:fillRect/>
                           </a:stretch>
@@ -4484,7 +4588,7 @@
               <w:t xml:space="preserve">Figure 3: LA random intercepts for disadvantaged-pupil attainment (imputed full panel model). Top and bottom 10 LAs labelled; Brighton and Hove highlighted.</w:t>
             </w:r>
           </w:p>
-          <w:bookmarkEnd w:id="61"/>
+          <w:bookmarkEnd w:id="64"/>
         </w:tc>
       </w:tr>
     </w:tbl>
@@ -4507,8 +4611,8 @@
         <w:t xml:space="preserve">shows that Brighton and Hove ranks 7th out of 152 LEAs for disadvantaged attainment once structural factors are accounted for in the multilevel model presented earlier. For non-disadvantaged pupils it ranks 5th; for all pupils, 4th. The positive random intercept of approximately +0.06 translates to around a 6% uplift in Attainment 8 — roughly 2 GCSE points above what structural factors would predict. This was unknown at the time of the 2024 consultation and entirely absent from the public narrative, which was framed around a premise of failure, based on limited analysis.</w:t>
       </w:r>
     </w:p>
-    <w:bookmarkEnd w:id="62"/>
-    <w:bookmarkStart w:id="67" w:name="X2c44da290b91186546cdc06847184f26ab3e331"/>
+    <w:bookmarkEnd w:id="65"/>
+    <w:bookmarkStart w:id="70" w:name="X2c44da290b91186546cdc06847184f26ab3e331"/>
     <w:p>
       <w:pPr>
         <w:pStyle w:val="Heading2"/>
@@ -4571,7 +4675,7 @@
       <w:tr>
         <w:tc>
           <w:tcPr/>
-          <w:bookmarkStart w:id="66" w:name="fig-accelerating-returns"/>
+          <w:bookmarkStart w:id="69" w:name="fig-accelerating-returns"/>
           <w:p>
             <w:pPr>
               <w:pStyle w:val="Compact"/>
@@ -4582,18 +4686,18 @@
                 <wp:inline>
                   <wp:extent cx="5334000" cy="3429000"/>
                   <wp:effectExtent b="0" l="0" r="0" t="0"/>
-                  <wp:docPr descr="" title="" id="64" name="Picture"/>
+                  <wp:docPr descr="" title="" id="67" name="Picture"/>
                   <a:graphic>
                     <a:graphicData uri="http://schemas.openxmlformats.org/drawingml/2006/picture">
                       <pic:pic>
                         <pic:nvPicPr>
-                          <pic:cNvPr descr="JEP_Paper_files/figure-docx/fig-accelerating-returns-1.png" id="65" name="Picture"/>
+                          <pic:cNvPr descr="JEP_Paper_files/figure-docx/fig-accelerating-returns-1.png" id="68" name="Picture"/>
                           <pic:cNvPicPr>
                             <a:picLocks noChangeArrowheads="1" noChangeAspect="1"/>
                           </pic:cNvPicPr>
                         </pic:nvPicPr>
                         <pic:blipFill>
-                          <a:blip r:embed="rId63"/>
+                          <a:blip r:embed="rId66"/>
                           <a:stretch>
                             <a:fillRect/>
                           </a:stretch>
@@ -4633,7 +4737,7 @@
               <w:t xml:space="preserve">Figure 4: Accelerating returns: each percentage-point reduction buys a progressively larger ATT8 gain (reading right to left). Absence delivers substantially larger gains than FSM at every level. Brighton and Hove schools marked on each curve.</w:t>
             </w:r>
           </w:p>
-          <w:bookmarkEnd w:id="66"/>
+          <w:bookmarkEnd w:id="69"/>
         </w:tc>
       </w:tr>
     </w:tbl>
@@ -4677,8 +4781,8 @@
         <w:t xml:space="preserve">Bringing schools above the national average for absence down to it would produce predicted gains averaging +2.9 Attainment 8 points per school, with gains for disadvantaged pupils averaging +3.3 points. Even dramatic FSM reductions would yield gains closer to 1 point. The policy was pulling a lever with relatively little mechanical advantage while ignoring one with considerably more.</w:t>
       </w:r>
     </w:p>
-    <w:bookmarkEnd w:id="67"/>
-    <w:bookmarkStart w:id="72" w:name="contextualised-school-performance"/>
+    <w:bookmarkEnd w:id="70"/>
+    <w:bookmarkStart w:id="75" w:name="contextualised-school-performance"/>
     <w:p>
       <w:pPr>
         <w:pStyle w:val="Heading2"/>
@@ -4700,7 +4804,7 @@
       <w:tr>
         <w:tc>
           <w:tcPr/>
-          <w:bookmarkStart w:id="71" w:name="fig-obs-vs-pred"/>
+          <w:bookmarkStart w:id="74" w:name="fig-obs-vs-pred"/>
           <w:p>
             <w:pPr>
               <w:pStyle w:val="Compact"/>
@@ -4711,18 +4815,18 @@
                 <wp:inline>
                   <wp:extent cx="5334000" cy="6858000"/>
                   <wp:effectExtent b="0" l="0" r="0" t="0"/>
-                  <wp:docPr descr="" title="" id="69" name="Picture"/>
+                  <wp:docPr descr="" title="" id="72" name="Picture"/>
                   <a:graphic>
                     <a:graphicData uri="http://schemas.openxmlformats.org/drawingml/2006/picture">
                       <pic:pic>
                         <pic:nvPicPr>
-                          <pic:cNvPr descr="JEP_Paper_files/figure-docx/fig-obs-vs-pred-1.png" id="70" name="Picture"/>
+                          <pic:cNvPr descr="JEP_Paper_files/figure-docx/fig-obs-vs-pred-1.png" id="73" name="Picture"/>
                           <pic:cNvPicPr>
                             <a:picLocks noChangeArrowheads="1" noChangeAspect="1"/>
                           </pic:cNvPicPr>
                         </pic:nvPicPr>
                         <pic:blipFill>
-                          <a:blip r:embed="rId68"/>
+                          <a:blip r:embed="rId71"/>
                           <a:stretch>
                             <a:fillRect/>
                           </a:stretch>
@@ -4762,7 +4866,7 @@
               <w:t xml:space="preserve">Figure 5: Observed versus predicted Attainment 8 for Brighton and Hove schools (highlighted) against all schools nationally, 2024–25.</w:t>
             </w:r>
           </w:p>
-          <w:bookmarkEnd w:id="71"/>
+          <w:bookmarkEnd w:id="74"/>
         </w:tc>
       </w:tr>
     </w:tbl>
@@ -4820,8 +4924,8 @@
         <w:t xml:space="preserve">measures - more nuanced than Progress 8 - as this model-based value added accounts for far more than just prior attainment in its representation.</w:t>
       </w:r>
     </w:p>
-    <w:bookmarkEnd w:id="72"/>
-    <w:bookmarkStart w:id="79" w:name="X8ff19f05081feb947c9bfda17930b607e81aacb"/>
+    <w:bookmarkEnd w:id="75"/>
+    <w:bookmarkStart w:id="82" w:name="X8ff19f05081feb947c9bfda17930b607e81aacb"/>
     <w:p>
       <w:pPr>
         <w:pStyle w:val="Heading2"/>
@@ -4835,7 +4939,7 @@
         <w:pStyle w:val="FirstParagraph"/>
       </w:pPr>
       <w:r>
-        <w:t xml:space="preserve">The contextualised value-added reading above hides a complication we should make explicit. Our headline model treats school-level absence as a single regressor on the same footing as the school’s intake variables, but absence is not a single causal entity. Some of school-level absence is exogenous to the school: driven by family circumstances, area health, deprivation patterns, the SEN profile of the catchment and other features of the intake the school inherits but cannot directly choose. Some of it is produced by the school: through pastoral systems, attendance officers, parental engagement and the broader ethos around getting children into class. When we control for raw absence in our headline model, both components are absorbed together — the school-level residual we have just been calling</w:t>
+        <w:t xml:space="preserve">The contextualised value-added reading above hides a complication we should make explicit. Our headline model treats school-level absence as a single regressor on the same footing as the school’s other intake variables, but absence is a little differnt to deprivation or English as and additional language. Some of school-level absence is exogenous to the school: driven by family circumstances, area-level health trends, deprivation patterns, the SEND profile of the catchment and other features of the intake the school inherits but cannot directly choose. However some of it is produced by the school: through pastoral systems, attendance officers, parental engagement and the broader ethos around getting children into class. When we control for raw absence in our headline model, both components are absorbed together — the school-level residual we have just been calling</w:t>
       </w:r>
       <w:r>
         <w:t xml:space="preserve"> </w:t>
@@ -4887,19 +4991,16 @@
         <w:pStyle w:val="BodyText"/>
       </w:pPr>
       <w:r>
-        <w:t xml:space="preserve">A two-stage decomposition</w:t>
+        <w:t xml:space="preserve">However, it is possible to separate these endogenous and exogenous elements of absence via A two-stage decomposition</w:t>
       </w:r>
       <w:r>
         <w:rPr>
           <w:rStyle w:val="FootnoteReference"/>
         </w:rPr>
-        <w:footnoteReference w:id="73"/>
-      </w:r>
-      <w:r>
-        <w:t xml:space="preserve"> </w:t>
-      </w:r>
-      <w:r>
-        <w:t xml:space="preserve">separates these. First, we fit an absence model in which school-level absence is regressed only on the variables we treat as exogenous to the school (FSM, EAL, low prior attainment, segregation, plus place and year random effects). This yields two derived quantities for every school-year: an</w:t>
+        <w:footnoteReference w:id="76"/>
+      </w:r>
+      <w:r>
+        <w:t xml:space="preserve">. Firstly, we fit a new absence model in which school-level absence is modelled only on the variables we treat as exogenous to the school (FSM, EAL, low prior attainment, segregation, plus place and year random effects). This produces two derived quantities for every school-year: an</w:t>
       </w:r>
       <w:r>
         <w:t xml:space="preserve"> </w:t>
@@ -4931,7 +5032,7 @@
         <w:t xml:space="preserve"> </w:t>
       </w:r>
       <w:r>
-        <w:t xml:space="preserve">(what is left over — broadly, the school-controllable component). Second, we refit the attainment model with the intake-predicted absence in place of raw absence, and we drop the workforce predictors. The school-level residual from this refitted attainment model is a more honest value-added measure: it gives credit for what the school adds to attainment over and above its intake,</w:t>
+        <w:t xml:space="preserve">(what is left over — broadly, the school-controllable component). Secondly, we refit the attainment model with the intake-predicted absence in place of raw absence, and we drop the workforce predictors. The school-level residual from this refitted attainment model is a more honest value-added measure: it gives credit for what the school adds to attainment over and above its intake,</w:t>
       </w:r>
       <w:r>
         <w:t xml:space="preserve"> </w:t>
@@ -4955,20 +5056,7 @@
         <w:pStyle w:val="BodyText"/>
       </w:pPr>
       <w:r>
-        <w:t xml:space="preserve">The national-level picture this paints is informative. Most of the school-year variation in absence is explained by the intake-only first stage — absence at school level is dominated by intake and place-level structural factors. The school-controllable residual is the smaller share, and a model that fits expected absence and residual absence as separate regressors confirms that the marginal contribution of residual absence to attainment is modest at population level once intake-driven absence is already accounted for. This does not mean attendance management is unimportant. It means</w:t>
-      </w:r>
-      <w:r>
-        <w:t xml:space="preserve"> </w:t>
-      </w:r>
-      <w:r>
-        <w:rPr>
-          <w:b/>
-          <w:bCs/>
-        </w:rPr>
-        <w:t xml:space="preserve">the headline raw-absence coefficient borrows much of its statistical force from the structural component</w:t>
-      </w:r>
-      <w:r>
-        <w:t xml:space="preserve">. The lever is real, but the school-only portion of it is smaller than the single coefficient implies. For local education authorities this has direct policy consequences: closing a city’s absence problem requires both school-level attention</w:t>
+        <w:t xml:space="preserve">The national-level picture this paints is informative. Most of the school-year variation in absence is explained by the intake-only first stage — absence at school level is dominated by intake and place-level structural factors. The school-controllable residual is the smaller share, and a model that fits expected absence and residual absence as separate predictors confirms that the marginal contribution of residual absence to attainment is modest at England school level once intake-driven absence is already accounted for. This does not mean attendance management is unimportant. It means the headline raw-absence coefficient borrows much of its statistical force from the structural component. The lever is real, but the school-only portion of it is smaller than the single coefficient implies. For local education authorities this has direct policy consequences: closing a city’s absence problem requires both school-level attention</w:t>
       </w:r>
       <w:r>
         <w:t xml:space="preserve"> </w:t>
@@ -4984,7 +5072,7 @@
         <w:t xml:space="preserve"> </w:t>
       </w:r>
       <w:r>
-        <w:t xml:space="preserve">cross-departmental work — public health, children’s services, area-level deprivation policy — because much of what schools are dealing with on attendance is inherited rather than generated.</w:t>
+        <w:t xml:space="preserve">cross-departmental work — public health, children’s services, area-level deprivation policy — because much of what schools are dealing with on attendance is inherited from within the LEA, rather than generated.</w:t>
       </w:r>
     </w:p>
     <w:tbl>
@@ -5000,7 +5088,7 @@
       <w:tr>
         <w:tc>
           <w:tcPr/>
-          <w:bookmarkStart w:id="78" w:name="fig-quadrant"/>
+          <w:bookmarkStart w:id="81" w:name="fig-quadrant"/>
           <w:p>
             <w:pPr>
               <w:pStyle w:val="Compact"/>
@@ -5011,18 +5099,18 @@
                 <wp:inline>
                   <wp:extent cx="5334000" cy="3810000"/>
                   <wp:effectExtent b="0" l="0" r="0" t="0"/>
-                  <wp:docPr descr="" title="" id="76" name="Picture"/>
+                  <wp:docPr descr="" title="" id="79" name="Picture"/>
                   <a:graphic>
                     <a:graphicData uri="http://schemas.openxmlformats.org/drawingml/2006/picture">
                       <pic:pic>
                         <pic:nvPicPr>
-                          <pic:cNvPr descr="JEP_Paper_files/figure-docx/fig-quadrant-1.png" id="77" name="Picture"/>
+                          <pic:cNvPr descr="JEP_Paper_files/figure-docx/fig-quadrant-1.png" id="80" name="Picture"/>
                           <pic:cNvPicPr>
                             <a:picLocks noChangeArrowheads="1" noChangeAspect="1"/>
                           </pic:cNvPicPr>
                         </pic:nvPicPr>
                         <pic:blipFill>
-                          <a:blip r:embed="rId75"/>
+                          <a:blip r:embed="rId78"/>
                           <a:stretch>
                             <a:fillRect/>
                           </a:stretch>
@@ -5062,7 +5150,7 @@
               <w:t xml:space="preserve">Figure 6: Brighton and Hove secondaries on the joint-signal plane: contextualised value-added (vertical, in Attainment 8 points) versus the school-controllable absence component (horizontal, in percentage points). The reference lines at zero on each axis split the plane into four narrative quadrants discussed in the text. The full national version with a local-authority filter is available interactively in the project’s HTML report.</w:t>
             </w:r>
           </w:p>
-          <w:bookmarkEnd w:id="78"/>
+          <w:bookmarkEnd w:id="81"/>
         </w:tc>
       </w:tr>
     </w:tbl>
@@ -5090,7 +5178,19 @@
         <w:pStyle w:val="BodyText"/>
       </w:pPr>
       <w:r>
-        <w:t xml:space="preserve">For Brighton and Hove the joint-signal view sharpens the case-study reading.</w:t>
+        <w:t xml:space="preserve">For Brighton and Hove the joint-signal view sharpens the case-study reading. Most of the city’s schools sit in Q2 in the top-right: they are delivering attainment above what their intake would predict and is doing so while running more absence than their intake-driven absence model expects. In these schools, the pedagogical work happening is the more impressive for it; closing any of these school’s residual-absence gap would compound directly onto an already-strong value-added signal. Any schools in Q4 provide a challenge: their attendance management is genuinely strong, but once intake is properly accounted for their attainment outcomes fall short of what their profile predicts, so the simple</w:t>
+      </w:r>
+      <w:r>
+        <w:t xml:space="preserve"> </w:t>
+      </w:r>
+      <w:r>
+        <w:t xml:space="preserve">“fix attendance”</w:t>
+      </w:r>
+      <w:r>
+        <w:t xml:space="preserve"> </w:t>
+      </w:r>
+      <w:r>
+        <w:t xml:space="preserve">improvement story is not available. Schools in Q3 are the most natural targets for council-led attendance interventions, and Q1 schools are where the city should look for practice worth sharing. Reporting</w:t>
       </w:r>
       <w:r>
         <w:t xml:space="preserve"> </w:t>
@@ -5100,56 +5200,15 @@
           <w:b/>
           <w:bCs/>
         </w:rPr>
-        <w:t xml:space="preserve">BACA</w:t>
-      </w:r>
-      <w:r>
-        <w:t xml:space="preserve"> </w:t>
-      </w:r>
-      <w:r>
-        <w:t xml:space="preserve">sits firmly in Q2: the school is delivering attainment well above what its intake would predict and is doing so while running more absence than its intake-driven absence model expects. The pedagogical work happening at BACA is the more impressive for it; closing the school’s residual-absence gap would compound directly onto an already-strong value-added signal.</w:t>
-      </w:r>
-      <w:r>
-        <w:t xml:space="preserve"> </w:t>
-      </w:r>
-      <w:r>
-        <w:rPr>
-          <w:b/>
-          <w:bCs/>
-        </w:rPr>
-        <w:t xml:space="preserve">Patcham</w:t>
-      </w:r>
-      <w:r>
-        <w:t xml:space="preserve">, by contrast, sits in Q4: its attendance management is genuinely strong, but once intake is properly accounted for its attainment outcomes fall short of what its profile predicts, so the simple</w:t>
-      </w:r>
-      <w:r>
-        <w:t xml:space="preserve"> </w:t>
-      </w:r>
-      <w:r>
-        <w:t xml:space="preserve">“fix attendance”</w:t>
-      </w:r>
-      <w:r>
-        <w:t xml:space="preserve"> </w:t>
-      </w:r>
-      <w:r>
-        <w:t xml:space="preserve">improvement story is not available. Schools in Q3 are the most natural targets for council-led attendance interventions, and Q1 schools are where the city should look for practice worth sharing. Reporting</w:t>
-      </w:r>
-      <w:r>
-        <w:t xml:space="preserve"> </w:t>
-      </w:r>
-      <w:r>
-        <w:rPr>
-          <w:b/>
-          <w:bCs/>
-        </w:rPr>
         <w:t xml:space="preserve">value-added alongside residual absence</w:t>
       </w:r>
       <w:r>
         <w:t xml:space="preserve">, with explicit uncertainty intervals, is a more honest framing than the single number that conventional benchmarking produces, and would help align local policy conversation with what the data can support.</w:t>
       </w:r>
     </w:p>
-    <w:bookmarkEnd w:id="79"/>
-    <w:bookmarkEnd w:id="80"/>
-    <w:bookmarkStart w:id="102" w:name="discussion"/>
+    <w:bookmarkEnd w:id="82"/>
+    <w:bookmarkEnd w:id="83"/>
+    <w:bookmarkStart w:id="104" w:name="discussion"/>
     <w:p>
       <w:pPr>
         <w:pStyle w:val="Heading1"/>
@@ -5158,7 +5217,7 @@
         <w:t xml:space="preserve">6. Discussion</w:t>
       </w:r>
     </w:p>
-    <w:bookmarkStart w:id="83" w:name="Xd3364b35d543c93770b334c5dc736f1edb746ee"/>
+    <w:bookmarkStart w:id="85" w:name="Xd3364b35d543c93770b334c5dc736f1edb746ee"/>
     <w:p>
       <w:pPr>
         <w:pStyle w:val="Heading2"/>
@@ -5178,7 +5237,7 @@
         <w:rPr>
           <w:rStyle w:val="FootnoteReference"/>
         </w:rPr>
-        <w:footnoteReference w:id="81"/>
+        <w:footnoteReference w:id="84"/>
       </w:r>
       <w:r>
         <w:t xml:space="preserve">, it was stated:</w:t>
@@ -5320,8 +5379,8 @@
         <w:t xml:space="preserve">overlooks these second-order effects.</w:t>
       </w:r>
     </w:p>
-    <w:bookmarkEnd w:id="83"/>
-    <w:bookmarkStart w:id="86" w:name="X7b02c639a05fbe633837d0e0e5f324b227d5713"/>
+    <w:bookmarkEnd w:id="85"/>
+    <w:bookmarkStart w:id="88" w:name="X7b02c639a05fbe633837d0e0e5f324b227d5713"/>
     <w:p>
       <w:pPr>
         <w:pStyle w:val="Heading2"/>
@@ -5341,7 +5400,7 @@
         <w:rPr>
           <w:rStyle w:val="FootnoteReference"/>
         </w:rPr>
-        <w:footnoteReference w:id="84"/>
+        <w:footnoteReference w:id="86"/>
       </w:r>
       <w:r>
         <w:t xml:space="preserve"> </w:t>
@@ -5366,8 +5425,8 @@
         <w:t xml:space="preserve">Brighton and Hove’s absence rates are not a necessary consequence of its intake composition. The city has near-average FSM eligibility levels but near-worst absence, suggesting the problem is likely driven by local factors — attendance culture, enforcement practices, or community dynamics — rather than being an unavoidable correlate of disadvantage.</w:t>
       </w:r>
     </w:p>
-    <w:bookmarkEnd w:id="86"/>
-    <w:bookmarkStart w:id="94" w:name="X3fc496a95cceb2f31de10765d345b6860b0e78e"/>
+    <w:bookmarkEnd w:id="88"/>
+    <w:bookmarkStart w:id="96" w:name="X3fc496a95cceb2f31de10765d345b6860b0e78e"/>
     <w:p>
       <w:pPr>
         <w:pStyle w:val="Heading2"/>
@@ -5397,7 +5456,7 @@
       <w:tr>
         <w:tc>
           <w:tcPr/>
-          <w:bookmarkStart w:id="87" w:name="tbl-league"/>
+          <w:bookmarkStart w:id="89" w:name="tbl-league"/>
           <w:p>
             <w:pPr>
               <w:jc w:val="center"/>
@@ -7384,7 +7443,7 @@
               </w:tc>
             </w:tr>
           </w:tbl>
-          <w:bookmarkEnd w:id="87"/>
+          <w:bookmarkEnd w:id="89"/>
           <w:p/>
         </w:tc>
       </w:tr>
@@ -7400,7 +7459,7 @@
         <w:rPr>
           <w:rStyle w:val="FootnoteReference"/>
         </w:rPr>
-        <w:footnoteReference w:id="88"/>
+        <w:footnoteReference w:id="90"/>
       </w:r>
       <w:r>
         <w:t xml:space="preserve"> </w:t>
@@ -7412,7 +7471,7 @@
         <w:rPr>
           <w:rStyle w:val="FootnoteReference"/>
         </w:rPr>
-        <w:footnoteReference w:id="90"/>
+        <w:footnoteReference w:id="92"/>
       </w:r>
       <w:r>
         <w:t xml:space="preserve">) emerged from within the BACA catchment advocating for parents to have more options available to</w:t>
@@ -7546,7 +7605,7 @@
         <w:rPr>
           <w:rStyle w:val="FootnoteReference"/>
         </w:rPr>
-        <w:footnoteReference w:id="92"/>
+        <w:footnoteReference w:id="94"/>
       </w:r>
       <w:r>
         <w:t xml:space="preserve"> </w:t>
@@ -7595,8 +7654,8 @@
         <w:t xml:space="preserve">One thing other schools in the city certainly could learn from Patcham High School is in how to improve attendance rates. The school is one of only two in the city with attendance better than the national average. This is an actionable policy lever at the school-level. Without a deeper dive into attendance issues at the different schools in the city, it’s impossible to know what the drivers of this issue are. But given we now know where the real problems in Brighton and Hove lie at the LEA level, one useful policy focus at the city level could well be exploring how schools like Patcham are able to keep attendance relatively high, while then allowing more school-level investigations into where under-performance might be occurring given our new knowledge of interacting structural drivers within the city.</w:t>
       </w:r>
     </w:p>
-    <w:bookmarkEnd w:id="94"/>
-    <w:bookmarkStart w:id="95" w:name="X40b1884cedc541d2941047d67c0b6e8ce71c267"/>
+    <w:bookmarkEnd w:id="96"/>
+    <w:bookmarkStart w:id="97" w:name="X40b1884cedc541d2941047d67c0b6e8ce71c267"/>
     <w:p>
       <w:pPr>
         <w:pStyle w:val="Heading2"/>
@@ -7621,8 +7680,8 @@
         <w:t xml:space="preserve">Following widespread opposition and appeals to the Schools Adjudicator, the proposed PAN reductions were rejected and the 20% out-of-catchment priority was reduced to 5%. While displacement was minimised, the policy reverberations continued through the choices expressed by parents already influenced by the preceding debate.</w:t>
       </w:r>
     </w:p>
-    <w:bookmarkEnd w:id="95"/>
-    <w:bookmarkStart w:id="97" w:name="the-cost-of-speed-over-evidence"/>
+    <w:bookmarkEnd w:id="97"/>
+    <w:bookmarkStart w:id="99" w:name="the-cost-of-speed-over-evidence"/>
     <w:p>
       <w:pPr>
         <w:pStyle w:val="Heading2"/>
@@ -7639,7 +7698,7 @@
         <w:t xml:space="preserve">The institutional context deserves reflection. The shift to a Leader and Cabinet system concentrated decision-making power and enabled policy to be enacted through a whipped voting system. The consultation was compressed in timeline and limited in scope for deliberative engagement. This matters because the evidence base for school attainment is complex — the factors are multiple, interacting, non-linear and context-dependent. Institutional structures that compress deliberation timelines are particularly dangerous when the evidence requires careful handling and its implications are counterintuitive. Had the analysis presented here been available at the outset, the quality of public scrutiny would have been substantially higher, even if the political outcome had remained the same.</w:t>
       </w:r>
     </w:p>
-    <w:bookmarkStart w:id="96" w:name="X6c85e6b131c00160602066b25667ec048f9fb77"/>
+    <w:bookmarkStart w:id="98" w:name="X6c85e6b131c00160602066b25667ec048f9fb77"/>
     <w:p>
       <w:pPr>
         <w:pStyle w:val="Heading3"/>
@@ -7672,9 +7731,9 @@
         <w:t xml:space="preserve">The honest answer is that we do not yet know what produces this LEA effect. The random effect, by definition, captures variance that the fixed-effect predictors do not explain. It could reflect high levels of parental engagement and aspiration — Brighton and Hove has a well-educated population with a strong civic culture. It could relate to the quality of school leadership and governance across the city, or to effective local authority support services and school improvement programmes. It could be something about the collaborative relationships between schools, or community factors that are difficult to quantify. Identifying the sources of this over-performance is an important research question in its own right, and one that could require additional qualitative investigation or access to pupil-level data that goes beyond what is publicly available. What is clear, however, is that policy interventions which risk disrupting a well-functioning system without understanding what makes it function well carry substantial downside risk.</w:t>
       </w:r>
     </w:p>
-    <w:bookmarkEnd w:id="96"/>
-    <w:bookmarkEnd w:id="97"/>
-    <w:bookmarkStart w:id="100" w:name="implications-for-national-policy"/>
+    <w:bookmarkEnd w:id="98"/>
+    <w:bookmarkEnd w:id="99"/>
+    <w:bookmarkStart w:id="102" w:name="implications-for-national-policy"/>
     <w:p>
       <w:pPr>
         <w:pStyle w:val="Heading2"/>
@@ -7714,7 +7773,7 @@
         <w:rPr>
           <w:rStyle w:val="FootnoteReference"/>
         </w:rPr>
-        <w:footnoteReference w:id="98"/>
+        <w:footnoteReference w:id="100"/>
       </w:r>
       <w:r>
         <w:t xml:space="preserve"> </w:t>
@@ -7723,8 +7782,8 @@
         <w:t xml:space="preserve">underpinned by the models in this paper, to begin bridging that gap. The tool allows users to explore any school in England, compare against contextual expectations, and model the indicative impact of changes to key variables.</w:t>
       </w:r>
     </w:p>
-    <w:bookmarkEnd w:id="100"/>
-    <w:bookmarkStart w:id="101" w:name="limitations"/>
+    <w:bookmarkEnd w:id="102"/>
+    <w:bookmarkStart w:id="103" w:name="limitations"/>
     <w:p>
       <w:pPr>
         <w:pStyle w:val="Heading2"/>
@@ -7741,9 +7800,9 @@
         <w:t xml:space="preserve">These are school-level models built from aggregate published data, not pupil-level analyses. The associations identified are not experimental causal estimates but the best approximations available from observational data. The models cannot capture unmeasured factors such as school culture, parental engagement, or individual pupil resilience. The Policy Simulator translates associations into indicative, not definitive, projections. We do not claim that reducing absence by a given amount will mechanically produce the predicted gain — the real world is more complex than any model captures. What we do claim is that these models are accurate enough, and the patterns consistent enough across years and specifications, to substantially improve the quality of the conversation around what matters most.</w:t>
       </w:r>
     </w:p>
-    <w:bookmarkEnd w:id="101"/>
-    <w:bookmarkEnd w:id="102"/>
-    <w:bookmarkStart w:id="103" w:name="conclusion"/>
+    <w:bookmarkEnd w:id="103"/>
+    <w:bookmarkEnd w:id="104"/>
+    <w:bookmarkStart w:id="105" w:name="conclusion"/>
     <w:p>
       <w:pPr>
         <w:pStyle w:val="Heading1"/>
@@ -7792,8 +7851,8 @@
         <w:t xml:space="preserve">decisions are made — not after. The raw materials already exist. What is needed is the analytical capacity and institutional willingness to use them.</w:t>
       </w:r>
     </w:p>
-    <w:bookmarkEnd w:id="103"/>
-    <w:bookmarkStart w:id="104" w:name="credit-authorship-contribution-statement"/>
+    <w:bookmarkEnd w:id="105"/>
+    <w:bookmarkStart w:id="106" w:name="credit-authorship-contribution-statement"/>
     <w:p>
       <w:pPr>
         <w:pStyle w:val="Heading1"/>
@@ -7836,8 +7895,8 @@
         <w:t xml:space="preserve">Methodology – refining and review; Writing – review &amp; editing.</w:t>
       </w:r>
     </w:p>
-    <w:bookmarkEnd w:id="104"/>
-    <w:bookmarkStart w:id="105" w:name="declaration-of-generative-ai-use"/>
+    <w:bookmarkEnd w:id="106"/>
+    <w:bookmarkStart w:id="107" w:name="declaration-of-generative-ai-use"/>
     <w:p>
       <w:pPr>
         <w:pStyle w:val="Heading1"/>
@@ -7854,8 +7913,8 @@
         <w:t xml:space="preserve">The authors used Anthropic’s Claude Code (Claude Opus 4.6) to assist with the development of R data-processing pipelines, the implementation of multilevel model fitting and visualisation code, the formatting of tables and bibliography entries, and the rendering and deployment of Quarto outputs. Any analytical decisions and interpretations during the iterative analytical process were reviewed, verified and approved by the authors, who take full responsibility for the work.</w:t>
       </w:r>
     </w:p>
-    <w:bookmarkEnd w:id="105"/>
-    <w:bookmarkStart w:id="106" w:name="acknowledgements"/>
+    <w:bookmarkEnd w:id="107"/>
+    <w:bookmarkStart w:id="108" w:name="acknowledgements"/>
     <w:p>
       <w:pPr>
         <w:pStyle w:val="Heading1"/>
@@ -7881,8 +7940,8 @@
         <w:t xml:space="preserve">. The range of perspectives and breadth of expertise within this group has been inspirational.</w:t>
       </w:r>
     </w:p>
-    <w:bookmarkEnd w:id="106"/>
-    <w:bookmarkStart w:id="107" w:name="declaration-of-interest"/>
+    <w:bookmarkEnd w:id="108"/>
+    <w:bookmarkStart w:id="109" w:name="declaration-of-interest"/>
     <w:p>
       <w:pPr>
         <w:pStyle w:val="Heading1"/>
@@ -7899,8 +7958,8 @@
         <w:t xml:space="preserve">The authors are residents of Brighton and Hove with lived experience of the effects of the admissions policy process described. Some authors are involved in local school governance. No financial conflicts of interest exist.</w:t>
       </w:r>
     </w:p>
-    <w:bookmarkEnd w:id="107"/>
-    <w:bookmarkStart w:id="194" w:name="references"/>
+    <w:bookmarkEnd w:id="109"/>
+    <w:bookmarkStart w:id="200" w:name="references"/>
     <w:p>
       <w:pPr>
         <w:pStyle w:val="Heading1"/>
@@ -7909,8 +7968,8 @@
         <w:t xml:space="preserve">References</w:t>
       </w:r>
     </w:p>
-    <w:bookmarkStart w:id="193" w:name="refs"/>
-    <w:bookmarkStart w:id="109" w:name="ref-Allen2018"/>
+    <w:bookmarkStart w:id="199" w:name="refs"/>
+    <w:bookmarkStart w:id="111" w:name="ref-Allen2018"/>
     <w:p>
       <w:pPr>
         <w:pStyle w:val="Bibliography"/>
@@ -7952,7 +8011,7 @@
       <w:r>
         <w:t xml:space="preserve"> </w:t>
       </w:r>
-      <w:hyperlink r:id="rId108">
+      <w:hyperlink r:id="rId110">
         <w:r>
           <w:rPr>
             <w:rStyle w:val="Hyperlink"/>
@@ -7964,8 +8023,8 @@
         <w:t xml:space="preserve">.</w:t>
       </w:r>
     </w:p>
-    <w:bookmarkEnd w:id="109"/>
-    <w:bookmarkStart w:id="111" w:name="ref-Allen2013"/>
+    <w:bookmarkEnd w:id="111"/>
+    <w:bookmarkStart w:id="113" w:name="ref-Allen2013"/>
     <w:p>
       <w:pPr>
         <w:pStyle w:val="Bibliography"/>
@@ -8019,7 +8078,7 @@
       <w:r>
         <w:t xml:space="preserve"> </w:t>
       </w:r>
-      <w:hyperlink r:id="rId110">
+      <w:hyperlink r:id="rId112">
         <w:r>
           <w:rPr>
             <w:rStyle w:val="Hyperlink"/>
@@ -8031,8 +8090,8 @@
         <w:t xml:space="preserve">.</w:t>
       </w:r>
     </w:p>
-    <w:bookmarkEnd w:id="111"/>
-    <w:bookmarkStart w:id="113" w:name="ref-Anders2024"/>
+    <w:bookmarkEnd w:id="113"/>
+    <w:bookmarkStart w:id="115" w:name="ref-Anders2024"/>
     <w:p>
       <w:pPr>
         <w:pStyle w:val="Bibliography"/>
@@ -8086,7 +8145,7 @@
       <w:r>
         <w:t xml:space="preserve"> </w:t>
       </w:r>
-      <w:hyperlink r:id="rId112">
+      <w:hyperlink r:id="rId114">
         <w:r>
           <w:rPr>
             <w:rStyle w:val="Hyperlink"/>
@@ -8098,8 +8157,8 @@
         <w:t xml:space="preserve">.</w:t>
       </w:r>
     </w:p>
-    <w:bookmarkEnd w:id="113"/>
-    <w:bookmarkStart w:id="115" w:name="ref-Blagg2018"/>
+    <w:bookmarkEnd w:id="115"/>
+    <w:bookmarkStart w:id="117" w:name="ref-Blagg2018"/>
     <w:p>
       <w:pPr>
         <w:pStyle w:val="Bibliography"/>
@@ -8291,7 +8350,7 @@
       <w:r>
         <w:t xml:space="preserve"> </w:t>
       </w:r>
-      <w:hyperlink r:id="rId114">
+      <w:hyperlink r:id="rId116">
         <w:r>
           <w:rPr>
             <w:rStyle w:val="Hyperlink"/>
@@ -8303,8 +8362,8 @@
         <w:t xml:space="preserve">.</w:t>
       </w:r>
     </w:p>
-    <w:bookmarkEnd w:id="115"/>
-    <w:bookmarkStart w:id="117" w:name="ref-Burgess2018"/>
+    <w:bookmarkEnd w:id="117"/>
+    <w:bookmarkStart w:id="119" w:name="ref-Burgess2018"/>
     <w:p>
       <w:pPr>
         <w:pStyle w:val="Bibliography"/>
@@ -8337,7 +8396,7 @@
       <w:r>
         <w:t xml:space="preserve"> </w:t>
       </w:r>
-      <w:hyperlink r:id="rId116">
+      <w:hyperlink r:id="rId118">
         <w:r>
           <w:rPr>
             <w:rStyle w:val="Hyperlink"/>
@@ -8349,8 +8408,8 @@
         <w:t xml:space="preserve">.</w:t>
       </w:r>
     </w:p>
-    <w:bookmarkEnd w:id="117"/>
-    <w:bookmarkStart w:id="119" w:name="ref-Burgess2023"/>
+    <w:bookmarkEnd w:id="119"/>
+    <w:bookmarkStart w:id="121" w:name="ref-Burgess2023"/>
     <w:p>
       <w:pPr>
         <w:pStyle w:val="Bibliography"/>
@@ -8383,7 +8442,7 @@
       <w:r>
         <w:t xml:space="preserve"> </w:t>
       </w:r>
-      <w:hyperlink r:id="rId118">
+      <w:hyperlink r:id="rId120">
         <w:r>
           <w:rPr>
             <w:rStyle w:val="Hyperlink"/>
@@ -8395,8 +8454,8 @@
         <w:t xml:space="preserve">.</w:t>
       </w:r>
     </w:p>
-    <w:bookmarkEnd w:id="119"/>
-    <w:bookmarkStart w:id="121" w:name="ref-Burgess2022"/>
+    <w:bookmarkEnd w:id="121"/>
+    <w:bookmarkStart w:id="123" w:name="ref-Burgess2022"/>
     <w:p>
       <w:pPr>
         <w:pStyle w:val="Bibliography"/>
@@ -8420,7 +8479,7 @@
       <w:r>
         <w:t xml:space="preserve"> </w:t>
       </w:r>
-      <w:hyperlink r:id="rId120">
+      <w:hyperlink r:id="rId122">
         <w:r>
           <w:rPr>
             <w:rStyle w:val="Hyperlink"/>
@@ -8432,8 +8491,8 @@
         <w:t xml:space="preserve">.</w:t>
       </w:r>
     </w:p>
-    <w:bookmarkEnd w:id="121"/>
-    <w:bookmarkStart w:id="123" w:name="ref-Chairassamee2024"/>
+    <w:bookmarkEnd w:id="123"/>
+    <w:bookmarkStart w:id="125" w:name="ref-Chairassamee2024"/>
     <w:p>
       <w:pPr>
         <w:pStyle w:val="Bibliography"/>
@@ -8466,7 +8525,7 @@
       <w:r>
         <w:t xml:space="preserve"> </w:t>
       </w:r>
-      <w:hyperlink r:id="rId122">
+      <w:hyperlink r:id="rId124">
         <w:r>
           <w:rPr>
             <w:rStyle w:val="Hyperlink"/>
@@ -8478,8 +8537,8 @@
         <w:t xml:space="preserve">.</w:t>
       </w:r>
     </w:p>
-    <w:bookmarkEnd w:id="123"/>
-    <w:bookmarkStart w:id="125" w:name="ref-HouseofCommons2021"/>
+    <w:bookmarkEnd w:id="125"/>
+    <w:bookmarkStart w:id="127" w:name="ref-HouseofCommons2021"/>
     <w:p>
       <w:pPr>
         <w:pStyle w:val="Bibliography"/>
@@ -8629,7 +8688,7 @@
       <w:r>
         <w:t xml:space="preserve"> </w:t>
       </w:r>
-      <w:hyperlink r:id="rId124">
+      <w:hyperlink r:id="rId126">
         <w:r>
           <w:rPr>
             <w:rStyle w:val="Hyperlink"/>
@@ -8641,8 +8700,8 @@
         <w:t xml:space="preserve">.</w:t>
       </w:r>
     </w:p>
-    <w:bookmarkEnd w:id="125"/>
-    <w:bookmarkStart w:id="127" w:name="ref-Cordes2022"/>
+    <w:bookmarkEnd w:id="127"/>
+    <w:bookmarkStart w:id="129" w:name="ref-Cordes2022"/>
     <w:p>
       <w:pPr>
         <w:pStyle w:val="Bibliography"/>
@@ -8675,7 +8734,7 @@
       <w:r>
         <w:t xml:space="preserve"> </w:t>
       </w:r>
-      <w:hyperlink r:id="rId126">
+      <w:hyperlink r:id="rId128">
         <w:r>
           <w:rPr>
             <w:rStyle w:val="Hyperlink"/>
@@ -8687,8 +8746,8 @@
         <w:t xml:space="preserve">.</w:t>
       </w:r>
     </w:p>
-    <w:bookmarkEnd w:id="127"/>
-    <w:bookmarkStart w:id="129" w:name="ref-DfE2022"/>
+    <w:bookmarkEnd w:id="129"/>
+    <w:bookmarkStart w:id="131" w:name="ref-DfE2022"/>
     <w:p>
       <w:pPr>
         <w:pStyle w:val="Bibliography"/>
@@ -8789,7 +8848,7 @@
       <w:r>
         <w:t xml:space="preserve"> </w:t>
       </w:r>
-      <w:hyperlink r:id="rId128">
+      <w:hyperlink r:id="rId130">
         <w:r>
           <w:rPr>
             <w:rStyle w:val="Hyperlink"/>
@@ -8801,8 +8860,8 @@
         <w:t xml:space="preserve">.</w:t>
       </w:r>
     </w:p>
-    <w:bookmarkEnd w:id="129"/>
-    <w:bookmarkStart w:id="131" w:name="ref-DfE2025a"/>
+    <w:bookmarkEnd w:id="131"/>
+    <w:bookmarkStart w:id="133" w:name="ref-DfE2025a"/>
     <w:p>
       <w:pPr>
         <w:pStyle w:val="Bibliography"/>
@@ -8826,7 +8885,7 @@
       <w:r>
         <w:t xml:space="preserve"> </w:t>
       </w:r>
-      <w:hyperlink r:id="rId130">
+      <w:hyperlink r:id="rId132">
         <w:r>
           <w:rPr>
             <w:rStyle w:val="Hyperlink"/>
@@ -8838,8 +8897,8 @@
         <w:t xml:space="preserve">.</w:t>
       </w:r>
     </w:p>
-    <w:bookmarkEnd w:id="131"/>
-    <w:bookmarkStart w:id="133" w:name="ref-DfE2025b"/>
+    <w:bookmarkEnd w:id="133"/>
+    <w:bookmarkStart w:id="135" w:name="ref-DfE2025b"/>
     <w:p>
       <w:pPr>
         <w:pStyle w:val="Bibliography"/>
@@ -8912,7 +8971,7 @@
       <w:r>
         <w:t xml:space="preserve"> </w:t>
       </w:r>
-      <w:hyperlink r:id="rId132">
+      <w:hyperlink r:id="rId134">
         <w:r>
           <w:rPr>
             <w:rStyle w:val="Hyperlink"/>
@@ -8924,8 +8983,8 @@
         <w:t xml:space="preserve">.</w:t>
       </w:r>
     </w:p>
-    <w:bookmarkEnd w:id="133"/>
-    <w:bookmarkStart w:id="135" w:name="ref-dfe_every_2026"/>
+    <w:bookmarkEnd w:id="135"/>
+    <w:bookmarkStart w:id="137" w:name="ref-dfe_every_2026"/>
     <w:p>
       <w:pPr>
         <w:pStyle w:val="Bibliography"/>
@@ -8949,7 +9008,7 @@
       <w:r>
         <w:t xml:space="preserve"> </w:t>
       </w:r>
-      <w:hyperlink r:id="rId134">
+      <w:hyperlink r:id="rId136">
         <w:r>
           <w:rPr>
             <w:rStyle w:val="Hyperlink"/>
@@ -8961,8 +9020,8 @@
         <w:t xml:space="preserve">.</w:t>
       </w:r>
     </w:p>
-    <w:bookmarkEnd w:id="135"/>
-    <w:bookmarkStart w:id="137" w:name="ref-Ding2023"/>
+    <w:bookmarkEnd w:id="137"/>
+    <w:bookmarkStart w:id="139" w:name="ref-Ding2023"/>
     <w:p>
       <w:pPr>
         <w:pStyle w:val="Bibliography"/>
@@ -9016,7 +9075,7 @@
       <w:r>
         <w:t xml:space="preserve"> </w:t>
       </w:r>
-      <w:hyperlink r:id="rId136">
+      <w:hyperlink r:id="rId138">
         <w:r>
           <w:rPr>
             <w:rStyle w:val="Hyperlink"/>
@@ -9028,8 +9087,8 @@
         <w:t xml:space="preserve">.</w:t>
       </w:r>
     </w:p>
-    <w:bookmarkEnd w:id="137"/>
-    <w:bookmarkStart w:id="139" w:name="ref-Drager2024"/>
+    <w:bookmarkEnd w:id="139"/>
+    <w:bookmarkStart w:id="141" w:name="ref-Drager2024"/>
     <w:p>
       <w:pPr>
         <w:pStyle w:val="Bibliography"/>
@@ -9062,7 +9121,7 @@
       <w:r>
         <w:t xml:space="preserve"> </w:t>
       </w:r>
-      <w:hyperlink r:id="rId138">
+      <w:hyperlink r:id="rId140">
         <w:r>
           <w:rPr>
             <w:rStyle w:val="Hyperlink"/>
@@ -9074,8 +9133,8 @@
         <w:t xml:space="preserve">.</w:t>
       </w:r>
     </w:p>
-    <w:bookmarkEnd w:id="139"/>
-    <w:bookmarkStart w:id="141" w:name="ref-Farquharson2024"/>
+    <w:bookmarkEnd w:id="141"/>
+    <w:bookmarkStart w:id="143" w:name="ref-Farquharson2024"/>
     <w:p>
       <w:pPr>
         <w:pStyle w:val="Bibliography"/>
@@ -9108,7 +9167,7 @@
       <w:r>
         <w:t xml:space="preserve"> </w:t>
       </w:r>
-      <w:hyperlink r:id="rId140">
+      <w:hyperlink r:id="rId142">
         <w:r>
           <w:rPr>
             <w:rStyle w:val="Hyperlink"/>
@@ -9120,8 +9179,8 @@
         <w:t xml:space="preserve">.</w:t>
       </w:r>
     </w:p>
-    <w:bookmarkEnd w:id="141"/>
-    <w:bookmarkStart w:id="143" w:name="ref-Faulkner2013"/>
+    <w:bookmarkEnd w:id="143"/>
+    <w:bookmarkStart w:id="145" w:name="ref-Faulkner2013"/>
     <w:p>
       <w:pPr>
         <w:pStyle w:val="Bibliography"/>
@@ -9154,7 +9213,7 @@
       <w:r>
         <w:t xml:space="preserve"> </w:t>
       </w:r>
-      <w:hyperlink r:id="rId142">
+      <w:hyperlink r:id="rId144">
         <w:r>
           <w:rPr>
             <w:rStyle w:val="Hyperlink"/>
@@ -9166,8 +9225,8 @@
         <w:t xml:space="preserve">.</w:t>
       </w:r>
     </w:p>
-    <w:bookmarkEnd w:id="143"/>
-    <w:bookmarkStart w:id="145" w:name="ref-Fredriksen2004"/>
+    <w:bookmarkEnd w:id="145"/>
+    <w:bookmarkStart w:id="147" w:name="ref-Fredriksen2004"/>
     <w:p>
       <w:pPr>
         <w:pStyle w:val="Bibliography"/>
@@ -9209,7 +9268,7 @@
       <w:r>
         <w:t xml:space="preserve"> </w:t>
       </w:r>
-      <w:hyperlink r:id="rId144">
+      <w:hyperlink r:id="rId146">
         <w:r>
           <w:rPr>
             <w:rStyle w:val="Hyperlink"/>
@@ -9221,8 +9280,8 @@
         <w:t xml:space="preserve">.</w:t>
       </w:r>
     </w:p>
-    <w:bookmarkEnd w:id="145"/>
-    <w:bookmarkStart w:id="147" w:name="ref-Gibbons2018"/>
+    <w:bookmarkEnd w:id="147"/>
+    <w:bookmarkStart w:id="149" w:name="ref-Gibbons2018"/>
     <w:p>
       <w:pPr>
         <w:pStyle w:val="Bibliography"/>
@@ -9246,7 +9305,7 @@
       <w:r>
         <w:t xml:space="preserve"> </w:t>
       </w:r>
-      <w:hyperlink r:id="rId146">
+      <w:hyperlink r:id="rId148">
         <w:r>
           <w:rPr>
             <w:rStyle w:val="Hyperlink"/>
@@ -9258,8 +9317,8 @@
         <w:t xml:space="preserve">.</w:t>
       </w:r>
     </w:p>
-    <w:bookmarkEnd w:id="147"/>
-    <w:bookmarkStart w:id="149" w:name="ref-Gillborn2017"/>
+    <w:bookmarkEnd w:id="149"/>
+    <w:bookmarkStart w:id="151" w:name="ref-Gillborn2017"/>
     <w:p>
       <w:pPr>
         <w:pStyle w:val="Bibliography"/>
@@ -9322,7 +9381,7 @@
       <w:r>
         <w:t xml:space="preserve"> </w:t>
       </w:r>
-      <w:hyperlink r:id="rId148">
+      <w:hyperlink r:id="rId150">
         <w:r>
           <w:rPr>
             <w:rStyle w:val="Hyperlink"/>
@@ -9334,8 +9393,8 @@
         <w:t xml:space="preserve">.</w:t>
       </w:r>
     </w:p>
-    <w:bookmarkEnd w:id="149"/>
-    <w:bookmarkStart w:id="151" w:name="ref-gorard_how_2019"/>
+    <w:bookmarkEnd w:id="151"/>
+    <w:bookmarkStart w:id="153" w:name="ref-gorard_how_2019"/>
     <w:p>
       <w:pPr>
         <w:pStyle w:val="Bibliography"/>
@@ -9413,7 +9472,7 @@
       <w:r>
         <w:t xml:space="preserve"> </w:t>
       </w:r>
-      <w:hyperlink r:id="rId150">
+      <w:hyperlink r:id="rId152">
         <w:r>
           <w:rPr>
             <w:rStyle w:val="Hyperlink"/>
@@ -9425,8 +9484,8 @@
         <w:t xml:space="preserve">.</w:t>
       </w:r>
     </w:p>
-    <w:bookmarkEnd w:id="151"/>
-    <w:bookmarkStart w:id="153" w:name="ref-gorard_school_2025"/>
+    <w:bookmarkEnd w:id="153"/>
+    <w:bookmarkStart w:id="155" w:name="ref-gorard_school_2025"/>
     <w:p>
       <w:pPr>
         <w:pStyle w:val="Bibliography"/>
@@ -9579,7 +9638,7 @@
       <w:r>
         <w:t xml:space="preserve"> </w:t>
       </w:r>
-      <w:hyperlink r:id="rId152">
+      <w:hyperlink r:id="rId154">
         <w:r>
           <w:rPr>
             <w:rStyle w:val="Hyperlink"/>
@@ -9591,8 +9650,8 @@
         <w:t xml:space="preserve">.</w:t>
       </w:r>
     </w:p>
-    <w:bookmarkEnd w:id="153"/>
-    <w:bookmarkStart w:id="155" w:name="ref-Grant2017"/>
+    <w:bookmarkEnd w:id="155"/>
+    <w:bookmarkStart w:id="157" w:name="ref-Grant2017"/>
     <w:p>
       <w:pPr>
         <w:pStyle w:val="Bibliography"/>
@@ -9700,7 +9759,7 @@
       <w:r>
         <w:t xml:space="preserve"> </w:t>
       </w:r>
-      <w:hyperlink r:id="rId154">
+      <w:hyperlink r:id="rId156">
         <w:r>
           <w:rPr>
             <w:rStyle w:val="Hyperlink"/>
@@ -9712,8 +9771,8 @@
         <w:t xml:space="preserve">.</w:t>
       </w:r>
     </w:p>
-    <w:bookmarkEnd w:id="155"/>
-    <w:bookmarkStart w:id="157" w:name="ref-Guan2025"/>
+    <w:bookmarkEnd w:id="157"/>
+    <w:bookmarkStart w:id="159" w:name="ref-Guan2025"/>
     <w:p>
       <w:pPr>
         <w:pStyle w:val="Bibliography"/>
@@ -9755,7 +9814,7 @@
       <w:r>
         <w:t xml:space="preserve"> </w:t>
       </w:r>
-      <w:hyperlink r:id="rId156">
+      <w:hyperlink r:id="rId158">
         <w:r>
           <w:rPr>
             <w:rStyle w:val="Hyperlink"/>
@@ -9767,8 +9826,8 @@
         <w:t xml:space="preserve">.</w:t>
       </w:r>
     </w:p>
-    <w:bookmarkEnd w:id="157"/>
-    <w:bookmarkStart w:id="159" w:name="ref-Karan2021"/>
+    <w:bookmarkEnd w:id="159"/>
+    <w:bookmarkStart w:id="161" w:name="ref-Karan2021"/>
     <w:p>
       <w:pPr>
         <w:pStyle w:val="Bibliography"/>
@@ -9813,7 +9872,7 @@
       <w:r>
         <w:t xml:space="preserve"> </w:t>
       </w:r>
-      <w:hyperlink r:id="rId158">
+      <w:hyperlink r:id="rId160">
         <w:r>
           <w:rPr>
             <w:rStyle w:val="Hyperlink"/>
@@ -9825,8 +9884,8 @@
         <w:t xml:space="preserve">.</w:t>
       </w:r>
     </w:p>
-    <w:bookmarkEnd w:id="159"/>
-    <w:bookmarkStart w:id="161" w:name="ref-macleod_supporting_2015"/>
+    <w:bookmarkEnd w:id="161"/>
+    <w:bookmarkStart w:id="163" w:name="ref-macleod_supporting_2015"/>
     <w:p>
       <w:pPr>
         <w:pStyle w:val="Bibliography"/>
@@ -9983,7 +10042,7 @@
       <w:r>
         <w:t xml:space="preserve"> </w:t>
       </w:r>
-      <w:hyperlink r:id="rId160">
+      <w:hyperlink r:id="rId162">
         <w:r>
           <w:rPr>
             <w:rStyle w:val="Hyperlink"/>
@@ -9995,8 +10054,8 @@
         <w:t xml:space="preserve">.</w:t>
       </w:r>
     </w:p>
-    <w:bookmarkEnd w:id="161"/>
-    <w:bookmarkStart w:id="163" w:name="ref-Menzies2023"/>
+    <w:bookmarkEnd w:id="163"/>
+    <w:bookmarkStart w:id="165" w:name="ref-Menzies2023"/>
     <w:p>
       <w:pPr>
         <w:pStyle w:val="Bibliography"/>
@@ -10029,7 +10088,7 @@
       <w:r>
         <w:t xml:space="preserve"> </w:t>
       </w:r>
-      <w:hyperlink r:id="rId162">
+      <w:hyperlink r:id="rId164">
         <w:r>
           <w:rPr>
             <w:rStyle w:val="Hyperlink"/>
@@ -10041,13 +10100,129 @@
         <w:t xml:space="preserve">.</w:t>
       </w:r>
     </w:p>
-    <w:bookmarkEnd w:id="163"/>
-    <w:bookmarkStart w:id="165" w:name="ref-Nakajima2024"/>
+    <w:bookmarkEnd w:id="165"/>
+    <w:bookmarkStart w:id="167" w:name="ref-nakagawa_coefficient_2017"/>
     <w:p>
       <w:pPr>
         <w:pStyle w:val="Bibliography"/>
       </w:pPr>
       <w:r>
+        <w:t xml:space="preserve">Nakagawa, Shinichi, Paul C. D. Johnson, and Holger Schielzeth. 2017.</w:t>
+      </w:r>
+      <w:r>
+        <w:t xml:space="preserve"> </w:t>
+      </w:r>
+      <w:r>
+        <w:t xml:space="preserve">“The Coefficient of Determination</w:t>
+      </w:r>
+      <w:r>
+        <w:t xml:space="preserve"> </w:t>
+      </w:r>
+      <w:r>
+        <w:t xml:space="preserve">R2</w:t>
+      </w:r>
+      <w:r>
+        <w:t xml:space="preserve"> </w:t>
+      </w:r>
+      <w:r>
+        <w:t xml:space="preserve">and Intra-Class Correlation Coefficient from Generalized Linear Mixed-Effects Models Revisited and Expanded.”</w:t>
+      </w:r>
+      <w:r>
+        <w:t xml:space="preserve"> </w:t>
+      </w:r>
+      <w:r>
+        <w:rPr>
+          <w:i/>
+          <w:iCs/>
+        </w:rPr>
+        <w:t xml:space="preserve">Journal of The Royal Society Interface</w:t>
+      </w:r>
+      <w:r>
+        <w:t xml:space="preserve"> </w:t>
+      </w:r>
+      <w:r>
+        <w:t xml:space="preserve">14 (134): 20170213.</w:t>
+      </w:r>
+      <w:r>
+        <w:t xml:space="preserve"> </w:t>
+      </w:r>
+      <w:hyperlink r:id="rId166">
+        <w:r>
+          <w:rPr>
+            <w:rStyle w:val="Hyperlink"/>
+          </w:rPr>
+          <w:t xml:space="preserve">https://doi.org/10.1098/rsif.2017.0213</w:t>
+        </w:r>
+      </w:hyperlink>
+      <w:r>
+        <w:t xml:space="preserve">.</w:t>
+      </w:r>
+    </w:p>
+    <w:bookmarkEnd w:id="167"/>
+    <w:bookmarkStart w:id="169" w:name="ref-nakagawa_general_2013"/>
+    <w:p>
+      <w:pPr>
+        <w:pStyle w:val="Bibliography"/>
+      </w:pPr>
+      <w:r>
+        <w:t xml:space="preserve">Nakagawa, Shinichi, and Holger Schielzeth. 2013.</w:t>
+      </w:r>
+      <w:r>
+        <w:t xml:space="preserve"> </w:t>
+      </w:r>
+      <w:r>
+        <w:t xml:space="preserve">“A General and Simple Method for Obtaining</w:t>
+      </w:r>
+      <w:r>
+        <w:t xml:space="preserve"> </w:t>
+      </w:r>
+      <w:r>
+        <w:t xml:space="preserve">R2</w:t>
+      </w:r>
+      <w:r>
+        <w:t xml:space="preserve"> </w:t>
+      </w:r>
+      <w:r>
+        <w:t xml:space="preserve">from Generalized Linear Mixed-Effects Models.”</w:t>
+      </w:r>
+      <w:r>
+        <w:t xml:space="preserve"> </w:t>
+      </w:r>
+      <w:r>
+        <w:rPr>
+          <w:i/>
+          <w:iCs/>
+        </w:rPr>
+        <w:t xml:space="preserve">Methods in Ecology and Evolution</w:t>
+      </w:r>
+      <w:r>
+        <w:t xml:space="preserve"> </w:t>
+      </w:r>
+      <w:r>
+        <w:t xml:space="preserve">4 (2): 133–42.</w:t>
+      </w:r>
+      <w:r>
+        <w:t xml:space="preserve"> </w:t>
+      </w:r>
+      <w:hyperlink r:id="rId168">
+        <w:r>
+          <w:rPr>
+            <w:rStyle w:val="Hyperlink"/>
+          </w:rPr>
+          <w:t xml:space="preserve">https://doi.org/10.1111/j.2041-210x.2012.00261.x</w:t>
+        </w:r>
+      </w:hyperlink>
+      <w:r>
+        <w:t xml:space="preserve">.</w:t>
+      </w:r>
+    </w:p>
+    <w:bookmarkEnd w:id="169"/>
+    <w:bookmarkStart w:id="171" w:name="ref-Nakajima2024"/>
+    <w:p>
+      <w:pPr>
+        <w:pStyle w:val="Bibliography"/>
+      </w:pPr>
+      <w:r>
         <w:t xml:space="preserve">Nakajima, Sakurako, Yuichiro Otsuka, Osamu Itani, Yoshifumi Kaneko, Masato Suzuki, and Yoshitaka Kaneita. 2024.</w:t>
       </w:r>
       <w:r>
@@ -10087,7 +10262,7 @@
       <w:r>
         <w:t xml:space="preserve"> </w:t>
       </w:r>
-      <w:hyperlink r:id="rId164">
+      <w:hyperlink r:id="rId170">
         <w:r>
           <w:rPr>
             <w:rStyle w:val="Hyperlink"/>
@@ -10099,8 +10274,8 @@
         <w:t xml:space="preserve">.</w:t>
       </w:r>
     </w:p>
-    <w:bookmarkEnd w:id="165"/>
-    <w:bookmarkStart w:id="167" w:name="ref-Otsuka2025"/>
+    <w:bookmarkEnd w:id="171"/>
+    <w:bookmarkStart w:id="173" w:name="ref-Otsuka2025"/>
     <w:p>
       <w:pPr>
         <w:pStyle w:val="Bibliography"/>
@@ -10145,7 +10320,7 @@
       <w:r>
         <w:t xml:space="preserve"> </w:t>
       </w:r>
-      <w:hyperlink r:id="rId166">
+      <w:hyperlink r:id="rId172">
         <w:r>
           <w:rPr>
             <w:rStyle w:val="Hyperlink"/>
@@ -10157,8 +10332,8 @@
         <w:t xml:space="preserve">.</w:t>
       </w:r>
     </w:p>
-    <w:bookmarkEnd w:id="167"/>
-    <w:bookmarkStart w:id="169" w:name="ref-Pereira2014"/>
+    <w:bookmarkEnd w:id="173"/>
+    <w:bookmarkStart w:id="175" w:name="ref-Pereira2014"/>
     <w:p>
       <w:pPr>
         <w:pStyle w:val="Bibliography"/>
@@ -10191,7 +10366,7 @@
       <w:r>
         <w:t xml:space="preserve"> </w:t>
       </w:r>
-      <w:hyperlink r:id="rId168">
+      <w:hyperlink r:id="rId174">
         <w:r>
           <w:rPr>
             <w:rStyle w:val="Hyperlink"/>
@@ -10203,8 +10378,8 @@
         <w:t xml:space="preserve">.</w:t>
       </w:r>
     </w:p>
-    <w:bookmarkEnd w:id="169"/>
-    <w:bookmarkStart w:id="171" w:name="ref-Pradhan2017"/>
+    <w:bookmarkEnd w:id="175"/>
+    <w:bookmarkStart w:id="177" w:name="ref-Pradhan2017"/>
     <w:p>
       <w:pPr>
         <w:pStyle w:val="Bibliography"/>
@@ -10237,7 +10412,7 @@
       <w:r>
         <w:t xml:space="preserve"> </w:t>
       </w:r>
-      <w:hyperlink r:id="rId170">
+      <w:hyperlink r:id="rId176">
         <w:r>
           <w:rPr>
             <w:rStyle w:val="Hyperlink"/>
@@ -10249,8 +10424,8 @@
         <w:t xml:space="preserve">.</w:t>
       </w:r>
     </w:p>
-    <w:bookmarkEnd w:id="171"/>
-    <w:bookmarkStart w:id="173" w:name="ref-Riordan2021"/>
+    <w:bookmarkEnd w:id="177"/>
+    <w:bookmarkStart w:id="179" w:name="ref-Riordan2021"/>
     <w:p>
       <w:pPr>
         <w:pStyle w:val="Bibliography"/>
@@ -10274,7 +10449,7 @@
       <w:r>
         <w:t xml:space="preserve"> </w:t>
       </w:r>
-      <w:hyperlink r:id="rId172">
+      <w:hyperlink r:id="rId178">
         <w:r>
           <w:rPr>
             <w:rStyle w:val="Hyperlink"/>
@@ -10286,8 +10461,8 @@
         <w:t xml:space="preserve">.</w:t>
       </w:r>
     </w:p>
-    <w:bookmarkEnd w:id="173"/>
-    <w:bookmarkStart w:id="175" w:name="ref-Ross2020"/>
+    <w:bookmarkEnd w:id="179"/>
+    <w:bookmarkStart w:id="181" w:name="ref-Ross2020"/>
     <w:p>
       <w:pPr>
         <w:pStyle w:val="Bibliography"/>
@@ -10353,7 +10528,7 @@
       <w:r>
         <w:t xml:space="preserve"> </w:t>
       </w:r>
-      <w:hyperlink r:id="rId174">
+      <w:hyperlink r:id="rId180">
         <w:r>
           <w:rPr>
             <w:rStyle w:val="Hyperlink"/>
@@ -10365,8 +10540,8 @@
         <w:t xml:space="preserve">.</w:t>
       </w:r>
     </w:p>
-    <w:bookmarkEnd w:id="175"/>
-    <w:bookmarkStart w:id="176" w:name="ref-Snijders2012"/>
+    <w:bookmarkEnd w:id="181"/>
+    <w:bookmarkStart w:id="182" w:name="ref-Snijders2012"/>
     <w:p>
       <w:pPr>
         <w:pStyle w:val="Bibliography"/>
@@ -10388,8 +10563,8 @@
         <w:t xml:space="preserve">. 2nd ed. SAGE.</w:t>
       </w:r>
     </w:p>
-    <w:bookmarkEnd w:id="176"/>
-    <w:bookmarkStart w:id="178" w:name="ref-StopforthGayle2025"/>
+    <w:bookmarkEnd w:id="182"/>
+    <w:bookmarkStart w:id="184" w:name="ref-StopforthGayle2025"/>
     <w:p>
       <w:pPr>
         <w:pStyle w:val="Bibliography"/>
@@ -10422,7 +10597,7 @@
       <w:r>
         <w:t xml:space="preserve"> </w:t>
       </w:r>
-      <w:hyperlink r:id="rId177">
+      <w:hyperlink r:id="rId183">
         <w:r>
           <w:rPr>
             <w:rStyle w:val="Hyperlink"/>
@@ -10434,8 +10609,8 @@
         <w:t xml:space="preserve">.</w:t>
       </w:r>
     </w:p>
-    <w:bookmarkEnd w:id="178"/>
-    <w:bookmarkStart w:id="180" w:name="ref-Strand2021"/>
+    <w:bookmarkEnd w:id="184"/>
+    <w:bookmarkStart w:id="186" w:name="ref-Strand2021"/>
     <w:p>
       <w:pPr>
         <w:pStyle w:val="Bibliography"/>
@@ -10501,7 +10676,7 @@
       <w:r>
         <w:t xml:space="preserve"> </w:t>
       </w:r>
-      <w:hyperlink r:id="rId179">
+      <w:hyperlink r:id="rId185">
         <w:r>
           <w:rPr>
             <w:rStyle w:val="Hyperlink"/>
@@ -10513,8 +10688,8 @@
         <w:t xml:space="preserve">.</w:t>
       </w:r>
     </w:p>
-    <w:bookmarkEnd w:id="180"/>
-    <w:bookmarkStart w:id="182" w:name="ref-tan_good_2025"/>
+    <w:bookmarkEnd w:id="186"/>
+    <w:bookmarkStart w:id="188" w:name="ref-tan_good_2025"/>
     <w:p>
       <w:pPr>
         <w:pStyle w:val="Bibliography"/>
@@ -10681,7 +10856,7 @@
       <w:r>
         <w:t xml:space="preserve"> </w:t>
       </w:r>
-      <w:hyperlink r:id="rId181">
+      <w:hyperlink r:id="rId187">
         <w:r>
           <w:rPr>
             <w:rStyle w:val="Hyperlink"/>
@@ -10693,8 +10868,8 @@
         <w:t xml:space="preserve">.</w:t>
       </w:r>
     </w:p>
-    <w:bookmarkEnd w:id="182"/>
-    <w:bookmarkStart w:id="184" w:name="ref-Thomson2023"/>
+    <w:bookmarkEnd w:id="188"/>
+    <w:bookmarkStart w:id="190" w:name="ref-Thomson2023"/>
     <w:p>
       <w:pPr>
         <w:pStyle w:val="Bibliography"/>
@@ -10727,7 +10902,7 @@
       <w:r>
         <w:t xml:space="preserve"> </w:t>
       </w:r>
-      <w:hyperlink r:id="rId183">
+      <w:hyperlink r:id="rId189">
         <w:r>
           <w:rPr>
             <w:rStyle w:val="Hyperlink"/>
@@ -10739,8 +10914,8 @@
         <w:t xml:space="preserve">.</w:t>
       </w:r>
     </w:p>
-    <w:bookmarkEnd w:id="184"/>
-    <w:bookmarkStart w:id="186" w:name="ref-Tuckett2023"/>
+    <w:bookmarkEnd w:id="190"/>
+    <w:bookmarkStart w:id="192" w:name="ref-Tuckett2023"/>
     <w:p>
       <w:pPr>
         <w:pStyle w:val="Bibliography"/>
@@ -10806,7 +10981,7 @@
       <w:r>
         <w:t xml:space="preserve"> </w:t>
       </w:r>
-      <w:hyperlink r:id="rId185">
+      <w:hyperlink r:id="rId191">
         <w:r>
           <w:rPr>
             <w:rStyle w:val="Hyperlink"/>
@@ -10818,8 +10993,8 @@
         <w:t xml:space="preserve">.</w:t>
       </w:r>
     </w:p>
-    <w:bookmarkEnd w:id="186"/>
-    <w:bookmarkStart w:id="188" w:name="ref-Voulgaris2019"/>
+    <w:bookmarkEnd w:id="192"/>
+    <w:bookmarkStart w:id="194" w:name="ref-Voulgaris2019"/>
     <w:p>
       <w:pPr>
         <w:pStyle w:val="Bibliography"/>
@@ -10876,7 +11051,7 @@
       <w:r>
         <w:t xml:space="preserve"> </w:t>
       </w:r>
-      <w:hyperlink r:id="rId187">
+      <w:hyperlink r:id="rId193">
         <w:r>
           <w:rPr>
             <w:rStyle w:val="Hyperlink"/>
@@ -10888,8 +11063,8 @@
         <w:t xml:space="preserve">.</w:t>
       </w:r>
     </w:p>
-    <w:bookmarkEnd w:id="188"/>
-    <w:bookmarkStart w:id="190" w:name="ref-Yeo2019"/>
+    <w:bookmarkEnd w:id="194"/>
+    <w:bookmarkStart w:id="196" w:name="ref-Yeo2019"/>
     <w:p>
       <w:pPr>
         <w:pStyle w:val="Bibliography"/>
@@ -10922,7 +11097,7 @@
       <w:r>
         <w:t xml:space="preserve"> </w:t>
       </w:r>
-      <w:hyperlink r:id="rId189">
+      <w:hyperlink r:id="rId195">
         <w:r>
           <w:rPr>
             <w:rStyle w:val="Hyperlink"/>
@@ -10934,8 +11109,8 @@
         <w:t xml:space="preserve">.</w:t>
       </w:r>
     </w:p>
-    <w:bookmarkEnd w:id="190"/>
-    <w:bookmarkStart w:id="192" w:name="ref-Zuccollo2023"/>
+    <w:bookmarkEnd w:id="196"/>
+    <w:bookmarkStart w:id="198" w:name="ref-Zuccollo2023"/>
     <w:p>
       <w:pPr>
         <w:pStyle w:val="Bibliography"/>
@@ -10959,7 +11134,7 @@
       <w:r>
         <w:t xml:space="preserve"> </w:t>
       </w:r>
-      <w:hyperlink r:id="rId191">
+      <w:hyperlink r:id="rId197">
         <w:r>
           <w:rPr>
             <w:rStyle w:val="Hyperlink"/>
@@ -10971,9 +11146,9 @@
         <w:t xml:space="preserve">.</w:t>
       </w:r>
     </w:p>
-    <w:bookmarkEnd w:id="192"/>
-    <w:bookmarkEnd w:id="193"/>
-    <w:bookmarkEnd w:id="194"/>
+    <w:bookmarkEnd w:id="198"/>
+    <w:bookmarkEnd w:id="199"/>
+    <w:bookmarkEnd w:id="200"/>
     <w:sectPr>
       <w:footnotePr>
         <w:numRestart w:val="eachSect"/>
@@ -11085,9 +11260,15 @@
           <w:t xml:space="preserve">https://adamdennett.github.io/school_attainment_tool/</w:t>
         </w:r>
       </w:hyperlink>
+      <w:r>
+        <w:t xml:space="preserve"> </w:t>
+      </w:r>
+      <w:r>
+        <w:t xml:space="preserve">- with links through to the source code on Github.</w:t>
+      </w:r>
     </w:p>
   </w:footnote>
-  <w:footnote w:id="32">
+  <w:footnote w:id="33">
     <w:p>
       <w:pPr>
         <w:pStyle w:val="FootnoteText"/>
@@ -11107,7 +11288,7 @@
       <w:r>
         <w:t xml:space="preserve"> </w:t>
       </w:r>
-      <w:hyperlink r:id="rId33">
+      <w:hyperlink r:id="rId34">
         <w:r>
           <w:rPr>
             <w:rStyle w:val="Hyperlink"/>
@@ -11117,7 +11298,7 @@
       </w:hyperlink>
     </w:p>
   </w:footnote>
-  <w:footnote w:id="43">
+  <w:footnote w:id="44">
     <w:p>
       <w:pPr>
         <w:pStyle w:val="FootnoteText"/>
@@ -11300,7 +11481,7 @@
       </w:r>
     </w:p>
   </w:footnote>
-  <w:footnote w:id="44">
+  <w:footnote w:id="45">
     <w:p>
       <w:pPr>
         <w:pStyle w:val="FootnoteText"/>
@@ -11320,7 +11501,7 @@
       <w:r>
         <w:t xml:space="preserve"> </w:t>
       </w:r>
-      <w:hyperlink r:id="rId45">
+      <w:hyperlink r:id="rId46">
         <w:r>
           <w:rPr>
             <w:rStyle w:val="Hyperlink"/>
@@ -11330,7 +11511,7 @@
       </w:hyperlink>
     </w:p>
   </w:footnote>
-  <w:footnote w:id="46">
+  <w:footnote w:id="47">
     <w:p>
       <w:pPr>
         <w:pStyle w:val="FootnoteText"/>
@@ -11350,7 +11531,7 @@
       <w:r>
         <w:t xml:space="preserve"> </w:t>
       </w:r>
-      <w:hyperlink r:id="rId47">
+      <w:hyperlink r:id="rId48">
         <w:r>
           <w:rPr>
             <w:rStyle w:val="Hyperlink"/>
@@ -11360,7 +11541,7 @@
       </w:hyperlink>
     </w:p>
   </w:footnote>
-  <w:footnote w:id="48">
+  <w:footnote w:id="49">
     <w:p>
       <w:pPr>
         <w:pStyle w:val="FootnoteText"/>
@@ -11380,7 +11561,7 @@
       <w:r>
         <w:t xml:space="preserve"> </w:t>
       </w:r>
-      <w:hyperlink r:id="rId49">
+      <w:hyperlink r:id="rId50">
         <w:r>
           <w:rPr>
             <w:rStyle w:val="Hyperlink"/>
@@ -11390,7 +11571,7 @@
       </w:hyperlink>
     </w:p>
   </w:footnote>
-  <w:footnote w:id="73">
+  <w:footnote w:id="54">
     <w:p>
       <w:pPr>
         <w:pStyle w:val="FootnoteText"/>
@@ -11405,12 +11586,58 @@
         <w:t xml:space="preserve"> </w:t>
       </w:r>
       <w:r>
+        <w:t xml:space="preserve">Brighton and Hove City Council (2024)</w:t>
+      </w:r>
+      <w:r>
+        <w:t xml:space="preserve"> </w:t>
+      </w:r>
+      <w:r>
+        <w:rPr>
+          <w:i/>
+          <w:iCs/>
+        </w:rPr>
+        <w:t xml:space="preserve">School Admission Arrangements 2026/27 — Appendix 9: Transport Implications and Considerations</w:t>
+      </w:r>
+      <w:r>
+        <w:t xml:space="preserve">. Cabinet papers accompanying the secondary school admissions consultation, available via the consultation portal:</w:t>
+      </w:r>
+      <w:r>
+        <w:t xml:space="preserve"> </w:t>
+      </w:r>
+      <w:hyperlink r:id="rId55">
+        <w:r>
+          <w:rPr>
+            <w:rStyle w:val="Hyperlink"/>
+          </w:rPr>
+          <w:t xml:space="preserve">https://yourvoice.brighton-hove.gov.uk/en-GB/projects/school-admission-arrangements-public-consultation/1</w:t>
+        </w:r>
+      </w:hyperlink>
+      <w:r>
+        <w:t xml:space="preserve">.</w:t>
+      </w:r>
+    </w:p>
+  </w:footnote>
+  <w:footnote w:id="76">
+    <w:p>
+      <w:pPr>
+        <w:pStyle w:val="FootnoteText"/>
+      </w:pPr>
+      <w:r>
+        <w:rPr>
+          <w:rStyle w:val="FootnoteReference"/>
+        </w:rPr>
+        <w:footnoteRef/>
+      </w:r>
+      <w:r>
+        <w:t xml:space="preserve"> </w:t>
+      </w:r>
+      <w:r>
         <w:t xml:space="preserve">Full technical details, model fits, sensitivity checks and a 50-replicate clustered bootstrap of school rank uncertainty are in the supplementary material:</w:t>
       </w:r>
       <w:r>
         <w:t xml:space="preserve"> </w:t>
       </w:r>
-      <w:hyperlink r:id="rId74">
+      <w:hyperlink r:id="rId77">
         <w:r>
           <w:rPr>
             <w:rStyle w:val="Hyperlink"/>
@@ -11420,7 +11647,7 @@
       </w:hyperlink>
     </w:p>
   </w:footnote>
-  <w:footnote w:id="81">
+  <w:footnote w:id="84">
     <w:p>
       <w:pPr>
         <w:pStyle w:val="FootnoteText"/>
@@ -11440,7 +11667,7 @@
       <w:r>
         <w:t xml:space="preserve"> </w:t>
       </w:r>
-      <w:hyperlink r:id="rId82">
+      <w:hyperlink r:id="rId55">
         <w:r>
           <w:rPr>
             <w:rStyle w:val="Hyperlink"/>
@@ -11450,7 +11677,7 @@
       </w:hyperlink>
     </w:p>
   </w:footnote>
-  <w:footnote w:id="84">
+  <w:footnote w:id="86">
     <w:p>
       <w:pPr>
         <w:pStyle w:val="FootnoteText"/>
@@ -11470,7 +11697,7 @@
       <w:r>
         <w:t xml:space="preserve"> </w:t>
       </w:r>
-      <w:hyperlink r:id="rId85">
+      <w:hyperlink r:id="rId87">
         <w:r>
           <w:rPr>
             <w:rStyle w:val="Hyperlink"/>
@@ -11480,7 +11707,7 @@
       </w:hyperlink>
     </w:p>
   </w:footnote>
-  <w:footnote w:id="88">
+  <w:footnote w:id="90">
     <w:p>
       <w:pPr>
         <w:pStyle w:val="FootnoteText"/>
@@ -11494,7 +11721,7 @@
       <w:r>
         <w:t xml:space="preserve"> </w:t>
       </w:r>
-      <w:hyperlink r:id="rId89">
+      <w:hyperlink r:id="rId91">
         <w:r>
           <w:rPr>
             <w:rStyle w:val="Hyperlink"/>
@@ -11504,7 +11731,7 @@
       </w:hyperlink>
     </w:p>
   </w:footnote>
-  <w:footnote w:id="90">
+  <w:footnote w:id="92">
     <w:p>
       <w:pPr>
         <w:pStyle w:val="FootnoteText"/>
@@ -11518,7 +11745,7 @@
       <w:r>
         <w:t xml:space="preserve"> </w:t>
       </w:r>
-      <w:hyperlink r:id="rId91">
+      <w:hyperlink r:id="rId93">
         <w:r>
           <w:rPr>
             <w:rStyle w:val="Hyperlink"/>
@@ -11528,7 +11755,7 @@
       </w:hyperlink>
     </w:p>
   </w:footnote>
-  <w:footnote w:id="92">
+  <w:footnote w:id="94">
     <w:p>
       <w:pPr>
         <w:pStyle w:val="FootnoteText"/>
@@ -11542,7 +11769,7 @@
       <w:r>
         <w:t xml:space="preserve"> </w:t>
       </w:r>
-      <w:hyperlink r:id="rId93">
+      <w:hyperlink r:id="rId95">
         <w:r>
           <w:rPr>
             <w:rStyle w:val="Hyperlink"/>
@@ -11552,7 +11779,7 @@
       </w:hyperlink>
     </w:p>
   </w:footnote>
-  <w:footnote w:id="98">
+  <w:footnote w:id="100">
     <w:p>
       <w:pPr>
         <w:pStyle w:val="FootnoteText"/>
@@ -11572,7 +11799,7 @@
       <w:r>
         <w:t xml:space="preserve"> </w:t>
       </w:r>
-      <w:hyperlink r:id="rId99">
+      <w:hyperlink r:id="rId101">
         <w:r>
           <w:rPr>
             <w:rStyle w:val="Hyperlink"/>

</xml_diff>